<commit_message>
Apply creative-director revisions to clinical-case series kit
Establish series-wide brand standards: CASO #00X numbering, fixed
end-card ritual (Tue->'Quinta 20h', Thu->'Terca 20h'), standardized
cover layout, padronized captions, and hallway-style debrief tone.
Reword EP01 to avoid disqualifying correct initial reasoning and
replace 'gives away' phrasing with reasoning-framed cues across all
four cases.

Co-Authored-By: Claude Opus 4.8 <noreply@anthropic.com>
Claude-Session: https://claude.ai/code/session_019ZEAXjZZitDeGUTgpg3SRV
</commit_message>
<xml_diff>
--- a/SEU_PLANTAO_COMECOU_mes_de_teste.docx
+++ b/SEU_PLANTAO_COMECOU_mes_de_teste.docx
@@ -23,12 +23,12 @@
     </w:p>
     <w:p>
       <w:r>
-        <w:t>Pendura Jaleco · Mês de teste · 4 episódios / 8 posts</w:t>
-      </w:r>
-    </w:p>
-    <w:p>
-      <w:r>
-        <w:t>Formato dividido: terça = o caso (gancho) · quinta = a resposta (entrega)</w:t>
+        <w:t>Pendura Jaleco · Mês de teste · 4 casos / 8 posts</w:t>
+      </w:r>
+    </w:p>
+    <w:p>
+      <w:r>
+        <w:t>Terça = o caso (gancho)  ·  Quinta = a resposta (debrief de corredor)</w:t>
       </w:r>
     </w:p>
     <w:p>
@@ -36,9 +36,8 @@
         <w:rPr>
           <w:b/>
           <w:color w:val="555555"/>
-          <w:sz w:val="22"/>
-        </w:rPr>
-        <w:t>ASSINATURA DA SÉRIE (o que se repete em todo episódio)</w:t>
+        </w:rPr>
+        <w:t>ASSINATURA DA SÉRIE</w:t>
       </w:r>
     </w:p>
     <w:p>
@@ -46,7 +45,7 @@
         <w:rPr>
           <w:i w:val="0"/>
         </w:rPr>
-        <w:t>A hipótese óbvia cai → o detalhe que ninguém olhou resolve o caso.</w:t>
+        <w:t>A hipótese óbvia não fecha → o detalhe que muda o rumo é o exame.</w:t>
       </w:r>
     </w:p>
     <w:p>
@@ -54,9 +53,8 @@
         <w:rPr>
           <w:b/>
           <w:color w:val="555555"/>
-          <w:sz w:val="22"/>
-        </w:rPr>
-        <w:t>ELEMENTOS FIXOS (gravar 1 vez, usar sempre)</w:t>
+        </w:rPr>
+        <w:t>PADRÕES QUE NUNCA MUDAM (é isto que vira marca)</w:t>
       </w:r>
     </w:p>
     <w:p>
@@ -64,7 +62,7 @@
         <w:rPr>
           <w:i w:val="0"/>
         </w:rPr>
-        <w:t>Abertura (4s): "Seu plantão começou." / (pausa) / "Esse paciente é seu."</w:t>
+        <w:t>• ABERTURA (4s): "Seu plantão começou." / (pausa) / "Esse paciente é seu."</w:t>
       </w:r>
     </w:p>
     <w:p>
@@ -72,7 +70,7 @@
         <w:rPr>
           <w:i w:val="0"/>
         </w:rPr>
-        <w:t>Encerramento padrão: "Você sabia por onde começar?" (corta seco)</w:t>
+        <w:t>• ENCERRAMENTO da terça (tela preta): "Seu plantão não acabou." → "Quinta-feira. 20h."</w:t>
       </w:r>
     </w:p>
     <w:p>
@@ -80,7 +78,31 @@
         <w:rPr>
           <w:i w:val="0"/>
         </w:rPr>
-        <w:t>Vocativo: sempre "Interno" — nunca "pessoal/galera".</w:t>
+        <w:t>• ENCERRAMENTO da quinta (tela preta): "Terça que vem, novo plantão." → "Terça-feira. 20h."</w:t>
+      </w:r>
+    </w:p>
+    <w:p>
+      <w:r>
+        <w:rPr>
+          <w:i w:val="0"/>
+        </w:rPr>
+        <w:t>• VOCATIVO: sempre "Interno".</w:t>
+      </w:r>
+    </w:p>
+    <w:p>
+      <w:r>
+        <w:rPr>
+          <w:i w:val="0"/>
+        </w:rPr>
+        <w:t>• NUMERAÇÃO: CASO #001, #002... desde o primeiro dia (cria o arquivo clínico — "no Caso #017 a maioria errou").</w:t>
+      </w:r>
+    </w:p>
+    <w:p>
+      <w:r>
+        <w:rPr>
+          <w:i w:val="0"/>
+        </w:rPr>
+        <w:t>• CAPA: mesmo layout sempre (ver abaixo). 9 capas lado a lado têm que gritar "mesma série".</w:t>
       </w:r>
     </w:p>
     <w:p>
@@ -88,59 +110,164 @@
         <w:rPr>
           <w:b/>
           <w:color w:val="555555"/>
-          <w:sz w:val="22"/>
-        </w:rPr>
-        <w:t>AS 5 REGRAS</w:t>
-      </w:r>
-    </w:p>
-    <w:p>
-      <w:r>
-        <w:rPr>
-          <w:i w:val="0"/>
-        </w:rPr>
-        <w:t>1. Nunca pergunte "qual o diagnóstico?" → pergunte "o que você quer saber agora?"</w:t>
-      </w:r>
-    </w:p>
-    <w:p>
-      <w:r>
-        <w:rPr>
-          <w:i w:val="0"/>
-        </w:rPr>
-        <w:t>2. Nunca explique durante o caso. Só no dia da resposta.</w:t>
-      </w:r>
-    </w:p>
-    <w:p>
-      <w:r>
-        <w:rPr>
-          <w:i w:val="0"/>
-        </w:rPr>
-        <w:t>3. Nunca passe de 60s.</w:t>
-      </w:r>
-    </w:p>
-    <w:p>
-      <w:r>
-        <w:rPr>
-          <w:i w:val="0"/>
-        </w:rPr>
-        <w:t>4. Chame o público de "Interno".</w:t>
-      </w:r>
-    </w:p>
-    <w:p>
-      <w:r>
-        <w:rPr>
-          <w:i w:val="0"/>
-        </w:rPr>
-        <w:t>5. Termina sempre com pergunta.</w:t>
-      </w:r>
-    </w:p>
-    <w:p>
+        </w:rPr>
+        <w:t>CAPA-PADRÃO (Igor olhando pra câmera, sem texto gigante, sem poluição)</w:t>
+      </w:r>
+    </w:p>
+    <w:p>
+      <w:pPr>
+        <w:jc w:val="center"/>
+      </w:pPr>
       <w:r>
         <w:rPr>
           <w:b/>
           <w:color w:val="555555"/>
-          <w:sz w:val="22"/>
-        </w:rPr>
-        <w:t>HASHTAGS PADRÃO (copiar em toda legenda)</w:t>
+          <w:sz w:val="20"/>
+        </w:rPr>
+        <w:t>🚨</w:t>
+      </w:r>
+    </w:p>
+    <w:p>
+      <w:pPr>
+        <w:jc w:val="center"/>
+      </w:pPr>
+      <w:r>
+        <w:rPr>
+          <w:b/>
+          <w:color w:val="5B21B6"/>
+          <w:sz w:val="28"/>
+        </w:rPr>
+        <w:t>SEU PLANTÃO COMEÇOU</w:t>
+      </w:r>
+    </w:p>
+    <w:p>
+      <w:pPr>
+        <w:jc w:val="center"/>
+      </w:pPr>
+      <w:r>
+        <w:rPr>
+          <w:b/>
+          <w:color w:val="555555"/>
+          <w:sz w:val="20"/>
+        </w:rPr>
+        <w:t>TEMPORADA 01</w:t>
+      </w:r>
+    </w:p>
+    <w:p>
+      <w:pPr>
+        <w:jc w:val="center"/>
+      </w:pPr>
+      <w:r>
+        <w:rPr>
+          <w:b/>
+          <w:color w:val="555555"/>
+          <w:sz w:val="20"/>
+        </w:rPr>
+        <w:t>EP.0X</w:t>
+      </w:r>
+    </w:p>
+    <w:p>
+      <w:pPr>
+        <w:jc w:val="center"/>
+      </w:pPr>
+      <w:r>
+        <w:rPr>
+          <w:b/>
+          <w:color w:val="5B21B6"/>
+          <w:sz w:val="26"/>
+        </w:rPr>
+        <w:t>NOME DO CASO</w:t>
+      </w:r>
+    </w:p>
+    <w:p>
+      <w:r>
+        <w:rPr>
+          <w:i/>
+        </w:rPr>
+        <w:t>A capa da quinta é idêntica, só com um pequeno selo "RESPOSTA" no canto.</w:t>
+      </w:r>
+    </w:p>
+    <w:p>
+      <w:r>
+        <w:rPr>
+          <w:b/>
+          <w:color w:val="555555"/>
+        </w:rPr>
+        <w:t>AS 6 REGRAS</w:t>
+      </w:r>
+    </w:p>
+    <w:p>
+      <w:r>
+        <w:rPr>
+          <w:i w:val="0"/>
+        </w:rPr>
+        <w:t>1. Nunca pergunte "qual o diagnóstico?" → pergunte "o que você quer saber agora?"</w:t>
+      </w:r>
+    </w:p>
+    <w:p>
+      <w:r>
+        <w:rPr>
+          <w:i w:val="0"/>
+        </w:rPr>
+        <w:t>2. Nunca explique durante o caso. Só na quinta.</w:t>
+      </w:r>
+    </w:p>
+    <w:p>
+      <w:r>
+        <w:rPr>
+          <w:i w:val="0"/>
+        </w:rPr>
+        <w:t>3. Nunca passe de 60s.</w:t>
+      </w:r>
+    </w:p>
+    <w:p>
+      <w:r>
+        <w:rPr>
+          <w:i w:val="0"/>
+        </w:rPr>
+        <w:t>4. Chame o público de "Interno".</w:t>
+      </w:r>
+    </w:p>
+    <w:p>
+      <w:r>
+        <w:rPr>
+          <w:i w:val="0"/>
+        </w:rPr>
+        <w:t>5. Termine sempre com pergunta.</w:t>
+      </w:r>
+    </w:p>
+    <w:p>
+      <w:r>
+        <w:rPr>
+          <w:i w:val="0"/>
+        </w:rPr>
+        <w:t>6. Nunca desqualifique o raciocínio inicial correto. Crie curiosidade SEM dizer que o outro está errado (pensar em SCA numa dor torácica é certo — respeite isso).</w:t>
+      </w:r>
+    </w:p>
+    <w:p>
+      <w:r>
+        <w:rPr>
+          <w:b/>
+          <w:color w:val="555555"/>
+        </w:rPr>
+        <w:t>TOM DO DEBRIEF DE QUINTA</w:t>
+      </w:r>
+    </w:p>
+    <w:p>
+      <w:r>
+        <w:rPr>
+          <w:i w:val="0"/>
+        </w:rPr>
+        <w:t>Conversa de corredor depois do plantão, não revisão de matéria. "Vi muita gente indo direto pra tomografia... mas antes dela tinha uma informação que custava dez segundos." É um preceptor comentando, não um professor revisando.</w:t>
+      </w:r>
+    </w:p>
+    <w:p>
+      <w:r>
+        <w:rPr>
+          <w:b/>
+          <w:color w:val="555555"/>
+        </w:rPr>
+        <w:t>HASHTAGS PADRÃO</w:t>
       </w:r>
     </w:p>
     <w:p>
@@ -163,7 +290,7 @@
           <w:color w:val="5B21B6"/>
           <w:sz w:val="40"/>
         </w:rPr>
-        <w:t>EPISÓDIO 01 — "Dor Torácica"</w:t>
+        <w:t>CASO #001 — "Dor Torácica"</w:t>
       </w:r>
     </w:p>
     <w:p>
@@ -201,9 +328,8 @@
         <w:rPr>
           <w:b/>
           <w:color w:val="555555"/>
-          <w:sz w:val="22"/>
-        </w:rPr>
-        <w:t>MINI-CAPA (0,5s)</w:t>
+        </w:rPr>
+        <w:t>CAPA</w:t>
       </w:r>
     </w:p>
     <w:p>
@@ -216,7 +342,7 @@
           <w:color w:val="555555"/>
           <w:sz w:val="20"/>
         </w:rPr>
-        <w:t>TEMPORADA 01</w:t>
+        <w:t>🚨</w:t>
       </w:r>
     </w:p>
     <w:p>
@@ -226,10 +352,10 @@
       <w:r>
         <w:rPr>
           <w:b/>
-          <w:color w:val="555555"/>
-          <w:sz w:val="20"/>
-        </w:rPr>
-        <w:t>EPISÓDIO 01 · PARTE 1 — O CASO</w:t>
+          <w:color w:val="5B21B6"/>
+          <w:sz w:val="28"/>
+        </w:rPr>
+        <w:t>SEU PLANTÃO COMEÇOU</w:t>
       </w:r>
     </w:p>
     <w:p>
@@ -239,154 +365,10 @@
       <w:r>
         <w:rPr>
           <w:b/>
-          <w:color w:val="5B21B6"/>
-          <w:sz w:val="26"/>
-        </w:rPr>
-        <w:t>DOR TORÁCICA</w:t>
-      </w:r>
-    </w:p>
-    <w:p>
-      <w:r>
-        <w:rPr>
-          <w:b/>
           <w:color w:val="555555"/>
-          <w:sz w:val="22"/>
-        </w:rPr>
-        <w:t>ROTEIRO (falado, máx. 60s)</w:t>
-      </w:r>
-    </w:p>
-    <w:p>
-      <w:r>
-        <w:rPr>
-          <w:i w:val="0"/>
-        </w:rPr>
-        <w:t>Interno. Seu plantão começou. Esse paciente é seu.</w:t>
-      </w:r>
-    </w:p>
-    <w:p>
-      <w:r>
-        <w:rPr>
-          <w:i w:val="0"/>
-        </w:rPr>
-        <w:t>Homem, 62 anos. Hipertenso. Chega agitado, com dor no peito que vai pras costas. Não consegue ficar deitado na maca.</w:t>
-      </w:r>
-    </w:p>
-    <w:p>
-      <w:r>
-        <w:rPr>
-          <w:i w:val="0"/>
-        </w:rPr>
-        <w:t>O que você quer saber primeiro? (pausa 1s)</w:t>
-      </w:r>
-    </w:p>
-    <w:p>
-      <w:r>
-        <w:rPr>
-          <w:i w:val="0"/>
-        </w:rPr>
-        <w:t>Pressão: 18 por 10. FC: 122. Saturando 92%. ECG: sem isquemia aguda.</w:t>
-      </w:r>
-    </w:p>
-    <w:p>
-      <w:r>
-        <w:rPr>
-          <w:i w:val="0"/>
-        </w:rPr>
-        <w:t>Reparou? O ECG tá limpo. Todo mundo ia pensar em infarto — e tá errado.</w:t>
-      </w:r>
-    </w:p>
-    <w:p>
-      <w:r>
-        <w:rPr>
-          <w:i w:val="0"/>
-        </w:rPr>
-        <w:t>Tem um detalhe no exame físico que entrega esse caso. Um só.</w:t>
-      </w:r>
-    </w:p>
-    <w:p>
-      <w:r>
-        <w:rPr>
-          <w:i w:val="0"/>
-        </w:rPr>
-        <w:t>Interno... o que você examinaria agora pra fechar? Comenta sua conduta. Amanhã eu te mostro o detalhe que quase todo mundo deixa passar. Seu plantão não acabou.</w:t>
-      </w:r>
-    </w:p>
-    <w:p>
-      <w:r>
-        <w:rPr>
-          <w:b/>
-          <w:color w:val="555555"/>
-          <w:sz w:val="22"/>
-        </w:rPr>
-        <w:t>LEGENDA DO POST</w:t>
-      </w:r>
-    </w:p>
-    <w:p>
-      <w:r>
-        <w:rPr>
-          <w:i w:val="0"/>
-        </w:rPr>
-        <w:t>O ECG tá limpo. Então não é infarto… é o quê? 🫥</w:t>
-      </w:r>
-    </w:p>
-    <w:p/>
-    <w:p>
-      <w:r>
-        <w:rPr>
-          <w:i w:val="0"/>
-        </w:rPr>
-        <w:t>Homem de 62 anos, dor no peito que vai pras costas, não para quieto na maca. Tem UM detalhe no exame físico que fecha esse caso — e quase todo plantonista esquece de olhar.</w:t>
-      </w:r>
-    </w:p>
-    <w:p/>
-    <w:p>
-      <w:r>
-        <w:rPr>
-          <w:i w:val="0"/>
-        </w:rPr>
-        <w:t>Interno, o que você examinaria agora? 👇</w:t>
-      </w:r>
-    </w:p>
-    <w:p>
-      <w:r>
-        <w:rPr>
-          <w:i w:val="0"/>
-        </w:rPr>
-        <w:t>Amanhã eu mostro o detalhe. 🚨</w:t>
-      </w:r>
-    </w:p>
-    <w:p>
-      <w:r>
-        <w:rPr>
-          <w:i w:val="0"/>
-        </w:rPr>
-        <w:t>#pendurajaleco #medicina #casoclinico #plantao #internato #residenciamedica #estudantedemedicina #emergencia</w:t>
-      </w:r>
-    </w:p>
-    <w:p>
-      <w:r>
-        <w:rPr>
-          <w:b/>
-          <w:color w:val="555555"/>
-          <w:sz w:val="22"/>
-        </w:rPr>
-        <w:t>COMENTÁRIO FIXADO (postar você mesmo e fixar)</w:t>
-      </w:r>
-    </w:p>
-    <w:p>
-      <w:r>
-        <w:rPr>
-          <w:i w:val="0"/>
-        </w:rPr>
-        <w:t>Regra de ouro da série: ECG normal NÃO te dá alta de raciocínio. 🧠</w:t>
-      </w:r>
-    </w:p>
-    <w:p>
-      <w:r>
-        <w:rPr>
-          <w:i w:val="0"/>
-        </w:rPr>
-        <w:t>Comenta aqui embaixo o que você pediria/examinaria ANTES de eu revelar. Quem acertar marca presença. 👇</w:t>
+          <w:sz w:val="20"/>
+        </w:rPr>
+        <w:t>TEMPORADA 01</w:t>
       </w:r>
     </w:p>
     <w:p>
@@ -395,6 +377,227 @@
       </w:pPr>
       <w:r>
         <w:rPr>
+          <w:b/>
+          <w:color w:val="555555"/>
+          <w:sz w:val="20"/>
+        </w:rPr>
+        <w:t>EP.01</w:t>
+      </w:r>
+    </w:p>
+    <w:p>
+      <w:pPr>
+        <w:jc w:val="center"/>
+      </w:pPr>
+      <w:r>
+        <w:rPr>
+          <w:b/>
+          <w:color w:val="5B21B6"/>
+          <w:sz w:val="26"/>
+        </w:rPr>
+        <w:t>DOR TORÁCICA</w:t>
+      </w:r>
+    </w:p>
+    <w:p>
+      <w:r>
+        <w:rPr>
+          <w:b/>
+          <w:color w:val="555555"/>
+        </w:rPr>
+        <w:t>ROTEIRO (falado, máx. 60s)</w:t>
+      </w:r>
+    </w:p>
+    <w:p>
+      <w:r>
+        <w:rPr>
+          <w:i w:val="0"/>
+        </w:rPr>
+        <w:t>Interno. Seu plantão começou. Esse paciente é seu.</w:t>
+      </w:r>
+    </w:p>
+    <w:p>
+      <w:r>
+        <w:rPr>
+          <w:i w:val="0"/>
+        </w:rPr>
+        <w:t>Homem, 62 anos. Hipertenso. Chega agitado, com dor no peito que vai pras costas. Não consegue ficar deitado na maca.</w:t>
+      </w:r>
+    </w:p>
+    <w:p>
+      <w:r>
+        <w:rPr>
+          <w:i w:val="0"/>
+        </w:rPr>
+        <w:t>O que você quer saber primeiro? (pausa 1s)</w:t>
+      </w:r>
+    </w:p>
+    <w:p>
+      <w:r>
+        <w:rPr>
+          <w:i w:val="0"/>
+        </w:rPr>
+        <w:t>Pressão: 18 por 10. FC: 122. Saturando 92%. ECG: sem isquemia aguda.</w:t>
+      </w:r>
+    </w:p>
+    <w:p>
+      <w:r>
+        <w:rPr>
+          <w:i w:val="0"/>
+        </w:rPr>
+        <w:t>O ECG veio limpo. Muita gente pararia o raciocínio por aqui.</w:t>
+      </w:r>
+    </w:p>
+    <w:p>
+      <w:r>
+        <w:rPr>
+          <w:i w:val="0"/>
+        </w:rPr>
+        <w:t>Mas esse caso ainda está longe de terminar. Tem um detalhe no exame físico que muda completamente o rumo dele.</w:t>
+      </w:r>
+    </w:p>
+    <w:p>
+      <w:r>
+        <w:rPr>
+          <w:i w:val="0"/>
+        </w:rPr>
+        <w:t>Interno... o que você examinaria agora? Comenta sua conduta.</w:t>
+      </w:r>
+    </w:p>
+    <w:p>
+      <w:r>
+        <w:rPr>
+          <w:b/>
+          <w:color w:val="555555"/>
+        </w:rPr>
+        <w:t>ENCERRAMENTO (tela preta — sempre igual)</w:t>
+      </w:r>
+    </w:p>
+    <w:p>
+      <w:pPr>
+        <w:jc w:val="center"/>
+      </w:pPr>
+      <w:r>
+        <w:rPr>
+          <w:b/>
+          <w:color w:val="5B21B6"/>
+        </w:rPr>
+        <w:t>"Seu plantão não acabou."</w:t>
+      </w:r>
+    </w:p>
+    <w:p>
+      <w:pPr>
+        <w:jc w:val="center"/>
+      </w:pPr>
+      <w:r>
+        <w:rPr>
+          <w:b/>
+          <w:color w:val="5B21B6"/>
+        </w:rPr>
+        <w:t>QUINTA-FEIRA · 20H</w:t>
+      </w:r>
+    </w:p>
+    <w:p>
+      <w:r>
+        <w:rPr>
+          <w:b/>
+          <w:color w:val="555555"/>
+        </w:rPr>
+        <w:t>LEGENDA DO POST (padrão da série)</w:t>
+      </w:r>
+    </w:p>
+    <w:p>
+      <w:r>
+        <w:rPr>
+          <w:i w:val="0"/>
+        </w:rPr>
+        <w:t>🚨 CASO #001</w:t>
+      </w:r>
+    </w:p>
+    <w:p>
+      <w:r>
+        <w:rPr>
+          <w:i w:val="0"/>
+        </w:rPr>
+        <w:t>Você assumiria esse caso?</w:t>
+      </w:r>
+    </w:p>
+    <w:p>
+      <w:r>
+        <w:rPr>
+          <w:i w:val="0"/>
+        </w:rPr>
+        <w:t>Homem, 62 anos.</w:t>
+      </w:r>
+    </w:p>
+    <w:p>
+      <w:r>
+        <w:rPr>
+          <w:i w:val="0"/>
+        </w:rPr>
+        <w:t>Dor no peito indo pras costas.</w:t>
+      </w:r>
+    </w:p>
+    <w:p>
+      <w:r>
+        <w:rPr>
+          <w:i w:val="0"/>
+        </w:rPr>
+        <w:t>ECG limpo.</w:t>
+      </w:r>
+    </w:p>
+    <w:p>
+      <w:r>
+        <w:rPr>
+          <w:i w:val="0"/>
+        </w:rPr>
+        <w:t>Qual é o próximo passo?</w:t>
+      </w:r>
+    </w:p>
+    <w:p>
+      <w:r>
+        <w:rPr>
+          <w:i w:val="0"/>
+        </w:rPr>
+        <w:t>👇 Quero ler sua conduta antes da resposta de quinta.</w:t>
+      </w:r>
+    </w:p>
+    <w:p>
+      <w:r>
+        <w:rPr>
+          <w:i w:val="0"/>
+        </w:rPr>
+      </w:r>
+    </w:p>
+    <w:p>
+      <w:r>
+        <w:rPr>
+          <w:i w:val="0"/>
+        </w:rPr>
+        <w:t>#pendurajaleco #medicina #casoclinico #plantao #internato #residenciamedica #estudantedemedicina #emergencia</w:t>
+      </w:r>
+    </w:p>
+    <w:p>
+      <w:r>
+        <w:rPr>
+          <w:b/>
+          <w:color w:val="555555"/>
+        </w:rPr>
+        <w:t>COMENTÁRIO FIXADO (você posta e fixa)</w:t>
+      </w:r>
+    </w:p>
+    <w:p>
+      <w:r>
+        <w:rPr>
+          <w:i w:val="0"/>
+        </w:rPr>
+        <w:t>Regra da série: ECG normal não fecha o raciocínio. 🧠 Comenta sua conduta antes da resposta de quinta — quem cravar marca presença. 👇</w:t>
+      </w:r>
+    </w:p>
+    <w:p>
+      <w:pPr>
+        <w:jc w:val="center"/>
+      </w:pPr>
+      <w:r>
+        <w:rPr>
           <w:color w:val="CCCCCC"/>
         </w:rPr>
         <w:t>— — — — — — — — — — — — — — — — — — — —</w:t>
@@ -407,7 +610,7 @@
           <w:color w:val="5B21B6"/>
           <w:sz w:val="30"/>
         </w:rPr>
-        <w:t>PARTE 2 — QUINTA (A RESPOSTA)</w:t>
+        <w:t>PARTE 2 — QUINTA (A RESPOSTA · debrief de corredor)</w:t>
       </w:r>
     </w:p>
     <w:p>
@@ -415,9 +618,8 @@
         <w:rPr>
           <w:b/>
           <w:color w:val="555555"/>
-          <w:sz w:val="22"/>
-        </w:rPr>
-        <w:t>MINI-CAPA (0,5s)</w:t>
+        </w:rPr>
+        <w:t>CAPA (mesma, com selo "RESPOSTA" no canto)</w:t>
       </w:r>
     </w:p>
     <w:p>
@@ -430,7 +632,7 @@
           <w:color w:val="555555"/>
           <w:sz w:val="20"/>
         </w:rPr>
-        <w:t>TEMPORADA 01</w:t>
+        <w:t>🚨</w:t>
       </w:r>
     </w:p>
     <w:p>
@@ -440,10 +642,10 @@
       <w:r>
         <w:rPr>
           <w:b/>
-          <w:color w:val="555555"/>
-          <w:sz w:val="20"/>
-        </w:rPr>
-        <w:t>EPISÓDIO 01 · PARTE 2 — A RESPOSTA</w:t>
+          <w:color w:val="5B21B6"/>
+          <w:sz w:val="28"/>
+        </w:rPr>
+        <w:t>SEU PLANTÃO COMEÇOU</w:t>
       </w:r>
     </w:p>
     <w:p>
@@ -453,6 +655,32 @@
       <w:r>
         <w:rPr>
           <w:b/>
+          <w:color w:val="555555"/>
+          <w:sz w:val="20"/>
+        </w:rPr>
+        <w:t>TEMPORADA 01</w:t>
+      </w:r>
+    </w:p>
+    <w:p>
+      <w:pPr>
+        <w:jc w:val="center"/>
+      </w:pPr>
+      <w:r>
+        <w:rPr>
+          <w:b/>
+          <w:color w:val="555555"/>
+          <w:sz w:val="20"/>
+        </w:rPr>
+        <w:t>EP.01 · RESPOSTA</w:t>
+      </w:r>
+    </w:p>
+    <w:p>
+      <w:pPr>
+        <w:jc w:val="center"/>
+      </w:pPr>
+      <w:r>
+        <w:rPr>
+          <w:b/>
           <w:color w:val="5B21B6"/>
           <w:sz w:val="26"/>
         </w:rPr>
@@ -464,7 +692,6 @@
         <w:rPr>
           <w:b/>
           <w:color w:val="555555"/>
-          <w:sz w:val="22"/>
         </w:rPr>
         <w:t>ROTEIRO (falado, máx. 60s)</w:t>
       </w:r>
@@ -474,7 +701,7 @@
         <w:rPr>
           <w:i w:val="0"/>
         </w:rPr>
-        <w:t>Interno. Ontem: homem de 62 anos, dor no peito indo pras costas, ECG limpo. Muita gente comentou infarto. Muita gente foi direto pra tomografia.</w:t>
+        <w:t>Interno. Sobre o plantão de terça.</w:t>
       </w:r>
     </w:p>
     <w:p>
@@ -482,7 +709,7 @@
         <w:rPr>
           <w:i w:val="0"/>
         </w:rPr>
-        <w:t>Mas o detalhe tava nas mãos.</w:t>
+        <w:t>"Vi muita gente indo direto para a tomografia." (pausa) "Mas antes dela... tinha uma informação que custava dez segundos." (pausa) "Palpar os pulsos."</w:t>
       </w:r>
     </w:p>
     <w:p>
@@ -490,7 +717,7 @@
         <w:rPr>
           <w:i w:val="0"/>
         </w:rPr>
-        <w:t>Pulso assimétrico entre os dois braços. Pede o raio-X: mediastino alargado.</w:t>
+        <w:t>Pulso assimétrico entre os braços. E no raio-X, mediastino alargado.</w:t>
       </w:r>
     </w:p>
     <w:p>
@@ -498,7 +725,7 @@
         <w:rPr>
           <w:i w:val="0"/>
         </w:rPr>
-        <w:t>Isso é dissecção aguda de aorta. Dor que vai pras costas + pulso diferente nos braços + mediastino largo. Esses três juntos gritam.</w:t>
+        <w:t>Isso é dissecção aguda de aorta. Dor que vai pras costas, pulso diferente nos braços e mediastino largo — os três juntos.</w:t>
       </w:r>
     </w:p>
     <w:p>
@@ -506,7 +733,7 @@
         <w:rPr>
           <w:i w:val="0"/>
         </w:rPr>
-        <w:t>A lição não é decorar dissecção. É: ECG normal não te dá alta de raciocínio. Você examina antes de fechar.</w:t>
+        <w:t>A lição não é decorar dissecção. É que o ECG limpo não fecha o raciocínio. O exame físico ainda manda.</w:t>
       </w:r>
     </w:p>
     <w:p>
@@ -514,7 +741,7 @@
         <w:rPr>
           <w:i w:val="0"/>
         </w:rPr>
-        <w:t>Interno... você tinha pego o pulso? Comenta. Quinta tem caso novo.</w:t>
+        <w:t>Interno... você tinha pego o pulso? Comenta.</w:t>
       </w:r>
     </w:p>
     <w:p>
@@ -522,43 +749,32 @@
         <w:rPr>
           <w:b/>
           <w:color w:val="555555"/>
-          <w:sz w:val="22"/>
-        </w:rPr>
-        <w:t>LEGENDA DO POST</w:t>
-      </w:r>
-    </w:p>
-    <w:p>
-      <w:r>
-        <w:rPr>
-          <w:i w:val="0"/>
-        </w:rPr>
-        <w:t>A resposta: DISSECÇÃO AGUDA DE AORTA. 🩸</w:t>
-      </w:r>
-    </w:p>
-    <w:p/>
-    <w:p>
-      <w:r>
-        <w:rPr>
-          <w:i w:val="0"/>
-        </w:rPr>
-        <w:t>O ECG limpo jogou todo mundo pra longe. O detalhe estava nas mãos: pulso diferente entre os braços + mediastino alargado no raio-X.</w:t>
-      </w:r>
-    </w:p>
-    <w:p/>
-    <w:p>
-      <w:r>
-        <w:rPr>
-          <w:i w:val="0"/>
-        </w:rPr>
-        <w:t>Você tinha pegado o pulso, Interno? Comenta com honestidade. 👇</w:t>
-      </w:r>
-    </w:p>
-    <w:p>
-      <w:r>
-        <w:rPr>
-          <w:i w:val="0"/>
-        </w:rPr>
-        <w:t>#pendurajaleco #medicina #casoclinico #plantao #internato #residenciamedica #estudantedemedicina #emergencia</w:t>
+        </w:rPr>
+        <w:t>ENCERRAMENTO (tela preta — sempre igual)</w:t>
+      </w:r>
+    </w:p>
+    <w:p>
+      <w:pPr>
+        <w:jc w:val="center"/>
+      </w:pPr>
+      <w:r>
+        <w:rPr>
+          <w:b/>
+          <w:color w:val="5B21B6"/>
+        </w:rPr>
+        <w:t>"Terça que vem, novo plantão."</w:t>
+      </w:r>
+    </w:p>
+    <w:p>
+      <w:pPr>
+        <w:jc w:val="center"/>
+      </w:pPr>
+      <w:r>
+        <w:rPr>
+          <w:b/>
+          <w:color w:val="5B21B6"/>
+        </w:rPr>
+        <w:t>TERÇA-FEIRA · 20H</w:t>
       </w:r>
     </w:p>
     <w:p>
@@ -566,9 +782,8 @@
         <w:rPr>
           <w:b/>
           <w:color w:val="555555"/>
-          <w:sz w:val="22"/>
-        </w:rPr>
-        <w:t>COMENTÁRIO FIXADO (postar você mesmo e fixar)</w:t>
+        </w:rPr>
+        <w:t>LEGENDA DO POST (padrão da série)</w:t>
       </w:r>
     </w:p>
     <w:p>
@@ -576,7 +791,7 @@
         <w:rPr>
           <w:i w:val="0"/>
         </w:rPr>
-        <w:t>Tríade que você não esquece mais: dor que vai pras costas + assimetria de pulso + mediastino alargado. ✅</w:t>
+        <w:t>🚨 CASO #001 — RESPOSTA</w:t>
       </w:r>
     </w:p>
     <w:p>
@@ -584,7 +799,63 @@
         <w:rPr>
           <w:i w:val="0"/>
         </w:rPr>
-        <w:t>Salva esse post pro seu próximo plantão. Quinta tem caso novo. 🚨</w:t>
+        <w:t>DISSECÇÃO AGUDA DE AORTA</w:t>
+      </w:r>
+    </w:p>
+    <w:p>
+      <w:r>
+        <w:rPr>
+          <w:i w:val="0"/>
+        </w:rPr>
+        <w:t>O ECG limpo parou muita gente. O que mudou o rumo foi palpar os pulsos: assimetria + mediastino alargado.</w:t>
+      </w:r>
+    </w:p>
+    <w:p>
+      <w:r>
+        <w:rPr>
+          <w:i w:val="0"/>
+        </w:rPr>
+        <w:t>Você tinha pego o pulso? 👇</w:t>
+      </w:r>
+    </w:p>
+    <w:p>
+      <w:r>
+        <w:rPr>
+          <w:i w:val="0"/>
+        </w:rPr>
+        <w:t>Salva pro seu próximo plantão.</w:t>
+      </w:r>
+    </w:p>
+    <w:p>
+      <w:r>
+        <w:rPr>
+          <w:i w:val="0"/>
+        </w:rPr>
+      </w:r>
+    </w:p>
+    <w:p>
+      <w:r>
+        <w:rPr>
+          <w:i w:val="0"/>
+        </w:rPr>
+        <w:t>#pendurajaleco #medicina #casoclinico #plantao #internato #residenciamedica #estudantedemedicina #emergencia</w:t>
+      </w:r>
+    </w:p>
+    <w:p>
+      <w:r>
+        <w:rPr>
+          <w:b/>
+          <w:color w:val="555555"/>
+        </w:rPr>
+        <w:t>COMENTÁRIO FIXADO (você posta e fixa)</w:t>
+      </w:r>
+    </w:p>
+    <w:p>
+      <w:r>
+        <w:rPr>
+          <w:i w:val="0"/>
+        </w:rPr>
+        <w:t>Guarda a tríade: dor pras costas + assimetria de pulso + mediastino alargado. ✅ Salva e leva pro plantão. 🚨</w:t>
       </w:r>
     </w:p>
     <w:p>
@@ -599,7 +870,7 @@
           <w:color w:val="5B21B6"/>
           <w:sz w:val="40"/>
         </w:rPr>
-        <w:t>EPISÓDIO 02 — "Ela Não Para Quieta"</w:t>
+        <w:t>CASO #002 — "Ela Não Para Quieta"</w:t>
       </w:r>
     </w:p>
     <w:p>
@@ -637,9 +908,8 @@
         <w:rPr>
           <w:b/>
           <w:color w:val="555555"/>
-          <w:sz w:val="22"/>
-        </w:rPr>
-        <w:t>MINI-CAPA (0,5s)</w:t>
+        </w:rPr>
+        <w:t>CAPA</w:t>
       </w:r>
     </w:p>
     <w:p>
@@ -652,7 +922,7 @@
           <w:color w:val="555555"/>
           <w:sz w:val="20"/>
         </w:rPr>
-        <w:t>TEMPORADA 01</w:t>
+        <w:t>🚨</w:t>
       </w:r>
     </w:p>
     <w:p>
@@ -662,10 +932,10 @@
       <w:r>
         <w:rPr>
           <w:b/>
-          <w:color w:val="555555"/>
-          <w:sz w:val="20"/>
-        </w:rPr>
-        <w:t>EPISÓDIO 02 · PARTE 1 — O CASO</w:t>
+          <w:color w:val="5B21B6"/>
+          <w:sz w:val="28"/>
+        </w:rPr>
+        <w:t>SEU PLANTÃO COMEÇOU</w:t>
       </w:r>
     </w:p>
     <w:p>
@@ -675,154 +945,10 @@
       <w:r>
         <w:rPr>
           <w:b/>
-          <w:color w:val="5B21B6"/>
-          <w:sz w:val="26"/>
-        </w:rPr>
-        <w:t>ELA NÃO PARA QUIETA</w:t>
-      </w:r>
-    </w:p>
-    <w:p>
-      <w:r>
-        <w:rPr>
-          <w:b/>
           <w:color w:val="555555"/>
-          <w:sz w:val="22"/>
-        </w:rPr>
-        <w:t>ROTEIRO (falado, máx. 60s)</w:t>
-      </w:r>
-    </w:p>
-    <w:p>
-      <w:r>
-        <w:rPr>
-          <w:i w:val="0"/>
-        </w:rPr>
-        <w:t>Interno. Seu plantão começou. Esse paciente é seu.</w:t>
-      </w:r>
-    </w:p>
-    <w:p>
-      <w:r>
-        <w:rPr>
-          <w:i w:val="0"/>
-        </w:rPr>
-        <w:t>Mulher, 38 anos. Hipertensa. Chega muito agitada, não consegue ficar quieta na maca. Calafrios, diarreia e febre.</w:t>
-      </w:r>
-    </w:p>
-    <w:p>
-      <w:r>
-        <w:rPr>
-          <w:i w:val="0"/>
-        </w:rPr>
-        <w:t>O que você quer saber primeiro? (pausa 1s)</w:t>
-      </w:r>
-    </w:p>
-    <w:p>
-      <w:r>
-        <w:rPr>
-          <w:i w:val="0"/>
-        </w:rPr>
-        <w:t>Temperatura: 38,2. Taquicárdica. Pressão 18 por 10. Coração regular, pulmão limpo, abdome sem nada demais.</w:t>
-      </w:r>
-    </w:p>
-    <w:p>
-      <w:r>
-        <w:rPr>
-          <w:i w:val="0"/>
-        </w:rPr>
-        <w:t>Você pensa infecção. Pede o pacote. Urina: limpa. Raio-X de tórax: normal. Hemograma: sem nada de infeccioso.</w:t>
-      </w:r>
-    </w:p>
-    <w:p>
-      <w:r>
-        <w:rPr>
-          <w:i w:val="0"/>
-        </w:rPr>
-        <w:t>Reparou? Febre, calafrio, taquicardia... e nenhum foco de infecção. O corpo dela tá gritando. Só que não é infecção.</w:t>
-      </w:r>
-    </w:p>
-    <w:p>
-      <w:r>
-        <w:rPr>
-          <w:i w:val="0"/>
-        </w:rPr>
-        <w:t>Tem um detalhe no rosto e no peso que entrega tudo. Interno... o que você examinaria agora? Comenta. Amanhã eu te mostro o que quase todo mundo deixou passar. Seu plantão não acabou.</w:t>
-      </w:r>
-    </w:p>
-    <w:p>
-      <w:r>
-        <w:rPr>
-          <w:b/>
-          <w:color w:val="555555"/>
-          <w:sz w:val="22"/>
-        </w:rPr>
-        <w:t>LEGENDA DO POST</w:t>
-      </w:r>
-    </w:p>
-    <w:p>
-      <w:r>
-        <w:rPr>
-          <w:i w:val="0"/>
-        </w:rPr>
-        <w:t>Febre + calafrio + taquicardia… e os exames de infecção voltam TODOS limpos. 🤔</w:t>
-      </w:r>
-    </w:p>
-    <w:p/>
-    <w:p>
-      <w:r>
-        <w:rPr>
-          <w:i w:val="0"/>
-        </w:rPr>
-        <w:t>Mulher de 38 anos, agitada, não para quieta. O corpo dela está gritando — mas não é infecção. A pista está no rosto e no peso.</w:t>
-      </w:r>
-    </w:p>
-    <w:p/>
-    <w:p>
-      <w:r>
-        <w:rPr>
-          <w:i w:val="0"/>
-        </w:rPr>
-        <w:t>Interno, o que você examinaria agora? 👇</w:t>
-      </w:r>
-    </w:p>
-    <w:p>
-      <w:r>
-        <w:rPr>
-          <w:i w:val="0"/>
-        </w:rPr>
-        <w:t>Amanhã eu revelo. 🚨</w:t>
-      </w:r>
-    </w:p>
-    <w:p>
-      <w:r>
-        <w:rPr>
-          <w:i w:val="0"/>
-        </w:rPr>
-        <w:t>#pendurajaleco #medicina #casoclinico #plantao #internato #residenciamedica #estudantedemedicina #emergencia</w:t>
-      </w:r>
-    </w:p>
-    <w:p>
-      <w:r>
-        <w:rPr>
-          <w:b/>
-          <w:color w:val="555555"/>
-          <w:sz w:val="22"/>
-        </w:rPr>
-        <w:t>COMENTÁRIO FIXADO (postar você mesmo e fixar)</w:t>
-      </w:r>
-    </w:p>
-    <w:p>
-      <w:r>
-        <w:rPr>
-          <w:i w:val="0"/>
-        </w:rPr>
-        <w:t>Pega a deixa: febre SEM foco nem sempre é infecção. 🧠</w:t>
-      </w:r>
-    </w:p>
-    <w:p>
-      <w:r>
-        <w:rPr>
-          <w:i w:val="0"/>
-        </w:rPr>
-        <w:t>Qual sua hipótese? Comenta antes de eu revelar — quem cravar ganha o respeito da galera. 👇</w:t>
+          <w:sz w:val="20"/>
+        </w:rPr>
+        <w:t>TEMPORADA 01</w:t>
       </w:r>
     </w:p>
     <w:p>
@@ -831,6 +957,227 @@
       </w:pPr>
       <w:r>
         <w:rPr>
+          <w:b/>
+          <w:color w:val="555555"/>
+          <w:sz w:val="20"/>
+        </w:rPr>
+        <w:t>EP.02</w:t>
+      </w:r>
+    </w:p>
+    <w:p>
+      <w:pPr>
+        <w:jc w:val="center"/>
+      </w:pPr>
+      <w:r>
+        <w:rPr>
+          <w:b/>
+          <w:color w:val="5B21B6"/>
+          <w:sz w:val="26"/>
+        </w:rPr>
+        <w:t>ELA NÃO PARA QUIETA</w:t>
+      </w:r>
+    </w:p>
+    <w:p>
+      <w:r>
+        <w:rPr>
+          <w:b/>
+          <w:color w:val="555555"/>
+        </w:rPr>
+        <w:t>ROTEIRO (falado, máx. 60s)</w:t>
+      </w:r>
+    </w:p>
+    <w:p>
+      <w:r>
+        <w:rPr>
+          <w:i w:val="0"/>
+        </w:rPr>
+        <w:t>Interno. Seu plantão começou. Esse paciente é seu.</w:t>
+      </w:r>
+    </w:p>
+    <w:p>
+      <w:r>
+        <w:rPr>
+          <w:i w:val="0"/>
+        </w:rPr>
+        <w:t>Mulher, 38 anos. Hipertensa. Chega muito agitada, não consegue ficar quieta na maca. Calafrios, diarreia e febre.</w:t>
+      </w:r>
+    </w:p>
+    <w:p>
+      <w:r>
+        <w:rPr>
+          <w:i w:val="0"/>
+        </w:rPr>
+        <w:t>O que você quer saber primeiro? (pausa 1s)</w:t>
+      </w:r>
+    </w:p>
+    <w:p>
+      <w:r>
+        <w:rPr>
+          <w:i w:val="0"/>
+        </w:rPr>
+        <w:t>Temperatura: 38,2. Taquicárdica. Pressão 18 por 10. Coração regular, pulmão limpo, abdome sem nada demais.</w:t>
+      </w:r>
+    </w:p>
+    <w:p>
+      <w:r>
+        <w:rPr>
+          <w:i w:val="0"/>
+        </w:rPr>
+        <w:t>Você pensa infecção — e faz certo em pensar. Pede o pacote. Urina: limpa. Raio-X de tórax: normal. Hemograma: sem nada de infeccioso.</w:t>
+      </w:r>
+    </w:p>
+    <w:p>
+      <w:r>
+        <w:rPr>
+          <w:i w:val="0"/>
+        </w:rPr>
+        <w:t>Febre, calafrio, taquicardia... e nenhum foco. O corpo dela está gritando outra coisa.</w:t>
+      </w:r>
+    </w:p>
+    <w:p>
+      <w:r>
+        <w:rPr>
+          <w:i w:val="0"/>
+        </w:rPr>
+        <w:t>Tem um detalhe no rosto e no peso que muda completamente o rumo desse caso. Interno... o que você examinaria agora? Comenta.</w:t>
+      </w:r>
+    </w:p>
+    <w:p>
+      <w:r>
+        <w:rPr>
+          <w:b/>
+          <w:color w:val="555555"/>
+        </w:rPr>
+        <w:t>ENCERRAMENTO (tela preta — sempre igual)</w:t>
+      </w:r>
+    </w:p>
+    <w:p>
+      <w:pPr>
+        <w:jc w:val="center"/>
+      </w:pPr>
+      <w:r>
+        <w:rPr>
+          <w:b/>
+          <w:color w:val="5B21B6"/>
+        </w:rPr>
+        <w:t>"Seu plantão não acabou."</w:t>
+      </w:r>
+    </w:p>
+    <w:p>
+      <w:pPr>
+        <w:jc w:val="center"/>
+      </w:pPr>
+      <w:r>
+        <w:rPr>
+          <w:b/>
+          <w:color w:val="5B21B6"/>
+        </w:rPr>
+        <w:t>QUINTA-FEIRA · 20H</w:t>
+      </w:r>
+    </w:p>
+    <w:p>
+      <w:r>
+        <w:rPr>
+          <w:b/>
+          <w:color w:val="555555"/>
+        </w:rPr>
+        <w:t>LEGENDA DO POST (padrão da série)</w:t>
+      </w:r>
+    </w:p>
+    <w:p>
+      <w:r>
+        <w:rPr>
+          <w:i w:val="0"/>
+        </w:rPr>
+        <w:t>🚨 CASO #002</w:t>
+      </w:r>
+    </w:p>
+    <w:p>
+      <w:r>
+        <w:rPr>
+          <w:i w:val="0"/>
+        </w:rPr>
+        <w:t>Você assumiria esse caso?</w:t>
+      </w:r>
+    </w:p>
+    <w:p>
+      <w:r>
+        <w:rPr>
+          <w:i w:val="0"/>
+        </w:rPr>
+        <w:t>Mulher, 38 anos.</w:t>
+      </w:r>
+    </w:p>
+    <w:p>
+      <w:r>
+        <w:rPr>
+          <w:i w:val="0"/>
+        </w:rPr>
+        <w:t>Febre, calafrio e taquicardia.</w:t>
+      </w:r>
+    </w:p>
+    <w:p>
+      <w:r>
+        <w:rPr>
+          <w:i w:val="0"/>
+        </w:rPr>
+        <w:t>Exames de infecção limpos.</w:t>
+      </w:r>
+    </w:p>
+    <w:p>
+      <w:r>
+        <w:rPr>
+          <w:i w:val="0"/>
+        </w:rPr>
+        <w:t>Qual é o próximo passo?</w:t>
+      </w:r>
+    </w:p>
+    <w:p>
+      <w:r>
+        <w:rPr>
+          <w:i w:val="0"/>
+        </w:rPr>
+        <w:t>👇 Quero ler sua conduta antes da resposta de quinta.</w:t>
+      </w:r>
+    </w:p>
+    <w:p>
+      <w:r>
+        <w:rPr>
+          <w:i w:val="0"/>
+        </w:rPr>
+      </w:r>
+    </w:p>
+    <w:p>
+      <w:r>
+        <w:rPr>
+          <w:i w:val="0"/>
+        </w:rPr>
+        <w:t>#pendurajaleco #medicina #casoclinico #plantao #internato #residenciamedica #estudantedemedicina #emergencia</w:t>
+      </w:r>
+    </w:p>
+    <w:p>
+      <w:r>
+        <w:rPr>
+          <w:b/>
+          <w:color w:val="555555"/>
+        </w:rPr>
+        <w:t>COMENTÁRIO FIXADO (você posta e fixa)</w:t>
+      </w:r>
+    </w:p>
+    <w:p>
+      <w:r>
+        <w:rPr>
+          <w:i w:val="0"/>
+        </w:rPr>
+        <w:t>Pista da série: febre sem foco nem sempre é infecção. 🧠 Qual sua hipótese? Comenta antes de quinta. 👇</w:t>
+      </w:r>
+    </w:p>
+    <w:p>
+      <w:pPr>
+        <w:jc w:val="center"/>
+      </w:pPr>
+      <w:r>
+        <w:rPr>
           <w:color w:val="CCCCCC"/>
         </w:rPr>
         <w:t>— — — — — — — — — — — — — — — — — — — —</w:t>
@@ -843,7 +1190,7 @@
           <w:color w:val="5B21B6"/>
           <w:sz w:val="30"/>
         </w:rPr>
-        <w:t>PARTE 2 — QUINTA (A RESPOSTA)</w:t>
+        <w:t>PARTE 2 — QUINTA (A RESPOSTA · debrief de corredor)</w:t>
       </w:r>
     </w:p>
     <w:p>
@@ -851,9 +1198,8 @@
         <w:rPr>
           <w:b/>
           <w:color w:val="555555"/>
-          <w:sz w:val="22"/>
-        </w:rPr>
-        <w:t>MINI-CAPA (0,5s)</w:t>
+        </w:rPr>
+        <w:t>CAPA (mesma, com selo "RESPOSTA" no canto)</w:t>
       </w:r>
     </w:p>
     <w:p>
@@ -866,7 +1212,7 @@
           <w:color w:val="555555"/>
           <w:sz w:val="20"/>
         </w:rPr>
-        <w:t>TEMPORADA 01</w:t>
+        <w:t>🚨</w:t>
       </w:r>
     </w:p>
     <w:p>
@@ -876,10 +1222,10 @@
       <w:r>
         <w:rPr>
           <w:b/>
-          <w:color w:val="555555"/>
-          <w:sz w:val="20"/>
-        </w:rPr>
-        <w:t>EPISÓDIO 02 · PARTE 2 — A RESPOSTA</w:t>
+          <w:color w:val="5B21B6"/>
+          <w:sz w:val="28"/>
+        </w:rPr>
+        <w:t>SEU PLANTÃO COMEÇOU</w:t>
       </w:r>
     </w:p>
     <w:p>
@@ -889,6 +1235,32 @@
       <w:r>
         <w:rPr>
           <w:b/>
+          <w:color w:val="555555"/>
+          <w:sz w:val="20"/>
+        </w:rPr>
+        <w:t>TEMPORADA 01</w:t>
+      </w:r>
+    </w:p>
+    <w:p>
+      <w:pPr>
+        <w:jc w:val="center"/>
+      </w:pPr>
+      <w:r>
+        <w:rPr>
+          <w:b/>
+          <w:color w:val="555555"/>
+          <w:sz w:val="20"/>
+        </w:rPr>
+        <w:t>EP.02 · RESPOSTA</w:t>
+      </w:r>
+    </w:p>
+    <w:p>
+      <w:pPr>
+        <w:jc w:val="center"/>
+      </w:pPr>
+      <w:r>
+        <w:rPr>
+          <w:b/>
           <w:color w:val="5B21B6"/>
           <w:sz w:val="26"/>
         </w:rPr>
@@ -900,7 +1272,6 @@
         <w:rPr>
           <w:b/>
           <w:color w:val="555555"/>
-          <w:sz w:val="22"/>
         </w:rPr>
         <w:t>ROTEIRO (falado, máx. 60s)</w:t>
       </w:r>
@@ -910,7 +1281,7 @@
         <w:rPr>
           <w:i w:val="0"/>
         </w:rPr>
-        <w:t>Interno. Ontem: mulher de 38 anos, febre, calafrio, taquicardia... e exames de infecção todos limpos. Muita gente comentou sepse. Foi atrás de um foco que não existia.</w:t>
+        <w:t>Interno. Sobre o plantão de terça.</w:t>
       </w:r>
     </w:p>
     <w:p>
@@ -918,7 +1289,7 @@
         <w:rPr>
           <w:i w:val="0"/>
         </w:rPr>
-        <w:t>O detalhe tava no rosto.</w:t>
+        <w:t>"Vi muita gente fechando sepse e caçando um foco." (pausa) "Mas o foco não existia." (pausa) "A pista estava no rosto."</w:t>
       </w:r>
     </w:p>
     <w:p>
@@ -926,7 +1297,7 @@
         <w:rPr>
           <w:i w:val="0"/>
         </w:rPr>
-        <w:t>Olhos saltados — exoftalmia. E emagrecida. Aí você pede a tireoide: TSH lá embaixo. T4 lá no alto.</w:t>
+        <w:t>Olhos saltados, exoftalmia. E emagrecida. Pede a tireoide: TSH baixo, T4 alto.</w:t>
       </w:r>
     </w:p>
     <w:p>
@@ -934,7 +1305,7 @@
         <w:rPr>
           <w:i w:val="0"/>
         </w:rPr>
-        <w:t>Isso é crise tireotóxica. Agitação, febre, taquicardia e diarreia que parecem infecção — mas é a tireoide a mil.</w:t>
+        <w:t>É crise tireotóxica. Agitação, febre, taquicardia e diarreia que imitam infecção — mas é a tireoide a mil.</w:t>
       </w:r>
     </w:p>
     <w:p>
@@ -942,7 +1313,7 @@
         <w:rPr>
           <w:i w:val="0"/>
         </w:rPr>
-        <w:t>A lição não é decorar tireotoxicose. É: febre sem foco não é sempre infecção. Olha o paciente inteiro antes de fechar.</w:t>
+        <w:t>A lição não é decorar tireotoxicose. É que febre sem foco te obriga a olhar o paciente inteiro antes de fechar.</w:t>
       </w:r>
     </w:p>
     <w:p>
@@ -950,7 +1321,7 @@
         <w:rPr>
           <w:i w:val="0"/>
         </w:rPr>
-        <w:t>Interno... você tinha olhado pros olhos dela? Comenta. Semana que vem tem caso novo.</w:t>
+        <w:t>Interno... você tinha olhado pros olhos dela? Comenta.</w:t>
       </w:r>
     </w:p>
     <w:p>
@@ -958,43 +1329,32 @@
         <w:rPr>
           <w:b/>
           <w:color w:val="555555"/>
-          <w:sz w:val="22"/>
-        </w:rPr>
-        <w:t>LEGENDA DO POST</w:t>
-      </w:r>
-    </w:p>
-    <w:p>
-      <w:r>
-        <w:rPr>
-          <w:i w:val="0"/>
-        </w:rPr>
-        <w:t>A resposta: CRISE TIREOTÓXICA. 🦋</w:t>
-      </w:r>
-    </w:p>
-    <w:p/>
-    <w:p>
-      <w:r>
-        <w:rPr>
-          <w:i w:val="0"/>
-        </w:rPr>
-        <w:t>Parecia sepse, mas o foco não existia. O detalhe estava no rosto: exoftalmia + emagrecimento → TSH baixo, T4 alto.</w:t>
-      </w:r>
-    </w:p>
-    <w:p/>
-    <w:p>
-      <w:r>
-        <w:rPr>
-          <w:i w:val="0"/>
-        </w:rPr>
-        <w:t>Você tinha olhado pros olhos dela, Interno? 👇</w:t>
-      </w:r>
-    </w:p>
-    <w:p>
-      <w:r>
-        <w:rPr>
-          <w:i w:val="0"/>
-        </w:rPr>
-        <w:t>#pendurajaleco #medicina #casoclinico #plantao #internato #residenciamedica #estudantedemedicina #emergencia</w:t>
+        </w:rPr>
+        <w:t>ENCERRAMENTO (tela preta — sempre igual)</w:t>
+      </w:r>
+    </w:p>
+    <w:p>
+      <w:pPr>
+        <w:jc w:val="center"/>
+      </w:pPr>
+      <w:r>
+        <w:rPr>
+          <w:b/>
+          <w:color w:val="5B21B6"/>
+        </w:rPr>
+        <w:t>"Terça que vem, novo plantão."</w:t>
+      </w:r>
+    </w:p>
+    <w:p>
+      <w:pPr>
+        <w:jc w:val="center"/>
+      </w:pPr>
+      <w:r>
+        <w:rPr>
+          <w:b/>
+          <w:color w:val="5B21B6"/>
+        </w:rPr>
+        <w:t>TERÇA-FEIRA · 20H</w:t>
       </w:r>
     </w:p>
     <w:p>
@@ -1002,9 +1362,8 @@
         <w:rPr>
           <w:b/>
           <w:color w:val="555555"/>
-          <w:sz w:val="22"/>
-        </w:rPr>
-        <w:t>COMENTÁRIO FIXADO (postar você mesmo e fixar)</w:t>
+        </w:rPr>
+        <w:t>LEGENDA DO POST (padrão da série)</w:t>
       </w:r>
     </w:p>
     <w:p>
@@ -1012,7 +1371,7 @@
         <w:rPr>
           <w:i w:val="0"/>
         </w:rPr>
-        <w:t>Lembrete que salva plantão: febre + taquicardia + agitação + diarreia + olho saltado = pensa TIREOIDE. ✅</w:t>
+        <w:t>🚨 CASO #002 — RESPOSTA</w:t>
       </w:r>
     </w:p>
     <w:p>
@@ -1020,7 +1379,63 @@
         <w:rPr>
           <w:i w:val="0"/>
         </w:rPr>
-        <w:t>Salva o post. Semana que vem tem caso novo. 🚨</w:t>
+        <w:t>CRISE TIREOTÓXICA</w:t>
+      </w:r>
+    </w:p>
+    <w:p>
+      <w:r>
+        <w:rPr>
+          <w:i w:val="0"/>
+        </w:rPr>
+        <w:t>O foco infeccioso não existia. A pista estava no rosto: exoftalmia + emagrecimento → TSH baixo, T4 alto.</w:t>
+      </w:r>
+    </w:p>
+    <w:p>
+      <w:r>
+        <w:rPr>
+          <w:i w:val="0"/>
+        </w:rPr>
+        <w:t>Você tinha olhado pros olhos dela? 👇</w:t>
+      </w:r>
+    </w:p>
+    <w:p>
+      <w:r>
+        <w:rPr>
+          <w:i w:val="0"/>
+        </w:rPr>
+        <w:t>Salva pro seu próximo plantão.</w:t>
+      </w:r>
+    </w:p>
+    <w:p>
+      <w:r>
+        <w:rPr>
+          <w:i w:val="0"/>
+        </w:rPr>
+      </w:r>
+    </w:p>
+    <w:p>
+      <w:r>
+        <w:rPr>
+          <w:i w:val="0"/>
+        </w:rPr>
+        <w:t>#pendurajaleco #medicina #casoclinico #plantao #internato #residenciamedica #estudantedemedicina #emergencia</w:t>
+      </w:r>
+    </w:p>
+    <w:p>
+      <w:r>
+        <w:rPr>
+          <w:b/>
+          <w:color w:val="555555"/>
+        </w:rPr>
+        <w:t>COMENTÁRIO FIXADO (você posta e fixa)</w:t>
+      </w:r>
+    </w:p>
+    <w:p>
+      <w:r>
+        <w:rPr>
+          <w:i w:val="0"/>
+        </w:rPr>
+        <w:t>Guarda o combo: febre + taquicardia + agitação + diarreia + olho saltado = pensa TIREOIDE. ✅ Salva e leva pro plantão. 🚨</w:t>
       </w:r>
     </w:p>
     <w:p>
@@ -1035,7 +1450,7 @@
           <w:color w:val="5B21B6"/>
           <w:sz w:val="40"/>
         </w:rPr>
-        <w:t>EPISÓDIO 03 — "É Só Ansiedade"</w:t>
+        <w:t>CASO #003 — "É Só Ansiedade"</w:t>
       </w:r>
     </w:p>
     <w:p>
@@ -1073,9 +1488,8 @@
         <w:rPr>
           <w:b/>
           <w:color w:val="555555"/>
-          <w:sz w:val="22"/>
-        </w:rPr>
-        <w:t>MINI-CAPA (0,5s)</w:t>
+        </w:rPr>
+        <w:t>CAPA</w:t>
       </w:r>
     </w:p>
     <w:p>
@@ -1088,7 +1502,7 @@
           <w:color w:val="555555"/>
           <w:sz w:val="20"/>
         </w:rPr>
-        <w:t>TEMPORADA 01</w:t>
+        <w:t>🚨</w:t>
       </w:r>
     </w:p>
     <w:p>
@@ -1098,10 +1512,10 @@
       <w:r>
         <w:rPr>
           <w:b/>
-          <w:color w:val="555555"/>
-          <w:sz w:val="20"/>
-        </w:rPr>
-        <w:t>EPISÓDIO 03 · PARTE 1 — O CASO</w:t>
+          <w:color w:val="5B21B6"/>
+          <w:sz w:val="28"/>
+        </w:rPr>
+        <w:t>SEU PLANTÃO COMEÇOU</w:t>
       </w:r>
     </w:p>
     <w:p>
@@ -1111,154 +1525,10 @@
       <w:r>
         <w:rPr>
           <w:b/>
-          <w:color w:val="5B21B6"/>
-          <w:sz w:val="26"/>
-        </w:rPr>
-        <w:t>É SÓ ANSIEDADE</w:t>
-      </w:r>
-    </w:p>
-    <w:p>
-      <w:r>
-        <w:rPr>
-          <w:b/>
           <w:color w:val="555555"/>
-          <w:sz w:val="22"/>
-        </w:rPr>
-        <w:t>ROTEIRO (falado, máx. 60s)</w:t>
-      </w:r>
-    </w:p>
-    <w:p>
-      <w:r>
-        <w:rPr>
-          <w:i w:val="0"/>
-        </w:rPr>
-        <w:t>Interno. Seu plantão começou. Esse paciente é seu.</w:t>
-      </w:r>
-    </w:p>
-    <w:p>
-      <w:r>
-        <w:rPr>
-          <w:i w:val="0"/>
-        </w:rPr>
-        <w:t>Rapaz, 18 anos. Começou a trabalhar agora. Foi diagnosticado com burnout, crises de ansiedade. Já toma ansiolítico e antidepressivo. E é a oitava vez que volta no pronto-socorro.</w:t>
-      </w:r>
-    </w:p>
-    <w:p>
-      <w:r>
-        <w:rPr>
-          <w:i w:val="0"/>
-        </w:rPr>
-        <w:t>O que você quer saber primeiro? (pausa 1s)</w:t>
-      </w:r>
-    </w:p>
-    <w:p>
-      <w:r>
-        <w:rPr>
-          <w:i w:val="0"/>
-        </w:rPr>
-        <w:t>Pressão: 20 por 16. Altíssima. Já em dois anti-hipertensivos — e não cede. Taquicardia. Dor de cabeça forte. Palpitação e suor todo dia... mas em crises. Tem hora que tá bem, tem hora que dispara.</w:t>
-      </w:r>
-    </w:p>
-    <w:p>
-      <w:r>
-        <w:rPr>
-          <w:i w:val="0"/>
-        </w:rPr>
-        <w:t>Reparou? 18 anos. Pressão que não baixa com dois remédios. Isso não é ansiedade.</w:t>
-      </w:r>
-    </w:p>
-    <w:p>
-      <w:r>
-        <w:rPr>
-          <w:i w:val="0"/>
-        </w:rPr>
-        <w:t>Tem um padrão nas crises que entrega o diagnóstico. A psiquiatria não viu. Sete plantonistas não viram.</w:t>
-      </w:r>
-    </w:p>
-    <w:p>
-      <w:r>
-        <w:rPr>
-          <w:i w:val="0"/>
-        </w:rPr>
-        <w:t>Interno... o que você pensaria num jovem com pressão assim? Comenta. Amanhã eu te mostro o que carimbaram errado oito vezes. Seu plantão não acabou.</w:t>
-      </w:r>
-    </w:p>
-    <w:p>
-      <w:r>
-        <w:rPr>
-          <w:b/>
-          <w:color w:val="555555"/>
-          <w:sz w:val="22"/>
-        </w:rPr>
-        <w:t>LEGENDA DO POST</w:t>
-      </w:r>
-    </w:p>
-    <w:p>
-      <w:r>
-        <w:rPr>
-          <w:i w:val="0"/>
-        </w:rPr>
-        <w:t>Carimbado de "ansiedade" 8 vezes. Já medicado. E não melhora. 😶‍🌫️</w:t>
-      </w:r>
-    </w:p>
-    <w:p/>
-    <w:p>
-      <w:r>
-        <w:rPr>
-          <w:i w:val="0"/>
-        </w:rPr>
-        <w:t>Rapaz de 18 anos, pressão 20x16 que não cede a dois remédios, crises de palpitação e suor que vão e voltam. Sete plantonistas não viram. Você vai ver?</w:t>
-      </w:r>
-    </w:p>
-    <w:p/>
-    <w:p>
-      <w:r>
-        <w:rPr>
-          <w:i w:val="0"/>
-        </w:rPr>
-        <w:t>Interno, o que você pensaria num jovem com pressão assim? 👇</w:t>
-      </w:r>
-    </w:p>
-    <w:p>
-      <w:r>
-        <w:rPr>
-          <w:i w:val="0"/>
-        </w:rPr>
-        <w:t>Amanhã eu revelo. 🚨</w:t>
-      </w:r>
-    </w:p>
-    <w:p>
-      <w:r>
-        <w:rPr>
-          <w:i w:val="0"/>
-        </w:rPr>
-        <w:t>#pendurajaleco #medicina #casoclinico #plantao #internato #residenciamedica #estudantedemedicina #emergencia</w:t>
-      </w:r>
-    </w:p>
-    <w:p>
-      <w:r>
-        <w:rPr>
-          <w:b/>
-          <w:color w:val="555555"/>
-          <w:sz w:val="22"/>
-        </w:rPr>
-        <w:t>COMENTÁRIO FIXADO (postar você mesmo e fixar)</w:t>
-      </w:r>
-    </w:p>
-    <w:p>
-      <w:r>
-        <w:rPr>
-          <w:i w:val="0"/>
-        </w:rPr>
-        <w:t>Jovem + hipertensão grave que não cede = NUNCA é só ansiedade. 🧠</w:t>
-      </w:r>
-    </w:p>
-    <w:p>
-      <w:r>
-        <w:rPr>
-          <w:i w:val="0"/>
-        </w:rPr>
-        <w:t>Comenta sua hipótese antes da revelação. Vamos ver quem pega o padrão. 👇</w:t>
+          <w:sz w:val="20"/>
+        </w:rPr>
+        <w:t>TEMPORADA 01</w:t>
       </w:r>
     </w:p>
     <w:p>
@@ -1267,6 +1537,219 @@
       </w:pPr>
       <w:r>
         <w:rPr>
+          <w:b/>
+          <w:color w:val="555555"/>
+          <w:sz w:val="20"/>
+        </w:rPr>
+        <w:t>EP.03</w:t>
+      </w:r>
+    </w:p>
+    <w:p>
+      <w:pPr>
+        <w:jc w:val="center"/>
+      </w:pPr>
+      <w:r>
+        <w:rPr>
+          <w:b/>
+          <w:color w:val="5B21B6"/>
+          <w:sz w:val="26"/>
+        </w:rPr>
+        <w:t>É SÓ ANSIEDADE</w:t>
+      </w:r>
+    </w:p>
+    <w:p>
+      <w:r>
+        <w:rPr>
+          <w:b/>
+          <w:color w:val="555555"/>
+        </w:rPr>
+        <w:t>ROTEIRO (falado, máx. 60s)</w:t>
+      </w:r>
+    </w:p>
+    <w:p>
+      <w:r>
+        <w:rPr>
+          <w:i w:val="0"/>
+        </w:rPr>
+        <w:t>Interno. Seu plantão começou. Esse paciente é seu.</w:t>
+      </w:r>
+    </w:p>
+    <w:p>
+      <w:r>
+        <w:rPr>
+          <w:i w:val="0"/>
+        </w:rPr>
+        <w:t>Rapaz, 18 anos. Começou a trabalhar agora. Diagnóstico de burnout, crises de ansiedade. Já toma ansiolítico e antidepressivo. É a oitava vez que volta no pronto-socorro.</w:t>
+      </w:r>
+    </w:p>
+    <w:p>
+      <w:r>
+        <w:rPr>
+          <w:i w:val="0"/>
+        </w:rPr>
+        <w:t>O que você quer saber primeiro? (pausa 1s)</w:t>
+      </w:r>
+    </w:p>
+    <w:p>
+      <w:r>
+        <w:rPr>
+          <w:i w:val="0"/>
+        </w:rPr>
+        <w:t>Pressão: 20 por 16. Já em dois anti-hipertensivos — e não cede. Taquicardia. Dor de cabeça forte. Palpitação e suor... em crises. Tem hora que tá bem, tem hora que dispara.</w:t>
+      </w:r>
+    </w:p>
+    <w:p>
+      <w:r>
+        <w:rPr>
+          <w:i w:val="0"/>
+        </w:rPr>
+        <w:t>Num jovem, pressão que não cede a dois remédios não pode parar em "ansiedade".</w:t>
+      </w:r>
+    </w:p>
+    <w:p>
+      <w:r>
+        <w:rPr>
+          <w:i w:val="0"/>
+        </w:rPr>
+        <w:t>Tem um padrão nas crises que muda completamente o rumo desse caso. Interno... o que você pensaria num jovem com pressão assim? Comenta.</w:t>
+      </w:r>
+    </w:p>
+    <w:p>
+      <w:r>
+        <w:rPr>
+          <w:b/>
+          <w:color w:val="555555"/>
+        </w:rPr>
+        <w:t>ENCERRAMENTO (tela preta — sempre igual)</w:t>
+      </w:r>
+    </w:p>
+    <w:p>
+      <w:pPr>
+        <w:jc w:val="center"/>
+      </w:pPr>
+      <w:r>
+        <w:rPr>
+          <w:b/>
+          <w:color w:val="5B21B6"/>
+        </w:rPr>
+        <w:t>"Seu plantão não acabou."</w:t>
+      </w:r>
+    </w:p>
+    <w:p>
+      <w:pPr>
+        <w:jc w:val="center"/>
+      </w:pPr>
+      <w:r>
+        <w:rPr>
+          <w:b/>
+          <w:color w:val="5B21B6"/>
+        </w:rPr>
+        <w:t>QUINTA-FEIRA · 20H</w:t>
+      </w:r>
+    </w:p>
+    <w:p>
+      <w:r>
+        <w:rPr>
+          <w:b/>
+          <w:color w:val="555555"/>
+        </w:rPr>
+        <w:t>LEGENDA DO POST (padrão da série)</w:t>
+      </w:r>
+    </w:p>
+    <w:p>
+      <w:r>
+        <w:rPr>
+          <w:i w:val="0"/>
+        </w:rPr>
+        <w:t>🚨 CASO #003</w:t>
+      </w:r>
+    </w:p>
+    <w:p>
+      <w:r>
+        <w:rPr>
+          <w:i w:val="0"/>
+        </w:rPr>
+        <w:t>Você assumiria esse caso?</w:t>
+      </w:r>
+    </w:p>
+    <w:p>
+      <w:r>
+        <w:rPr>
+          <w:i w:val="0"/>
+        </w:rPr>
+        <w:t>Rapaz, 18 anos.</w:t>
+      </w:r>
+    </w:p>
+    <w:p>
+      <w:r>
+        <w:rPr>
+          <w:i w:val="0"/>
+        </w:rPr>
+        <w:t>Tratado como ansiedade há meses.</w:t>
+      </w:r>
+    </w:p>
+    <w:p>
+      <w:r>
+        <w:rPr>
+          <w:i w:val="0"/>
+        </w:rPr>
+        <w:t>Pressão 20x16 que não cede.</w:t>
+      </w:r>
+    </w:p>
+    <w:p>
+      <w:r>
+        <w:rPr>
+          <w:i w:val="0"/>
+        </w:rPr>
+        <w:t>Qual é o próximo passo?</w:t>
+      </w:r>
+    </w:p>
+    <w:p>
+      <w:r>
+        <w:rPr>
+          <w:i w:val="0"/>
+        </w:rPr>
+        <w:t>👇 Quero ler sua conduta antes da resposta de quinta.</w:t>
+      </w:r>
+    </w:p>
+    <w:p>
+      <w:r>
+        <w:rPr>
+          <w:i w:val="0"/>
+        </w:rPr>
+      </w:r>
+    </w:p>
+    <w:p>
+      <w:r>
+        <w:rPr>
+          <w:i w:val="0"/>
+        </w:rPr>
+        <w:t>#pendurajaleco #medicina #casoclinico #plantao #internato #residenciamedica #estudantedemedicina #emergencia</w:t>
+      </w:r>
+    </w:p>
+    <w:p>
+      <w:r>
+        <w:rPr>
+          <w:b/>
+          <w:color w:val="555555"/>
+        </w:rPr>
+        <w:t>COMENTÁRIO FIXADO (você posta e fixa)</w:t>
+      </w:r>
+    </w:p>
+    <w:p>
+      <w:r>
+        <w:rPr>
+          <w:i w:val="0"/>
+        </w:rPr>
+        <w:t>Jovem + hipertensão grave que não cede ≠ ansiedade. 🧠 Comenta seu próximo passo antes de quinta. 👇</w:t>
+      </w:r>
+    </w:p>
+    <w:p>
+      <w:pPr>
+        <w:jc w:val="center"/>
+      </w:pPr>
+      <w:r>
+        <w:rPr>
           <w:color w:val="CCCCCC"/>
         </w:rPr>
         <w:t>— — — — — — — — — — — — — — — — — — — —</w:t>
@@ -1279,7 +1762,7 @@
           <w:color w:val="5B21B6"/>
           <w:sz w:val="30"/>
         </w:rPr>
-        <w:t>PARTE 2 — QUINTA (A RESPOSTA)</w:t>
+        <w:t>PARTE 2 — QUINTA (A RESPOSTA · debrief de corredor)</w:t>
       </w:r>
     </w:p>
     <w:p>
@@ -1287,9 +1770,8 @@
         <w:rPr>
           <w:b/>
           <w:color w:val="555555"/>
-          <w:sz w:val="22"/>
-        </w:rPr>
-        <w:t>MINI-CAPA (0,5s)</w:t>
+        </w:rPr>
+        <w:t>CAPA (mesma, com selo "RESPOSTA" no canto)</w:t>
       </w:r>
     </w:p>
     <w:p>
@@ -1302,7 +1784,7 @@
           <w:color w:val="555555"/>
           <w:sz w:val="20"/>
         </w:rPr>
-        <w:t>TEMPORADA 01</w:t>
+        <w:t>🚨</w:t>
       </w:r>
     </w:p>
     <w:p>
@@ -1312,10 +1794,10 @@
       <w:r>
         <w:rPr>
           <w:b/>
-          <w:color w:val="555555"/>
-          <w:sz w:val="20"/>
-        </w:rPr>
-        <w:t>EPISÓDIO 03 · PARTE 2 — A RESPOSTA</w:t>
+          <w:color w:val="5B21B6"/>
+          <w:sz w:val="28"/>
+        </w:rPr>
+        <w:t>SEU PLANTÃO COMEÇOU</w:t>
       </w:r>
     </w:p>
     <w:p>
@@ -1325,6 +1807,32 @@
       <w:r>
         <w:rPr>
           <w:b/>
+          <w:color w:val="555555"/>
+          <w:sz w:val="20"/>
+        </w:rPr>
+        <w:t>TEMPORADA 01</w:t>
+      </w:r>
+    </w:p>
+    <w:p>
+      <w:pPr>
+        <w:jc w:val="center"/>
+      </w:pPr>
+      <w:r>
+        <w:rPr>
+          <w:b/>
+          <w:color w:val="555555"/>
+          <w:sz w:val="20"/>
+        </w:rPr>
+        <w:t>EP.03 · RESPOSTA</w:t>
+      </w:r>
+    </w:p>
+    <w:p>
+      <w:pPr>
+        <w:jc w:val="center"/>
+      </w:pPr>
+      <w:r>
+        <w:rPr>
+          <w:b/>
           <w:color w:val="5B21B6"/>
           <w:sz w:val="26"/>
         </w:rPr>
@@ -1336,7 +1844,6 @@
         <w:rPr>
           <w:b/>
           <w:color w:val="555555"/>
-          <w:sz w:val="22"/>
         </w:rPr>
         <w:t>ROTEIRO (falado, máx. 60s)</w:t>
       </w:r>
@@ -1346,7 +1853,7 @@
         <w:rPr>
           <w:i w:val="0"/>
         </w:rPr>
-        <w:t>Interno. Ontem: rapaz de 18 anos, "ansiedade e burnout", oito idas ao PS, pressão 20 por 16 que não cede a dois remédios. Muita gente continuou tratando como crise de pânico.</w:t>
+        <w:t>Interno. Sobre o plantão de terça.</w:t>
       </w:r>
     </w:p>
     <w:p>
@@ -1354,7 +1861,7 @@
         <w:rPr>
           <w:i w:val="0"/>
         </w:rPr>
-        <w:t>O padrão tava nas crises.</w:t>
+        <w:t>"Vi muita gente seguindo o carimbo de ansiedade." (pausa) "Mas oito idas ao PS com pressão 20 por 16 pedem outra pergunta." (pausa) "Como vêm as crises?"</w:t>
       </w:r>
     </w:p>
     <w:p>
@@ -1362,7 +1869,7 @@
         <w:rPr>
           <w:i w:val="0"/>
         </w:rPr>
-        <w:t>Dor de cabeça + palpitação + sudorese — juntas, em ondas. Num jovem, com hipertensão que não responde, isso tem nome.</w:t>
+        <w:t>Dor de cabeça, palpitação e sudorese — juntas, em ondas. Num jovem com hipertensão que não responde, isso tem nome.</w:t>
       </w:r>
     </w:p>
     <w:p>
@@ -1370,7 +1877,7 @@
         <w:rPr>
           <w:i w:val="0"/>
         </w:rPr>
-        <w:t>É feocromocitoma. Hipertensão secundária no jovem + a tríade em crises. Clássico. O que parecia ansiedade era adrenalina sendo despejada por um tumor.</w:t>
+        <w:t>É feocromocitoma. O que parecia pânico era adrenalina despejada por um tumor.</w:t>
       </w:r>
     </w:p>
     <w:p>
@@ -1378,7 +1885,7 @@
         <w:rPr>
           <w:i w:val="0"/>
         </w:rPr>
-        <w:t>A lição não é decorar feocromocitoma. É: paciente jovem com hipertensão grave merece investigação, não um carimbo de ansiedade.</w:t>
+        <w:t>A lição não é decorar feocromocitoma. É que hipertensão grave no jovem merece investigação, não um carimbo.</w:t>
       </w:r>
     </w:p>
     <w:p>
@@ -1386,7 +1893,7 @@
         <w:rPr>
           <w:i w:val="0"/>
         </w:rPr>
-        <w:t>Interno... quantas vezes a gente quase carimba antes de pensar? Comenta. Semana que vem tem plantão novo.</w:t>
+        <w:t>Interno... quantas vezes a gente quase carimba antes de pensar? Comenta.</w:t>
       </w:r>
     </w:p>
     <w:p>
@@ -1394,43 +1901,32 @@
         <w:rPr>
           <w:b/>
           <w:color w:val="555555"/>
-          <w:sz w:val="22"/>
-        </w:rPr>
-        <w:t>LEGENDA DO POST</w:t>
-      </w:r>
-    </w:p>
-    <w:p>
-      <w:r>
-        <w:rPr>
-          <w:i w:val="0"/>
-        </w:rPr>
-        <w:t>A resposta: FEOCROMOCITOMA. ⚡</w:t>
-      </w:r>
-    </w:p>
-    <w:p/>
-    <w:p>
-      <w:r>
-        <w:rPr>
-          <w:i w:val="0"/>
-        </w:rPr>
-        <w:t>O que parecia pânico era adrenalina jogada por um tumor. A tríade estava escondida: cefaleia + palpitação + sudorese, em crises, num jovem com HAS refratária.</w:t>
-      </w:r>
-    </w:p>
-    <w:p/>
-    <w:p>
-      <w:r>
-        <w:rPr>
-          <w:i w:val="0"/>
-        </w:rPr>
-        <w:t>Quantas vezes a gente quase carimba antes de pensar, Interno? 👇</w:t>
-      </w:r>
-    </w:p>
-    <w:p>
-      <w:r>
-        <w:rPr>
-          <w:i w:val="0"/>
-        </w:rPr>
-        <w:t>#pendurajaleco #medicina #casoclinico #plantao #internato #residenciamedica #estudantedemedicina #emergencia</w:t>
+        </w:rPr>
+        <w:t>ENCERRAMENTO (tela preta — sempre igual)</w:t>
+      </w:r>
+    </w:p>
+    <w:p>
+      <w:pPr>
+        <w:jc w:val="center"/>
+      </w:pPr>
+      <w:r>
+        <w:rPr>
+          <w:b/>
+          <w:color w:val="5B21B6"/>
+        </w:rPr>
+        <w:t>"Terça que vem, novo plantão."</w:t>
+      </w:r>
+    </w:p>
+    <w:p>
+      <w:pPr>
+        <w:jc w:val="center"/>
+      </w:pPr>
+      <w:r>
+        <w:rPr>
+          <w:b/>
+          <w:color w:val="5B21B6"/>
+        </w:rPr>
+        <w:t>TERÇA-FEIRA · 20H</w:t>
       </w:r>
     </w:p>
     <w:p>
@@ -1438,9 +1934,8 @@
         <w:rPr>
           <w:b/>
           <w:color w:val="555555"/>
-          <w:sz w:val="22"/>
-        </w:rPr>
-        <w:t>COMENTÁRIO FIXADO (postar você mesmo e fixar)</w:t>
+        </w:rPr>
+        <w:t>LEGENDA DO POST (padrão da série)</w:t>
       </w:r>
     </w:p>
     <w:p>
@@ -1448,7 +1943,7 @@
         <w:rPr>
           <w:i w:val="0"/>
         </w:rPr>
-        <w:t>Tríade do feocromocitoma que você não esquece: cefaleia + palpitação + sudorese, em crises. ✅</w:t>
+        <w:t>🚨 CASO #003 — RESPOSTA</w:t>
       </w:r>
     </w:p>
     <w:p>
@@ -1456,7 +1951,63 @@
         <w:rPr>
           <w:i w:val="0"/>
         </w:rPr>
-        <w:t>Jovem com hipertensão grave = investiga, não carimba. Salva o post. 🚨</w:t>
+        <w:t>FEOCROMOCITOMA</w:t>
+      </w:r>
+    </w:p>
+    <w:p>
+      <w:r>
+        <w:rPr>
+          <w:i w:val="0"/>
+        </w:rPr>
+        <w:t>Não era pânico — era adrenalina de um tumor. Cefaleia + palpitação + sudorese, em crises, num jovem com HAS refratária.</w:t>
+      </w:r>
+    </w:p>
+    <w:p>
+      <w:r>
+        <w:rPr>
+          <w:i w:val="0"/>
+        </w:rPr>
+        <w:t>Quantas vezes a gente quase carimba? 👇</w:t>
+      </w:r>
+    </w:p>
+    <w:p>
+      <w:r>
+        <w:rPr>
+          <w:i w:val="0"/>
+        </w:rPr>
+        <w:t>Salva pro seu próximo plantão.</w:t>
+      </w:r>
+    </w:p>
+    <w:p>
+      <w:r>
+        <w:rPr>
+          <w:i w:val="0"/>
+        </w:rPr>
+      </w:r>
+    </w:p>
+    <w:p>
+      <w:r>
+        <w:rPr>
+          <w:i w:val="0"/>
+        </w:rPr>
+        <w:t>#pendurajaleco #medicina #casoclinico #plantao #internato #residenciamedica #estudantedemedicina #emergencia</w:t>
+      </w:r>
+    </w:p>
+    <w:p>
+      <w:r>
+        <w:rPr>
+          <w:b/>
+          <w:color w:val="555555"/>
+        </w:rPr>
+        <w:t>COMENTÁRIO FIXADO (você posta e fixa)</w:t>
+      </w:r>
+    </w:p>
+    <w:p>
+      <w:r>
+        <w:rPr>
+          <w:i w:val="0"/>
+        </w:rPr>
+        <w:t>Guarda a tríade do feo: cefaleia + palpitação + sudorese, em crises. ✅ Jovem com HAS grave = investiga. 🚨</w:t>
       </w:r>
     </w:p>
     <w:p>
@@ -1471,7 +2022,7 @@
           <w:color w:val="5B21B6"/>
           <w:sz w:val="40"/>
         </w:rPr>
-        <w:t>EPISÓDIO 04 — "O Paciente Não Fala"</w:t>
+        <w:t>CASO #004 — "O Paciente Não Fala"</w:t>
       </w:r>
     </w:p>
     <w:p>
@@ -1509,9 +2060,8 @@
         <w:rPr>
           <w:b/>
           <w:color w:val="555555"/>
-          <w:sz w:val="22"/>
-        </w:rPr>
-        <w:t>MINI-CAPA (0,5s)</w:t>
+        </w:rPr>
+        <w:t>CAPA</w:t>
       </w:r>
     </w:p>
     <w:p>
@@ -1524,7 +2074,7 @@
           <w:color w:val="555555"/>
           <w:sz w:val="20"/>
         </w:rPr>
-        <w:t>TEMPORADA 01</w:t>
+        <w:t>🚨</w:t>
       </w:r>
     </w:p>
     <w:p>
@@ -1534,10 +2084,10 @@
       <w:r>
         <w:rPr>
           <w:b/>
-          <w:color w:val="555555"/>
-          <w:sz w:val="20"/>
-        </w:rPr>
-        <w:t>EPISÓDIO 04 · PARTE 1 — O CASO</w:t>
+          <w:color w:val="5B21B6"/>
+          <w:sz w:val="28"/>
+        </w:rPr>
+        <w:t>SEU PLANTÃO COMEÇOU</w:t>
       </w:r>
     </w:p>
     <w:p>
@@ -1547,154 +2097,10 @@
       <w:r>
         <w:rPr>
           <w:b/>
-          <w:color w:val="5B21B6"/>
-          <w:sz w:val="26"/>
-        </w:rPr>
-        <w:t>O PACIENTE NÃO FALA</w:t>
-      </w:r>
-    </w:p>
-    <w:p>
-      <w:r>
-        <w:rPr>
-          <w:b/>
           <w:color w:val="555555"/>
-          <w:sz w:val="22"/>
-        </w:rPr>
-        <w:t>ROTEIRO (falado, máx. 60s)</w:t>
-      </w:r>
-    </w:p>
-    <w:p>
-      <w:r>
-        <w:rPr>
-          <w:i w:val="0"/>
-        </w:rPr>
-        <w:t>Interno. Seu plantão começou. Esse paciente é seu.</w:t>
-      </w:r>
-    </w:p>
-    <w:p>
-      <w:r>
-        <w:rPr>
-          <w:i w:val="0"/>
-        </w:rPr>
-        <w:t>Você é o cirurgião. A pediatria te chama pra ver uma criança com dor na barriga. Mas tem um detalhe: ela tem 9 meses. Não fala. Não te conta nada.</w:t>
-      </w:r>
-    </w:p>
-    <w:p>
-      <w:r>
-        <w:rPr>
-          <w:i w:val="0"/>
-        </w:rPr>
-        <w:t>O que você quer saber primeiro? (pausa 1s)</w:t>
-      </w:r>
-    </w:p>
-    <w:p>
-      <w:r>
-        <w:rPr>
-          <w:i w:val="0"/>
-        </w:rPr>
-        <w:t>A dor vem em ondas. Ela chora muito, contrai, faz cara de dor... e depois acalma. Daqui a pouco volta tudo de novo. Já vomitou. Tá um pouco hipotensa.</w:t>
-      </w:r>
-    </w:p>
-    <w:p>
-      <w:r>
-        <w:rPr>
-          <w:i w:val="0"/>
-        </w:rPr>
-        <w:t>Reparou? Sem queixa, sem história. Só o corpo dela fala. Dor que vai e volta em ondas num bebê desse tamanho.</w:t>
-      </w:r>
-    </w:p>
-    <w:p>
-      <w:r>
-        <w:rPr>
-          <w:i w:val="0"/>
-        </w:rPr>
-        <w:t>Tem um exame que quase todo mundo esquece de fazer no bebê — e ele entrega o diagnóstico na hora.</w:t>
-      </w:r>
-    </w:p>
-    <w:p>
-      <w:r>
-        <w:rPr>
-          <w:i w:val="0"/>
-        </w:rPr>
-        <w:t>Interno... qual exame você faria agora? Comenta. Amanhã eu te mostro o que tava escondido. Seu plantão não acabou.</w:t>
-      </w:r>
-    </w:p>
-    <w:p>
-      <w:r>
-        <w:rPr>
-          <w:b/>
-          <w:color w:val="555555"/>
-          <w:sz w:val="22"/>
-        </w:rPr>
-        <w:t>LEGENDA DO POST</w:t>
-      </w:r>
-    </w:p>
-    <w:p>
-      <w:r>
-        <w:rPr>
-          <w:i w:val="0"/>
-        </w:rPr>
-        <w:t>O paciente tem 9 meses. Não fala. Não te conta nada. 👶</w:t>
-      </w:r>
-    </w:p>
-    <w:p/>
-    <w:p>
-      <w:r>
-        <w:rPr>
-          <w:i w:val="0"/>
-        </w:rPr>
-        <w:t>Dor abdominal em ondas: chora, contrai, acalma — e volta. Já vomitou. Tem UM exame que quase todo mundo esquece de fazer no bebê e que entrega o diagnóstico na hora.</w:t>
-      </w:r>
-    </w:p>
-    <w:p/>
-    <w:p>
-      <w:r>
-        <w:rPr>
-          <w:i w:val="0"/>
-        </w:rPr>
-        <w:t>Interno, qual exame você faria agora? 👇</w:t>
-      </w:r>
-    </w:p>
-    <w:p>
-      <w:r>
-        <w:rPr>
-          <w:i w:val="0"/>
-        </w:rPr>
-        <w:t>Amanhã eu revelo. 🚨</w:t>
-      </w:r>
-    </w:p>
-    <w:p>
-      <w:r>
-        <w:rPr>
-          <w:i w:val="0"/>
-        </w:rPr>
-        <w:t>#pendurajaleco #medicina #casoclinico #plantao #internato #residenciamedica #estudantedemedicina #emergencia</w:t>
-      </w:r>
-    </w:p>
-    <w:p>
-      <w:r>
-        <w:rPr>
-          <w:b/>
-          <w:color w:val="555555"/>
-          <w:sz w:val="22"/>
-        </w:rPr>
-        <w:t>COMENTÁRIO FIXADO (postar você mesmo e fixar)</w:t>
-      </w:r>
-    </w:p>
-    <w:p>
-      <w:r>
-        <w:rPr>
-          <w:i w:val="0"/>
-        </w:rPr>
-        <w:t>Quando o paciente não fala, o exame fala por ele. 🧠</w:t>
-      </w:r>
-    </w:p>
-    <w:p>
-      <w:r>
-        <w:rPr>
-          <w:i w:val="0"/>
-        </w:rPr>
-        <w:t>Qual exame você NÃO pularia nesse bebê? Comenta antes da revelação. 👇</w:t>
+          <w:sz w:val="20"/>
+        </w:rPr>
+        <w:t>TEMPORADA 01</w:t>
       </w:r>
     </w:p>
     <w:p>
@@ -1703,6 +2109,219 @@
       </w:pPr>
       <w:r>
         <w:rPr>
+          <w:b/>
+          <w:color w:val="555555"/>
+          <w:sz w:val="20"/>
+        </w:rPr>
+        <w:t>EP.04</w:t>
+      </w:r>
+    </w:p>
+    <w:p>
+      <w:pPr>
+        <w:jc w:val="center"/>
+      </w:pPr>
+      <w:r>
+        <w:rPr>
+          <w:b/>
+          <w:color w:val="5B21B6"/>
+          <w:sz w:val="26"/>
+        </w:rPr>
+        <w:t>O PACIENTE NÃO FALA</w:t>
+      </w:r>
+    </w:p>
+    <w:p>
+      <w:r>
+        <w:rPr>
+          <w:b/>
+          <w:color w:val="555555"/>
+        </w:rPr>
+        <w:t>ROTEIRO (falado, máx. 60s)</w:t>
+      </w:r>
+    </w:p>
+    <w:p>
+      <w:r>
+        <w:rPr>
+          <w:i w:val="0"/>
+        </w:rPr>
+        <w:t>Interno. Seu plantão começou. Esse paciente é seu.</w:t>
+      </w:r>
+    </w:p>
+    <w:p>
+      <w:r>
+        <w:rPr>
+          <w:i w:val="0"/>
+        </w:rPr>
+        <w:t>Você é o cirurgião. A pediatria te chama pra ver uma criança com dor na barriga. Mas ela tem 9 meses. Não fala. Não te conta nada.</w:t>
+      </w:r>
+    </w:p>
+    <w:p>
+      <w:r>
+        <w:rPr>
+          <w:i w:val="0"/>
+        </w:rPr>
+        <w:t>O que você quer saber primeiro? (pausa 1s)</w:t>
+      </w:r>
+    </w:p>
+    <w:p>
+      <w:r>
+        <w:rPr>
+          <w:i w:val="0"/>
+        </w:rPr>
+        <w:t>A dor vem em ondas. Ela chora, contrai, faz cara de dor... e acalma. Daqui a pouco, volta tudo. Já vomitou. Tá um pouco hipotensa.</w:t>
+      </w:r>
+    </w:p>
+    <w:p>
+      <w:r>
+        <w:rPr>
+          <w:i w:val="0"/>
+        </w:rPr>
+        <w:t>Sem queixa, sem história. Só o corpo dela fala.</w:t>
+      </w:r>
+    </w:p>
+    <w:p>
+      <w:r>
+        <w:rPr>
+          <w:i w:val="0"/>
+        </w:rPr>
+        <w:t>Tem um exame que é fácil de pular no bebê — e que muda completamente o rumo do caso. Interno... qual exame você faria agora? Comenta.</w:t>
+      </w:r>
+    </w:p>
+    <w:p>
+      <w:r>
+        <w:rPr>
+          <w:b/>
+          <w:color w:val="555555"/>
+        </w:rPr>
+        <w:t>ENCERRAMENTO (tela preta — sempre igual)</w:t>
+      </w:r>
+    </w:p>
+    <w:p>
+      <w:pPr>
+        <w:jc w:val="center"/>
+      </w:pPr>
+      <w:r>
+        <w:rPr>
+          <w:b/>
+          <w:color w:val="5B21B6"/>
+        </w:rPr>
+        <w:t>"Seu plantão não acabou."</w:t>
+      </w:r>
+    </w:p>
+    <w:p>
+      <w:pPr>
+        <w:jc w:val="center"/>
+      </w:pPr>
+      <w:r>
+        <w:rPr>
+          <w:b/>
+          <w:color w:val="5B21B6"/>
+        </w:rPr>
+        <w:t>QUINTA-FEIRA · 20H</w:t>
+      </w:r>
+    </w:p>
+    <w:p>
+      <w:r>
+        <w:rPr>
+          <w:b/>
+          <w:color w:val="555555"/>
+        </w:rPr>
+        <w:t>LEGENDA DO POST (padrão da série)</w:t>
+      </w:r>
+    </w:p>
+    <w:p>
+      <w:r>
+        <w:rPr>
+          <w:i w:val="0"/>
+        </w:rPr>
+        <w:t>🚨 CASO #004</w:t>
+      </w:r>
+    </w:p>
+    <w:p>
+      <w:r>
+        <w:rPr>
+          <w:i w:val="0"/>
+        </w:rPr>
+        <w:t>Você assumiria esse caso?</w:t>
+      </w:r>
+    </w:p>
+    <w:p>
+      <w:r>
+        <w:rPr>
+          <w:i w:val="0"/>
+        </w:rPr>
+        <w:t>Bebê, 9 meses.</w:t>
+      </w:r>
+    </w:p>
+    <w:p>
+      <w:r>
+        <w:rPr>
+          <w:i w:val="0"/>
+        </w:rPr>
+        <w:t>Dor abdominal em ondas.</w:t>
+      </w:r>
+    </w:p>
+    <w:p>
+      <w:r>
+        <w:rPr>
+          <w:i w:val="0"/>
+        </w:rPr>
+        <w:t>Não fala, não conta nada.</w:t>
+      </w:r>
+    </w:p>
+    <w:p>
+      <w:r>
+        <w:rPr>
+          <w:i w:val="0"/>
+        </w:rPr>
+        <w:t>Qual é o próximo passo?</w:t>
+      </w:r>
+    </w:p>
+    <w:p>
+      <w:r>
+        <w:rPr>
+          <w:i w:val="0"/>
+        </w:rPr>
+        <w:t>👇 Quero ler sua conduta antes da resposta de quinta.</w:t>
+      </w:r>
+    </w:p>
+    <w:p>
+      <w:r>
+        <w:rPr>
+          <w:i w:val="0"/>
+        </w:rPr>
+      </w:r>
+    </w:p>
+    <w:p>
+      <w:r>
+        <w:rPr>
+          <w:i w:val="0"/>
+        </w:rPr>
+        <w:t>#pendurajaleco #medicina #casoclinico #plantao #internato #residenciamedica #estudantedemedicina #emergencia</w:t>
+      </w:r>
+    </w:p>
+    <w:p>
+      <w:r>
+        <w:rPr>
+          <w:b/>
+          <w:color w:val="555555"/>
+        </w:rPr>
+        <w:t>COMENTÁRIO FIXADO (você posta e fixa)</w:t>
+      </w:r>
+    </w:p>
+    <w:p>
+      <w:r>
+        <w:rPr>
+          <w:i w:val="0"/>
+        </w:rPr>
+        <w:t>Quando o paciente não fala, o exame fala por ele. 🧠 Qual exame você não pularia? Comenta antes de quinta. 👇</w:t>
+      </w:r>
+    </w:p>
+    <w:p>
+      <w:pPr>
+        <w:jc w:val="center"/>
+      </w:pPr>
+      <w:r>
+        <w:rPr>
           <w:color w:val="CCCCCC"/>
         </w:rPr>
         <w:t>— — — — — — — — — — — — — — — — — — — —</w:t>
@@ -1715,7 +2334,7 @@
           <w:color w:val="5B21B6"/>
           <w:sz w:val="30"/>
         </w:rPr>
-        <w:t>PARTE 2 — QUINTA (A RESPOSTA)</w:t>
+        <w:t>PARTE 2 — QUINTA (A RESPOSTA · debrief de corredor)</w:t>
       </w:r>
     </w:p>
     <w:p>
@@ -1723,9 +2342,8 @@
         <w:rPr>
           <w:b/>
           <w:color w:val="555555"/>
-          <w:sz w:val="22"/>
-        </w:rPr>
-        <w:t>MINI-CAPA (0,5s)</w:t>
+        </w:rPr>
+        <w:t>CAPA (mesma, com selo "RESPOSTA" no canto)</w:t>
       </w:r>
     </w:p>
     <w:p>
@@ -1738,7 +2356,7 @@
           <w:color w:val="555555"/>
           <w:sz w:val="20"/>
         </w:rPr>
-        <w:t>TEMPORADA 01</w:t>
+        <w:t>🚨</w:t>
       </w:r>
     </w:p>
     <w:p>
@@ -1748,10 +2366,10 @@
       <w:r>
         <w:rPr>
           <w:b/>
-          <w:color w:val="555555"/>
-          <w:sz w:val="20"/>
-        </w:rPr>
-        <w:t>EPISÓDIO 04 · PARTE 2 — A RESPOSTA</w:t>
+          <w:color w:val="5B21B6"/>
+          <w:sz w:val="28"/>
+        </w:rPr>
+        <w:t>SEU PLANTÃO COMEÇOU</w:t>
       </w:r>
     </w:p>
     <w:p>
@@ -1761,6 +2379,32 @@
       <w:r>
         <w:rPr>
           <w:b/>
+          <w:color w:val="555555"/>
+          <w:sz w:val="20"/>
+        </w:rPr>
+        <w:t>TEMPORADA 01</w:t>
+      </w:r>
+    </w:p>
+    <w:p>
+      <w:pPr>
+        <w:jc w:val="center"/>
+      </w:pPr>
+      <w:r>
+        <w:rPr>
+          <w:b/>
+          <w:color w:val="555555"/>
+          <w:sz w:val="20"/>
+        </w:rPr>
+        <w:t>EP.04 · RESPOSTA</w:t>
+      </w:r>
+    </w:p>
+    <w:p>
+      <w:pPr>
+        <w:jc w:val="center"/>
+      </w:pPr>
+      <w:r>
+        <w:rPr>
+          <w:b/>
           <w:color w:val="5B21B6"/>
           <w:sz w:val="26"/>
         </w:rPr>
@@ -1772,7 +2416,6 @@
         <w:rPr>
           <w:b/>
           <w:color w:val="555555"/>
-          <w:sz w:val="22"/>
         </w:rPr>
         <w:t>ROTEIRO (falado, máx. 60s)</w:t>
       </w:r>
@@ -1782,7 +2425,7 @@
         <w:rPr>
           <w:i w:val="0"/>
         </w:rPr>
-        <w:t>Interno. Ontem: bebê de 9 meses, dor abdominal em ondas, chora e acalma, já vomitou. Muita gente foi direto pro ultrassom. E ele até ajuda — mas o que entregou foi mais simples.</w:t>
+        <w:t>Interno. Sobre o plantão de terça.</w:t>
       </w:r>
     </w:p>
     <w:p>
@@ -1790,7 +2433,7 @@
         <w:rPr>
           <w:i w:val="0"/>
         </w:rPr>
-        <w:t>O toque retal. Fezes em geleia de framboesa.</w:t>
+        <w:t>"Vi muita gente indo direto pro ultrassom." (pausa) "E ele ajuda." (pausa) "Mas quem entregou foi o toque retal."</w:t>
       </w:r>
     </w:p>
     <w:p>
@@ -1798,7 +2441,7 @@
         <w:rPr>
           <w:i w:val="0"/>
         </w:rPr>
-        <w:t>Isso é intussuscepção. Bebê de 6 meses a 2 anos + dor intensa e intermitente (para até de brincar, chora, melhora) + geleia de framboesa. Às vezes dá pra palpar uma massa em forma de salsicha. Confirma no ultrassom: sinal do alvo.</w:t>
+        <w:t>Fezes em geleia de framboesa. Isso é intussuscepção.</w:t>
       </w:r>
     </w:p>
     <w:p>
@@ -1806,7 +2449,7 @@
         <w:rPr>
           <w:i w:val="0"/>
         </w:rPr>
-        <w:t>A lição não é decorar intussuscepção. É: quando o paciente não fala, o exame fala por ele. Não pule o básico.</w:t>
+        <w:t>Bebê de 6 meses a 2 anos, dor em ondas (para até de brincar, chora, melhora), às vezes uma massa em forma de salsicha. O ultrassom confirma: sinal do alvo.</w:t>
       </w:r>
     </w:p>
     <w:p>
@@ -1814,7 +2457,15 @@
         <w:rPr>
           <w:i w:val="0"/>
         </w:rPr>
-        <w:t>Interno... você teria feito o toque? Comenta. Mês que vem o plantão continua.</w:t>
+        <w:t>A lição não é decorar intussuscepção. É que, quando o paciente não fala, o exame fala por ele. Não pule o básico.</w:t>
+      </w:r>
+    </w:p>
+    <w:p>
+      <w:r>
+        <w:rPr>
+          <w:i w:val="0"/>
+        </w:rPr>
+        <w:t>Interno... você teria feito o toque? Comenta.</w:t>
       </w:r>
     </w:p>
     <w:p>
@@ -1822,43 +2473,32 @@
         <w:rPr>
           <w:b/>
           <w:color w:val="555555"/>
-          <w:sz w:val="22"/>
-        </w:rPr>
-        <w:t>LEGENDA DO POST</w:t>
-      </w:r>
-    </w:p>
-    <w:p>
-      <w:r>
-        <w:rPr>
-          <w:i w:val="0"/>
-        </w:rPr>
-        <w:t>A resposta: INTUSSUSCEPÇÃO. 🎯</w:t>
-      </w:r>
-    </w:p>
-    <w:p/>
-    <w:p>
-      <w:r>
-        <w:rPr>
-          <w:i w:val="0"/>
-        </w:rPr>
-        <w:t>O ultrassom ajuda (sinal do alvo), mas quem entregou foi o toque retal: fezes em geleia de framboesa. Bebê 6m–2a + dor em ondas + massa em salsicha.</w:t>
-      </w:r>
-    </w:p>
-    <w:p/>
-    <w:p>
-      <w:r>
-        <w:rPr>
-          <w:i w:val="0"/>
-        </w:rPr>
-        <w:t>Você teria feito o toque, Interno? 👇</w:t>
-      </w:r>
-    </w:p>
-    <w:p>
-      <w:r>
-        <w:rPr>
-          <w:i w:val="0"/>
-        </w:rPr>
-        <w:t>#pendurajaleco #medicina #casoclinico #plantao #internato #residenciamedica #estudantedemedicina #emergencia</w:t>
+        </w:rPr>
+        <w:t>ENCERRAMENTO (tela preta — sempre igual)</w:t>
+      </w:r>
+    </w:p>
+    <w:p>
+      <w:pPr>
+        <w:jc w:val="center"/>
+      </w:pPr>
+      <w:r>
+        <w:rPr>
+          <w:b/>
+          <w:color w:val="5B21B6"/>
+        </w:rPr>
+        <w:t>"Terça que vem, novo plantão."</w:t>
+      </w:r>
+    </w:p>
+    <w:p>
+      <w:pPr>
+        <w:jc w:val="center"/>
+      </w:pPr>
+      <w:r>
+        <w:rPr>
+          <w:b/>
+          <w:color w:val="5B21B6"/>
+        </w:rPr>
+        <w:t>TERÇA-FEIRA · 20H</w:t>
       </w:r>
     </w:p>
     <w:p>
@@ -1866,9 +2506,8 @@
         <w:rPr>
           <w:b/>
           <w:color w:val="555555"/>
-          <w:sz w:val="22"/>
-        </w:rPr>
-        <w:t>COMENTÁRIO FIXADO (postar você mesmo e fixar)</w:t>
+        </w:rPr>
+        <w:t>LEGENDA DO POST (padrão da série)</w:t>
       </w:r>
     </w:p>
     <w:p>
@@ -1876,7 +2515,7 @@
         <w:rPr>
           <w:i w:val="0"/>
         </w:rPr>
-        <w:t>Combo da intussuscepção: 6m–2a + dor intermitente + geleia de framboesa + sinal do alvo no US. ✅</w:t>
+        <w:t>🚨 CASO #004 — RESPOSTA</w:t>
       </w:r>
     </w:p>
     <w:p>
@@ -1884,7 +2523,63 @@
         <w:rPr>
           <w:i w:val="0"/>
         </w:rPr>
-        <w:t>Quando o paciente não fala, não pule o básico. Salva o post. 🚨</w:t>
+        <w:t>INTUSSUSCEPÇÃO</w:t>
+      </w:r>
+    </w:p>
+    <w:p>
+      <w:r>
+        <w:rPr>
+          <w:i w:val="0"/>
+        </w:rPr>
+        <w:t>O ultrassom confirma (sinal do alvo), mas quem entregou foi o toque: geleia de framboesa. Bebê 6m–2a + dor em ondas.</w:t>
+      </w:r>
+    </w:p>
+    <w:p>
+      <w:r>
+        <w:rPr>
+          <w:i w:val="0"/>
+        </w:rPr>
+        <w:t>Você teria feito o toque? 👇</w:t>
+      </w:r>
+    </w:p>
+    <w:p>
+      <w:r>
+        <w:rPr>
+          <w:i w:val="0"/>
+        </w:rPr>
+        <w:t>Salva pro seu próximo plantão.</w:t>
+      </w:r>
+    </w:p>
+    <w:p>
+      <w:r>
+        <w:rPr>
+          <w:i w:val="0"/>
+        </w:rPr>
+      </w:r>
+    </w:p>
+    <w:p>
+      <w:r>
+        <w:rPr>
+          <w:i w:val="0"/>
+        </w:rPr>
+        <w:t>#pendurajaleco #medicina #casoclinico #plantao #internato #residenciamedica #estudantedemedicina #emergencia</w:t>
+      </w:r>
+    </w:p>
+    <w:p>
+      <w:r>
+        <w:rPr>
+          <w:b/>
+          <w:color w:val="555555"/>
+        </w:rPr>
+        <w:t>COMENTÁRIO FIXADO (você posta e fixa)</w:t>
+      </w:r>
+    </w:p>
+    <w:p>
+      <w:r>
+        <w:rPr>
+          <w:i w:val="0"/>
+        </w:rPr>
+        <w:t>Guarda o combo: 6m–2a + dor intermitente + geleia de framboesa + sinal do alvo. ✅ Salva e leva pro plantão. 🚨</w:t>
       </w:r>
     </w:p>
     <w:p>
@@ -1915,7 +2610,6 @@
         <w:rPr>
           <w:b/>
           <w:color w:val="555555"/>
-          <w:sz w:val="22"/>
         </w:rPr>
         <w:t>O QUE OLHAR, NESTA ORDEM</w:t>
       </w:r>
@@ -1925,7 +2619,7 @@
         <w:rPr>
           <w:i w:val="0"/>
         </w:rPr>
-        <w:t>1. Salvamentos ÷ views — sinal nº1 de que acertou o público de estudo. Meta do teste: acima de 1–2% (no viral antigo foi ~0,13%).</w:t>
+        <w:t>1. Salvamentos ÷ views — sinal nº1 de que acertou o público de estudo. Meta: acima de 1–2% (no viral antigo foi ~0,13%).</w:t>
       </w:r>
     </w:p>
     <w:p>
@@ -1933,7 +2627,7 @@
         <w:rPr>
           <w:i w:val="0"/>
         </w:rPr>
-        <w:t>2. Comentários com conduta ("eu pediria...", "checaria glicemia") vs. comentários leigos. Qualidade &gt; quantidade.</w:t>
+        <w:t>2. Comentários com conduta ("eu pediria...", "palparia o pulso") vs. comentários leigos. Qualidade &gt; quantidade.</w:t>
       </w:r>
     </w:p>
     <w:p>
@@ -1949,7 +2643,7 @@
         <w:rPr>
           <w:i w:val="0"/>
         </w:rPr>
-        <w:t>4. Retenção entre P1 e P2 — quantos que viram o caso voltam pra resposta.</w:t>
+        <w:t>4. Retenção entre terça e quinta — quantos que viram o caso voltam pra resposta.</w:t>
       </w:r>
     </w:p>
     <w:p>
@@ -1957,7 +2651,6 @@
         <w:rPr>
           <w:b/>
           <w:color w:val="555555"/>
-          <w:sz w:val="22"/>
         </w:rPr>
         <w:t>REGRA DE DECISÃO</w:t>
       </w:r>
@@ -1967,7 +2660,7 @@
         <w:rPr>
           <w:i w:val="0"/>
         </w:rPr>
-        <w:t>Se views caírem MAS salvamento e comentário-de-conduta subirem → o formato funcionou, só mudou de público. Se cair tudo junto → o problema é o gancho dos 3 primeiros segundos, não o conceito.</w:t>
+        <w:t>Views caem MAS salvamento e comentário-de-conduta sobem → o formato funcionou, só mudou de público. Cai tudo junto → o problema é o gancho dos 3 primeiros segundos, não o conceito.</w:t>
       </w:r>
     </w:p>
     <w:sectPr>

</xml_diff>

<commit_message>
Refine series kit: PLANTAO/DEBRIEF format and delivery direction
Rename the two halves to PLANTAO #00X (Tue) and DEBRIEF #00X (Thu).
Open every script with 'Interno...', deliver patient data in short
beats, add the mandatory 2s silence after the prompt, pass-the-baton
'E voce...' close, debrief sign-off 'Bom plantao, Interno', and a
'O que esse caso ensinou?' lesson card. Captions adopt PLANTAO/DEBRIEF
language across all four cases.

Co-Authored-By: Claude Opus 4.8 <noreply@anthropic.com>
Claude-Session: https://claude.ai/code/session_019ZEAXjZZitDeGUTgpg3SRV
</commit_message>
<xml_diff>
--- a/SEU_PLANTAO_COMECOU_mes_de_teste.docx
+++ b/SEU_PLANTAO_COMECOU_mes_de_teste.docx
@@ -23,12 +23,12 @@
     </w:p>
     <w:p>
       <w:r>
-        <w:t>Pendura Jaleco · Mês de teste · 4 casos / 8 posts</w:t>
-      </w:r>
-    </w:p>
-    <w:p>
-      <w:r>
-        <w:t>Terça = o caso (gancho)  ·  Quinta = a resposta (debrief de corredor)</w:t>
+        <w:t>Pendura Jaleco · Mês de teste · 4 plantões / 8 posts</w:t>
+      </w:r>
+    </w:p>
+    <w:p>
+      <w:r>
+        <w:t>TERÇA = 🚨 PLANTÃO (o caso)   ·   QUINTA = 🩺 DEBRIEF (a discussão)</w:t>
       </w:r>
     </w:p>
     <w:p>
@@ -45,7 +45,7 @@
         <w:rPr>
           <w:i w:val="0"/>
         </w:rPr>
-        <w:t>A hipótese óbvia não fecha → o detalhe que muda o rumo é o exame.</w:t>
+        <w:t>A hipótese óbvia não fecha → um gesto de dez segundos muda completamente o caso.</w:t>
       </w:r>
     </w:p>
     <w:p>
@@ -62,7 +62,7 @@
         <w:rPr>
           <w:i w:val="0"/>
         </w:rPr>
-        <w:t>• ABERTURA (4s): "Seu plantão começou." / (pausa) / "Esse paciente é seu."</w:t>
+        <w:t>• ABERTURA (4s): "Interno..." (pausa) "Seu plantão começou." (pausa) "Esse paciente é seu."</w:t>
       </w:r>
     </w:p>
     <w:p>
@@ -70,7 +70,7 @@
         <w:rPr>
           <w:i w:val="0"/>
         </w:rPr>
-        <w:t>• ENCERRAMENTO da terça (tela preta): "Seu plantão não acabou." → "Quinta-feira. 20h."</w:t>
+        <w:t>• NOMES: terça é 🚨 PLANTÃO #00X · quinta é 🩺 DEBRIEF #00X (mesmo número). Vira arquivo: "no Plantão #017 a maioria errou".</w:t>
       </w:r>
     </w:p>
     <w:p>
@@ -78,7 +78,7 @@
         <w:rPr>
           <w:i w:val="0"/>
         </w:rPr>
-        <w:t>• ENCERRAMENTO da quinta (tela preta): "Terça que vem, novo plantão." → "Terça-feira. 20h."</w:t>
+        <w:t>• SILÊNCIO OBRIGATÓRIO: depois de "O que você quer saber primeiro?", Igor não mexe, não sorri, não fala. 2 segundos. O silêncio vale mais que frase.</w:t>
       </w:r>
     </w:p>
     <w:p>
@@ -86,7 +86,7 @@
         <w:rPr>
           <w:i w:val="0"/>
         </w:rPr>
-        <w:t>• VOCATIVO: sempre "Interno".</w:t>
+        <w:t>• PASSAR O BASTÃO: o caso sempre termina com "E você... (pausa) ...o que examinaria agora?" — a câmera aponta pro interno.</w:t>
       </w:r>
     </w:p>
     <w:p>
@@ -94,7 +94,7 @@
         <w:rPr>
           <w:i w:val="0"/>
         </w:rPr>
-        <w:t>• NUMERAÇÃO: CASO #001, #002... desde o primeiro dia (cria o arquivo clínico — "no Caso #017 a maioria errou").</w:t>
+        <w:t>• ENCERRAMENTO da terça (tela preta): "Seu plantão não acabou." → QUINTA · 20H</w:t>
       </w:r>
     </w:p>
     <w:p>
@@ -102,7 +102,23 @@
         <w:rPr>
           <w:i w:val="0"/>
         </w:rPr>
-        <w:t>• CAPA: mesmo layout sempre (ver abaixo). 9 capas lado a lado têm que gritar "mesma série".</w:t>
+        <w:t>• ENCERRAMENTO do debrief: "Até terça." (pausa) "Bom plantão, Interno." → card "O QUE ESSE CASO ENSINOU?" + 1 frase → TERÇA · 20H</w:t>
+      </w:r>
+    </w:p>
+    <w:p>
+      <w:r>
+        <w:rPr>
+          <w:i w:val="0"/>
+        </w:rPr>
+        <w:t>• RITMO DE FALA: idade e dados em batidas curtas, com pausa. "Homem. (pausa) Sessenta e dois anos. (pausa) Hipertenso." É assim que médico fala.</w:t>
+      </w:r>
+    </w:p>
+    <w:p>
+      <w:r>
+        <w:rPr>
+          <w:i w:val="0"/>
+        </w:rPr>
+        <w:t>• CAPA: layout único sempre (Igor olhando pra câmera, sem texto gigante).</w:t>
       </w:r>
     </w:p>
     <w:p>
@@ -111,7 +127,7 @@
           <w:b/>
           <w:color w:val="555555"/>
         </w:rPr>
-        <w:t>CAPA-PADRÃO (Igor olhando pra câmera, sem texto gigante, sem poluição)</w:t>
+        <w:t>CAPA-PADRÃO</w:t>
       </w:r>
     </w:p>
     <w:p>
@@ -163,7 +179,7 @@
           <w:color w:val="555555"/>
           <w:sz w:val="20"/>
         </w:rPr>
-        <w:t>EP.0X</w:t>
+        <w:t>PLANTÃO #00X</w:t>
       </w:r>
     </w:p>
     <w:p>
@@ -184,7 +200,7 @@
         <w:rPr>
           <w:i/>
         </w:rPr>
-        <w:t>A capa da quinta é idêntica, só com um pequeno selo "RESPOSTA" no canto.</w:t>
+        <w:t>No debrief: mesma capa, com 🩺 e "DEBRIEF #00X" no lugar.</w:t>
       </w:r>
     </w:p>
     <w:p>
@@ -201,7 +217,7 @@
         <w:rPr>
           <w:i w:val="0"/>
         </w:rPr>
-        <w:t>1. Nunca pergunte "qual o diagnóstico?" → pergunte "o que você quer saber agora?"</w:t>
+        <w:t>1. Nunca pergunte "qual o diagnóstico?" → "o que você quer saber agora?"</w:t>
       </w:r>
     </w:p>
     <w:p>
@@ -209,7 +225,7 @@
         <w:rPr>
           <w:i w:val="0"/>
         </w:rPr>
-        <w:t>2. Nunca explique durante o caso. Só na quinta.</w:t>
+        <w:t>2. Nunca explique durante o caso. Só no debrief.</w:t>
       </w:r>
     </w:p>
     <w:p>
@@ -241,7 +257,7 @@
         <w:rPr>
           <w:i w:val="0"/>
         </w:rPr>
-        <w:t>6. Nunca desqualifique o raciocínio inicial correto. Crie curiosidade SEM dizer que o outro está errado (pensar em SCA numa dor torácica é certo — respeite isso).</w:t>
+        <w:t>6. Nunca desqualifique o raciocínio inicial correto. Convide, não julgue (pensar em SCA numa dor torácica é certo).</w:t>
       </w:r>
     </w:p>
     <w:p>
@@ -250,7 +266,7 @@
           <w:b/>
           <w:color w:val="555555"/>
         </w:rPr>
-        <w:t>TOM DO DEBRIEF DE QUINTA</w:t>
+        <w:t>A EXECUÇÃO É O 0,1 QUE FALTA</w:t>
       </w:r>
     </w:p>
     <w:p>
@@ -258,7 +274,7 @@
         <w:rPr>
           <w:i w:val="0"/>
         </w:rPr>
-        <w:t>Conversa de corredor depois do plantão, não revisão de matéria. "Vi muita gente indo direto pra tomografia... mas antes dela tinha uma informação que custava dez segundos." É um preceptor comentando, não um professor revisando.</w:t>
+        <w:t>O sucesso depende mais de COMO o Igor fala do que das palavras. Preceptor: calmo, seguro, provocando o raciocínio. A meta é a série ser reconhecida só pela primeira frase — "Interno..." / "Seu plantão começou."</w:t>
       </w:r>
     </w:p>
     <w:p>
@@ -290,7 +306,7 @@
           <w:color w:val="5B21B6"/>
           <w:sz w:val="40"/>
         </w:rPr>
-        <w:t>CASO #001 — "Dor Torácica"</w:t>
+        <w:t>PLANTÃO #001 — "Dor Torácica"</w:t>
       </w:r>
     </w:p>
     <w:p>
@@ -320,7 +336,7 @@
           <w:color w:val="5B21B6"/>
           <w:sz w:val="30"/>
         </w:rPr>
-        <w:t>PARTE 1 — TERÇA (O CASO)</w:t>
+        <w:t>🚨 PLANTÃO — TERÇA (o caso)</w:t>
       </w:r>
     </w:p>
     <w:p>
@@ -381,7 +397,7 @@
           <w:color w:val="555555"/>
           <w:sz w:val="20"/>
         </w:rPr>
-        <w:t>EP.01</w:t>
+        <w:t>PLANTÃO #001</w:t>
       </w:r>
     </w:p>
     <w:p>
@@ -411,7 +427,7 @@
         <w:rPr>
           <w:i w:val="0"/>
         </w:rPr>
-        <w:t>Interno. Seu plantão começou. Esse paciente é seu.</w:t>
+        <w:t>Interno... (pausa) Seu plantão começou. (pausa) Esse paciente é seu.</w:t>
       </w:r>
     </w:p>
     <w:p>
@@ -419,7 +435,7 @@
         <w:rPr>
           <w:i w:val="0"/>
         </w:rPr>
-        <w:t>Homem, 62 anos. Hipertenso. Chega agitado, com dor no peito que vai pras costas. Não consegue ficar deitado na maca.</w:t>
+        <w:t>Homem. (pausa) Sessenta e dois anos. (pausa) Hipertenso.</w:t>
       </w:r>
     </w:p>
     <w:p>
@@ -427,7 +443,7 @@
         <w:rPr>
           <w:i w:val="0"/>
         </w:rPr>
-        <w:t>O que você quer saber primeiro? (pausa 1s)</w:t>
+        <w:t>Chega agitado, com dor no peito que vai pras costas. Não consegue ficar deitado na maca.</w:t>
       </w:r>
     </w:p>
     <w:p>
@@ -435,6 +451,23 @@
         <w:rPr>
           <w:i w:val="0"/>
         </w:rPr>
+        <w:t>O que você quer saber primeiro?</w:t>
+      </w:r>
+    </w:p>
+    <w:p>
+      <w:r>
+        <w:rPr>
+          <w:i/>
+          <w:color w:val="555555"/>
+        </w:rPr>
+        <w:t>[DIREÇÃO: Igor olha pra câmera. Não mexe. Não sorri. Não fala. 2 segundos de silêncio.]</w:t>
+      </w:r>
+    </w:p>
+    <w:p>
+      <w:r>
+        <w:rPr>
+          <w:i w:val="0"/>
+        </w:rPr>
         <w:t>Pressão: 18 por 10. FC: 122. Saturando 92%. ECG: sem isquemia aguda.</w:t>
       </w:r>
     </w:p>
@@ -451,7 +484,7 @@
         <w:rPr>
           <w:i w:val="0"/>
         </w:rPr>
-        <w:t>Mas esse caso ainda está longe de terminar. Tem um detalhe no exame físico que muda completamente o rumo dele.</w:t>
+        <w:t>Só que esse caso ainda não terminou. (pausa) Tem um detalhe que muda tudo.</w:t>
       </w:r>
     </w:p>
     <w:p>
@@ -459,7 +492,7 @@
         <w:rPr>
           <w:i w:val="0"/>
         </w:rPr>
-        <w:t>Interno... o que você examinaria agora? Comenta sua conduta.</w:t>
+        <w:t>E você... (pausa) ...o que examinaria agora? Comenta sua conduta.</w:t>
       </w:r>
     </w:p>
     <w:p>
@@ -492,7 +525,7 @@
           <w:b/>
           <w:color w:val="5B21B6"/>
         </w:rPr>
-        <w:t>QUINTA-FEIRA · 20H</w:t>
+        <w:t>QUINTA · 20H</w:t>
       </w:r>
     </w:p>
     <w:p>
@@ -501,7 +534,7 @@
           <w:b/>
           <w:color w:val="555555"/>
         </w:rPr>
-        <w:t>LEGENDA DO POST (padrão da série)</w:t>
+        <w:t>LEGENDA DO POST</w:t>
       </w:r>
     </w:p>
     <w:p>
@@ -509,7 +542,7 @@
         <w:rPr>
           <w:i w:val="0"/>
         </w:rPr>
-        <w:t>🚨 CASO #001</w:t>
+        <w:t>🚨 PLANTÃO #001 · Dor Torácica</w:t>
       </w:r>
     </w:p>
     <w:p>
@@ -549,7 +582,7 @@
         <w:rPr>
           <w:i w:val="0"/>
         </w:rPr>
-        <w:t>Qual é o próximo passo?</w:t>
+        <w:t>E você — qual é o próximo passo?</w:t>
       </w:r>
     </w:p>
     <w:p>
@@ -557,7 +590,7 @@
         <w:rPr>
           <w:i w:val="0"/>
         </w:rPr>
-        <w:t>👇 Quero ler sua conduta antes da resposta de quinta.</w:t>
+        <w:t>👇 Quero ler sua conduta antes do debrief de quinta.</w:t>
       </w:r>
     </w:p>
     <w:p>
@@ -581,7 +614,7 @@
           <w:b/>
           <w:color w:val="555555"/>
         </w:rPr>
-        <w:t>COMENTÁRIO FIXADO (você posta e fixa)</w:t>
+        <w:t>COMENTÁRIO FIXADO</w:t>
       </w:r>
     </w:p>
     <w:p>
@@ -589,7 +622,7 @@
         <w:rPr>
           <w:i w:val="0"/>
         </w:rPr>
-        <w:t>Regra da série: ECG normal não fecha o raciocínio. 🧠 Comenta sua conduta antes da resposta de quinta — quem cravar marca presença. 👇</w:t>
+        <w:t>Regra da série: ECG normal não fecha o raciocínio. 🧠 Comenta sua conduta antes do debrief de quinta — quem cravar marca presença. 👇</w:t>
       </w:r>
     </w:p>
     <w:p>
@@ -610,7 +643,7 @@
           <w:color w:val="5B21B6"/>
           <w:sz w:val="30"/>
         </w:rPr>
-        <w:t>PARTE 2 — QUINTA (A RESPOSTA · debrief de corredor)</w:t>
+        <w:t>🩺 DEBRIEF — QUINTA (a discussão de corredor)</w:t>
       </w:r>
     </w:p>
     <w:p>
@@ -619,7 +652,7 @@
           <w:b/>
           <w:color w:val="555555"/>
         </w:rPr>
-        <w:t>CAPA (mesma, com selo "RESPOSTA" no canto)</w:t>
+        <w:t>CAPA (mesma, com 🩺 e "DEBRIEF")</w:t>
       </w:r>
     </w:p>
     <w:p>
@@ -632,7 +665,7 @@
           <w:color w:val="555555"/>
           <w:sz w:val="20"/>
         </w:rPr>
-        <w:t>🚨</w:t>
+        <w:t>🩺</w:t>
       </w:r>
     </w:p>
     <w:p>
@@ -671,7 +704,7 @@
           <w:color w:val="555555"/>
           <w:sz w:val="20"/>
         </w:rPr>
-        <w:t>EP.01 · RESPOSTA</w:t>
+        <w:t>DEBRIEF #001</w:t>
       </w:r>
     </w:p>
     <w:p>
@@ -701,7 +734,7 @@
         <w:rPr>
           <w:i w:val="0"/>
         </w:rPr>
-        <w:t>Interno. Sobre o plantão de terça.</w:t>
+        <w:t>Interno... (pausa) sobre o plantão de terça.</w:t>
       </w:r>
     </w:p>
     <w:p>
@@ -709,7 +742,7 @@
         <w:rPr>
           <w:i w:val="0"/>
         </w:rPr>
-        <w:t>"Vi muita gente indo direto para a tomografia." (pausa) "Mas antes dela... tinha uma informação que custava dez segundos." (pausa) "Palpar os pulsos."</w:t>
+        <w:t>"Vi muita gente indo direto para a tomografia."</w:t>
       </w:r>
     </w:p>
     <w:p>
@@ -717,7 +750,7 @@
         <w:rPr>
           <w:i w:val="0"/>
         </w:rPr>
-        <w:t>Pulso assimétrico entre os braços. E no raio-X, mediastino alargado.</w:t>
+        <w:t>(pausa) "Mas antes dela... tinha uma informação que custava dez segundos."</w:t>
       </w:r>
     </w:p>
     <w:p>
@@ -725,7 +758,7 @@
         <w:rPr>
           <w:i w:val="0"/>
         </w:rPr>
-        <w:t>Isso é dissecção aguda de aorta. Dor que vai pras costas, pulso diferente nos braços e mediastino largo — os três juntos.</w:t>
+        <w:t>(pausa) "Palpar os pulsos."</w:t>
       </w:r>
     </w:p>
     <w:p>
@@ -733,7 +766,7 @@
         <w:rPr>
           <w:i w:val="0"/>
         </w:rPr>
-        <w:t>A lição não é decorar dissecção. É que o ECG limpo não fecha o raciocínio. O exame físico ainda manda.</w:t>
+        <w:t>(pausa) "Dez segundos."</w:t>
       </w:r>
     </w:p>
     <w:p>
@@ -741,7 +774,23 @@
         <w:rPr>
           <w:i w:val="0"/>
         </w:rPr>
-        <w:t>Interno... você tinha pego o pulso? Comenta.</w:t>
+        <w:t>(pausa) "Foi isso que mudou completamente o caso."</w:t>
+      </w:r>
+    </w:p>
+    <w:p>
+      <w:r>
+        <w:rPr>
+          <w:i w:val="0"/>
+        </w:rPr>
+        <w:t>Pulso assimétrico entre os braços. E no raio-X, mediastino alargado. Isso é dissecção aguda de aorta.</w:t>
+      </w:r>
+    </w:p>
+    <w:p>
+      <w:r>
+        <w:rPr>
+          <w:i w:val="0"/>
+        </w:rPr>
+        <w:t>Até terça. (pausa) Bom plantão, Interno.</w:t>
       </w:r>
     </w:p>
     <w:p>
@@ -750,7 +799,7 @@
           <w:b/>
           <w:color w:val="555555"/>
         </w:rPr>
-        <w:t>ENCERRAMENTO (tela preta — sempre igual)</w:t>
+        <w:t>LIÇÃO (cards na tela, ~2s cada)</w:t>
       </w:r>
     </w:p>
     <w:p>
@@ -760,9 +809,9 @@
       <w:r>
         <w:rPr>
           <w:b/>
-          <w:color w:val="5B21B6"/>
-        </w:rPr>
-        <w:t>"Terça que vem, novo plantão."</w:t>
+          <w:color w:val="555555"/>
+        </w:rPr>
+        <w:t>O QUE ESSE CASO ENSINOU?</w:t>
       </w:r>
     </w:p>
     <w:p>
@@ -772,9 +821,10 @@
       <w:r>
         <w:rPr>
           <w:b/>
-          <w:color w:val="5B21B6"/>
-        </w:rPr>
-        <w:t>TERÇA-FEIRA · 20H</w:t>
+          <w:color w:val="0F7B3F"/>
+          <w:sz w:val="26"/>
+        </w:rPr>
+        <w:t>ECG normal NÃO encerra o raciocínio.</w:t>
       </w:r>
     </w:p>
     <w:p>
@@ -783,62 +833,19 @@
           <w:b/>
           <w:color w:val="555555"/>
         </w:rPr>
-        <w:t>LEGENDA DO POST (padrão da série)</w:t>
-      </w:r>
-    </w:p>
-    <w:p>
-      <w:r>
-        <w:rPr>
-          <w:i w:val="0"/>
-        </w:rPr>
-        <w:t>🚨 CASO #001 — RESPOSTA</w:t>
-      </w:r>
-    </w:p>
-    <w:p>
-      <w:r>
-        <w:rPr>
-          <w:i w:val="0"/>
-        </w:rPr>
-        <w:t>DISSECÇÃO AGUDA DE AORTA</w:t>
-      </w:r>
-    </w:p>
-    <w:p>
-      <w:r>
-        <w:rPr>
-          <w:i w:val="0"/>
-        </w:rPr>
-        <w:t>O ECG limpo parou muita gente. O que mudou o rumo foi palpar os pulsos: assimetria + mediastino alargado.</w:t>
-      </w:r>
-    </w:p>
-    <w:p>
-      <w:r>
-        <w:rPr>
-          <w:i w:val="0"/>
-        </w:rPr>
-        <w:t>Você tinha pego o pulso? 👇</w:t>
-      </w:r>
-    </w:p>
-    <w:p>
-      <w:r>
-        <w:rPr>
-          <w:i w:val="0"/>
-        </w:rPr>
-        <w:t>Salva pro seu próximo plantão.</w:t>
-      </w:r>
-    </w:p>
-    <w:p>
-      <w:r>
-        <w:rPr>
-          <w:i w:val="0"/>
-        </w:rPr>
-      </w:r>
-    </w:p>
-    <w:p>
-      <w:r>
-        <w:rPr>
-          <w:i w:val="0"/>
-        </w:rPr>
-        <w:t>#pendurajaleco #medicina #casoclinico #plantao #internato #residenciamedica #estudantedemedicina #emergencia</w:t>
+        <w:t>ENCERRAMENTO (tela preta — sempre igual)</w:t>
+      </w:r>
+    </w:p>
+    <w:p>
+      <w:pPr>
+        <w:jc w:val="center"/>
+      </w:pPr>
+      <w:r>
+        <w:rPr>
+          <w:b/>
+          <w:color w:val="5B21B6"/>
+        </w:rPr>
+        <w:t>TERÇA · 20H</w:t>
       </w:r>
     </w:p>
     <w:p>
@@ -847,7 +854,87 @@
           <w:b/>
           <w:color w:val="555555"/>
         </w:rPr>
-        <w:t>COMENTÁRIO FIXADO (você posta e fixa)</w:t>
+        <w:t>LEGENDA DO POST</w:t>
+      </w:r>
+    </w:p>
+    <w:p>
+      <w:r>
+        <w:rPr>
+          <w:i w:val="0"/>
+        </w:rPr>
+        <w:t>🩺 DEBRIEF #001 · Dor Torácica</w:t>
+      </w:r>
+    </w:p>
+    <w:p>
+      <w:r>
+        <w:rPr>
+          <w:i w:val="0"/>
+        </w:rPr>
+        <w:t>O debrief do Plantão #001 já está no ar.</w:t>
+      </w:r>
+    </w:p>
+    <w:p>
+      <w:r>
+        <w:rPr>
+          <w:i w:val="0"/>
+        </w:rPr>
+        <w:t>DISSECÇÃO AGUDA DE AORTA</w:t>
+      </w:r>
+    </w:p>
+    <w:p>
+      <w:r>
+        <w:rPr>
+          <w:i w:val="0"/>
+        </w:rPr>
+        <w:t>O ECG limpo parou muita gente. Dez segundos palpando os pulsos mudaram tudo: assimetria + mediastino alargado.</w:t>
+      </w:r>
+    </w:p>
+    <w:p>
+      <w:r>
+        <w:rPr>
+          <w:i w:val="0"/>
+        </w:rPr>
+        <w:t>Lição: ECG normal NÃO encerra o raciocínio.</w:t>
+      </w:r>
+    </w:p>
+    <w:p>
+      <w:r>
+        <w:rPr>
+          <w:i w:val="0"/>
+        </w:rPr>
+        <w:t>E você, tinha pego o pulso? 👇</w:t>
+      </w:r>
+    </w:p>
+    <w:p>
+      <w:r>
+        <w:rPr>
+          <w:i w:val="0"/>
+        </w:rPr>
+        <w:t>Salva pro seu próximo plantão.</w:t>
+      </w:r>
+    </w:p>
+    <w:p>
+      <w:r>
+        <w:rPr>
+          <w:i w:val="0"/>
+        </w:rPr>
+      </w:r>
+    </w:p>
+    <w:p>
+      <w:r>
+        <w:rPr>
+          <w:i w:val="0"/>
+        </w:rPr>
+        <w:t>#pendurajaleco #medicina #casoclinico #plantao #internato #residenciamedica #estudantedemedicina #emergencia</w:t>
+      </w:r>
+    </w:p>
+    <w:p>
+      <w:r>
+        <w:rPr>
+          <w:b/>
+          <w:color w:val="555555"/>
+        </w:rPr>
+        <w:t>COMENTÁRIO FIXADO</w:t>
       </w:r>
     </w:p>
     <w:p>
@@ -870,7 +957,7 @@
           <w:color w:val="5B21B6"/>
           <w:sz w:val="40"/>
         </w:rPr>
-        <w:t>CASO #002 — "Ela Não Para Quieta"</w:t>
+        <w:t>PLANTÃO #002 — "Ela Não Para Quieta"</w:t>
       </w:r>
     </w:p>
     <w:p>
@@ -900,7 +987,7 @@
           <w:color w:val="5B21B6"/>
           <w:sz w:val="30"/>
         </w:rPr>
-        <w:t>PARTE 1 — TERÇA (O CASO)</w:t>
+        <w:t>🚨 PLANTÃO — TERÇA (o caso)</w:t>
       </w:r>
     </w:p>
     <w:p>
@@ -961,7 +1048,7 @@
           <w:color w:val="555555"/>
           <w:sz w:val="20"/>
         </w:rPr>
-        <w:t>EP.02</w:t>
+        <w:t>PLANTÃO #002</w:t>
       </w:r>
     </w:p>
     <w:p>
@@ -991,7 +1078,7 @@
         <w:rPr>
           <w:i w:val="0"/>
         </w:rPr>
-        <w:t>Interno. Seu plantão começou. Esse paciente é seu.</w:t>
+        <w:t>Interno... (pausa) Seu plantão começou. (pausa) Esse paciente é seu.</w:t>
       </w:r>
     </w:p>
     <w:p>
@@ -999,7 +1086,7 @@
         <w:rPr>
           <w:i w:val="0"/>
         </w:rPr>
-        <w:t>Mulher, 38 anos. Hipertensa. Chega muito agitada, não consegue ficar quieta na maca. Calafrios, diarreia e febre.</w:t>
+        <w:t>Mulher. (pausa) Trinta e oito anos. (pausa) Hipertensa.</w:t>
       </w:r>
     </w:p>
     <w:p>
@@ -1007,7 +1094,7 @@
         <w:rPr>
           <w:i w:val="0"/>
         </w:rPr>
-        <w:t>O que você quer saber primeiro? (pausa 1s)</w:t>
+        <w:t>Chega muito agitada, não consegue ficar quieta na maca. Calafrios, diarreia e febre.</w:t>
       </w:r>
     </w:p>
     <w:p>
@@ -1015,6 +1102,23 @@
         <w:rPr>
           <w:i w:val="0"/>
         </w:rPr>
+        <w:t>O que você quer saber primeiro?</w:t>
+      </w:r>
+    </w:p>
+    <w:p>
+      <w:r>
+        <w:rPr>
+          <w:i/>
+          <w:color w:val="555555"/>
+        </w:rPr>
+        <w:t>[DIREÇÃO: silêncio de 2 segundos. Igor parado, olhando pra câmera.]</w:t>
+      </w:r>
+    </w:p>
+    <w:p>
+      <w:r>
+        <w:rPr>
+          <w:i w:val="0"/>
+        </w:rPr>
         <w:t>Temperatura: 38,2. Taquicárdica. Pressão 18 por 10. Coração regular, pulmão limpo, abdome sem nada demais.</w:t>
       </w:r>
     </w:p>
@@ -1023,7 +1127,7 @@
         <w:rPr>
           <w:i w:val="0"/>
         </w:rPr>
-        <w:t>Você pensa infecção — e faz certo em pensar. Pede o pacote. Urina: limpa. Raio-X de tórax: normal. Hemograma: sem nada de infeccioso.</w:t>
+        <w:t>Você pensa infecção — e faz certo em pensar. Pede o pacote. Urina limpa. Raio-X normal. Hemograma sem nada de infeccioso.</w:t>
       </w:r>
     </w:p>
     <w:p>
@@ -1031,7 +1135,7 @@
         <w:rPr>
           <w:i w:val="0"/>
         </w:rPr>
-        <w:t>Febre, calafrio, taquicardia... e nenhum foco. O corpo dela está gritando outra coisa.</w:t>
+        <w:t>Só que o foco não aparece. (pausa) E tem um detalhe que muda tudo.</w:t>
       </w:r>
     </w:p>
     <w:p>
@@ -1039,7 +1143,7 @@
         <w:rPr>
           <w:i w:val="0"/>
         </w:rPr>
-        <w:t>Tem um detalhe no rosto e no peso que muda completamente o rumo desse caso. Interno... o que você examinaria agora? Comenta.</w:t>
+        <w:t>E você... (pausa) ...o que examinaria agora? Comenta.</w:t>
       </w:r>
     </w:p>
     <w:p>
@@ -1072,7 +1176,7 @@
           <w:b/>
           <w:color w:val="5B21B6"/>
         </w:rPr>
-        <w:t>QUINTA-FEIRA · 20H</w:t>
+        <w:t>QUINTA · 20H</w:t>
       </w:r>
     </w:p>
     <w:p>
@@ -1081,7 +1185,7 @@
           <w:b/>
           <w:color w:val="555555"/>
         </w:rPr>
-        <w:t>LEGENDA DO POST (padrão da série)</w:t>
+        <w:t>LEGENDA DO POST</w:t>
       </w:r>
     </w:p>
     <w:p>
@@ -1089,7 +1193,7 @@
         <w:rPr>
           <w:i w:val="0"/>
         </w:rPr>
-        <w:t>🚨 CASO #002</w:t>
+        <w:t>🚨 PLANTÃO #002 · Ela Não Para Quieta</w:t>
       </w:r>
     </w:p>
     <w:p>
@@ -1129,7 +1233,7 @@
         <w:rPr>
           <w:i w:val="0"/>
         </w:rPr>
-        <w:t>Qual é o próximo passo?</w:t>
+        <w:t>E você — qual é o próximo passo?</w:t>
       </w:r>
     </w:p>
     <w:p>
@@ -1137,7 +1241,7 @@
         <w:rPr>
           <w:i w:val="0"/>
         </w:rPr>
-        <w:t>👇 Quero ler sua conduta antes da resposta de quinta.</w:t>
+        <w:t>👇 Quero ler sua conduta antes do debrief de quinta.</w:t>
       </w:r>
     </w:p>
     <w:p>
@@ -1161,7 +1265,7 @@
           <w:b/>
           <w:color w:val="555555"/>
         </w:rPr>
-        <w:t>COMENTÁRIO FIXADO (você posta e fixa)</w:t>
+        <w:t>COMENTÁRIO FIXADO</w:t>
       </w:r>
     </w:p>
     <w:p>
@@ -1169,7 +1273,7 @@
         <w:rPr>
           <w:i w:val="0"/>
         </w:rPr>
-        <w:t>Pista da série: febre sem foco nem sempre é infecção. 🧠 Qual sua hipótese? Comenta antes de quinta. 👇</w:t>
+        <w:t>Pista da série: febre sem foco nem sempre é infecção. 🧠 Qual sua hipótese? Comenta antes do debrief de quinta. 👇</w:t>
       </w:r>
     </w:p>
     <w:p>
@@ -1190,7 +1294,7 @@
           <w:color w:val="5B21B6"/>
           <w:sz w:val="30"/>
         </w:rPr>
-        <w:t>PARTE 2 — QUINTA (A RESPOSTA · debrief de corredor)</w:t>
+        <w:t>🩺 DEBRIEF — QUINTA (a discussão de corredor)</w:t>
       </w:r>
     </w:p>
     <w:p>
@@ -1199,7 +1303,7 @@
           <w:b/>
           <w:color w:val="555555"/>
         </w:rPr>
-        <w:t>CAPA (mesma, com selo "RESPOSTA" no canto)</w:t>
+        <w:t>CAPA (mesma, com 🩺 e "DEBRIEF")</w:t>
       </w:r>
     </w:p>
     <w:p>
@@ -1212,7 +1316,7 @@
           <w:color w:val="555555"/>
           <w:sz w:val="20"/>
         </w:rPr>
-        <w:t>🚨</w:t>
+        <w:t>🩺</w:t>
       </w:r>
     </w:p>
     <w:p>
@@ -1251,7 +1355,7 @@
           <w:color w:val="555555"/>
           <w:sz w:val="20"/>
         </w:rPr>
-        <w:t>EP.02 · RESPOSTA</w:t>
+        <w:t>DEBRIEF #002</w:t>
       </w:r>
     </w:p>
     <w:p>
@@ -1281,7 +1385,7 @@
         <w:rPr>
           <w:i w:val="0"/>
         </w:rPr>
-        <w:t>Interno. Sobre o plantão de terça.</w:t>
+        <w:t>Interno... (pausa) sobre o plantão de terça.</w:t>
       </w:r>
     </w:p>
     <w:p>
@@ -1289,7 +1393,7 @@
         <w:rPr>
           <w:i w:val="0"/>
         </w:rPr>
-        <w:t>"Vi muita gente fechando sepse e caçando um foco." (pausa) "Mas o foco não existia." (pausa) "A pista estava no rosto."</w:t>
+        <w:t>"Vi muita gente fechando sepse e caçando um foco."</w:t>
       </w:r>
     </w:p>
     <w:p>
@@ -1297,7 +1401,7 @@
         <w:rPr>
           <w:i w:val="0"/>
         </w:rPr>
-        <w:t>Olhos saltados, exoftalmia. E emagrecida. Pede a tireoide: TSH baixo, T4 alto.</w:t>
+        <w:t>(pausa) "Mas o foco não existia."</w:t>
       </w:r>
     </w:p>
     <w:p>
@@ -1305,7 +1409,7 @@
         <w:rPr>
           <w:i w:val="0"/>
         </w:rPr>
-        <w:t>É crise tireotóxica. Agitação, febre, taquicardia e diarreia que imitam infecção — mas é a tireoide a mil.</w:t>
+        <w:t>(pausa) "Olhar pro rosto dela."</w:t>
       </w:r>
     </w:p>
     <w:p>
@@ -1313,7 +1417,7 @@
         <w:rPr>
           <w:i w:val="0"/>
         </w:rPr>
-        <w:t>A lição não é decorar tireotoxicose. É que febre sem foco te obriga a olhar o paciente inteiro antes de fechar.</w:t>
+        <w:t>(pausa) "Cinco segundos."</w:t>
       </w:r>
     </w:p>
     <w:p>
@@ -1321,7 +1425,23 @@
         <w:rPr>
           <w:i w:val="0"/>
         </w:rPr>
-        <w:t>Interno... você tinha olhado pros olhos dela? Comenta.</w:t>
+        <w:t>(pausa) "Foi isso que mudou completamente o caso."</w:t>
+      </w:r>
+    </w:p>
+    <w:p>
+      <w:r>
+        <w:rPr>
+          <w:i w:val="0"/>
+        </w:rPr>
+        <w:t>Olhos saltados, exoftalmia. E emagrecida. Pede a tireoide: TSH baixo, T4 alto. É crise tireotóxica.</w:t>
+      </w:r>
+    </w:p>
+    <w:p>
+      <w:r>
+        <w:rPr>
+          <w:i w:val="0"/>
+        </w:rPr>
+        <w:t>Até terça. (pausa) Bom plantão, Interno.</w:t>
       </w:r>
     </w:p>
     <w:p>
@@ -1330,7 +1450,7 @@
           <w:b/>
           <w:color w:val="555555"/>
         </w:rPr>
-        <w:t>ENCERRAMENTO (tela preta — sempre igual)</w:t>
+        <w:t>LIÇÃO (cards na tela, ~2s cada)</w:t>
       </w:r>
     </w:p>
     <w:p>
@@ -1340,9 +1460,9 @@
       <w:r>
         <w:rPr>
           <w:b/>
-          <w:color w:val="5B21B6"/>
-        </w:rPr>
-        <w:t>"Terça que vem, novo plantão."</w:t>
+          <w:color w:val="555555"/>
+        </w:rPr>
+        <w:t>O QUE ESSE CASO ENSINOU?</w:t>
       </w:r>
     </w:p>
     <w:p>
@@ -1352,9 +1472,10 @@
       <w:r>
         <w:rPr>
           <w:b/>
-          <w:color w:val="5B21B6"/>
-        </w:rPr>
-        <w:t>TERÇA-FEIRA · 20H</w:t>
+          <w:color w:val="0F7B3F"/>
+          <w:sz w:val="26"/>
+        </w:rPr>
+        <w:t>Febre sem foco não é sempre infecção.</w:t>
       </w:r>
     </w:p>
     <w:p>
@@ -1363,62 +1484,19 @@
           <w:b/>
           <w:color w:val="555555"/>
         </w:rPr>
-        <w:t>LEGENDA DO POST (padrão da série)</w:t>
-      </w:r>
-    </w:p>
-    <w:p>
-      <w:r>
-        <w:rPr>
-          <w:i w:val="0"/>
-        </w:rPr>
-        <w:t>🚨 CASO #002 — RESPOSTA</w:t>
-      </w:r>
-    </w:p>
-    <w:p>
-      <w:r>
-        <w:rPr>
-          <w:i w:val="0"/>
-        </w:rPr>
-        <w:t>CRISE TIREOTÓXICA</w:t>
-      </w:r>
-    </w:p>
-    <w:p>
-      <w:r>
-        <w:rPr>
-          <w:i w:val="0"/>
-        </w:rPr>
-        <w:t>O foco infeccioso não existia. A pista estava no rosto: exoftalmia + emagrecimento → TSH baixo, T4 alto.</w:t>
-      </w:r>
-    </w:p>
-    <w:p>
-      <w:r>
-        <w:rPr>
-          <w:i w:val="0"/>
-        </w:rPr>
-        <w:t>Você tinha olhado pros olhos dela? 👇</w:t>
-      </w:r>
-    </w:p>
-    <w:p>
-      <w:r>
-        <w:rPr>
-          <w:i w:val="0"/>
-        </w:rPr>
-        <w:t>Salva pro seu próximo plantão.</w:t>
-      </w:r>
-    </w:p>
-    <w:p>
-      <w:r>
-        <w:rPr>
-          <w:i w:val="0"/>
-        </w:rPr>
-      </w:r>
-    </w:p>
-    <w:p>
-      <w:r>
-        <w:rPr>
-          <w:i w:val="0"/>
-        </w:rPr>
-        <w:t>#pendurajaleco #medicina #casoclinico #plantao #internato #residenciamedica #estudantedemedicina #emergencia</w:t>
+        <w:t>ENCERRAMENTO (tela preta — sempre igual)</w:t>
+      </w:r>
+    </w:p>
+    <w:p>
+      <w:pPr>
+        <w:jc w:val="center"/>
+      </w:pPr>
+      <w:r>
+        <w:rPr>
+          <w:b/>
+          <w:color w:val="5B21B6"/>
+        </w:rPr>
+        <w:t>TERÇA · 20H</w:t>
       </w:r>
     </w:p>
     <w:p>
@@ -1427,7 +1505,87 @@
           <w:b/>
           <w:color w:val="555555"/>
         </w:rPr>
-        <w:t>COMENTÁRIO FIXADO (você posta e fixa)</w:t>
+        <w:t>LEGENDA DO POST</w:t>
+      </w:r>
+    </w:p>
+    <w:p>
+      <w:r>
+        <w:rPr>
+          <w:i w:val="0"/>
+        </w:rPr>
+        <w:t>🩺 DEBRIEF #002 · Ela Não Para Quieta</w:t>
+      </w:r>
+    </w:p>
+    <w:p>
+      <w:r>
+        <w:rPr>
+          <w:i w:val="0"/>
+        </w:rPr>
+        <w:t>O debrief do Plantão #002 já está no ar.</w:t>
+      </w:r>
+    </w:p>
+    <w:p>
+      <w:r>
+        <w:rPr>
+          <w:i w:val="0"/>
+        </w:rPr>
+        <w:t>CRISE TIREOTÓXICA</w:t>
+      </w:r>
+    </w:p>
+    <w:p>
+      <w:r>
+        <w:rPr>
+          <w:i w:val="0"/>
+        </w:rPr>
+        <w:t>O foco infeccioso não existia. Cinco segundos olhando o rosto mudaram tudo: exoftalmia + emagrecimento → TSH baixo, T4 alto.</w:t>
+      </w:r>
+    </w:p>
+    <w:p>
+      <w:r>
+        <w:rPr>
+          <w:i w:val="0"/>
+        </w:rPr>
+        <w:t>Lição: Febre sem foco não é sempre infecção.</w:t>
+      </w:r>
+    </w:p>
+    <w:p>
+      <w:r>
+        <w:rPr>
+          <w:i w:val="0"/>
+        </w:rPr>
+        <w:t>E você, tinha olhado pros olhos dela? 👇</w:t>
+      </w:r>
+    </w:p>
+    <w:p>
+      <w:r>
+        <w:rPr>
+          <w:i w:val="0"/>
+        </w:rPr>
+        <w:t>Salva pro seu próximo plantão.</w:t>
+      </w:r>
+    </w:p>
+    <w:p>
+      <w:r>
+        <w:rPr>
+          <w:i w:val="0"/>
+        </w:rPr>
+      </w:r>
+    </w:p>
+    <w:p>
+      <w:r>
+        <w:rPr>
+          <w:i w:val="0"/>
+        </w:rPr>
+        <w:t>#pendurajaleco #medicina #casoclinico #plantao #internato #residenciamedica #estudantedemedicina #emergencia</w:t>
+      </w:r>
+    </w:p>
+    <w:p>
+      <w:r>
+        <w:rPr>
+          <w:b/>
+          <w:color w:val="555555"/>
+        </w:rPr>
+        <w:t>COMENTÁRIO FIXADO</w:t>
       </w:r>
     </w:p>
     <w:p>
@@ -1450,7 +1608,7 @@
           <w:color w:val="5B21B6"/>
           <w:sz w:val="40"/>
         </w:rPr>
-        <w:t>CASO #003 — "É Só Ansiedade"</w:t>
+        <w:t>PLANTÃO #003 — "É Só Ansiedade"</w:t>
       </w:r>
     </w:p>
     <w:p>
@@ -1480,7 +1638,7 @@
           <w:color w:val="5B21B6"/>
           <w:sz w:val="30"/>
         </w:rPr>
-        <w:t>PARTE 1 — TERÇA (O CASO)</w:t>
+        <w:t>🚨 PLANTÃO — TERÇA (o caso)</w:t>
       </w:r>
     </w:p>
     <w:p>
@@ -1541,7 +1699,7 @@
           <w:color w:val="555555"/>
           <w:sz w:val="20"/>
         </w:rPr>
-        <w:t>EP.03</w:t>
+        <w:t>PLANTÃO #003</w:t>
       </w:r>
     </w:p>
     <w:p>
@@ -1571,7 +1729,7 @@
         <w:rPr>
           <w:i w:val="0"/>
         </w:rPr>
-        <w:t>Interno. Seu plantão começou. Esse paciente é seu.</w:t>
+        <w:t>Interno... (pausa) Seu plantão começou. (pausa) Esse paciente é seu.</w:t>
       </w:r>
     </w:p>
     <w:p>
@@ -1579,7 +1737,7 @@
         <w:rPr>
           <w:i w:val="0"/>
         </w:rPr>
-        <w:t>Rapaz, 18 anos. Começou a trabalhar agora. Diagnóstico de burnout, crises de ansiedade. Já toma ansiolítico e antidepressivo. É a oitava vez que volta no pronto-socorro.</w:t>
+        <w:t>Rapaz. (pausa) Dezoito anos. (pausa) Começou a trabalhar agora.</w:t>
       </w:r>
     </w:p>
     <w:p>
@@ -1587,7 +1745,7 @@
         <w:rPr>
           <w:i w:val="0"/>
         </w:rPr>
-        <w:t>O que você quer saber primeiro? (pausa 1s)</w:t>
+        <w:t>Diagnóstico de burnout, crises de ansiedade. Já toma ansiolítico e antidepressivo. É a oitava vez que volta no pronto-socorro.</w:t>
       </w:r>
     </w:p>
     <w:p>
@@ -1595,6 +1753,23 @@
         <w:rPr>
           <w:i w:val="0"/>
         </w:rPr>
+        <w:t>O que você quer saber primeiro?</w:t>
+      </w:r>
+    </w:p>
+    <w:p>
+      <w:r>
+        <w:rPr>
+          <w:i/>
+          <w:color w:val="555555"/>
+        </w:rPr>
+        <w:t>[DIREÇÃO: silêncio de 2 segundos. Igor não fala, não sorri.]</w:t>
+      </w:r>
+    </w:p>
+    <w:p>
+      <w:r>
+        <w:rPr>
+          <w:i w:val="0"/>
+        </w:rPr>
         <w:t>Pressão: 20 por 16. Já em dois anti-hipertensivos — e não cede. Taquicardia. Dor de cabeça forte. Palpitação e suor... em crises. Tem hora que tá bem, tem hora que dispara.</w:t>
       </w:r>
     </w:p>
@@ -1611,7 +1786,15 @@
         <w:rPr>
           <w:i w:val="0"/>
         </w:rPr>
-        <w:t>Tem um padrão nas crises que muda completamente o rumo desse caso. Interno... o que você pensaria num jovem com pressão assim? Comenta.</w:t>
+        <w:t>Tem um padrão nas crises que muda tudo.</w:t>
+      </w:r>
+    </w:p>
+    <w:p>
+      <w:r>
+        <w:rPr>
+          <w:i w:val="0"/>
+        </w:rPr>
+        <w:t>E você... (pausa) ...o que pensaria num jovem com pressão assim? Comenta.</w:t>
       </w:r>
     </w:p>
     <w:p>
@@ -1644,7 +1827,7 @@
           <w:b/>
           <w:color w:val="5B21B6"/>
         </w:rPr>
-        <w:t>QUINTA-FEIRA · 20H</w:t>
+        <w:t>QUINTA · 20H</w:t>
       </w:r>
     </w:p>
     <w:p>
@@ -1653,7 +1836,7 @@
           <w:b/>
           <w:color w:val="555555"/>
         </w:rPr>
-        <w:t>LEGENDA DO POST (padrão da série)</w:t>
+        <w:t>LEGENDA DO POST</w:t>
       </w:r>
     </w:p>
     <w:p>
@@ -1661,7 +1844,7 @@
         <w:rPr>
           <w:i w:val="0"/>
         </w:rPr>
-        <w:t>🚨 CASO #003</w:t>
+        <w:t>🚨 PLANTÃO #003 · É Só Ansiedade</w:t>
       </w:r>
     </w:p>
     <w:p>
@@ -1701,7 +1884,7 @@
         <w:rPr>
           <w:i w:val="0"/>
         </w:rPr>
-        <w:t>Qual é o próximo passo?</w:t>
+        <w:t>E você — qual é o próximo passo?</w:t>
       </w:r>
     </w:p>
     <w:p>
@@ -1709,7 +1892,7 @@
         <w:rPr>
           <w:i w:val="0"/>
         </w:rPr>
-        <w:t>👇 Quero ler sua conduta antes da resposta de quinta.</w:t>
+        <w:t>👇 Quero ler sua conduta antes do debrief de quinta.</w:t>
       </w:r>
     </w:p>
     <w:p>
@@ -1733,7 +1916,7 @@
           <w:b/>
           <w:color w:val="555555"/>
         </w:rPr>
-        <w:t>COMENTÁRIO FIXADO (você posta e fixa)</w:t>
+        <w:t>COMENTÁRIO FIXADO</w:t>
       </w:r>
     </w:p>
     <w:p>
@@ -1741,7 +1924,7 @@
         <w:rPr>
           <w:i w:val="0"/>
         </w:rPr>
-        <w:t>Jovem + hipertensão grave que não cede ≠ ansiedade. 🧠 Comenta seu próximo passo antes de quinta. 👇</w:t>
+        <w:t>Jovem + hipertensão grave que não cede ≠ ansiedade. 🧠 Comenta seu próximo passo antes do debrief de quinta. 👇</w:t>
       </w:r>
     </w:p>
     <w:p>
@@ -1762,7 +1945,7 @@
           <w:color w:val="5B21B6"/>
           <w:sz w:val="30"/>
         </w:rPr>
-        <w:t>PARTE 2 — QUINTA (A RESPOSTA · debrief de corredor)</w:t>
+        <w:t>🩺 DEBRIEF — QUINTA (a discussão de corredor)</w:t>
       </w:r>
     </w:p>
     <w:p>
@@ -1771,7 +1954,7 @@
           <w:b/>
           <w:color w:val="555555"/>
         </w:rPr>
-        <w:t>CAPA (mesma, com selo "RESPOSTA" no canto)</w:t>
+        <w:t>CAPA (mesma, com 🩺 e "DEBRIEF")</w:t>
       </w:r>
     </w:p>
     <w:p>
@@ -1784,7 +1967,7 @@
           <w:color w:val="555555"/>
           <w:sz w:val="20"/>
         </w:rPr>
-        <w:t>🚨</w:t>
+        <w:t>🩺</w:t>
       </w:r>
     </w:p>
     <w:p>
@@ -1823,7 +2006,7 @@
           <w:color w:val="555555"/>
           <w:sz w:val="20"/>
         </w:rPr>
-        <w:t>EP.03 · RESPOSTA</w:t>
+        <w:t>DEBRIEF #003</w:t>
       </w:r>
     </w:p>
     <w:p>
@@ -1853,7 +2036,7 @@
         <w:rPr>
           <w:i w:val="0"/>
         </w:rPr>
-        <w:t>Interno. Sobre o plantão de terça.</w:t>
+        <w:t>Interno... (pausa) sobre o plantão de terça.</w:t>
       </w:r>
     </w:p>
     <w:p>
@@ -1861,7 +2044,7 @@
         <w:rPr>
           <w:i w:val="0"/>
         </w:rPr>
-        <w:t>"Vi muita gente seguindo o carimbo de ansiedade." (pausa) "Mas oito idas ao PS com pressão 20 por 16 pedem outra pergunta." (pausa) "Como vêm as crises?"</w:t>
+        <w:t>"Vi muita gente seguindo o carimbo de ansiedade."</w:t>
       </w:r>
     </w:p>
     <w:p>
@@ -1869,7 +2052,7 @@
         <w:rPr>
           <w:i w:val="0"/>
         </w:rPr>
-        <w:t>Dor de cabeça, palpitação e sudorese — juntas, em ondas. Num jovem com hipertensão que não responde, isso tem nome.</w:t>
+        <w:t>(pausa) "Mas oito idas ao PS com pressão 20 por 16 pedem outra pergunta."</w:t>
       </w:r>
     </w:p>
     <w:p>
@@ -1877,7 +2060,7 @@
         <w:rPr>
           <w:i w:val="0"/>
         </w:rPr>
-        <w:t>É feocromocitoma. O que parecia pânico era adrenalina despejada por um tumor.</w:t>
+        <w:t>(pausa) "Como vêm as crises?"</w:t>
       </w:r>
     </w:p>
     <w:p>
@@ -1885,7 +2068,7 @@
         <w:rPr>
           <w:i w:val="0"/>
         </w:rPr>
-        <w:t>A lição não é decorar feocromocitoma. É que hipertensão grave no jovem merece investigação, não um carimbo.</w:t>
+        <w:t>(pausa) "Foi isso que mudou completamente o caso."</w:t>
       </w:r>
     </w:p>
     <w:p>
@@ -1893,7 +2076,15 @@
         <w:rPr>
           <w:i w:val="0"/>
         </w:rPr>
-        <w:t>Interno... quantas vezes a gente quase carimba antes de pensar? Comenta.</w:t>
+        <w:t>Dor de cabeça, palpitação e sudorese — juntas, em ondas. Isso é feocromocitoma. O que parecia pânico era adrenalina de um tumor.</w:t>
+      </w:r>
+    </w:p>
+    <w:p>
+      <w:r>
+        <w:rPr>
+          <w:i w:val="0"/>
+        </w:rPr>
+        <w:t>Até terça. (pausa) Bom plantão, Interno.</w:t>
       </w:r>
     </w:p>
     <w:p>
@@ -1902,7 +2093,7 @@
           <w:b/>
           <w:color w:val="555555"/>
         </w:rPr>
-        <w:t>ENCERRAMENTO (tela preta — sempre igual)</w:t>
+        <w:t>LIÇÃO (cards na tela, ~2s cada)</w:t>
       </w:r>
     </w:p>
     <w:p>
@@ -1912,9 +2103,9 @@
       <w:r>
         <w:rPr>
           <w:b/>
-          <w:color w:val="5B21B6"/>
-        </w:rPr>
-        <w:t>"Terça que vem, novo plantão."</w:t>
+          <w:color w:val="555555"/>
+        </w:rPr>
+        <w:t>O QUE ESSE CASO ENSINOU?</w:t>
       </w:r>
     </w:p>
     <w:p>
@@ -1924,9 +2115,10 @@
       <w:r>
         <w:rPr>
           <w:b/>
-          <w:color w:val="5B21B6"/>
-        </w:rPr>
-        <w:t>TERÇA-FEIRA · 20H</w:t>
+          <w:color w:val="0F7B3F"/>
+          <w:sz w:val="26"/>
+        </w:rPr>
+        <w:t>Hipertensão grave no jovem você investiga, não carimba.</w:t>
       </w:r>
     </w:p>
     <w:p>
@@ -1935,62 +2127,19 @@
           <w:b/>
           <w:color w:val="555555"/>
         </w:rPr>
-        <w:t>LEGENDA DO POST (padrão da série)</w:t>
-      </w:r>
-    </w:p>
-    <w:p>
-      <w:r>
-        <w:rPr>
-          <w:i w:val="0"/>
-        </w:rPr>
-        <w:t>🚨 CASO #003 — RESPOSTA</w:t>
-      </w:r>
-    </w:p>
-    <w:p>
-      <w:r>
-        <w:rPr>
-          <w:i w:val="0"/>
-        </w:rPr>
-        <w:t>FEOCROMOCITOMA</w:t>
-      </w:r>
-    </w:p>
-    <w:p>
-      <w:r>
-        <w:rPr>
-          <w:i w:val="0"/>
-        </w:rPr>
-        <w:t>Não era pânico — era adrenalina de um tumor. Cefaleia + palpitação + sudorese, em crises, num jovem com HAS refratária.</w:t>
-      </w:r>
-    </w:p>
-    <w:p>
-      <w:r>
-        <w:rPr>
-          <w:i w:val="0"/>
-        </w:rPr>
-        <w:t>Quantas vezes a gente quase carimba? 👇</w:t>
-      </w:r>
-    </w:p>
-    <w:p>
-      <w:r>
-        <w:rPr>
-          <w:i w:val="0"/>
-        </w:rPr>
-        <w:t>Salva pro seu próximo plantão.</w:t>
-      </w:r>
-    </w:p>
-    <w:p>
-      <w:r>
-        <w:rPr>
-          <w:i w:val="0"/>
-        </w:rPr>
-      </w:r>
-    </w:p>
-    <w:p>
-      <w:r>
-        <w:rPr>
-          <w:i w:val="0"/>
-        </w:rPr>
-        <w:t>#pendurajaleco #medicina #casoclinico #plantao #internato #residenciamedica #estudantedemedicina #emergencia</w:t>
+        <w:t>ENCERRAMENTO (tela preta — sempre igual)</w:t>
+      </w:r>
+    </w:p>
+    <w:p>
+      <w:pPr>
+        <w:jc w:val="center"/>
+      </w:pPr>
+      <w:r>
+        <w:rPr>
+          <w:b/>
+          <w:color w:val="5B21B6"/>
+        </w:rPr>
+        <w:t>TERÇA · 20H</w:t>
       </w:r>
     </w:p>
     <w:p>
@@ -1999,7 +2148,87 @@
           <w:b/>
           <w:color w:val="555555"/>
         </w:rPr>
-        <w:t>COMENTÁRIO FIXADO (você posta e fixa)</w:t>
+        <w:t>LEGENDA DO POST</w:t>
+      </w:r>
+    </w:p>
+    <w:p>
+      <w:r>
+        <w:rPr>
+          <w:i w:val="0"/>
+        </w:rPr>
+        <w:t>🩺 DEBRIEF #003 · É Só Ansiedade</w:t>
+      </w:r>
+    </w:p>
+    <w:p>
+      <w:r>
+        <w:rPr>
+          <w:i w:val="0"/>
+        </w:rPr>
+        <w:t>O debrief do Plantão #003 já está no ar.</w:t>
+      </w:r>
+    </w:p>
+    <w:p>
+      <w:r>
+        <w:rPr>
+          <w:i w:val="0"/>
+        </w:rPr>
+        <w:t>FEOCROMOCITOMA</w:t>
+      </w:r>
+    </w:p>
+    <w:p>
+      <w:r>
+        <w:rPr>
+          <w:i w:val="0"/>
+        </w:rPr>
+        <w:t>Não era pânico — era adrenalina de um tumor. Uma pergunta ("como vêm as crises?") mudou tudo: cefaleia + palpitação + sudorese, em ondas.</w:t>
+      </w:r>
+    </w:p>
+    <w:p>
+      <w:r>
+        <w:rPr>
+          <w:i w:val="0"/>
+        </w:rPr>
+        <w:t>Lição: Hipertensão grave no jovem você investiga, não carimba.</w:t>
+      </w:r>
+    </w:p>
+    <w:p>
+      <w:r>
+        <w:rPr>
+          <w:i w:val="0"/>
+        </w:rPr>
+        <w:t>E você, quantas vezes quase carimba antes de pensar? 👇</w:t>
+      </w:r>
+    </w:p>
+    <w:p>
+      <w:r>
+        <w:rPr>
+          <w:i w:val="0"/>
+        </w:rPr>
+        <w:t>Salva pro seu próximo plantão.</w:t>
+      </w:r>
+    </w:p>
+    <w:p>
+      <w:r>
+        <w:rPr>
+          <w:i w:val="0"/>
+        </w:rPr>
+      </w:r>
+    </w:p>
+    <w:p>
+      <w:r>
+        <w:rPr>
+          <w:i w:val="0"/>
+        </w:rPr>
+        <w:t>#pendurajaleco #medicina #casoclinico #plantao #internato #residenciamedica #estudantedemedicina #emergencia</w:t>
+      </w:r>
+    </w:p>
+    <w:p>
+      <w:r>
+        <w:rPr>
+          <w:b/>
+          <w:color w:val="555555"/>
+        </w:rPr>
+        <w:t>COMENTÁRIO FIXADO</w:t>
       </w:r>
     </w:p>
     <w:p>
@@ -2022,7 +2251,7 @@
           <w:color w:val="5B21B6"/>
           <w:sz w:val="40"/>
         </w:rPr>
-        <w:t>CASO #004 — "O Paciente Não Fala"</w:t>
+        <w:t>PLANTÃO #004 — "O Paciente Não Fala"</w:t>
       </w:r>
     </w:p>
     <w:p>
@@ -2052,7 +2281,7 @@
           <w:color w:val="5B21B6"/>
           <w:sz w:val="30"/>
         </w:rPr>
-        <w:t>PARTE 1 — TERÇA (O CASO)</w:t>
+        <w:t>🚨 PLANTÃO — TERÇA (o caso)</w:t>
       </w:r>
     </w:p>
     <w:p>
@@ -2113,7 +2342,7 @@
           <w:color w:val="555555"/>
           <w:sz w:val="20"/>
         </w:rPr>
-        <w:t>EP.04</w:t>
+        <w:t>PLANTÃO #004</w:t>
       </w:r>
     </w:p>
     <w:p>
@@ -2143,7 +2372,7 @@
         <w:rPr>
           <w:i w:val="0"/>
         </w:rPr>
-        <w:t>Interno. Seu plantão começou. Esse paciente é seu.</w:t>
+        <w:t>Interno... (pausa) Seu plantão começou. (pausa) Esse paciente é seu.</w:t>
       </w:r>
     </w:p>
     <w:p>
@@ -2151,7 +2380,7 @@
         <w:rPr>
           <w:i w:val="0"/>
         </w:rPr>
-        <w:t>Você é o cirurgião. A pediatria te chama pra ver uma criança com dor na barriga. Mas ela tem 9 meses. Não fala. Não te conta nada.</w:t>
+        <w:t>Você é o cirurgião. A pediatria te chama pra ver uma criança com dor na barriga.</w:t>
       </w:r>
     </w:p>
     <w:p>
@@ -2159,7 +2388,7 @@
         <w:rPr>
           <w:i w:val="0"/>
         </w:rPr>
-        <w:t>O que você quer saber primeiro? (pausa 1s)</w:t>
+        <w:t>Mas ela tem... (pausa) nove meses. (pausa) Não fala. Não te conta nada.</w:t>
       </w:r>
     </w:p>
     <w:p>
@@ -2167,6 +2396,23 @@
         <w:rPr>
           <w:i w:val="0"/>
         </w:rPr>
+        <w:t>O que você quer saber primeiro?</w:t>
+      </w:r>
+    </w:p>
+    <w:p>
+      <w:r>
+        <w:rPr>
+          <w:i/>
+          <w:color w:val="555555"/>
+        </w:rPr>
+        <w:t>[DIREÇÃO: silêncio de 2 segundos. Igor parado, olhando pra câmera.]</w:t>
+      </w:r>
+    </w:p>
+    <w:p>
+      <w:r>
+        <w:rPr>
+          <w:i w:val="0"/>
+        </w:rPr>
         <w:t>A dor vem em ondas. Ela chora, contrai, faz cara de dor... e acalma. Daqui a pouco, volta tudo. Já vomitou. Tá um pouco hipotensa.</w:t>
       </w:r>
     </w:p>
@@ -2183,7 +2429,15 @@
         <w:rPr>
           <w:i w:val="0"/>
         </w:rPr>
-        <w:t>Tem um exame que é fácil de pular no bebê — e que muda completamente o rumo do caso. Interno... qual exame você faria agora? Comenta.</w:t>
+        <w:t>Tem um exame que é fácil de pular no bebê — e que muda tudo.</w:t>
+      </w:r>
+    </w:p>
+    <w:p>
+      <w:r>
+        <w:rPr>
+          <w:i w:val="0"/>
+        </w:rPr>
+        <w:t>E você... (pausa) ...qual exame faria agora? Comenta.</w:t>
       </w:r>
     </w:p>
     <w:p>
@@ -2216,7 +2470,7 @@
           <w:b/>
           <w:color w:val="5B21B6"/>
         </w:rPr>
-        <w:t>QUINTA-FEIRA · 20H</w:t>
+        <w:t>QUINTA · 20H</w:t>
       </w:r>
     </w:p>
     <w:p>
@@ -2225,7 +2479,7 @@
           <w:b/>
           <w:color w:val="555555"/>
         </w:rPr>
-        <w:t>LEGENDA DO POST (padrão da série)</w:t>
+        <w:t>LEGENDA DO POST</w:t>
       </w:r>
     </w:p>
     <w:p>
@@ -2233,7 +2487,7 @@
         <w:rPr>
           <w:i w:val="0"/>
         </w:rPr>
-        <w:t>🚨 CASO #004</w:t>
+        <w:t>🚨 PLANTÃO #004 · O Paciente Não Fala</w:t>
       </w:r>
     </w:p>
     <w:p>
@@ -2273,7 +2527,7 @@
         <w:rPr>
           <w:i w:val="0"/>
         </w:rPr>
-        <w:t>Qual é o próximo passo?</w:t>
+        <w:t>E você — qual é o próximo passo?</w:t>
       </w:r>
     </w:p>
     <w:p>
@@ -2281,7 +2535,7 @@
         <w:rPr>
           <w:i w:val="0"/>
         </w:rPr>
-        <w:t>👇 Quero ler sua conduta antes da resposta de quinta.</w:t>
+        <w:t>👇 Quero ler sua conduta antes do debrief de quinta.</w:t>
       </w:r>
     </w:p>
     <w:p>
@@ -2305,7 +2559,7 @@
           <w:b/>
           <w:color w:val="555555"/>
         </w:rPr>
-        <w:t>COMENTÁRIO FIXADO (você posta e fixa)</w:t>
+        <w:t>COMENTÁRIO FIXADO</w:t>
       </w:r>
     </w:p>
     <w:p>
@@ -2313,7 +2567,7 @@
         <w:rPr>
           <w:i w:val="0"/>
         </w:rPr>
-        <w:t>Quando o paciente não fala, o exame fala por ele. 🧠 Qual exame você não pularia? Comenta antes de quinta. 👇</w:t>
+        <w:t>Quando o paciente não fala, o exame fala por ele. 🧠 Qual exame você não pularia? Comenta antes do debrief de quinta. 👇</w:t>
       </w:r>
     </w:p>
     <w:p>
@@ -2334,7 +2588,7 @@
           <w:color w:val="5B21B6"/>
           <w:sz w:val="30"/>
         </w:rPr>
-        <w:t>PARTE 2 — QUINTA (A RESPOSTA · debrief de corredor)</w:t>
+        <w:t>🩺 DEBRIEF — QUINTA (a discussão de corredor)</w:t>
       </w:r>
     </w:p>
     <w:p>
@@ -2343,7 +2597,7 @@
           <w:b/>
           <w:color w:val="555555"/>
         </w:rPr>
-        <w:t>CAPA (mesma, com selo "RESPOSTA" no canto)</w:t>
+        <w:t>CAPA (mesma, com 🩺 e "DEBRIEF")</w:t>
       </w:r>
     </w:p>
     <w:p>
@@ -2356,7 +2610,7 @@
           <w:color w:val="555555"/>
           <w:sz w:val="20"/>
         </w:rPr>
-        <w:t>🚨</w:t>
+        <w:t>🩺</w:t>
       </w:r>
     </w:p>
     <w:p>
@@ -2395,7 +2649,7 @@
           <w:color w:val="555555"/>
           <w:sz w:val="20"/>
         </w:rPr>
-        <w:t>EP.04 · RESPOSTA</w:t>
+        <w:t>DEBRIEF #004</w:t>
       </w:r>
     </w:p>
     <w:p>
@@ -2425,7 +2679,7 @@
         <w:rPr>
           <w:i w:val="0"/>
         </w:rPr>
-        <w:t>Interno. Sobre o plantão de terça.</w:t>
+        <w:t>Interno... (pausa) sobre o plantão de terça.</w:t>
       </w:r>
     </w:p>
     <w:p>
@@ -2433,7 +2687,7 @@
         <w:rPr>
           <w:i w:val="0"/>
         </w:rPr>
-        <w:t>"Vi muita gente indo direto pro ultrassom." (pausa) "E ele ajuda." (pausa) "Mas quem entregou foi o toque retal."</w:t>
+        <w:t>"Vi muita gente indo direto pro ultrassom."</w:t>
       </w:r>
     </w:p>
     <w:p>
@@ -2441,7 +2695,7 @@
         <w:rPr>
           <w:i w:val="0"/>
         </w:rPr>
-        <w:t>Fezes em geleia de framboesa. Isso é intussuscepção.</w:t>
+        <w:t>(pausa) "E ele ajuda."</w:t>
       </w:r>
     </w:p>
     <w:p>
@@ -2449,7 +2703,7 @@
         <w:rPr>
           <w:i w:val="0"/>
         </w:rPr>
-        <w:t>Bebê de 6 meses a 2 anos, dor em ondas (para até de brincar, chora, melhora), às vezes uma massa em forma de salsicha. O ultrassom confirma: sinal do alvo.</w:t>
+        <w:t>(pausa) "Mas quem entregou foi o toque retal."</w:t>
       </w:r>
     </w:p>
     <w:p>
@@ -2457,7 +2711,7 @@
         <w:rPr>
           <w:i w:val="0"/>
         </w:rPr>
-        <w:t>A lição não é decorar intussuscepção. É que, quando o paciente não fala, o exame fala por ele. Não pule o básico.</w:t>
+        <w:t>(pausa) "Dez segundos."</w:t>
       </w:r>
     </w:p>
     <w:p>
@@ -2465,7 +2719,23 @@
         <w:rPr>
           <w:i w:val="0"/>
         </w:rPr>
-        <w:t>Interno... você teria feito o toque? Comenta.</w:t>
+        <w:t>(pausa) "Foi isso que mudou completamente o caso."</w:t>
+      </w:r>
+    </w:p>
+    <w:p>
+      <w:r>
+        <w:rPr>
+          <w:i w:val="0"/>
+        </w:rPr>
+        <w:t>Fezes em geleia de framboesa. Isso é intussuscepção. Bebê de 6 meses a 2 anos, dor em ondas, às vezes massa em salsicha. O ultrassom confirma: sinal do alvo.</w:t>
+      </w:r>
+    </w:p>
+    <w:p>
+      <w:r>
+        <w:rPr>
+          <w:i w:val="0"/>
+        </w:rPr>
+        <w:t>Até terça. (pausa) Bom plantão, Interno.</w:t>
       </w:r>
     </w:p>
     <w:p>
@@ -2474,7 +2744,7 @@
           <w:b/>
           <w:color w:val="555555"/>
         </w:rPr>
-        <w:t>ENCERRAMENTO (tela preta — sempre igual)</w:t>
+        <w:t>LIÇÃO (cards na tela, ~2s cada)</w:t>
       </w:r>
     </w:p>
     <w:p>
@@ -2484,9 +2754,9 @@
       <w:r>
         <w:rPr>
           <w:b/>
-          <w:color w:val="5B21B6"/>
-        </w:rPr>
-        <w:t>"Terça que vem, novo plantão."</w:t>
+          <w:color w:val="555555"/>
+        </w:rPr>
+        <w:t>O QUE ESSE CASO ENSINOU?</w:t>
       </w:r>
     </w:p>
     <w:p>
@@ -2496,9 +2766,10 @@
       <w:r>
         <w:rPr>
           <w:b/>
-          <w:color w:val="5B21B6"/>
-        </w:rPr>
-        <w:t>TERÇA-FEIRA · 20H</w:t>
+          <w:color w:val="0F7B3F"/>
+          <w:sz w:val="26"/>
+        </w:rPr>
+        <w:t>Quando o paciente não fala, examine. O básico fala por ele.</w:t>
       </w:r>
     </w:p>
     <w:p>
@@ -2507,62 +2778,19 @@
           <w:b/>
           <w:color w:val="555555"/>
         </w:rPr>
-        <w:t>LEGENDA DO POST (padrão da série)</w:t>
-      </w:r>
-    </w:p>
-    <w:p>
-      <w:r>
-        <w:rPr>
-          <w:i w:val="0"/>
-        </w:rPr>
-        <w:t>🚨 CASO #004 — RESPOSTA</w:t>
-      </w:r>
-    </w:p>
-    <w:p>
-      <w:r>
-        <w:rPr>
-          <w:i w:val="0"/>
-        </w:rPr>
-        <w:t>INTUSSUSCEPÇÃO</w:t>
-      </w:r>
-    </w:p>
-    <w:p>
-      <w:r>
-        <w:rPr>
-          <w:i w:val="0"/>
-        </w:rPr>
-        <w:t>O ultrassom confirma (sinal do alvo), mas quem entregou foi o toque: geleia de framboesa. Bebê 6m–2a + dor em ondas.</w:t>
-      </w:r>
-    </w:p>
-    <w:p>
-      <w:r>
-        <w:rPr>
-          <w:i w:val="0"/>
-        </w:rPr>
-        <w:t>Você teria feito o toque? 👇</w:t>
-      </w:r>
-    </w:p>
-    <w:p>
-      <w:r>
-        <w:rPr>
-          <w:i w:val="0"/>
-        </w:rPr>
-        <w:t>Salva pro seu próximo plantão.</w:t>
-      </w:r>
-    </w:p>
-    <w:p>
-      <w:r>
-        <w:rPr>
-          <w:i w:val="0"/>
-        </w:rPr>
-      </w:r>
-    </w:p>
-    <w:p>
-      <w:r>
-        <w:rPr>
-          <w:i w:val="0"/>
-        </w:rPr>
-        <w:t>#pendurajaleco #medicina #casoclinico #plantao #internato #residenciamedica #estudantedemedicina #emergencia</w:t>
+        <w:t>ENCERRAMENTO (tela preta — sempre igual)</w:t>
+      </w:r>
+    </w:p>
+    <w:p>
+      <w:pPr>
+        <w:jc w:val="center"/>
+      </w:pPr>
+      <w:r>
+        <w:rPr>
+          <w:b/>
+          <w:color w:val="5B21B6"/>
+        </w:rPr>
+        <w:t>TERÇA · 20H</w:t>
       </w:r>
     </w:p>
     <w:p>
@@ -2571,7 +2799,87 @@
           <w:b/>
           <w:color w:val="555555"/>
         </w:rPr>
-        <w:t>COMENTÁRIO FIXADO (você posta e fixa)</w:t>
+        <w:t>LEGENDA DO POST</w:t>
+      </w:r>
+    </w:p>
+    <w:p>
+      <w:r>
+        <w:rPr>
+          <w:i w:val="0"/>
+        </w:rPr>
+        <w:t>🩺 DEBRIEF #004 · O Paciente Não Fala</w:t>
+      </w:r>
+    </w:p>
+    <w:p>
+      <w:r>
+        <w:rPr>
+          <w:i w:val="0"/>
+        </w:rPr>
+        <w:t>O debrief do Plantão #004 já está no ar.</w:t>
+      </w:r>
+    </w:p>
+    <w:p>
+      <w:r>
+        <w:rPr>
+          <w:i w:val="0"/>
+        </w:rPr>
+        <w:t>INTUSSUSCEPÇÃO</w:t>
+      </w:r>
+    </w:p>
+    <w:p>
+      <w:r>
+        <w:rPr>
+          <w:i w:val="0"/>
+        </w:rPr>
+        <w:t>O ultrassom confirma (sinal do alvo), mas quem entregou foi o toque: geleia de framboesa. Bebê 6m–2a + dor em ondas.</w:t>
+      </w:r>
+    </w:p>
+    <w:p>
+      <w:r>
+        <w:rPr>
+          <w:i w:val="0"/>
+        </w:rPr>
+        <w:t>Lição: Quando o paciente não fala, examine. O básico fala por ele.</w:t>
+      </w:r>
+    </w:p>
+    <w:p>
+      <w:r>
+        <w:rPr>
+          <w:i w:val="0"/>
+        </w:rPr>
+        <w:t>E você, teria feito o toque? 👇</w:t>
+      </w:r>
+    </w:p>
+    <w:p>
+      <w:r>
+        <w:rPr>
+          <w:i w:val="0"/>
+        </w:rPr>
+        <w:t>Salva pro seu próximo plantão.</w:t>
+      </w:r>
+    </w:p>
+    <w:p>
+      <w:r>
+        <w:rPr>
+          <w:i w:val="0"/>
+        </w:rPr>
+      </w:r>
+    </w:p>
+    <w:p>
+      <w:r>
+        <w:rPr>
+          <w:i w:val="0"/>
+        </w:rPr>
+        <w:t>#pendurajaleco #medicina #casoclinico #plantao #internato #residenciamedica #estudantedemedicina #emergencia</w:t>
+      </w:r>
+    </w:p>
+    <w:p>
+      <w:r>
+        <w:rPr>
+          <w:b/>
+          <w:color w:val="555555"/>
+        </w:rPr>
+        <w:t>COMENTÁRIO FIXADO</w:t>
       </w:r>
     </w:p>
     <w:p>
@@ -2627,7 +2935,7 @@
         <w:rPr>
           <w:i w:val="0"/>
         </w:rPr>
-        <w:t>2. Comentários com conduta ("eu pediria...", "palparia o pulso") vs. comentários leigos. Qualidade &gt; quantidade.</w:t>
+        <w:t>2. Comentários com conduta ("eu palparia o pulso", "pediria TSH") vs. comentários leigos. Qualidade &gt; quantidade.</w:t>
       </w:r>
     </w:p>
     <w:p>
@@ -2635,7 +2943,7 @@
         <w:rPr>
           <w:i w:val="0"/>
         </w:rPr>
-        <w:t>3. Atividade no perfil / visitas — interno que volta na quinta pra ver a resposta é quem constrói a base.</w:t>
+        <w:t>3. Atividade no perfil / visitas — interno que volta na quinta pro debrief é quem constrói a base.</w:t>
       </w:r>
     </w:p>
     <w:p>
@@ -2643,7 +2951,7 @@
         <w:rPr>
           <w:i w:val="0"/>
         </w:rPr>
-        <w:t>4. Retenção entre terça e quinta — quantos que viram o caso voltam pra resposta.</w:t>
+        <w:t>4. Retenção entre PLANTÃO (terça) e DEBRIEF (quinta).</w:t>
       </w:r>
     </w:p>
     <w:p>
@@ -2660,7 +2968,7 @@
         <w:rPr>
           <w:i w:val="0"/>
         </w:rPr>
-        <w:t>Views caem MAS salvamento e comentário-de-conduta sobem → o formato funcionou, só mudou de público. Cai tudo junto → o problema é o gancho dos 3 primeiros segundos, não o conceito.</w:t>
+        <w:t>Views caem MAS salvamento e comentário-de-conduta sobem → funcionou, só mudou de público. Cai tudo junto → o problema é o gancho dos 3 primeiros segundos, não o conceito.</w:t>
       </w:r>
     </w:p>
     <w:sectPr>

</xml_diff>

<commit_message>
Lock series format: SEU PLANTAO brand, cycle close, REGRAS page
Rebrand to 'SEU PLANTAO' + 'Caso #00X'. Close the narrative loop
('Esse paciente e seu' -> 'Pode ir... esse paciente ja nao e mais
seu'). Switch CTA from 'conduta' to 'por onde voce comecaria'. Reframe
the debrief beat to sell the discipline (exame fisico / anamnese), not
the single maneuver. Add a REGRAS DA SERIE page (never/always do).

Co-Authored-By: Claude Opus 4.8 <noreply@anthropic.com>
Claude-Session: https://claude.ai/code/session_019ZEAXjZZitDeGUTgpg3SRV
</commit_message>
<xml_diff>
--- a/SEU_PLANTAO_COMECOU_mes_de_teste.docx
+++ b/SEU_PLANTAO_COMECOU_mes_de_teste.docx
@@ -9,7 +9,7 @@
           <w:color w:val="5B21B6"/>
           <w:sz w:val="40"/>
         </w:rPr>
-        <w:t>🚨 SEU PLANTÃO COMEÇOU</w:t>
+        <w:t>🚨 SEU PLANTÃO</w:t>
       </w:r>
     </w:p>
     <w:p>
@@ -23,12 +23,12 @@
     </w:p>
     <w:p>
       <w:r>
-        <w:t>Pendura Jaleco · Mês de teste · 4 plantões / 8 posts</w:t>
-      </w:r>
-    </w:p>
-    <w:p>
-      <w:r>
-        <w:t>TERÇA = 🚨 PLANTÃO (o caso)   ·   QUINTA = 🩺 DEBRIEF (a discussão)</w:t>
+        <w:t>Pendura Jaleco · Mês de teste · 4 casos / 8 posts</w:t>
+      </w:r>
+    </w:p>
+    <w:p>
+      <w:r>
+        <w:t>TERÇA = 🚨 SEU PLANTÃO (o caso)   ·   QUINTA = 🩺 DEBRIEF DO PLANTÃO (a discussão)</w:t>
       </w:r>
     </w:p>
     <w:p>
@@ -37,7 +37,7 @@
           <w:b/>
           <w:color w:val="555555"/>
         </w:rPr>
-        <w:t>ASSINATURA DA SÉRIE</w:t>
+        <w:t>O QUE É ISTO</w:t>
       </w:r>
     </w:p>
     <w:p>
@@ -45,7 +45,7 @@
         <w:rPr>
           <w:i w:val="0"/>
         </w:rPr>
-        <w:t>A hipótese óbvia não fecha → um gesto de dez segundos muda completamente o caso.</w:t>
+        <w:t>Não é um quadro. Não é um Reels. É um formato editorial — e formato dura anos. A marca é "SEU PLANTÃO"; cada episódio é um "Caso #00X".</w:t>
       </w:r>
     </w:p>
     <w:p>
@@ -54,7 +54,7 @@
           <w:b/>
           <w:color w:val="555555"/>
         </w:rPr>
-        <w:t>PADRÕES QUE NUNCA MUDAM (é isto que vira marca)</w:t>
+        <w:t>ASSINATURA DA SÉRIE</w:t>
       </w:r>
     </w:p>
     <w:p>
@@ -62,63 +62,7 @@
         <w:rPr>
           <w:i w:val="0"/>
         </w:rPr>
-        <w:t>• ABERTURA (4s): "Interno..." (pausa) "Seu plantão começou." (pausa) "Esse paciente é seu."</w:t>
-      </w:r>
-    </w:p>
-    <w:p>
-      <w:r>
-        <w:rPr>
-          <w:i w:val="0"/>
-        </w:rPr>
-        <w:t>• NOMES: terça é 🚨 PLANTÃO #00X · quinta é 🩺 DEBRIEF #00X (mesmo número). Vira arquivo: "no Plantão #017 a maioria errou".</w:t>
-      </w:r>
-    </w:p>
-    <w:p>
-      <w:r>
-        <w:rPr>
-          <w:i w:val="0"/>
-        </w:rPr>
-        <w:t>• SILÊNCIO OBRIGATÓRIO: depois de "O que você quer saber primeiro?", Igor não mexe, não sorri, não fala. 2 segundos. O silêncio vale mais que frase.</w:t>
-      </w:r>
-    </w:p>
-    <w:p>
-      <w:r>
-        <w:rPr>
-          <w:i w:val="0"/>
-        </w:rPr>
-        <w:t>• PASSAR O BASTÃO: o caso sempre termina com "E você... (pausa) ...o que examinaria agora?" — a câmera aponta pro interno.</w:t>
-      </w:r>
-    </w:p>
-    <w:p>
-      <w:r>
-        <w:rPr>
-          <w:i w:val="0"/>
-        </w:rPr>
-        <w:t>• ENCERRAMENTO da terça (tela preta): "Seu plantão não acabou." → QUINTA · 20H</w:t>
-      </w:r>
-    </w:p>
-    <w:p>
-      <w:r>
-        <w:rPr>
-          <w:i w:val="0"/>
-        </w:rPr>
-        <w:t>• ENCERRAMENTO do debrief: "Até terça." (pausa) "Bom plantão, Interno." → card "O QUE ESSE CASO ENSINOU?" + 1 frase → TERÇA · 20H</w:t>
-      </w:r>
-    </w:p>
-    <w:p>
-      <w:r>
-        <w:rPr>
-          <w:i w:val="0"/>
-        </w:rPr>
-        <w:t>• RITMO DE FALA: idade e dados em batidas curtas, com pausa. "Homem. (pausa) Sessenta e dois anos. (pausa) Hipertenso." É assim que médico fala.</w:t>
-      </w:r>
-    </w:p>
-    <w:p>
-      <w:r>
-        <w:rPr>
-          <w:i w:val="0"/>
-        </w:rPr>
-        <w:t>• CAPA: layout único sempre (Igor olhando pra câmera, sem texto gigante).</w:t>
+        <w:t>A hipótese óbvia não fecha → o exame físico muda completamente o rumo do caso.</w:t>
       </w:r>
     </w:p>
     <w:p>
@@ -127,7 +71,286 @@
           <w:b/>
           <w:color w:val="555555"/>
         </w:rPr>
-        <w:t>CAPA-PADRÃO</w:t>
+        <w:t>O CICLO (começo e fim se conectam)</w:t>
+      </w:r>
+    </w:p>
+    <w:p>
+      <w:r>
+        <w:rPr>
+          <w:i w:val="0"/>
+        </w:rPr>
+        <w:t>Abre: "Esse paciente é seu."   →   Fecha: "Pode ir... esse paciente já não é mais seu."</w:t>
+      </w:r>
+    </w:p>
+    <w:p>
+      <w:r>
+        <w:rPr>
+          <w:b/>
+          <w:color w:val="555555"/>
+        </w:rPr>
+        <w:t>PADRÕES QUE NUNCA MUDAM</w:t>
+      </w:r>
+    </w:p>
+    <w:p>
+      <w:r>
+        <w:rPr>
+          <w:i w:val="0"/>
+        </w:rPr>
+        <w:t>• ABERTURA (4s) — INTOCÁVEL, mesmo no episódio 300: "Interno..." (pausa) "Seu plantão começou." (pausa) "Esse paciente é seu."</w:t>
+      </w:r>
+    </w:p>
+    <w:p>
+      <w:r>
+        <w:rPr>
+          <w:i w:val="0"/>
+        </w:rPr>
+        <w:t>• NOMES: terça é 🚨 SEU PLANTÃO · Caso #00X · quinta é 🩺 DEBRIEF DO PLANTÃO · Caso #00X. Vira arquivo: "no Caso #017 a maioria errou".</w:t>
+      </w:r>
+    </w:p>
+    <w:p>
+      <w:r>
+        <w:rPr>
+          <w:i w:val="0"/>
+        </w:rPr>
+        <w:t>• SILÊNCIO: depois de "O que você quer saber primeiro?", Igor olha pra lente e NÃO mexe, não sorri, não fala. 2 segundos. O silêncio obriga o espectador a responder.</w:t>
+      </w:r>
+    </w:p>
+    <w:p>
+      <w:r>
+        <w:rPr>
+          <w:i w:val="0"/>
+        </w:rPr>
+        <w:t>• PASSAR O BASTÃO: o caso termina sempre com "E você... (pausa) ...por onde você começaria?"</w:t>
+      </w:r>
+    </w:p>
+    <w:p>
+      <w:r>
+        <w:rPr>
+          <w:i w:val="0"/>
+        </w:rPr>
+        <w:t>• ENCERRAMENTO da terça (tela preta): "Seu plantão não acabou." → QUINTA · 20H</w:t>
+      </w:r>
+    </w:p>
+    <w:p>
+      <w:r>
+        <w:rPr>
+          <w:i w:val="0"/>
+        </w:rPr>
+        <w:t>• ENCERRAMENTO do debrief: "Bom plantão, Interno." (pausa) "Pode ir... esse paciente já não é mais seu." → card "O QUE ESSE CASO ENSINOU?" + 1 frase → PRÓXIMO PACIENTE · TERÇA · 20H</w:t>
+      </w:r>
+    </w:p>
+    <w:p>
+      <w:r>
+        <w:rPr>
+          <w:i w:val="0"/>
+        </w:rPr>
+        <w:t>• RITMO DE FALA: uma informação por vez, em batidas com pausa. "Homem. (pausa) Sessenta e dois anos. (pausa) Hipertenso."</w:t>
+      </w:r>
+    </w:p>
+    <w:p>
+      <w:r>
+        <w:rPr>
+          <w:b/>
+          <w:color w:val="555555"/>
+        </w:rPr>
+        <w:t>CTA — sempre "próximo passo", nunca "conduta"</w:t>
+      </w:r>
+    </w:p>
+    <w:p>
+      <w:r>
+        <w:rPr>
+          <w:i w:val="0"/>
+        </w:rPr>
+        <w:t>"Conduta" sugere resolver o caso inteiro. "Por onde você começaria?" / "Qual seria seu próximo passo?" é o que estamos ensinando: raciocínio.</w:t>
+      </w:r>
+    </w:p>
+    <w:p>
+      <w:r>
+        <w:rPr>
+          <w:b/>
+          <w:color w:val="555555"/>
+        </w:rPr>
+        <w:t>A EXECUÇÃO É O 0,1 QUE FALTA</w:t>
+      </w:r>
+    </w:p>
+    <w:p>
+      <w:r>
+        <w:rPr>
+          <w:i w:val="0"/>
+        </w:rPr>
+        <w:t>O sucesso depende mais de COMO o Igor fala do que das palavras. Preceptor: calmo, seguro, provocando o raciocínio. Meta: a série ser reconhecida só pela primeira frase — "Interno... Seu plantão começou."</w:t>
+      </w:r>
+    </w:p>
+    <w:p>
+      <w:r>
+        <w:rPr>
+          <w:b/>
+          <w:color w:val="555555"/>
+        </w:rPr>
+        <w:t>HASHTAGS PADRÃO</w:t>
+      </w:r>
+    </w:p>
+    <w:p>
+      <w:r>
+        <w:rPr>
+          <w:i w:val="0"/>
+        </w:rPr>
+        <w:t>#pendurajaleco #medicina #casoclinico #plantao #internato #residenciamedica #estudantedemedicina #emergencia</w:t>
+      </w:r>
+    </w:p>
+    <w:p>
+      <w:r>
+        <w:br w:type="page"/>
+      </w:r>
+    </w:p>
+    <w:p>
+      <w:r>
+        <w:rPr>
+          <w:b/>
+          <w:color w:val="5B21B6"/>
+          <w:sz w:val="40"/>
+        </w:rPr>
+        <w:t>📏 REGRAS DA SÉRIE</w:t>
+      </w:r>
+    </w:p>
+    <w:p>
+      <w:r>
+        <w:rPr>
+          <w:i w:val="0"/>
+        </w:rPr>
+        <w:t>Cole isto na parede da edição. Vale pra todo episódio, pra sempre.</w:t>
+      </w:r>
+    </w:p>
+    <w:p>
+      <w:r>
+        <w:rPr>
+          <w:b/>
+          <w:color w:val="B02020"/>
+          <w:sz w:val="30"/>
+        </w:rPr>
+        <w:t>NUNCA fazer</w:t>
+      </w:r>
+    </w:p>
+    <w:p>
+      <w:r>
+        <w:rPr>
+          <w:i w:val="0"/>
+        </w:rPr>
+        <w:t>❌ Mudar a abertura.</w:t>
+      </w:r>
+    </w:p>
+    <w:p>
+      <w:r>
+        <w:rPr>
+          <w:i w:val="0"/>
+        </w:rPr>
+        <w:t>❌ Explicar antes da pergunta.</w:t>
+      </w:r>
+    </w:p>
+    <w:p>
+      <w:r>
+        <w:rPr>
+          <w:i w:val="0"/>
+        </w:rPr>
+        <w:t>❌ Dar o diagnóstico cedo.</w:t>
+      </w:r>
+    </w:p>
+    <w:p>
+      <w:r>
+        <w:rPr>
+          <w:i w:val="0"/>
+        </w:rPr>
+        <w:t>❌ Falar olhando para outro lugar.</w:t>
+      </w:r>
+    </w:p>
+    <w:p>
+      <w:r>
+        <w:rPr>
+          <w:i w:val="0"/>
+        </w:rPr>
+        <w:t>❌ Fazer piada.</w:t>
+      </w:r>
+    </w:p>
+    <w:p>
+      <w:r>
+        <w:rPr>
+          <w:i w:val="0"/>
+        </w:rPr>
+        <w:t>❌ Cortar a pausa.</w:t>
+      </w:r>
+    </w:p>
+    <w:p>
+      <w:r>
+        <w:rPr>
+          <w:b/>
+          <w:color w:val="0F7B3F"/>
+          <w:sz w:val="30"/>
+        </w:rPr>
+        <w:t>SEMPRE fazer</w:t>
+      </w:r>
+    </w:p>
+    <w:p>
+      <w:r>
+        <w:rPr>
+          <w:i w:val="0"/>
+        </w:rPr>
+        <w:t>✅ Olhar para a lente.</w:t>
+      </w:r>
+    </w:p>
+    <w:p>
+      <w:r>
+        <w:rPr>
+          <w:i w:val="0"/>
+        </w:rPr>
+        <w:t>✅ Fazer silêncio.</w:t>
+      </w:r>
+    </w:p>
+    <w:p>
+      <w:r>
+        <w:rPr>
+          <w:i w:val="0"/>
+        </w:rPr>
+        <w:t>✅ Dar uma informação por vez.</w:t>
+      </w:r>
+    </w:p>
+    <w:p>
+      <w:r>
+        <w:rPr>
+          <w:i w:val="0"/>
+        </w:rPr>
+        <w:t>✅ Falar como preceptor.</w:t>
+      </w:r>
+    </w:p>
+    <w:p>
+      <w:r>
+        <w:rPr>
+          <w:i w:val="0"/>
+        </w:rPr>
+        <w:t>✅ Terminar criando expectativa.</w:t>
+      </w:r>
+    </w:p>
+    <w:p>
+      <w:r>
+        <w:br w:type="page"/>
+      </w:r>
+    </w:p>
+    <w:p>
+      <w:r>
+        <w:rPr>
+          <w:b/>
+          <w:color w:val="5B21B6"/>
+          <w:sz w:val="40"/>
+        </w:rPr>
+        <w:t>CASO #001 — "Dor Torácica"</w:t>
+      </w:r>
+    </w:p>
+    <w:p>
+      <w:r>
+        <w:rPr>
+          <w:i/>
+          <w:color w:val="555555"/>
+        </w:rPr>
+        <w:t>Semana 1  ·  Diagnóstico: Dissecção aguda de aorta</w:t>
       </w:r>
     </w:p>
     <w:p>
@@ -136,6 +359,36 @@
       </w:pPr>
       <w:r>
         <w:rPr>
+          <w:color w:val="CCCCCC"/>
+        </w:rPr>
+        <w:t>— — — — — — — — — — — — — — — — — — — —</w:t>
+      </w:r>
+    </w:p>
+    <w:p>
+      <w:r>
+        <w:rPr>
+          <w:b/>
+          <w:color w:val="5B21B6"/>
+          <w:sz w:val="30"/>
+        </w:rPr>
+        <w:t>🚨 SEU PLANTÃO — TERÇA (o caso)</w:t>
+      </w:r>
+    </w:p>
+    <w:p>
+      <w:r>
+        <w:rPr>
+          <w:b/>
+          <w:color w:val="555555"/>
+        </w:rPr>
+        <w:t>CAPA</w:t>
+      </w:r>
+    </w:p>
+    <w:p>
+      <w:pPr>
+        <w:jc w:val="center"/>
+      </w:pPr>
+      <w:r>
+        <w:rPr>
           <w:b/>
           <w:color w:val="555555"/>
           <w:sz w:val="20"/>
@@ -153,7 +406,7 @@
           <w:color w:val="5B21B6"/>
           <w:sz w:val="28"/>
         </w:rPr>
-        <w:t>SEU PLANTÃO COMEÇOU</w:t>
+        <w:t>SEU PLANTÃO</w:t>
       </w:r>
     </w:p>
     <w:p>
@@ -166,7 +419,7 @@
           <w:color w:val="555555"/>
           <w:sz w:val="20"/>
         </w:rPr>
-        <w:t>TEMPORADA 01</w:t>
+        <w:t>CASO #001</w:t>
       </w:r>
     </w:p>
     <w:p>
@@ -176,10 +429,101 @@
       <w:r>
         <w:rPr>
           <w:b/>
+          <w:color w:val="5B21B6"/>
+          <w:sz w:val="26"/>
+        </w:rPr>
+        <w:t>DOR TORÁCICA</w:t>
+      </w:r>
+    </w:p>
+    <w:p>
+      <w:r>
+        <w:rPr>
+          <w:b/>
           <w:color w:val="555555"/>
-          <w:sz w:val="20"/>
-        </w:rPr>
-        <w:t>PLANTÃO #00X</w:t>
+        </w:rPr>
+        <w:t>ROTEIRO (falado, máx. 60s)</w:t>
+      </w:r>
+    </w:p>
+    <w:p>
+      <w:r>
+        <w:rPr>
+          <w:i w:val="0"/>
+        </w:rPr>
+        <w:t>Interno... (pausa) Seu plantão começou. (pausa) Esse paciente é seu.</w:t>
+      </w:r>
+    </w:p>
+    <w:p>
+      <w:r>
+        <w:rPr>
+          <w:i w:val="0"/>
+        </w:rPr>
+        <w:t>Homem. (pausa) Sessenta e dois anos. (pausa) Hipertenso.</w:t>
+      </w:r>
+    </w:p>
+    <w:p>
+      <w:r>
+        <w:rPr>
+          <w:i w:val="0"/>
+        </w:rPr>
+        <w:t>Chega agitado, com dor no peito que vai pras costas. Não consegue ficar deitado na maca.</w:t>
+      </w:r>
+    </w:p>
+    <w:p>
+      <w:r>
+        <w:rPr>
+          <w:i w:val="0"/>
+        </w:rPr>
+        <w:t>O que você quer saber primeiro?</w:t>
+      </w:r>
+    </w:p>
+    <w:p>
+      <w:r>
+        <w:rPr>
+          <w:i/>
+          <w:color w:val="555555"/>
+        </w:rPr>
+        <w:t>[DIREÇÃO: olha pra lente · não mexe · não sorri · não fala · 2 segundos de silêncio]</w:t>
+      </w:r>
+    </w:p>
+    <w:p>
+      <w:r>
+        <w:rPr>
+          <w:i w:val="0"/>
+        </w:rPr>
+        <w:t>Pressão: 18 por 10. FC: 122. Saturando 92%. ECG: sem isquemia aguda.</w:t>
+      </w:r>
+    </w:p>
+    <w:p>
+      <w:r>
+        <w:rPr>
+          <w:i w:val="0"/>
+        </w:rPr>
+        <w:t>O ECG veio limpo. Muita gente pararia o raciocínio por aqui.</w:t>
+      </w:r>
+    </w:p>
+    <w:p>
+      <w:r>
+        <w:rPr>
+          <w:i w:val="0"/>
+        </w:rPr>
+        <w:t>Só que esse caso ainda não terminou. (pausa) Tem um detalhe que muda tudo.</w:t>
+      </w:r>
+    </w:p>
+    <w:p>
+      <w:r>
+        <w:rPr>
+          <w:i w:val="0"/>
+        </w:rPr>
+        <w:t>E você... (pausa) ...por onde você começaria?</w:t>
+      </w:r>
+    </w:p>
+    <w:p>
+      <w:r>
+        <w:rPr>
+          <w:b/>
+          <w:color w:val="555555"/>
+        </w:rPr>
+        <w:t>ENCERRAMENTO (tela preta — sempre igual)</w:t>
       </w:r>
     </w:p>
     <w:p>
@@ -190,17 +534,20 @@
         <w:rPr>
           <w:b/>
           <w:color w:val="5B21B6"/>
-          <w:sz w:val="26"/>
-        </w:rPr>
-        <w:t>NOME DO CASO</w:t>
-      </w:r>
-    </w:p>
-    <w:p>
-      <w:r>
-        <w:rPr>
-          <w:i/>
-        </w:rPr>
-        <w:t>No debrief: mesma capa, com 🩺 e "DEBRIEF #00X" no lugar.</w:t>
+        </w:rPr>
+        <w:t>"Seu plantão não acabou."</w:t>
+      </w:r>
+    </w:p>
+    <w:p>
+      <w:pPr>
+        <w:jc w:val="center"/>
+      </w:pPr>
+      <w:r>
+        <w:rPr>
+          <w:b/>
+          <w:color w:val="5B21B6"/>
+        </w:rPr>
+        <w:t>QUINTA · 20H</w:t>
       </w:r>
     </w:p>
     <w:p>
@@ -209,7 +556,7 @@
           <w:b/>
           <w:color w:val="555555"/>
         </w:rPr>
-        <w:t>AS 6 REGRAS</w:t>
+        <w:t>LEGENDA DO POST</w:t>
       </w:r>
     </w:p>
     <w:p>
@@ -217,7 +564,7 @@
         <w:rPr>
           <w:i w:val="0"/>
         </w:rPr>
-        <w:t>1. Nunca pergunte "qual o diagnóstico?" → "o que você quer saber agora?"</w:t>
+        <w:t>🚨 SEU PLANTÃO · Caso #001 · Dor Torácica</w:t>
       </w:r>
     </w:p>
     <w:p>
@@ -225,7 +572,7 @@
         <w:rPr>
           <w:i w:val="0"/>
         </w:rPr>
-        <w:t>2. Nunca explique durante o caso. Só no debrief.</w:t>
+        <w:t>Você assumiria esse caso?</w:t>
       </w:r>
     </w:p>
     <w:p>
@@ -233,7 +580,7 @@
         <w:rPr>
           <w:i w:val="0"/>
         </w:rPr>
-        <w:t>3. Nunca passe de 60s.</w:t>
+        <w:t>Homem, 62 anos.</w:t>
       </w:r>
     </w:p>
     <w:p>
@@ -241,7 +588,7 @@
         <w:rPr>
           <w:i w:val="0"/>
         </w:rPr>
-        <w:t>4. Chame o público de "Interno".</w:t>
+        <w:t>Dor no peito indo pras costas.</w:t>
       </w:r>
     </w:p>
     <w:p>
@@ -249,7 +596,7 @@
         <w:rPr>
           <w:i w:val="0"/>
         </w:rPr>
-        <w:t>5. Termine sempre com pergunta.</w:t>
+        <w:t>ECG limpo.</w:t>
       </w:r>
     </w:p>
     <w:p>
@@ -257,7 +604,30 @@
         <w:rPr>
           <w:i w:val="0"/>
         </w:rPr>
-        <w:t>6. Nunca desqualifique o raciocínio inicial correto. Convide, não julgue (pensar em SCA numa dor torácica é certo).</w:t>
+        <w:t>E você — por onde começaria?</w:t>
+      </w:r>
+    </w:p>
+    <w:p>
+      <w:r>
+        <w:rPr>
+          <w:i w:val="0"/>
+        </w:rPr>
+        <w:t>👇 Quero saber seu próximo passo, antes do debrief de quinta.</w:t>
+      </w:r>
+    </w:p>
+    <w:p>
+      <w:r>
+        <w:rPr>
+          <w:i w:val="0"/>
+        </w:rPr>
+      </w:r>
+    </w:p>
+    <w:p>
+      <w:r>
+        <w:rPr>
+          <w:i w:val="0"/>
+        </w:rPr>
+        <w:t>#pendurajaleco #medicina #casoclinico #plantao #internato #residenciamedica #estudantedemedicina #emergencia</w:t>
       </w:r>
     </w:p>
     <w:p>
@@ -266,7 +636,7 @@
           <w:b/>
           <w:color w:val="555555"/>
         </w:rPr>
-        <w:t>A EXECUÇÃO É O 0,1 QUE FALTA</w:t>
+        <w:t>COMENTÁRIO FIXADO</w:t>
       </w:r>
     </w:p>
     <w:p>
@@ -274,7 +644,28 @@
         <w:rPr>
           <w:i w:val="0"/>
         </w:rPr>
-        <w:t>O sucesso depende mais de COMO o Igor fala do que das palavras. Preceptor: calmo, seguro, provocando o raciocínio. A meta é a série ser reconhecida só pela primeira frase — "Interno..." / "Seu plantão começou."</w:t>
+        <w:t>Regra da série: ECG normal não fecha o raciocínio. 🧠 Comenta por onde você começaria, antes do debrief de quinta — quem cravar marca presença. 👇</w:t>
+      </w:r>
+    </w:p>
+    <w:p>
+      <w:pPr>
+        <w:jc w:val="center"/>
+      </w:pPr>
+      <w:r>
+        <w:rPr>
+          <w:color w:val="CCCCCC"/>
+        </w:rPr>
+        <w:t>— — — — — — — — — — — — — — — — — — — —</w:t>
+      </w:r>
+    </w:p>
+    <w:p>
+      <w:r>
+        <w:rPr>
+          <w:b/>
+          <w:color w:val="5B21B6"/>
+          <w:sz w:val="30"/>
+        </w:rPr>
+        <w:t>🩺 DEBRIEF DO PLANTÃO — QUINTA (discussão de corredor)</w:t>
       </w:r>
     </w:p>
     <w:p>
@@ -283,7 +674,68 @@
           <w:b/>
           <w:color w:val="555555"/>
         </w:rPr>
-        <w:t>HASHTAGS PADRÃO</w:t>
+        <w:t>CAPA (mesma arte, com 🩺)</w:t>
+      </w:r>
+    </w:p>
+    <w:p>
+      <w:pPr>
+        <w:jc w:val="center"/>
+      </w:pPr>
+      <w:r>
+        <w:rPr>
+          <w:b/>
+          <w:color w:val="555555"/>
+          <w:sz w:val="20"/>
+        </w:rPr>
+        <w:t>🩺</w:t>
+      </w:r>
+    </w:p>
+    <w:p>
+      <w:pPr>
+        <w:jc w:val="center"/>
+      </w:pPr>
+      <w:r>
+        <w:rPr>
+          <w:b/>
+          <w:color w:val="5B21B6"/>
+          <w:sz w:val="28"/>
+        </w:rPr>
+        <w:t>DEBRIEF DO PLANTÃO</w:t>
+      </w:r>
+    </w:p>
+    <w:p>
+      <w:pPr>
+        <w:jc w:val="center"/>
+      </w:pPr>
+      <w:r>
+        <w:rPr>
+          <w:b/>
+          <w:color w:val="555555"/>
+          <w:sz w:val="20"/>
+        </w:rPr>
+        <w:t>CASO #001</w:t>
+      </w:r>
+    </w:p>
+    <w:p>
+      <w:pPr>
+        <w:jc w:val="center"/>
+      </w:pPr>
+      <w:r>
+        <w:rPr>
+          <w:b/>
+          <w:color w:val="5B21B6"/>
+          <w:sz w:val="26"/>
+        </w:rPr>
+        <w:t>DOR TORÁCICA</w:t>
+      </w:r>
+    </w:p>
+    <w:p>
+      <w:r>
+        <w:rPr>
+          <w:b/>
+          <w:color w:val="555555"/>
+        </w:rPr>
+        <w:t>ROTEIRO (falado, máx. 60s)</w:t>
       </w:r>
     </w:p>
     <w:p>
@@ -291,7 +743,235 @@
         <w:rPr>
           <w:i w:val="0"/>
         </w:rPr>
+        <w:t>Interno... (pausa) sobre o plantão de terça.</w:t>
+      </w:r>
+    </w:p>
+    <w:p>
+      <w:r>
+        <w:rPr>
+          <w:i w:val="0"/>
+        </w:rPr>
+        <w:t>"Vi muita gente indo direto para a tomografia."</w:t>
+      </w:r>
+    </w:p>
+    <w:p>
+      <w:r>
+        <w:rPr>
+          <w:i w:val="0"/>
+        </w:rPr>
+        <w:t>(pausa) "Mas antes dela... tinha uma informação que custava dez segundos."</w:t>
+      </w:r>
+    </w:p>
+    <w:p>
+      <w:r>
+        <w:rPr>
+          <w:i w:val="0"/>
+        </w:rPr>
+        <w:t>(pausa) "Palpar os pulsos."</w:t>
+      </w:r>
+    </w:p>
+    <w:p>
+      <w:r>
+        <w:rPr>
+          <w:i w:val="0"/>
+        </w:rPr>
+        <w:t>(pausa) "Dez segundos."</w:t>
+      </w:r>
+    </w:p>
+    <w:p>
+      <w:r>
+        <w:rPr>
+          <w:i w:val="0"/>
+        </w:rPr>
+        <w:t>(pausa) "Foi o exame físico... (pausa) ...que mudou completamente o rumo desse caso."</w:t>
+      </w:r>
+    </w:p>
+    <w:p>
+      <w:r>
+        <w:rPr>
+          <w:i w:val="0"/>
+        </w:rPr>
+        <w:t>Pulso assimétrico entre os braços. E no raio-X, mediastino alargado. Isso é dissecção aguda de aorta.</w:t>
+      </w:r>
+    </w:p>
+    <w:p>
+      <w:r>
+        <w:rPr>
+          <w:i w:val="0"/>
+        </w:rPr>
+        <w:t>Bom plantão, Interno.</w:t>
+      </w:r>
+    </w:p>
+    <w:p>
+      <w:r>
+        <w:rPr>
+          <w:i w:val="0"/>
+        </w:rPr>
+        <w:t>Pode ir... (pausa) esse paciente já não é mais seu.</w:t>
+      </w:r>
+    </w:p>
+    <w:p>
+      <w:r>
+        <w:rPr>
+          <w:b/>
+          <w:color w:val="555555"/>
+        </w:rPr>
+        <w:t>LIÇÃO (cards na tela, ~2s cada)</w:t>
+      </w:r>
+    </w:p>
+    <w:p>
+      <w:pPr>
+        <w:jc w:val="center"/>
+      </w:pPr>
+      <w:r>
+        <w:rPr>
+          <w:b/>
+          <w:color w:val="555555"/>
+        </w:rPr>
+        <w:t>O QUE ESSE CASO ENSINOU?</w:t>
+      </w:r>
+    </w:p>
+    <w:p>
+      <w:pPr>
+        <w:jc w:val="center"/>
+      </w:pPr>
+      <w:r>
+        <w:rPr>
+          <w:b/>
+          <w:color w:val="0F7B3F"/>
+          <w:sz w:val="26"/>
+        </w:rPr>
+        <w:t>ECG normal NÃO encerra o raciocínio.</w:t>
+      </w:r>
+    </w:p>
+    <w:p>
+      <w:r>
+        <w:rPr>
+          <w:b/>
+          <w:color w:val="555555"/>
+        </w:rPr>
+        <w:t>ENCERRAMENTO (tela preta — sempre igual)</w:t>
+      </w:r>
+    </w:p>
+    <w:p>
+      <w:pPr>
+        <w:jc w:val="center"/>
+      </w:pPr>
+      <w:r>
+        <w:rPr>
+          <w:b/>
+          <w:color w:val="5B21B6"/>
+        </w:rPr>
+        <w:t>PRÓXIMO PACIENTE</w:t>
+      </w:r>
+    </w:p>
+    <w:p>
+      <w:pPr>
+        <w:jc w:val="center"/>
+      </w:pPr>
+      <w:r>
+        <w:rPr>
+          <w:b/>
+          <w:color w:val="5B21B6"/>
+        </w:rPr>
+        <w:t>TERÇA · 20H</w:t>
+      </w:r>
+    </w:p>
+    <w:p>
+      <w:r>
+        <w:rPr>
+          <w:b/>
+          <w:color w:val="555555"/>
+        </w:rPr>
+        <w:t>LEGENDA DO POST</w:t>
+      </w:r>
+    </w:p>
+    <w:p>
+      <w:r>
+        <w:rPr>
+          <w:i w:val="0"/>
+        </w:rPr>
+        <w:t>🩺 DEBRIEF DO PLANTÃO · Caso #001 · Dor Torácica</w:t>
+      </w:r>
+    </w:p>
+    <w:p>
+      <w:r>
+        <w:rPr>
+          <w:i w:val="0"/>
+        </w:rPr>
+        <w:t>O debrief do Caso #001 já está no ar.</w:t>
+      </w:r>
+    </w:p>
+    <w:p>
+      <w:r>
+        <w:rPr>
+          <w:i w:val="0"/>
+        </w:rPr>
+        <w:t>DISSECÇÃO AGUDA DE AORTA</w:t>
+      </w:r>
+    </w:p>
+    <w:p>
+      <w:r>
+        <w:rPr>
+          <w:i w:val="0"/>
+        </w:rPr>
+        <w:t>O ECG limpo parou muita gente. Dez segundos de exame físico mudaram tudo: pulso assimétrico + mediastino alargado.</w:t>
+      </w:r>
+    </w:p>
+    <w:p>
+      <w:r>
+        <w:rPr>
+          <w:i w:val="0"/>
+        </w:rPr>
+        <w:t>Lição: ECG normal NÃO encerra o raciocínio.</w:t>
+      </w:r>
+    </w:p>
+    <w:p>
+      <w:r>
+        <w:rPr>
+          <w:i w:val="0"/>
+        </w:rPr>
+        <w:t>E você, tinha pego o pulso? 👇</w:t>
+      </w:r>
+    </w:p>
+    <w:p>
+      <w:r>
+        <w:rPr>
+          <w:i w:val="0"/>
+        </w:rPr>
+        <w:t>Salva pro seu próximo plantão.</w:t>
+      </w:r>
+    </w:p>
+    <w:p>
+      <w:r>
+        <w:rPr>
+          <w:i w:val="0"/>
+        </w:rPr>
+      </w:r>
+    </w:p>
+    <w:p>
+      <w:r>
+        <w:rPr>
+          <w:i w:val="0"/>
+        </w:rPr>
         <w:t>#pendurajaleco #medicina #casoclinico #plantao #internato #residenciamedica #estudantedemedicina #emergencia</w:t>
+      </w:r>
+    </w:p>
+    <w:p>
+      <w:r>
+        <w:rPr>
+          <w:b/>
+          <w:color w:val="555555"/>
+        </w:rPr>
+        <w:t>COMENTÁRIO FIXADO</w:t>
+      </w:r>
+    </w:p>
+    <w:p>
+      <w:r>
+        <w:rPr>
+          <w:i w:val="0"/>
+        </w:rPr>
+        <w:t>Guarda a tríade: dor pras costas + assimetria de pulso + mediastino alargado. ✅ Salva e leva pro plantão. 🚨</w:t>
       </w:r>
     </w:p>
     <w:p>
@@ -306,7 +986,7 @@
           <w:color w:val="5B21B6"/>
           <w:sz w:val="40"/>
         </w:rPr>
-        <w:t>PLANTÃO #001 — "Dor Torácica"</w:t>
+        <w:t>CASO #002 — "Ela Não Para Quieta"</w:t>
       </w:r>
     </w:p>
     <w:p>
@@ -315,7 +995,7 @@
           <w:i/>
           <w:color w:val="555555"/>
         </w:rPr>
-        <w:t>Semana 1  ·  Diagnóstico: Dissecção aguda de aorta</w:t>
+        <w:t>Semana 2  ·  Diagnóstico: Crise tireotóxica</w:t>
       </w:r>
     </w:p>
     <w:p>
@@ -336,7 +1016,7 @@
           <w:color w:val="5B21B6"/>
           <w:sz w:val="30"/>
         </w:rPr>
-        <w:t>🚨 PLANTÃO — TERÇA (o caso)</w:t>
+        <w:t>🚨 SEU PLANTÃO — TERÇA (o caso)</w:t>
       </w:r>
     </w:p>
     <w:p>
@@ -371,7 +1051,7 @@
           <w:color w:val="5B21B6"/>
           <w:sz w:val="28"/>
         </w:rPr>
-        <w:t>SEU PLANTÃO COMEÇOU</w:t>
+        <w:t>SEU PLANTÃO</w:t>
       </w:r>
     </w:p>
     <w:p>
@@ -384,7 +1064,7 @@
           <w:color w:val="555555"/>
           <w:sz w:val="20"/>
         </w:rPr>
-        <w:t>TEMPORADA 01</w:t>
+        <w:t>CASO #002</w:t>
       </w:r>
     </w:p>
     <w:p>
@@ -394,10 +1074,101 @@
       <w:r>
         <w:rPr>
           <w:b/>
+          <w:color w:val="5B21B6"/>
+          <w:sz w:val="26"/>
+        </w:rPr>
+        <w:t>ELA NÃO PARA QUIETA</w:t>
+      </w:r>
+    </w:p>
+    <w:p>
+      <w:r>
+        <w:rPr>
+          <w:b/>
           <w:color w:val="555555"/>
-          <w:sz w:val="20"/>
-        </w:rPr>
-        <w:t>PLANTÃO #001</w:t>
+        </w:rPr>
+        <w:t>ROTEIRO (falado, máx. 60s)</w:t>
+      </w:r>
+    </w:p>
+    <w:p>
+      <w:r>
+        <w:rPr>
+          <w:i w:val="0"/>
+        </w:rPr>
+        <w:t>Interno... (pausa) Seu plantão começou. (pausa) Esse paciente é seu.</w:t>
+      </w:r>
+    </w:p>
+    <w:p>
+      <w:r>
+        <w:rPr>
+          <w:i w:val="0"/>
+        </w:rPr>
+        <w:t>Mulher. (pausa) Trinta e oito anos. (pausa) Hipertensa.</w:t>
+      </w:r>
+    </w:p>
+    <w:p>
+      <w:r>
+        <w:rPr>
+          <w:i w:val="0"/>
+        </w:rPr>
+        <w:t>Chega muito agitada, não consegue ficar quieta na maca. Calafrios, diarreia e febre.</w:t>
+      </w:r>
+    </w:p>
+    <w:p>
+      <w:r>
+        <w:rPr>
+          <w:i w:val="0"/>
+        </w:rPr>
+        <w:t>O que você quer saber primeiro?</w:t>
+      </w:r>
+    </w:p>
+    <w:p>
+      <w:r>
+        <w:rPr>
+          <w:i/>
+          <w:color w:val="555555"/>
+        </w:rPr>
+        <w:t>[DIREÇÃO: olha pra lente · não mexe · não sorri · não fala · 2 segundos de silêncio]</w:t>
+      </w:r>
+    </w:p>
+    <w:p>
+      <w:r>
+        <w:rPr>
+          <w:i w:val="0"/>
+        </w:rPr>
+        <w:t>Temperatura: 38,2. Taquicárdica. Pressão 18 por 10. Coração regular, pulmão limpo, abdome sem nada demais.</w:t>
+      </w:r>
+    </w:p>
+    <w:p>
+      <w:r>
+        <w:rPr>
+          <w:i w:val="0"/>
+        </w:rPr>
+        <w:t>Você pensa infecção — e faz certo em pensar. Pede o pacote. Urina limpa. Raio-X normal. Hemograma sem nada de infeccioso.</w:t>
+      </w:r>
+    </w:p>
+    <w:p>
+      <w:r>
+        <w:rPr>
+          <w:i w:val="0"/>
+        </w:rPr>
+        <w:t>Só que o foco não aparece. (pausa) E tem um detalhe que muda tudo.</w:t>
+      </w:r>
+    </w:p>
+    <w:p>
+      <w:r>
+        <w:rPr>
+          <w:i w:val="0"/>
+        </w:rPr>
+        <w:t>E você... (pausa) ...por onde você começaria?</w:t>
+      </w:r>
+    </w:p>
+    <w:p>
+      <w:r>
+        <w:rPr>
+          <w:b/>
+          <w:color w:val="555555"/>
+        </w:rPr>
+        <w:t>ENCERRAMENTO (tela preta — sempre igual)</w:t>
       </w:r>
     </w:p>
     <w:p>
@@ -408,100 +1179,8 @@
         <w:rPr>
           <w:b/>
           <w:color w:val="5B21B6"/>
-          <w:sz w:val="26"/>
-        </w:rPr>
-        <w:t>DOR TORÁCICA</w:t>
-      </w:r>
-    </w:p>
-    <w:p>
-      <w:r>
-        <w:rPr>
-          <w:b/>
-          <w:color w:val="555555"/>
-        </w:rPr>
-        <w:t>ROTEIRO (falado, máx. 60s)</w:t>
-      </w:r>
-    </w:p>
-    <w:p>
-      <w:r>
-        <w:rPr>
-          <w:i w:val="0"/>
-        </w:rPr>
-        <w:t>Interno... (pausa) Seu plantão começou. (pausa) Esse paciente é seu.</w:t>
-      </w:r>
-    </w:p>
-    <w:p>
-      <w:r>
-        <w:rPr>
-          <w:i w:val="0"/>
-        </w:rPr>
-        <w:t>Homem. (pausa) Sessenta e dois anos. (pausa) Hipertenso.</w:t>
-      </w:r>
-    </w:p>
-    <w:p>
-      <w:r>
-        <w:rPr>
-          <w:i w:val="0"/>
-        </w:rPr>
-        <w:t>Chega agitado, com dor no peito que vai pras costas. Não consegue ficar deitado na maca.</w:t>
-      </w:r>
-    </w:p>
-    <w:p>
-      <w:r>
-        <w:rPr>
-          <w:i w:val="0"/>
-        </w:rPr>
-        <w:t>O que você quer saber primeiro?</w:t>
-      </w:r>
-    </w:p>
-    <w:p>
-      <w:r>
-        <w:rPr>
-          <w:i/>
-          <w:color w:val="555555"/>
-        </w:rPr>
-        <w:t>[DIREÇÃO: Igor olha pra câmera. Não mexe. Não sorri. Não fala. 2 segundos de silêncio.]</w:t>
-      </w:r>
-    </w:p>
-    <w:p>
-      <w:r>
-        <w:rPr>
-          <w:i w:val="0"/>
-        </w:rPr>
-        <w:t>Pressão: 18 por 10. FC: 122. Saturando 92%. ECG: sem isquemia aguda.</w:t>
-      </w:r>
-    </w:p>
-    <w:p>
-      <w:r>
-        <w:rPr>
-          <w:i w:val="0"/>
-        </w:rPr>
-        <w:t>O ECG veio limpo. Muita gente pararia o raciocínio por aqui.</w:t>
-      </w:r>
-    </w:p>
-    <w:p>
-      <w:r>
-        <w:rPr>
-          <w:i w:val="0"/>
-        </w:rPr>
-        <w:t>Só que esse caso ainda não terminou. (pausa) Tem um detalhe que muda tudo.</w:t>
-      </w:r>
-    </w:p>
-    <w:p>
-      <w:r>
-        <w:rPr>
-          <w:i w:val="0"/>
-        </w:rPr>
-        <w:t>E você... (pausa) ...o que examinaria agora? Comenta sua conduta.</w:t>
-      </w:r>
-    </w:p>
-    <w:p>
-      <w:r>
-        <w:rPr>
-          <w:b/>
-          <w:color w:val="555555"/>
-        </w:rPr>
-        <w:t>ENCERRAMENTO (tela preta — sempre igual)</w:t>
+        </w:rPr>
+        <w:t>"Seu plantão não acabou."</w:t>
       </w:r>
     </w:p>
     <w:p>
@@ -513,7 +1192,104 @@
           <w:b/>
           <w:color w:val="5B21B6"/>
         </w:rPr>
-        <w:t>"Seu plantão não acabou."</w:t>
+        <w:t>QUINTA · 20H</w:t>
+      </w:r>
+    </w:p>
+    <w:p>
+      <w:r>
+        <w:rPr>
+          <w:b/>
+          <w:color w:val="555555"/>
+        </w:rPr>
+        <w:t>LEGENDA DO POST</w:t>
+      </w:r>
+    </w:p>
+    <w:p>
+      <w:r>
+        <w:rPr>
+          <w:i w:val="0"/>
+        </w:rPr>
+        <w:t>🚨 SEU PLANTÃO · Caso #002 · Ela Não Para Quieta</w:t>
+      </w:r>
+    </w:p>
+    <w:p>
+      <w:r>
+        <w:rPr>
+          <w:i w:val="0"/>
+        </w:rPr>
+        <w:t>Você assumiria esse caso?</w:t>
+      </w:r>
+    </w:p>
+    <w:p>
+      <w:r>
+        <w:rPr>
+          <w:i w:val="0"/>
+        </w:rPr>
+        <w:t>Mulher, 38 anos.</w:t>
+      </w:r>
+    </w:p>
+    <w:p>
+      <w:r>
+        <w:rPr>
+          <w:i w:val="0"/>
+        </w:rPr>
+        <w:t>Febre, calafrio e taquicardia.</w:t>
+      </w:r>
+    </w:p>
+    <w:p>
+      <w:r>
+        <w:rPr>
+          <w:i w:val="0"/>
+        </w:rPr>
+        <w:t>Exames de infecção limpos.</w:t>
+      </w:r>
+    </w:p>
+    <w:p>
+      <w:r>
+        <w:rPr>
+          <w:i w:val="0"/>
+        </w:rPr>
+        <w:t>E você — por onde começaria?</w:t>
+      </w:r>
+    </w:p>
+    <w:p>
+      <w:r>
+        <w:rPr>
+          <w:i w:val="0"/>
+        </w:rPr>
+        <w:t>👇 Quero saber seu próximo passo, antes do debrief de quinta.</w:t>
+      </w:r>
+    </w:p>
+    <w:p>
+      <w:r>
+        <w:rPr>
+          <w:i w:val="0"/>
+        </w:rPr>
+      </w:r>
+    </w:p>
+    <w:p>
+      <w:r>
+        <w:rPr>
+          <w:i w:val="0"/>
+        </w:rPr>
+        <w:t>#pendurajaleco #medicina #casoclinico #plantao #internato #residenciamedica #estudantedemedicina #emergencia</w:t>
+      </w:r>
+    </w:p>
+    <w:p>
+      <w:r>
+        <w:rPr>
+          <w:b/>
+          <w:color w:val="555555"/>
+        </w:rPr>
+        <w:t>COMENTÁRIO FIXADO</w:t>
+      </w:r>
+    </w:p>
+    <w:p>
+      <w:r>
+        <w:rPr>
+          <w:i w:val="0"/>
+        </w:rPr>
+        <w:t>Pista da série: febre sem foco nem sempre é infecção. 🧠 Comenta por onde você começaria, antes do debrief de quinta. 👇</w:t>
       </w:r>
     </w:p>
     <w:p>
@@ -522,10 +1298,19 @@
       </w:pPr>
       <w:r>
         <w:rPr>
+          <w:color w:val="CCCCCC"/>
+        </w:rPr>
+        <w:t>— — — — — — — — — — — — — — — — — — — —</w:t>
+      </w:r>
+    </w:p>
+    <w:p>
+      <w:r>
+        <w:rPr>
           <w:b/>
           <w:color w:val="5B21B6"/>
-        </w:rPr>
-        <w:t>QUINTA · 20H</w:t>
+          <w:sz w:val="30"/>
+        </w:rPr>
+        <w:t>🩺 DEBRIEF DO PLANTÃO — QUINTA (discussão de corredor)</w:t>
       </w:r>
     </w:p>
     <w:p>
@@ -534,95 +1319,7 @@
           <w:b/>
           <w:color w:val="555555"/>
         </w:rPr>
-        <w:t>LEGENDA DO POST</w:t>
-      </w:r>
-    </w:p>
-    <w:p>
-      <w:r>
-        <w:rPr>
-          <w:i w:val="0"/>
-        </w:rPr>
-        <w:t>🚨 PLANTÃO #001 · Dor Torácica</w:t>
-      </w:r>
-    </w:p>
-    <w:p>
-      <w:r>
-        <w:rPr>
-          <w:i w:val="0"/>
-        </w:rPr>
-        <w:t>Você assumiria esse caso?</w:t>
-      </w:r>
-    </w:p>
-    <w:p>
-      <w:r>
-        <w:rPr>
-          <w:i w:val="0"/>
-        </w:rPr>
-        <w:t>Homem, 62 anos.</w:t>
-      </w:r>
-    </w:p>
-    <w:p>
-      <w:r>
-        <w:rPr>
-          <w:i w:val="0"/>
-        </w:rPr>
-        <w:t>Dor no peito indo pras costas.</w:t>
-      </w:r>
-    </w:p>
-    <w:p>
-      <w:r>
-        <w:rPr>
-          <w:i w:val="0"/>
-        </w:rPr>
-        <w:t>ECG limpo.</w:t>
-      </w:r>
-    </w:p>
-    <w:p>
-      <w:r>
-        <w:rPr>
-          <w:i w:val="0"/>
-        </w:rPr>
-        <w:t>E você — qual é o próximo passo?</w:t>
-      </w:r>
-    </w:p>
-    <w:p>
-      <w:r>
-        <w:rPr>
-          <w:i w:val="0"/>
-        </w:rPr>
-        <w:t>👇 Quero ler sua conduta antes do debrief de quinta.</w:t>
-      </w:r>
-    </w:p>
-    <w:p>
-      <w:r>
-        <w:rPr>
-          <w:i w:val="0"/>
-        </w:rPr>
-      </w:r>
-    </w:p>
-    <w:p>
-      <w:r>
-        <w:rPr>
-          <w:i w:val="0"/>
-        </w:rPr>
-        <w:t>#pendurajaleco #medicina #casoclinico #plantao #internato #residenciamedica #estudantedemedicina #emergencia</w:t>
-      </w:r>
-    </w:p>
-    <w:p>
-      <w:r>
-        <w:rPr>
-          <w:b/>
-          <w:color w:val="555555"/>
-        </w:rPr>
-        <w:t>COMENTÁRIO FIXADO</w:t>
-      </w:r>
-    </w:p>
-    <w:p>
-      <w:r>
-        <w:rPr>
-          <w:i w:val="0"/>
-        </w:rPr>
-        <w:t>Regra da série: ECG normal não fecha o raciocínio. 🧠 Comenta sua conduta antes do debrief de quinta — quem cravar marca presença. 👇</w:t>
+        <w:t>CAPA (mesma arte, com 🩺)</w:t>
       </w:r>
     </w:p>
     <w:p>
@@ -631,6 +1328,327 @@
       </w:pPr>
       <w:r>
         <w:rPr>
+          <w:b/>
+          <w:color w:val="555555"/>
+          <w:sz w:val="20"/>
+        </w:rPr>
+        <w:t>🩺</w:t>
+      </w:r>
+    </w:p>
+    <w:p>
+      <w:pPr>
+        <w:jc w:val="center"/>
+      </w:pPr>
+      <w:r>
+        <w:rPr>
+          <w:b/>
+          <w:color w:val="5B21B6"/>
+          <w:sz w:val="28"/>
+        </w:rPr>
+        <w:t>DEBRIEF DO PLANTÃO</w:t>
+      </w:r>
+    </w:p>
+    <w:p>
+      <w:pPr>
+        <w:jc w:val="center"/>
+      </w:pPr>
+      <w:r>
+        <w:rPr>
+          <w:b/>
+          <w:color w:val="555555"/>
+          <w:sz w:val="20"/>
+        </w:rPr>
+        <w:t>CASO #002</w:t>
+      </w:r>
+    </w:p>
+    <w:p>
+      <w:pPr>
+        <w:jc w:val="center"/>
+      </w:pPr>
+      <w:r>
+        <w:rPr>
+          <w:b/>
+          <w:color w:val="5B21B6"/>
+          <w:sz w:val="26"/>
+        </w:rPr>
+        <w:t>ELA NÃO PARA QUIETA</w:t>
+      </w:r>
+    </w:p>
+    <w:p>
+      <w:r>
+        <w:rPr>
+          <w:b/>
+          <w:color w:val="555555"/>
+        </w:rPr>
+        <w:t>ROTEIRO (falado, máx. 60s)</w:t>
+      </w:r>
+    </w:p>
+    <w:p>
+      <w:r>
+        <w:rPr>
+          <w:i w:val="0"/>
+        </w:rPr>
+        <w:t>Interno... (pausa) sobre o plantão de terça.</w:t>
+      </w:r>
+    </w:p>
+    <w:p>
+      <w:r>
+        <w:rPr>
+          <w:i w:val="0"/>
+        </w:rPr>
+        <w:t>"Vi muita gente fechando sepse e caçando um foco."</w:t>
+      </w:r>
+    </w:p>
+    <w:p>
+      <w:r>
+        <w:rPr>
+          <w:i w:val="0"/>
+        </w:rPr>
+        <w:t>(pausa) "Mas o foco não existia."</w:t>
+      </w:r>
+    </w:p>
+    <w:p>
+      <w:r>
+        <w:rPr>
+          <w:i w:val="0"/>
+        </w:rPr>
+        <w:t>(pausa) "Olhar pro rosto dela."</w:t>
+      </w:r>
+    </w:p>
+    <w:p>
+      <w:r>
+        <w:rPr>
+          <w:i w:val="0"/>
+        </w:rPr>
+        <w:t>(pausa) "Cinco segundos."</w:t>
+      </w:r>
+    </w:p>
+    <w:p>
+      <w:r>
+        <w:rPr>
+          <w:i w:val="0"/>
+        </w:rPr>
+        <w:t>(pausa) "Foi o exame físico... (pausa) ...que mudou completamente o rumo desse caso."</w:t>
+      </w:r>
+    </w:p>
+    <w:p>
+      <w:r>
+        <w:rPr>
+          <w:i w:val="0"/>
+        </w:rPr>
+        <w:t>Olhos saltados, exoftalmia. E emagrecida. Pede a tireoide: TSH baixo, T4 alto. É crise tireotóxica.</w:t>
+      </w:r>
+    </w:p>
+    <w:p>
+      <w:r>
+        <w:rPr>
+          <w:i w:val="0"/>
+        </w:rPr>
+        <w:t>Bom plantão, Interno.</w:t>
+      </w:r>
+    </w:p>
+    <w:p>
+      <w:r>
+        <w:rPr>
+          <w:i w:val="0"/>
+        </w:rPr>
+        <w:t>Pode ir... (pausa) esse paciente já não é mais seu.</w:t>
+      </w:r>
+    </w:p>
+    <w:p>
+      <w:r>
+        <w:rPr>
+          <w:b/>
+          <w:color w:val="555555"/>
+        </w:rPr>
+        <w:t>LIÇÃO (cards na tela, ~2s cada)</w:t>
+      </w:r>
+    </w:p>
+    <w:p>
+      <w:pPr>
+        <w:jc w:val="center"/>
+      </w:pPr>
+      <w:r>
+        <w:rPr>
+          <w:b/>
+          <w:color w:val="555555"/>
+        </w:rPr>
+        <w:t>O QUE ESSE CASO ENSINOU?</w:t>
+      </w:r>
+    </w:p>
+    <w:p>
+      <w:pPr>
+        <w:jc w:val="center"/>
+      </w:pPr>
+      <w:r>
+        <w:rPr>
+          <w:b/>
+          <w:color w:val="0F7B3F"/>
+          <w:sz w:val="26"/>
+        </w:rPr>
+        <w:t>Febre sem foco não é sempre infecção.</w:t>
+      </w:r>
+    </w:p>
+    <w:p>
+      <w:r>
+        <w:rPr>
+          <w:b/>
+          <w:color w:val="555555"/>
+        </w:rPr>
+        <w:t>ENCERRAMENTO (tela preta — sempre igual)</w:t>
+      </w:r>
+    </w:p>
+    <w:p>
+      <w:pPr>
+        <w:jc w:val="center"/>
+      </w:pPr>
+      <w:r>
+        <w:rPr>
+          <w:b/>
+          <w:color w:val="5B21B6"/>
+        </w:rPr>
+        <w:t>PRÓXIMO PACIENTE</w:t>
+      </w:r>
+    </w:p>
+    <w:p>
+      <w:pPr>
+        <w:jc w:val="center"/>
+      </w:pPr>
+      <w:r>
+        <w:rPr>
+          <w:b/>
+          <w:color w:val="5B21B6"/>
+        </w:rPr>
+        <w:t>TERÇA · 20H</w:t>
+      </w:r>
+    </w:p>
+    <w:p>
+      <w:r>
+        <w:rPr>
+          <w:b/>
+          <w:color w:val="555555"/>
+        </w:rPr>
+        <w:t>LEGENDA DO POST</w:t>
+      </w:r>
+    </w:p>
+    <w:p>
+      <w:r>
+        <w:rPr>
+          <w:i w:val="0"/>
+        </w:rPr>
+        <w:t>🩺 DEBRIEF DO PLANTÃO · Caso #002 · Ela Não Para Quieta</w:t>
+      </w:r>
+    </w:p>
+    <w:p>
+      <w:r>
+        <w:rPr>
+          <w:i w:val="0"/>
+        </w:rPr>
+        <w:t>O debrief do Caso #002 já está no ar.</w:t>
+      </w:r>
+    </w:p>
+    <w:p>
+      <w:r>
+        <w:rPr>
+          <w:i w:val="0"/>
+        </w:rPr>
+        <w:t>CRISE TIREOTÓXICA</w:t>
+      </w:r>
+    </w:p>
+    <w:p>
+      <w:r>
+        <w:rPr>
+          <w:i w:val="0"/>
+        </w:rPr>
+        <w:t>O foco infeccioso não existia. Cinco segundos de exame físico mudaram tudo: exoftalmia + emagrecimento → TSH baixo, T4 alto.</w:t>
+      </w:r>
+    </w:p>
+    <w:p>
+      <w:r>
+        <w:rPr>
+          <w:i w:val="0"/>
+        </w:rPr>
+        <w:t>Lição: Febre sem foco não é sempre infecção.</w:t>
+      </w:r>
+    </w:p>
+    <w:p>
+      <w:r>
+        <w:rPr>
+          <w:i w:val="0"/>
+        </w:rPr>
+        <w:t>E você, tinha olhado pros olhos dela? 👇</w:t>
+      </w:r>
+    </w:p>
+    <w:p>
+      <w:r>
+        <w:rPr>
+          <w:i w:val="0"/>
+        </w:rPr>
+        <w:t>Salva pro seu próximo plantão.</w:t>
+      </w:r>
+    </w:p>
+    <w:p>
+      <w:r>
+        <w:rPr>
+          <w:i w:val="0"/>
+        </w:rPr>
+      </w:r>
+    </w:p>
+    <w:p>
+      <w:r>
+        <w:rPr>
+          <w:i w:val="0"/>
+        </w:rPr>
+        <w:t>#pendurajaleco #medicina #casoclinico #plantao #internato #residenciamedica #estudantedemedicina #emergencia</w:t>
+      </w:r>
+    </w:p>
+    <w:p>
+      <w:r>
+        <w:rPr>
+          <w:b/>
+          <w:color w:val="555555"/>
+        </w:rPr>
+        <w:t>COMENTÁRIO FIXADO</w:t>
+      </w:r>
+    </w:p>
+    <w:p>
+      <w:r>
+        <w:rPr>
+          <w:i w:val="0"/>
+        </w:rPr>
+        <w:t>Guarda o combo: febre + taquicardia + agitação + diarreia + olho saltado = pensa TIREOIDE. ✅ Salva e leva pro plantão. 🚨</w:t>
+      </w:r>
+    </w:p>
+    <w:p>
+      <w:r>
+        <w:br w:type="page"/>
+      </w:r>
+    </w:p>
+    <w:p>
+      <w:r>
+        <w:rPr>
+          <w:b/>
+          <w:color w:val="5B21B6"/>
+          <w:sz w:val="40"/>
+        </w:rPr>
+        <w:t>CASO #003 — "É Só Ansiedade"</w:t>
+      </w:r>
+    </w:p>
+    <w:p>
+      <w:r>
+        <w:rPr>
+          <w:i/>
+          <w:color w:val="555555"/>
+        </w:rPr>
+        <w:t>Semana 3  ·  Diagnóstico: Feocromocitoma</w:t>
+      </w:r>
+    </w:p>
+    <w:p>
+      <w:pPr>
+        <w:jc w:val="center"/>
+      </w:pPr>
+      <w:r>
+        <w:rPr>
           <w:color w:val="CCCCCC"/>
         </w:rPr>
         <w:t>— — — — — — — — — — — — — — — — — — — —</w:t>
@@ -643,7 +1661,7 @@
           <w:color w:val="5B21B6"/>
           <w:sz w:val="30"/>
         </w:rPr>
-        <w:t>🩺 DEBRIEF — QUINTA (a discussão de corredor)</w:t>
+        <w:t>🚨 SEU PLANTÃO — TERÇA (o caso)</w:t>
       </w:r>
     </w:p>
     <w:p>
@@ -652,7 +1670,7 @@
           <w:b/>
           <w:color w:val="555555"/>
         </w:rPr>
-        <w:t>CAPA (mesma, com 🩺 e "DEBRIEF")</w:t>
+        <w:t>CAPA</w:t>
       </w:r>
     </w:p>
     <w:p>
@@ -665,7 +1683,7 @@
           <w:color w:val="555555"/>
           <w:sz w:val="20"/>
         </w:rPr>
-        <w:t>🩺</w:t>
+        <w:t>🚨</w:t>
       </w:r>
     </w:p>
     <w:p>
@@ -678,7 +1696,7 @@
           <w:color w:val="5B21B6"/>
           <w:sz w:val="28"/>
         </w:rPr>
-        <w:t>SEU PLANTÃO COMEÇOU</w:t>
+        <w:t>SEU PLANTÃO</w:t>
       </w:r>
     </w:p>
     <w:p>
@@ -691,7 +1709,7 @@
           <w:color w:val="555555"/>
           <w:sz w:val="20"/>
         </w:rPr>
-        <w:t>TEMPORADA 01</w:t>
+        <w:t>CASO #003</w:t>
       </w:r>
     </w:p>
     <w:p>
@@ -701,10 +1719,101 @@
       <w:r>
         <w:rPr>
           <w:b/>
+          <w:color w:val="5B21B6"/>
+          <w:sz w:val="26"/>
+        </w:rPr>
+        <w:t>É SÓ ANSIEDADE</w:t>
+      </w:r>
+    </w:p>
+    <w:p>
+      <w:r>
+        <w:rPr>
+          <w:b/>
           <w:color w:val="555555"/>
-          <w:sz w:val="20"/>
-        </w:rPr>
-        <w:t>DEBRIEF #001</w:t>
+        </w:rPr>
+        <w:t>ROTEIRO (falado, máx. 60s)</w:t>
+      </w:r>
+    </w:p>
+    <w:p>
+      <w:r>
+        <w:rPr>
+          <w:i w:val="0"/>
+        </w:rPr>
+        <w:t>Interno... (pausa) Seu plantão começou. (pausa) Esse paciente é seu.</w:t>
+      </w:r>
+    </w:p>
+    <w:p>
+      <w:r>
+        <w:rPr>
+          <w:i w:val="0"/>
+        </w:rPr>
+        <w:t>Rapaz. (pausa) Dezoito anos. (pausa) Começou a trabalhar agora.</w:t>
+      </w:r>
+    </w:p>
+    <w:p>
+      <w:r>
+        <w:rPr>
+          <w:i w:val="0"/>
+        </w:rPr>
+        <w:t>Diagnóstico de burnout, crises de ansiedade. Já toma ansiolítico e antidepressivo. É a oitava vez que volta no pronto-socorro.</w:t>
+      </w:r>
+    </w:p>
+    <w:p>
+      <w:r>
+        <w:rPr>
+          <w:i w:val="0"/>
+        </w:rPr>
+        <w:t>O que você quer saber primeiro?</w:t>
+      </w:r>
+    </w:p>
+    <w:p>
+      <w:r>
+        <w:rPr>
+          <w:i/>
+          <w:color w:val="555555"/>
+        </w:rPr>
+        <w:t>[DIREÇÃO: olha pra lente · não mexe · não sorri · não fala · 2 segundos de silêncio]</w:t>
+      </w:r>
+    </w:p>
+    <w:p>
+      <w:r>
+        <w:rPr>
+          <w:i w:val="0"/>
+        </w:rPr>
+        <w:t>Pressão: 20 por 16. Já em dois anti-hipertensivos — e não cede. Taquicardia. Dor de cabeça forte. Palpitação e suor... em crises. Tem hora que tá bem, tem hora que dispara.</w:t>
+      </w:r>
+    </w:p>
+    <w:p>
+      <w:r>
+        <w:rPr>
+          <w:i w:val="0"/>
+        </w:rPr>
+        <w:t>Num jovem, pressão que não cede a dois remédios não pode parar em "ansiedade".</w:t>
+      </w:r>
+    </w:p>
+    <w:p>
+      <w:r>
+        <w:rPr>
+          <w:i w:val="0"/>
+        </w:rPr>
+        <w:t>Tem um padrão nas crises que muda tudo.</w:t>
+      </w:r>
+    </w:p>
+    <w:p>
+      <w:r>
+        <w:rPr>
+          <w:i w:val="0"/>
+        </w:rPr>
+        <w:t>E você... (pausa) ...por onde você começaria?</w:t>
+      </w:r>
+    </w:p>
+    <w:p>
+      <w:r>
+        <w:rPr>
+          <w:b/>
+          <w:color w:val="555555"/>
+        </w:rPr>
+        <w:t>ENCERRAMENTO (tela preta — sempre igual)</w:t>
       </w:r>
     </w:p>
     <w:p>
@@ -715,91 +1824,8 @@
         <w:rPr>
           <w:b/>
           <w:color w:val="5B21B6"/>
-          <w:sz w:val="26"/>
-        </w:rPr>
-        <w:t>DOR TORÁCICA</w:t>
-      </w:r>
-    </w:p>
-    <w:p>
-      <w:r>
-        <w:rPr>
-          <w:b/>
-          <w:color w:val="555555"/>
-        </w:rPr>
-        <w:t>ROTEIRO (falado, máx. 60s)</w:t>
-      </w:r>
-    </w:p>
-    <w:p>
-      <w:r>
-        <w:rPr>
-          <w:i w:val="0"/>
-        </w:rPr>
-        <w:t>Interno... (pausa) sobre o plantão de terça.</w:t>
-      </w:r>
-    </w:p>
-    <w:p>
-      <w:r>
-        <w:rPr>
-          <w:i w:val="0"/>
-        </w:rPr>
-        <w:t>"Vi muita gente indo direto para a tomografia."</w:t>
-      </w:r>
-    </w:p>
-    <w:p>
-      <w:r>
-        <w:rPr>
-          <w:i w:val="0"/>
-        </w:rPr>
-        <w:t>(pausa) "Mas antes dela... tinha uma informação que custava dez segundos."</w:t>
-      </w:r>
-    </w:p>
-    <w:p>
-      <w:r>
-        <w:rPr>
-          <w:i w:val="0"/>
-        </w:rPr>
-        <w:t>(pausa) "Palpar os pulsos."</w:t>
-      </w:r>
-    </w:p>
-    <w:p>
-      <w:r>
-        <w:rPr>
-          <w:i w:val="0"/>
-        </w:rPr>
-        <w:t>(pausa) "Dez segundos."</w:t>
-      </w:r>
-    </w:p>
-    <w:p>
-      <w:r>
-        <w:rPr>
-          <w:i w:val="0"/>
-        </w:rPr>
-        <w:t>(pausa) "Foi isso que mudou completamente o caso."</w:t>
-      </w:r>
-    </w:p>
-    <w:p>
-      <w:r>
-        <w:rPr>
-          <w:i w:val="0"/>
-        </w:rPr>
-        <w:t>Pulso assimétrico entre os braços. E no raio-X, mediastino alargado. Isso é dissecção aguda de aorta.</w:t>
-      </w:r>
-    </w:p>
-    <w:p>
-      <w:r>
-        <w:rPr>
-          <w:i w:val="0"/>
-        </w:rPr>
-        <w:t>Até terça. (pausa) Bom plantão, Interno.</w:t>
-      </w:r>
-    </w:p>
-    <w:p>
-      <w:r>
-        <w:rPr>
-          <w:b/>
-          <w:color w:val="555555"/>
-        </w:rPr>
-        <w:t>LIÇÃO (cards na tela, ~2s cada)</w:t>
+        </w:rPr>
+        <w:t>"Seu plantão não acabou."</w:t>
       </w:r>
     </w:p>
     <w:p>
@@ -809,9 +1835,106 @@
       <w:r>
         <w:rPr>
           <w:b/>
+          <w:color w:val="5B21B6"/>
+        </w:rPr>
+        <w:t>QUINTA · 20H</w:t>
+      </w:r>
+    </w:p>
+    <w:p>
+      <w:r>
+        <w:rPr>
+          <w:b/>
           <w:color w:val="555555"/>
         </w:rPr>
-        <w:t>O QUE ESSE CASO ENSINOU?</w:t>
+        <w:t>LEGENDA DO POST</w:t>
+      </w:r>
+    </w:p>
+    <w:p>
+      <w:r>
+        <w:rPr>
+          <w:i w:val="0"/>
+        </w:rPr>
+        <w:t>🚨 SEU PLANTÃO · Caso #003 · É Só Ansiedade</w:t>
+      </w:r>
+    </w:p>
+    <w:p>
+      <w:r>
+        <w:rPr>
+          <w:i w:val="0"/>
+        </w:rPr>
+        <w:t>Você assumiria esse caso?</w:t>
+      </w:r>
+    </w:p>
+    <w:p>
+      <w:r>
+        <w:rPr>
+          <w:i w:val="0"/>
+        </w:rPr>
+        <w:t>Rapaz, 18 anos.</w:t>
+      </w:r>
+    </w:p>
+    <w:p>
+      <w:r>
+        <w:rPr>
+          <w:i w:val="0"/>
+        </w:rPr>
+        <w:t>Tratado como ansiedade há meses.</w:t>
+      </w:r>
+    </w:p>
+    <w:p>
+      <w:r>
+        <w:rPr>
+          <w:i w:val="0"/>
+        </w:rPr>
+        <w:t>Pressão 20x16 que não cede.</w:t>
+      </w:r>
+    </w:p>
+    <w:p>
+      <w:r>
+        <w:rPr>
+          <w:i w:val="0"/>
+        </w:rPr>
+        <w:t>E você — por onde começaria?</w:t>
+      </w:r>
+    </w:p>
+    <w:p>
+      <w:r>
+        <w:rPr>
+          <w:i w:val="0"/>
+        </w:rPr>
+        <w:t>👇 Quero saber seu próximo passo, antes do debrief de quinta.</w:t>
+      </w:r>
+    </w:p>
+    <w:p>
+      <w:r>
+        <w:rPr>
+          <w:i w:val="0"/>
+        </w:rPr>
+      </w:r>
+    </w:p>
+    <w:p>
+      <w:r>
+        <w:rPr>
+          <w:i w:val="0"/>
+        </w:rPr>
+        <w:t>#pendurajaleco #medicina #casoclinico #plantao #internato #residenciamedica #estudantedemedicina #emergencia</w:t>
+      </w:r>
+    </w:p>
+    <w:p>
+      <w:r>
+        <w:rPr>
+          <w:b/>
+          <w:color w:val="555555"/>
+        </w:rPr>
+        <w:t>COMENTÁRIO FIXADO</w:t>
+      </w:r>
+    </w:p>
+    <w:p>
+      <w:r>
+        <w:rPr>
+          <w:i w:val="0"/>
+        </w:rPr>
+        <w:t>Jovem + hipertensão grave que não cede ≠ ansiedade. 🧠 Comenta por onde você começaria, antes do debrief de quinta. 👇</w:t>
       </w:r>
     </w:p>
     <w:p>
@@ -820,11 +1943,187 @@
       </w:pPr>
       <w:r>
         <w:rPr>
+          <w:color w:val="CCCCCC"/>
+        </w:rPr>
+        <w:t>— — — — — — — — — — — — — — — — — — — —</w:t>
+      </w:r>
+    </w:p>
+    <w:p>
+      <w:r>
+        <w:rPr>
+          <w:b/>
+          <w:color w:val="5B21B6"/>
+          <w:sz w:val="30"/>
+        </w:rPr>
+        <w:t>🩺 DEBRIEF DO PLANTÃO — QUINTA (discussão de corredor)</w:t>
+      </w:r>
+    </w:p>
+    <w:p>
+      <w:r>
+        <w:rPr>
+          <w:b/>
+          <w:color w:val="555555"/>
+        </w:rPr>
+        <w:t>CAPA (mesma arte, com 🩺)</w:t>
+      </w:r>
+    </w:p>
+    <w:p>
+      <w:pPr>
+        <w:jc w:val="center"/>
+      </w:pPr>
+      <w:r>
+        <w:rPr>
+          <w:b/>
+          <w:color w:val="555555"/>
+          <w:sz w:val="20"/>
+        </w:rPr>
+        <w:t>🩺</w:t>
+      </w:r>
+    </w:p>
+    <w:p>
+      <w:pPr>
+        <w:jc w:val="center"/>
+      </w:pPr>
+      <w:r>
+        <w:rPr>
+          <w:b/>
+          <w:color w:val="5B21B6"/>
+          <w:sz w:val="28"/>
+        </w:rPr>
+        <w:t>DEBRIEF DO PLANTÃO</w:t>
+      </w:r>
+    </w:p>
+    <w:p>
+      <w:pPr>
+        <w:jc w:val="center"/>
+      </w:pPr>
+      <w:r>
+        <w:rPr>
+          <w:b/>
+          <w:color w:val="555555"/>
+          <w:sz w:val="20"/>
+        </w:rPr>
+        <w:t>CASO #003</w:t>
+      </w:r>
+    </w:p>
+    <w:p>
+      <w:pPr>
+        <w:jc w:val="center"/>
+      </w:pPr>
+      <w:r>
+        <w:rPr>
+          <w:b/>
+          <w:color w:val="5B21B6"/>
+          <w:sz w:val="26"/>
+        </w:rPr>
+        <w:t>É SÓ ANSIEDADE</w:t>
+      </w:r>
+    </w:p>
+    <w:p>
+      <w:r>
+        <w:rPr>
+          <w:b/>
+          <w:color w:val="555555"/>
+        </w:rPr>
+        <w:t>ROTEIRO (falado, máx. 60s)</w:t>
+      </w:r>
+    </w:p>
+    <w:p>
+      <w:r>
+        <w:rPr>
+          <w:i w:val="0"/>
+        </w:rPr>
+        <w:t>Interno... (pausa) sobre o plantão de terça.</w:t>
+      </w:r>
+    </w:p>
+    <w:p>
+      <w:r>
+        <w:rPr>
+          <w:i w:val="0"/>
+        </w:rPr>
+        <w:t>"Vi muita gente seguindo o carimbo de ansiedade."</w:t>
+      </w:r>
+    </w:p>
+    <w:p>
+      <w:r>
+        <w:rPr>
+          <w:i w:val="0"/>
+        </w:rPr>
+        <w:t>(pausa) "Mas oito idas ao PS com pressão 20 por 16 pedem outra pergunta."</w:t>
+      </w:r>
+    </w:p>
+    <w:p>
+      <w:r>
+        <w:rPr>
+          <w:i w:val="0"/>
+        </w:rPr>
+        <w:t>(pausa) "Uma pergunta: como vêm as crises?"</w:t>
+      </w:r>
+    </w:p>
+    <w:p>
+      <w:r>
+        <w:rPr>
+          <w:i w:val="0"/>
+        </w:rPr>
+        <w:t>(pausa) "Foi a anamnese... (pausa) ...que mudou completamente o rumo desse caso."</w:t>
+      </w:r>
+    </w:p>
+    <w:p>
+      <w:r>
+        <w:rPr>
+          <w:i w:val="0"/>
+        </w:rPr>
+        <w:t>Dor de cabeça, palpitação e sudorese — juntas, em ondas. Isso é feocromocitoma. O que parecia pânico era adrenalina de um tumor.</w:t>
+      </w:r>
+    </w:p>
+    <w:p>
+      <w:r>
+        <w:rPr>
+          <w:i w:val="0"/>
+        </w:rPr>
+        <w:t>Bom plantão, Interno.</w:t>
+      </w:r>
+    </w:p>
+    <w:p>
+      <w:r>
+        <w:rPr>
+          <w:i w:val="0"/>
+        </w:rPr>
+        <w:t>Pode ir... (pausa) esse paciente já não é mais seu.</w:t>
+      </w:r>
+    </w:p>
+    <w:p>
+      <w:r>
+        <w:rPr>
+          <w:b/>
+          <w:color w:val="555555"/>
+        </w:rPr>
+        <w:t>LIÇÃO (cards na tela, ~2s cada)</w:t>
+      </w:r>
+    </w:p>
+    <w:p>
+      <w:pPr>
+        <w:jc w:val="center"/>
+      </w:pPr>
+      <w:r>
+        <w:rPr>
+          <w:b/>
+          <w:color w:val="555555"/>
+        </w:rPr>
+        <w:t>O QUE ESSE CASO ENSINOU?</w:t>
+      </w:r>
+    </w:p>
+    <w:p>
+      <w:pPr>
+        <w:jc w:val="center"/>
+      </w:pPr>
+      <w:r>
+        <w:rPr>
           <w:b/>
           <w:color w:val="0F7B3F"/>
           <w:sz w:val="26"/>
         </w:rPr>
-        <w:t>ECG normal NÃO encerra o raciocínio.</w:t>
+        <w:t>Hipertensão grave no jovem você investiga, não carimba.</w:t>
       </w:r>
     </w:p>
     <w:p>
@@ -845,6 +2144,18 @@
           <w:b/>
           <w:color w:val="5B21B6"/>
         </w:rPr>
+        <w:t>PRÓXIMO PACIENTE</w:t>
+      </w:r>
+    </w:p>
+    <w:p>
+      <w:pPr>
+        <w:jc w:val="center"/>
+      </w:pPr>
+      <w:r>
+        <w:rPr>
+          <w:b/>
+          <w:color w:val="5B21B6"/>
+        </w:rPr>
         <w:t>TERÇA · 20H</w:t>
       </w:r>
     </w:p>
@@ -862,7 +2173,7 @@
         <w:rPr>
           <w:i w:val="0"/>
         </w:rPr>
-        <w:t>🩺 DEBRIEF #001 · Dor Torácica</w:t>
+        <w:t>🩺 DEBRIEF DO PLANTÃO · Caso #003 · É Só Ansiedade</w:t>
       </w:r>
     </w:p>
     <w:p>
@@ -870,7 +2181,7 @@
         <w:rPr>
           <w:i w:val="0"/>
         </w:rPr>
-        <w:t>O debrief do Plantão #001 já está no ar.</w:t>
+        <w:t>O debrief do Caso #003 já está no ar.</w:t>
       </w:r>
     </w:p>
     <w:p>
@@ -878,7 +2189,7 @@
         <w:rPr>
           <w:i w:val="0"/>
         </w:rPr>
-        <w:t>DISSECÇÃO AGUDA DE AORTA</w:t>
+        <w:t>FEOCROMOCITOMA</w:t>
       </w:r>
     </w:p>
     <w:p>
@@ -886,7 +2197,7 @@
         <w:rPr>
           <w:i w:val="0"/>
         </w:rPr>
-        <w:t>O ECG limpo parou muita gente. Dez segundos palpando os pulsos mudaram tudo: assimetria + mediastino alargado.</w:t>
+        <w:t>Não era pânico — era adrenalina de um tumor. Uma pergunta ("como vêm as crises?") mudou tudo: cefaleia + palpitação + sudorese, em ondas.</w:t>
       </w:r>
     </w:p>
     <w:p>
@@ -894,7 +2205,7 @@
         <w:rPr>
           <w:i w:val="0"/>
         </w:rPr>
-        <w:t>Lição: ECG normal NÃO encerra o raciocínio.</w:t>
+        <w:t>Lição: Hipertensão grave no jovem você investiga, não carimba.</w:t>
       </w:r>
     </w:p>
     <w:p>
@@ -902,7 +2213,7 @@
         <w:rPr>
           <w:i w:val="0"/>
         </w:rPr>
-        <w:t>E você, tinha pego o pulso? 👇</w:t>
+        <w:t>E você, quantas vezes quase carimba antes de pensar? 👇</w:t>
       </w:r>
     </w:p>
     <w:p>
@@ -942,7 +2253,7 @@
         <w:rPr>
           <w:i w:val="0"/>
         </w:rPr>
-        <w:t>Guarda a tríade: dor pras costas + assimetria de pulso + mediastino alargado. ✅ Salva e leva pro plantão. 🚨</w:t>
+        <w:t>Guarda a tríade do feo: cefaleia + palpitação + sudorese, em crises. ✅ Jovem com HAS grave = investiga. 🚨</w:t>
       </w:r>
     </w:p>
     <w:p>
@@ -957,7 +2268,7 @@
           <w:color w:val="5B21B6"/>
           <w:sz w:val="40"/>
         </w:rPr>
-        <w:t>PLANTÃO #002 — "Ela Não Para Quieta"</w:t>
+        <w:t>CASO #004 — "O Paciente Não Fala"</w:t>
       </w:r>
     </w:p>
     <w:p>
@@ -966,7 +2277,7 @@
           <w:i/>
           <w:color w:val="555555"/>
         </w:rPr>
-        <w:t>Semana 2  ·  Diagnóstico: Crise tireotóxica</w:t>
+        <w:t>Semana 4  ·  Diagnóstico: Intussuscepção</w:t>
       </w:r>
     </w:p>
     <w:p>
@@ -987,7 +2298,7 @@
           <w:color w:val="5B21B6"/>
           <w:sz w:val="30"/>
         </w:rPr>
-        <w:t>🚨 PLANTÃO — TERÇA (o caso)</w:t>
+        <w:t>🚨 SEU PLANTÃO — TERÇA (o caso)</w:t>
       </w:r>
     </w:p>
     <w:p>
@@ -1022,7 +2333,7 @@
           <w:color w:val="5B21B6"/>
           <w:sz w:val="28"/>
         </w:rPr>
-        <w:t>SEU PLANTÃO COMEÇOU</w:t>
+        <w:t>SEU PLANTÃO</w:t>
       </w:r>
     </w:p>
     <w:p>
@@ -1035,7 +2346,7 @@
           <w:color w:val="555555"/>
           <w:sz w:val="20"/>
         </w:rPr>
-        <w:t>TEMPORADA 01</w:t>
+        <w:t>CASO #004</w:t>
       </w:r>
     </w:p>
     <w:p>
@@ -1045,10 +2356,101 @@
       <w:r>
         <w:rPr>
           <w:b/>
+          <w:color w:val="5B21B6"/>
+          <w:sz w:val="26"/>
+        </w:rPr>
+        <w:t>O PACIENTE NÃO FALA</w:t>
+      </w:r>
+    </w:p>
+    <w:p>
+      <w:r>
+        <w:rPr>
+          <w:b/>
           <w:color w:val="555555"/>
-          <w:sz w:val="20"/>
-        </w:rPr>
-        <w:t>PLANTÃO #002</w:t>
+        </w:rPr>
+        <w:t>ROTEIRO (falado, máx. 60s)</w:t>
+      </w:r>
+    </w:p>
+    <w:p>
+      <w:r>
+        <w:rPr>
+          <w:i w:val="0"/>
+        </w:rPr>
+        <w:t>Interno... (pausa) Seu plantão começou. (pausa) Esse paciente é seu.</w:t>
+      </w:r>
+    </w:p>
+    <w:p>
+      <w:r>
+        <w:rPr>
+          <w:i w:val="0"/>
+        </w:rPr>
+        <w:t>Você é o cirurgião. A pediatria te chama pra ver uma criança com dor na barriga.</w:t>
+      </w:r>
+    </w:p>
+    <w:p>
+      <w:r>
+        <w:rPr>
+          <w:i w:val="0"/>
+        </w:rPr>
+        <w:t>Mas ela tem... (pausa) nove meses. (pausa) Não fala. Não te conta nada.</w:t>
+      </w:r>
+    </w:p>
+    <w:p>
+      <w:r>
+        <w:rPr>
+          <w:i w:val="0"/>
+        </w:rPr>
+        <w:t>O que você quer saber primeiro?</w:t>
+      </w:r>
+    </w:p>
+    <w:p>
+      <w:r>
+        <w:rPr>
+          <w:i/>
+          <w:color w:val="555555"/>
+        </w:rPr>
+        <w:t>[DIREÇÃO: olha pra lente · não mexe · não sorri · não fala · 2 segundos de silêncio]</w:t>
+      </w:r>
+    </w:p>
+    <w:p>
+      <w:r>
+        <w:rPr>
+          <w:i w:val="0"/>
+        </w:rPr>
+        <w:t>A dor vem em ondas. Ela chora, contrai, faz cara de dor... e acalma. Daqui a pouco, volta tudo. Já vomitou. Tá um pouco hipotensa.</w:t>
+      </w:r>
+    </w:p>
+    <w:p>
+      <w:r>
+        <w:rPr>
+          <w:i w:val="0"/>
+        </w:rPr>
+        <w:t>Sem queixa, sem história. Só o corpo dela fala.</w:t>
+      </w:r>
+    </w:p>
+    <w:p>
+      <w:r>
+        <w:rPr>
+          <w:i w:val="0"/>
+        </w:rPr>
+        <w:t>Tem um exame que é fácil de pular no bebê — e que muda tudo.</w:t>
+      </w:r>
+    </w:p>
+    <w:p>
+      <w:r>
+        <w:rPr>
+          <w:i w:val="0"/>
+        </w:rPr>
+        <w:t>E você... (pausa) ...por onde você começaria?</w:t>
+      </w:r>
+    </w:p>
+    <w:p>
+      <w:r>
+        <w:rPr>
+          <w:b/>
+          <w:color w:val="555555"/>
+        </w:rPr>
+        <w:t>ENCERRAMENTO (tela preta — sempre igual)</w:t>
       </w:r>
     </w:p>
     <w:p>
@@ -1059,100 +2461,8 @@
         <w:rPr>
           <w:b/>
           <w:color w:val="5B21B6"/>
-          <w:sz w:val="26"/>
-        </w:rPr>
-        <w:t>ELA NÃO PARA QUIETA</w:t>
-      </w:r>
-    </w:p>
-    <w:p>
-      <w:r>
-        <w:rPr>
-          <w:b/>
-          <w:color w:val="555555"/>
-        </w:rPr>
-        <w:t>ROTEIRO (falado, máx. 60s)</w:t>
-      </w:r>
-    </w:p>
-    <w:p>
-      <w:r>
-        <w:rPr>
-          <w:i w:val="0"/>
-        </w:rPr>
-        <w:t>Interno... (pausa) Seu plantão começou. (pausa) Esse paciente é seu.</w:t>
-      </w:r>
-    </w:p>
-    <w:p>
-      <w:r>
-        <w:rPr>
-          <w:i w:val="0"/>
-        </w:rPr>
-        <w:t>Mulher. (pausa) Trinta e oito anos. (pausa) Hipertensa.</w:t>
-      </w:r>
-    </w:p>
-    <w:p>
-      <w:r>
-        <w:rPr>
-          <w:i w:val="0"/>
-        </w:rPr>
-        <w:t>Chega muito agitada, não consegue ficar quieta na maca. Calafrios, diarreia e febre.</w:t>
-      </w:r>
-    </w:p>
-    <w:p>
-      <w:r>
-        <w:rPr>
-          <w:i w:val="0"/>
-        </w:rPr>
-        <w:t>O que você quer saber primeiro?</w:t>
-      </w:r>
-    </w:p>
-    <w:p>
-      <w:r>
-        <w:rPr>
-          <w:i/>
-          <w:color w:val="555555"/>
-        </w:rPr>
-        <w:t>[DIREÇÃO: silêncio de 2 segundos. Igor parado, olhando pra câmera.]</w:t>
-      </w:r>
-    </w:p>
-    <w:p>
-      <w:r>
-        <w:rPr>
-          <w:i w:val="0"/>
-        </w:rPr>
-        <w:t>Temperatura: 38,2. Taquicárdica. Pressão 18 por 10. Coração regular, pulmão limpo, abdome sem nada demais.</w:t>
-      </w:r>
-    </w:p>
-    <w:p>
-      <w:r>
-        <w:rPr>
-          <w:i w:val="0"/>
-        </w:rPr>
-        <w:t>Você pensa infecção — e faz certo em pensar. Pede o pacote. Urina limpa. Raio-X normal. Hemograma sem nada de infeccioso.</w:t>
-      </w:r>
-    </w:p>
-    <w:p>
-      <w:r>
-        <w:rPr>
-          <w:i w:val="0"/>
-        </w:rPr>
-        <w:t>Só que o foco não aparece. (pausa) E tem um detalhe que muda tudo.</w:t>
-      </w:r>
-    </w:p>
-    <w:p>
-      <w:r>
-        <w:rPr>
-          <w:i w:val="0"/>
-        </w:rPr>
-        <w:t>E você... (pausa) ...o que examinaria agora? Comenta.</w:t>
-      </w:r>
-    </w:p>
-    <w:p>
-      <w:r>
-        <w:rPr>
-          <w:b/>
-          <w:color w:val="555555"/>
-        </w:rPr>
-        <w:t>ENCERRAMENTO (tela preta — sempre igual)</w:t>
+        </w:rPr>
+        <w:t>"Seu plantão não acabou."</w:t>
       </w:r>
     </w:p>
     <w:p>
@@ -1164,7 +2474,104 @@
           <w:b/>
           <w:color w:val="5B21B6"/>
         </w:rPr>
-        <w:t>"Seu plantão não acabou."</w:t>
+        <w:t>QUINTA · 20H</w:t>
+      </w:r>
+    </w:p>
+    <w:p>
+      <w:r>
+        <w:rPr>
+          <w:b/>
+          <w:color w:val="555555"/>
+        </w:rPr>
+        <w:t>LEGENDA DO POST</w:t>
+      </w:r>
+    </w:p>
+    <w:p>
+      <w:r>
+        <w:rPr>
+          <w:i w:val="0"/>
+        </w:rPr>
+        <w:t>🚨 SEU PLANTÃO · Caso #004 · O Paciente Não Fala</w:t>
+      </w:r>
+    </w:p>
+    <w:p>
+      <w:r>
+        <w:rPr>
+          <w:i w:val="0"/>
+        </w:rPr>
+        <w:t>Você assumiria esse caso?</w:t>
+      </w:r>
+    </w:p>
+    <w:p>
+      <w:r>
+        <w:rPr>
+          <w:i w:val="0"/>
+        </w:rPr>
+        <w:t>Bebê, 9 meses.</w:t>
+      </w:r>
+    </w:p>
+    <w:p>
+      <w:r>
+        <w:rPr>
+          <w:i w:val="0"/>
+        </w:rPr>
+        <w:t>Dor abdominal em ondas.</w:t>
+      </w:r>
+    </w:p>
+    <w:p>
+      <w:r>
+        <w:rPr>
+          <w:i w:val="0"/>
+        </w:rPr>
+        <w:t>Não fala, não conta nada.</w:t>
+      </w:r>
+    </w:p>
+    <w:p>
+      <w:r>
+        <w:rPr>
+          <w:i w:val="0"/>
+        </w:rPr>
+        <w:t>E você — por onde começaria?</w:t>
+      </w:r>
+    </w:p>
+    <w:p>
+      <w:r>
+        <w:rPr>
+          <w:i w:val="0"/>
+        </w:rPr>
+        <w:t>👇 Quero saber seu próximo passo, antes do debrief de quinta.</w:t>
+      </w:r>
+    </w:p>
+    <w:p>
+      <w:r>
+        <w:rPr>
+          <w:i w:val="0"/>
+        </w:rPr>
+      </w:r>
+    </w:p>
+    <w:p>
+      <w:r>
+        <w:rPr>
+          <w:i w:val="0"/>
+        </w:rPr>
+        <w:t>#pendurajaleco #medicina #casoclinico #plantao #internato #residenciamedica #estudantedemedicina #emergencia</w:t>
+      </w:r>
+    </w:p>
+    <w:p>
+      <w:r>
+        <w:rPr>
+          <w:b/>
+          <w:color w:val="555555"/>
+        </w:rPr>
+        <w:t>COMENTÁRIO FIXADO</w:t>
+      </w:r>
+    </w:p>
+    <w:p>
+      <w:r>
+        <w:rPr>
+          <w:i w:val="0"/>
+        </w:rPr>
+        <w:t>Quando o paciente não fala, o exame fala por ele. 🧠 Comenta por onde você começaria, antes do debrief de quinta. 👇</w:t>
       </w:r>
     </w:p>
     <w:p>
@@ -1173,10 +2580,19 @@
       </w:pPr>
       <w:r>
         <w:rPr>
+          <w:color w:val="CCCCCC"/>
+        </w:rPr>
+        <w:t>— — — — — — — — — — — — — — — — — — — —</w:t>
+      </w:r>
+    </w:p>
+    <w:p>
+      <w:r>
+        <w:rPr>
           <w:b/>
           <w:color w:val="5B21B6"/>
-        </w:rPr>
-        <w:t>QUINTA · 20H</w:t>
+          <w:sz w:val="30"/>
+        </w:rPr>
+        <w:t>🩺 DEBRIEF DO PLANTÃO — QUINTA (discussão de corredor)</w:t>
       </w:r>
     </w:p>
     <w:p>
@@ -1185,95 +2601,7 @@
           <w:b/>
           <w:color w:val="555555"/>
         </w:rPr>
-        <w:t>LEGENDA DO POST</w:t>
-      </w:r>
-    </w:p>
-    <w:p>
-      <w:r>
-        <w:rPr>
-          <w:i w:val="0"/>
-        </w:rPr>
-        <w:t>🚨 PLANTÃO #002 · Ela Não Para Quieta</w:t>
-      </w:r>
-    </w:p>
-    <w:p>
-      <w:r>
-        <w:rPr>
-          <w:i w:val="0"/>
-        </w:rPr>
-        <w:t>Você assumiria esse caso?</w:t>
-      </w:r>
-    </w:p>
-    <w:p>
-      <w:r>
-        <w:rPr>
-          <w:i w:val="0"/>
-        </w:rPr>
-        <w:t>Mulher, 38 anos.</w:t>
-      </w:r>
-    </w:p>
-    <w:p>
-      <w:r>
-        <w:rPr>
-          <w:i w:val="0"/>
-        </w:rPr>
-        <w:t>Febre, calafrio e taquicardia.</w:t>
-      </w:r>
-    </w:p>
-    <w:p>
-      <w:r>
-        <w:rPr>
-          <w:i w:val="0"/>
-        </w:rPr>
-        <w:t>Exames de infecção limpos.</w:t>
-      </w:r>
-    </w:p>
-    <w:p>
-      <w:r>
-        <w:rPr>
-          <w:i w:val="0"/>
-        </w:rPr>
-        <w:t>E você — qual é o próximo passo?</w:t>
-      </w:r>
-    </w:p>
-    <w:p>
-      <w:r>
-        <w:rPr>
-          <w:i w:val="0"/>
-        </w:rPr>
-        <w:t>👇 Quero ler sua conduta antes do debrief de quinta.</w:t>
-      </w:r>
-    </w:p>
-    <w:p>
-      <w:r>
-        <w:rPr>
-          <w:i w:val="0"/>
-        </w:rPr>
-      </w:r>
-    </w:p>
-    <w:p>
-      <w:r>
-        <w:rPr>
-          <w:i w:val="0"/>
-        </w:rPr>
-        <w:t>#pendurajaleco #medicina #casoclinico #plantao #internato #residenciamedica #estudantedemedicina #emergencia</w:t>
-      </w:r>
-    </w:p>
-    <w:p>
-      <w:r>
-        <w:rPr>
-          <w:b/>
-          <w:color w:val="555555"/>
-        </w:rPr>
-        <w:t>COMENTÁRIO FIXADO</w:t>
-      </w:r>
-    </w:p>
-    <w:p>
-      <w:r>
-        <w:rPr>
-          <w:i w:val="0"/>
-        </w:rPr>
-        <w:t>Pista da série: febre sem foco nem sempre é infecção. 🧠 Qual sua hipótese? Comenta antes do debrief de quinta. 👇</w:t>
+        <w:t>CAPA (mesma arte, com 🩺)</w:t>
       </w:r>
     </w:p>
     <w:p>
@@ -1282,28 +2610,11 @@
       </w:pPr>
       <w:r>
         <w:rPr>
-          <w:color w:val="CCCCCC"/>
-        </w:rPr>
-        <w:t>— — — — — — — — — — — — — — — — — — — —</w:t>
-      </w:r>
-    </w:p>
-    <w:p>
-      <w:r>
-        <w:rPr>
-          <w:b/>
-          <w:color w:val="5B21B6"/>
-          <w:sz w:val="30"/>
-        </w:rPr>
-        <w:t>🩺 DEBRIEF — QUINTA (a discussão de corredor)</w:t>
-      </w:r>
-    </w:p>
-    <w:p>
-      <w:r>
-        <w:rPr>
           <w:b/>
           <w:color w:val="555555"/>
-        </w:rPr>
-        <w:t>CAPA (mesma, com 🩺 e "DEBRIEF")</w:t>
+          <w:sz w:val="20"/>
+        </w:rPr>
+        <w:t>🩺</w:t>
       </w:r>
     </w:p>
     <w:p>
@@ -1313,10 +2624,10 @@
       <w:r>
         <w:rPr>
           <w:b/>
-          <w:color w:val="555555"/>
-          <w:sz w:val="20"/>
-        </w:rPr>
-        <w:t>🩺</w:t>
+          <w:color w:val="5B21B6"/>
+          <w:sz w:val="28"/>
+        </w:rPr>
+        <w:t>DEBRIEF DO PLANTÃO</w:t>
       </w:r>
     </w:p>
     <w:p>
@@ -1326,10 +2637,10 @@
       <w:r>
         <w:rPr>
           <w:b/>
-          <w:color w:val="5B21B6"/>
-          <w:sz w:val="28"/>
-        </w:rPr>
-        <w:t>SEU PLANTÃO COMEÇOU</w:t>
+          <w:color w:val="555555"/>
+          <w:sz w:val="20"/>
+        </w:rPr>
+        <w:t>CASO #004</w:t>
       </w:r>
     </w:p>
     <w:p>
@@ -1339,10 +2650,108 @@
       <w:r>
         <w:rPr>
           <w:b/>
+          <w:color w:val="5B21B6"/>
+          <w:sz w:val="26"/>
+        </w:rPr>
+        <w:t>O PACIENTE NÃO FALA</w:t>
+      </w:r>
+    </w:p>
+    <w:p>
+      <w:r>
+        <w:rPr>
+          <w:b/>
           <w:color w:val="555555"/>
-          <w:sz w:val="20"/>
-        </w:rPr>
-        <w:t>TEMPORADA 01</w:t>
+        </w:rPr>
+        <w:t>ROTEIRO (falado, máx. 60s)</w:t>
+      </w:r>
+    </w:p>
+    <w:p>
+      <w:r>
+        <w:rPr>
+          <w:i w:val="0"/>
+        </w:rPr>
+        <w:t>Interno... (pausa) sobre o plantão de terça.</w:t>
+      </w:r>
+    </w:p>
+    <w:p>
+      <w:r>
+        <w:rPr>
+          <w:i w:val="0"/>
+        </w:rPr>
+        <w:t>"Vi muita gente indo direto pro ultrassom."</w:t>
+      </w:r>
+    </w:p>
+    <w:p>
+      <w:r>
+        <w:rPr>
+          <w:i w:val="0"/>
+        </w:rPr>
+        <w:t>(pausa) "E ele ajuda."</w:t>
+      </w:r>
+    </w:p>
+    <w:p>
+      <w:r>
+        <w:rPr>
+          <w:i w:val="0"/>
+        </w:rPr>
+        <w:t>(pausa) "Mas quem entregou foi o básico."</w:t>
+      </w:r>
+    </w:p>
+    <w:p>
+      <w:r>
+        <w:rPr>
+          <w:i w:val="0"/>
+        </w:rPr>
+        <w:t>(pausa) "O toque retal."</w:t>
+      </w:r>
+    </w:p>
+    <w:p>
+      <w:r>
+        <w:rPr>
+          <w:i w:val="0"/>
+        </w:rPr>
+        <w:t>(pausa) "Dez segundos."</w:t>
+      </w:r>
+    </w:p>
+    <w:p>
+      <w:r>
+        <w:rPr>
+          <w:i w:val="0"/>
+        </w:rPr>
+        <w:t>(pausa) "Foi o exame físico... (pausa) ...que mudou completamente o rumo desse caso."</w:t>
+      </w:r>
+    </w:p>
+    <w:p>
+      <w:r>
+        <w:rPr>
+          <w:i w:val="0"/>
+        </w:rPr>
+        <w:t>Fezes em geleia de framboesa. Isso é intussuscepção. Bebê de 6 meses a 2 anos, dor em ondas, às vezes massa em salsicha. O ultrassom confirma: sinal do alvo.</w:t>
+      </w:r>
+    </w:p>
+    <w:p>
+      <w:r>
+        <w:rPr>
+          <w:i w:val="0"/>
+        </w:rPr>
+        <w:t>Bom plantão, Interno.</w:t>
+      </w:r>
+    </w:p>
+    <w:p>
+      <w:r>
+        <w:rPr>
+          <w:i w:val="0"/>
+        </w:rPr>
+        <w:t>Pode ir... (pausa) esse paciente já não é mais seu.</w:t>
+      </w:r>
+    </w:p>
+    <w:p>
+      <w:r>
+        <w:rPr>
+          <w:b/>
+          <w:color w:val="555555"/>
+        </w:rPr>
+        <w:t>LIÇÃO (cards na tela, ~2s cada)</w:t>
       </w:r>
     </w:p>
     <w:p>
@@ -1353,9 +2762,8 @@
         <w:rPr>
           <w:b/>
           <w:color w:val="555555"/>
-          <w:sz w:val="20"/>
-        </w:rPr>
-        <w:t>DEBRIEF #002</w:t>
+        </w:rPr>
+        <w:t>O QUE ESSE CASO ENSINOU?</w:t>
       </w:r>
     </w:p>
     <w:p>
@@ -1365,10 +2773,10 @@
       <w:r>
         <w:rPr>
           <w:b/>
-          <w:color w:val="5B21B6"/>
+          <w:color w:val="0F7B3F"/>
           <w:sz w:val="26"/>
         </w:rPr>
-        <w:t>ELA NÃO PARA QUIETA</w:t>
+        <w:t>Quando o paciente não fala, examine. O básico fala por ele.</w:t>
       </w:r>
     </w:p>
     <w:p>
@@ -1377,80 +2785,7 @@
           <w:b/>
           <w:color w:val="555555"/>
         </w:rPr>
-        <w:t>ROTEIRO (falado, máx. 60s)</w:t>
-      </w:r>
-    </w:p>
-    <w:p>
-      <w:r>
-        <w:rPr>
-          <w:i w:val="0"/>
-        </w:rPr>
-        <w:t>Interno... (pausa) sobre o plantão de terça.</w:t>
-      </w:r>
-    </w:p>
-    <w:p>
-      <w:r>
-        <w:rPr>
-          <w:i w:val="0"/>
-        </w:rPr>
-        <w:t>"Vi muita gente fechando sepse e caçando um foco."</w:t>
-      </w:r>
-    </w:p>
-    <w:p>
-      <w:r>
-        <w:rPr>
-          <w:i w:val="0"/>
-        </w:rPr>
-        <w:t>(pausa) "Mas o foco não existia."</w:t>
-      </w:r>
-    </w:p>
-    <w:p>
-      <w:r>
-        <w:rPr>
-          <w:i w:val="0"/>
-        </w:rPr>
-        <w:t>(pausa) "Olhar pro rosto dela."</w:t>
-      </w:r>
-    </w:p>
-    <w:p>
-      <w:r>
-        <w:rPr>
-          <w:i w:val="0"/>
-        </w:rPr>
-        <w:t>(pausa) "Cinco segundos."</w:t>
-      </w:r>
-    </w:p>
-    <w:p>
-      <w:r>
-        <w:rPr>
-          <w:i w:val="0"/>
-        </w:rPr>
-        <w:t>(pausa) "Foi isso que mudou completamente o caso."</w:t>
-      </w:r>
-    </w:p>
-    <w:p>
-      <w:r>
-        <w:rPr>
-          <w:i w:val="0"/>
-        </w:rPr>
-        <w:t>Olhos saltados, exoftalmia. E emagrecida. Pede a tireoide: TSH baixo, T4 alto. É crise tireotóxica.</w:t>
-      </w:r>
-    </w:p>
-    <w:p>
-      <w:r>
-        <w:rPr>
-          <w:i w:val="0"/>
-        </w:rPr>
-        <w:t>Até terça. (pausa) Bom plantão, Interno.</w:t>
-      </w:r>
-    </w:p>
-    <w:p>
-      <w:r>
-        <w:rPr>
-          <w:b/>
-          <w:color w:val="555555"/>
-        </w:rPr>
-        <w:t>LIÇÃO (cards na tela, ~2s cada)</w:t>
+        <w:t>ENCERRAMENTO (tela preta — sempre igual)</w:t>
       </w:r>
     </w:p>
     <w:p>
@@ -1460,9 +2795,9 @@
       <w:r>
         <w:rPr>
           <w:b/>
-          <w:color w:val="555555"/>
-        </w:rPr>
-        <w:t>O QUE ESSE CASO ENSINOU?</w:t>
+          <w:color w:val="5B21B6"/>
+        </w:rPr>
+        <w:t>PRÓXIMO PACIENTE</w:t>
       </w:r>
     </w:p>
     <w:p>
@@ -1472,10 +2807,9 @@
       <w:r>
         <w:rPr>
           <w:b/>
-          <w:color w:val="0F7B3F"/>
-          <w:sz w:val="26"/>
-        </w:rPr>
-        <w:t>Febre sem foco não é sempre infecção.</w:t>
+          <w:color w:val="5B21B6"/>
+        </w:rPr>
+        <w:t>TERÇA · 20H</w:t>
       </w:r>
     </w:p>
     <w:p>
@@ -1484,19 +2818,78 @@
           <w:b/>
           <w:color w:val="555555"/>
         </w:rPr>
-        <w:t>ENCERRAMENTO (tela preta — sempre igual)</w:t>
-      </w:r>
-    </w:p>
-    <w:p>
-      <w:pPr>
-        <w:jc w:val="center"/>
-      </w:pPr>
-      <w:r>
-        <w:rPr>
-          <w:b/>
-          <w:color w:val="5B21B6"/>
-        </w:rPr>
-        <w:t>TERÇA · 20H</w:t>
+        <w:t>LEGENDA DO POST</w:t>
+      </w:r>
+    </w:p>
+    <w:p>
+      <w:r>
+        <w:rPr>
+          <w:i w:val="0"/>
+        </w:rPr>
+        <w:t>🩺 DEBRIEF DO PLANTÃO · Caso #004 · O Paciente Não Fala</w:t>
+      </w:r>
+    </w:p>
+    <w:p>
+      <w:r>
+        <w:rPr>
+          <w:i w:val="0"/>
+        </w:rPr>
+        <w:t>O debrief do Caso #004 já está no ar.</w:t>
+      </w:r>
+    </w:p>
+    <w:p>
+      <w:r>
+        <w:rPr>
+          <w:i w:val="0"/>
+        </w:rPr>
+        <w:t>INTUSSUSCEPÇÃO</w:t>
+      </w:r>
+    </w:p>
+    <w:p>
+      <w:r>
+        <w:rPr>
+          <w:i w:val="0"/>
+        </w:rPr>
+        <w:t>O ultrassom confirma (sinal do alvo), mas quem entregou foi o toque: geleia de framboesa. Bebê 6m–2a + dor em ondas.</w:t>
+      </w:r>
+    </w:p>
+    <w:p>
+      <w:r>
+        <w:rPr>
+          <w:i w:val="0"/>
+        </w:rPr>
+        <w:t>Lição: Quando o paciente não fala, examine. O básico fala por ele.</w:t>
+      </w:r>
+    </w:p>
+    <w:p>
+      <w:r>
+        <w:rPr>
+          <w:i w:val="0"/>
+        </w:rPr>
+        <w:t>E você, teria feito o toque? 👇</w:t>
+      </w:r>
+    </w:p>
+    <w:p>
+      <w:r>
+        <w:rPr>
+          <w:i w:val="0"/>
+        </w:rPr>
+        <w:t>Salva pro seu próximo plantão.</w:t>
+      </w:r>
+    </w:p>
+    <w:p>
+      <w:r>
+        <w:rPr>
+          <w:i w:val="0"/>
+        </w:rPr>
+      </w:r>
+    </w:p>
+    <w:p>
+      <w:r>
+        <w:rPr>
+          <w:i w:val="0"/>
+        </w:rPr>
+        <w:t>#pendurajaleco #medicina #casoclinico #plantao #internato #residenciamedica #estudantedemedicina #emergencia</w:t>
       </w:r>
     </w:p>
     <w:p>
@@ -1505,7 +2898,7 @@
           <w:b/>
           <w:color w:val="555555"/>
         </w:rPr>
-        <w:t>LEGENDA DO POST</w:t>
+        <w:t>COMENTÁRIO FIXADO</w:t>
       </w:r>
     </w:p>
     <w:p>
@@ -1513,87 +2906,7 @@
         <w:rPr>
           <w:i w:val="0"/>
         </w:rPr>
-        <w:t>🩺 DEBRIEF #002 · Ela Não Para Quieta</w:t>
-      </w:r>
-    </w:p>
-    <w:p>
-      <w:r>
-        <w:rPr>
-          <w:i w:val="0"/>
-        </w:rPr>
-        <w:t>O debrief do Plantão #002 já está no ar.</w:t>
-      </w:r>
-    </w:p>
-    <w:p>
-      <w:r>
-        <w:rPr>
-          <w:i w:val="0"/>
-        </w:rPr>
-        <w:t>CRISE TIREOTÓXICA</w:t>
-      </w:r>
-    </w:p>
-    <w:p>
-      <w:r>
-        <w:rPr>
-          <w:i w:val="0"/>
-        </w:rPr>
-        <w:t>O foco infeccioso não existia. Cinco segundos olhando o rosto mudaram tudo: exoftalmia + emagrecimento → TSH baixo, T4 alto.</w:t>
-      </w:r>
-    </w:p>
-    <w:p>
-      <w:r>
-        <w:rPr>
-          <w:i w:val="0"/>
-        </w:rPr>
-        <w:t>Lição: Febre sem foco não é sempre infecção.</w:t>
-      </w:r>
-    </w:p>
-    <w:p>
-      <w:r>
-        <w:rPr>
-          <w:i w:val="0"/>
-        </w:rPr>
-        <w:t>E você, tinha olhado pros olhos dela? 👇</w:t>
-      </w:r>
-    </w:p>
-    <w:p>
-      <w:r>
-        <w:rPr>
-          <w:i w:val="0"/>
-        </w:rPr>
-        <w:t>Salva pro seu próximo plantão.</w:t>
-      </w:r>
-    </w:p>
-    <w:p>
-      <w:r>
-        <w:rPr>
-          <w:i w:val="0"/>
-        </w:rPr>
-      </w:r>
-    </w:p>
-    <w:p>
-      <w:r>
-        <w:rPr>
-          <w:i w:val="0"/>
-        </w:rPr>
-        <w:t>#pendurajaleco #medicina #casoclinico #plantao #internato #residenciamedica #estudantedemedicina #emergencia</w:t>
-      </w:r>
-    </w:p>
-    <w:p>
-      <w:r>
-        <w:rPr>
-          <w:b/>
-          <w:color w:val="555555"/>
-        </w:rPr>
-        <w:t>COMENTÁRIO FIXADO</w:t>
-      </w:r>
-    </w:p>
-    <w:p>
-      <w:r>
-        <w:rPr>
-          <w:i w:val="0"/>
-        </w:rPr>
-        <w:t>Guarda o combo: febre + taquicardia + agitação + diarreia + olho saltado = pensa TIREOIDE. ✅ Salva e leva pro plantão. 🚨</w:t>
+        <w:t>Guarda o combo: 6m–2a + dor intermitente + geleia de framboesa + sinal do alvo. ✅ Salva e leva pro plantão. 🚨</w:t>
       </w:r>
     </w:p>
     <w:p>
@@ -1608,37 +2921,15 @@
           <w:color w:val="5B21B6"/>
           <w:sz w:val="40"/>
         </w:rPr>
-        <w:t>PLANTÃO #003 — "É Só Ansiedade"</w:t>
-      </w:r>
-    </w:p>
-    <w:p>
-      <w:r>
-        <w:rPr>
-          <w:i/>
-          <w:color w:val="555555"/>
-        </w:rPr>
-        <w:t>Semana 3  ·  Diagnóstico: Feocromocitoma</w:t>
-      </w:r>
-    </w:p>
-    <w:p>
-      <w:pPr>
-        <w:jc w:val="center"/>
-      </w:pPr>
-      <w:r>
-        <w:rPr>
-          <w:color w:val="CCCCCC"/>
-        </w:rPr>
-        <w:t>— — — — — — — — — — — — — — — — — — — —</w:t>
-      </w:r>
-    </w:p>
-    <w:p>
-      <w:r>
-        <w:rPr>
-          <w:b/>
-          <w:color w:val="5B21B6"/>
-          <w:sz w:val="30"/>
-        </w:rPr>
-        <w:t>🚨 PLANTÃO — TERÇA (o caso)</w:t>
+        <w:t>📊 Como medir o teste (1 mês)</w:t>
+      </w:r>
+    </w:p>
+    <w:p>
+      <w:r>
+        <w:rPr>
+          <w:i w:val="0"/>
+        </w:rPr>
+        <w:t>Não meça por VIEWS. O reel antigo viralizou com público leigo (99,4% não-seguidores). Ao virar pro interno, o alcance bruto tende a cair — e tudo bem.</w:t>
       </w:r>
     </w:p>
     <w:p>
@@ -1647,81 +2938,48 @@
           <w:b/>
           <w:color w:val="555555"/>
         </w:rPr>
-        <w:t>CAPA</w:t>
-      </w:r>
-    </w:p>
-    <w:p>
-      <w:pPr>
-        <w:jc w:val="center"/>
-      </w:pPr>
+        <w:t>O QUE OLHAR, NESTA ORDEM</w:t>
+      </w:r>
+    </w:p>
+    <w:p>
+      <w:r>
+        <w:rPr>
+          <w:i w:val="0"/>
+        </w:rPr>
+        <w:t>1. Salvamentos ÷ views — sinal nº1 de que acertou o público de estudo. Meta: acima de 1–2% (no viral antigo foi ~0,13%).</w:t>
+      </w:r>
+    </w:p>
+    <w:p>
+      <w:r>
+        <w:rPr>
+          <w:i w:val="0"/>
+        </w:rPr>
+        <w:t>2. Comentários com raciocínio ("eu palparia o pulso", "pediria TSH") vs. comentários leigos. Qualidade &gt; quantidade.</w:t>
+      </w:r>
+    </w:p>
+    <w:p>
+      <w:r>
+        <w:rPr>
+          <w:i w:val="0"/>
+        </w:rPr>
+        <w:t>3. Atividade no perfil / visitas — interno que volta na quinta pro debrief é quem constrói a base.</w:t>
+      </w:r>
+    </w:p>
+    <w:p>
+      <w:r>
+        <w:rPr>
+          <w:i w:val="0"/>
+        </w:rPr>
+        <w:t>4. Retenção entre PLANTÃO (terça) e DEBRIEF (quinta).</w:t>
+      </w:r>
+    </w:p>
+    <w:p>
       <w:r>
         <w:rPr>
           <w:b/>
           <w:color w:val="555555"/>
-          <w:sz w:val="20"/>
-        </w:rPr>
-        <w:t>🚨</w:t>
-      </w:r>
-    </w:p>
-    <w:p>
-      <w:pPr>
-        <w:jc w:val="center"/>
-      </w:pPr>
-      <w:r>
-        <w:rPr>
-          <w:b/>
-          <w:color w:val="5B21B6"/>
-          <w:sz w:val="28"/>
-        </w:rPr>
-        <w:t>SEU PLANTÃO COMEÇOU</w:t>
-      </w:r>
-    </w:p>
-    <w:p>
-      <w:pPr>
-        <w:jc w:val="center"/>
-      </w:pPr>
-      <w:r>
-        <w:rPr>
-          <w:b/>
-          <w:color w:val="555555"/>
-          <w:sz w:val="20"/>
-        </w:rPr>
-        <w:t>TEMPORADA 01</w:t>
-      </w:r>
-    </w:p>
-    <w:p>
-      <w:pPr>
-        <w:jc w:val="center"/>
-      </w:pPr>
-      <w:r>
-        <w:rPr>
-          <w:b/>
-          <w:color w:val="555555"/>
-          <w:sz w:val="20"/>
-        </w:rPr>
-        <w:t>PLANTÃO #003</w:t>
-      </w:r>
-    </w:p>
-    <w:p>
-      <w:pPr>
-        <w:jc w:val="center"/>
-      </w:pPr>
-      <w:r>
-        <w:rPr>
-          <w:b/>
-          <w:color w:val="5B21B6"/>
-          <w:sz w:val="26"/>
-        </w:rPr>
-        <w:t>É SÓ ANSIEDADE</w:t>
-      </w:r>
-    </w:p>
-    <w:p>
-      <w:r>
-        <w:rPr>
-          <w:b/>
-          <w:color w:val="555555"/>
-        </w:rPr>
-        <w:t>ROTEIRO (falado, máx. 60s)</w:t>
+        </w:rPr>
+        <w:t>REGRA DE DECISÃO</w:t>
       </w:r>
     </w:p>
     <w:p>
@@ -1729,1246 +2987,7 @@
         <w:rPr>
           <w:i w:val="0"/>
         </w:rPr>
-        <w:t>Interno... (pausa) Seu plantão começou. (pausa) Esse paciente é seu.</w:t>
-      </w:r>
-    </w:p>
-    <w:p>
-      <w:r>
-        <w:rPr>
-          <w:i w:val="0"/>
-        </w:rPr>
-        <w:t>Rapaz. (pausa) Dezoito anos. (pausa) Começou a trabalhar agora.</w:t>
-      </w:r>
-    </w:p>
-    <w:p>
-      <w:r>
-        <w:rPr>
-          <w:i w:val="0"/>
-        </w:rPr>
-        <w:t>Diagnóstico de burnout, crises de ansiedade. Já toma ansiolítico e antidepressivo. É a oitava vez que volta no pronto-socorro.</w:t>
-      </w:r>
-    </w:p>
-    <w:p>
-      <w:r>
-        <w:rPr>
-          <w:i w:val="0"/>
-        </w:rPr>
-        <w:t>O que você quer saber primeiro?</w:t>
-      </w:r>
-    </w:p>
-    <w:p>
-      <w:r>
-        <w:rPr>
-          <w:i/>
-          <w:color w:val="555555"/>
-        </w:rPr>
-        <w:t>[DIREÇÃO: silêncio de 2 segundos. Igor não fala, não sorri.]</w:t>
-      </w:r>
-    </w:p>
-    <w:p>
-      <w:r>
-        <w:rPr>
-          <w:i w:val="0"/>
-        </w:rPr>
-        <w:t>Pressão: 20 por 16. Já em dois anti-hipertensivos — e não cede. Taquicardia. Dor de cabeça forte. Palpitação e suor... em crises. Tem hora que tá bem, tem hora que dispara.</w:t>
-      </w:r>
-    </w:p>
-    <w:p>
-      <w:r>
-        <w:rPr>
-          <w:i w:val="0"/>
-        </w:rPr>
-        <w:t>Num jovem, pressão que não cede a dois remédios não pode parar em "ansiedade".</w:t>
-      </w:r>
-    </w:p>
-    <w:p>
-      <w:r>
-        <w:rPr>
-          <w:i w:val="0"/>
-        </w:rPr>
-        <w:t>Tem um padrão nas crises que muda tudo.</w:t>
-      </w:r>
-    </w:p>
-    <w:p>
-      <w:r>
-        <w:rPr>
-          <w:i w:val="0"/>
-        </w:rPr>
-        <w:t>E você... (pausa) ...o que pensaria num jovem com pressão assim? Comenta.</w:t>
-      </w:r>
-    </w:p>
-    <w:p>
-      <w:r>
-        <w:rPr>
-          <w:b/>
-          <w:color w:val="555555"/>
-        </w:rPr>
-        <w:t>ENCERRAMENTO (tela preta — sempre igual)</w:t>
-      </w:r>
-    </w:p>
-    <w:p>
-      <w:pPr>
-        <w:jc w:val="center"/>
-      </w:pPr>
-      <w:r>
-        <w:rPr>
-          <w:b/>
-          <w:color w:val="5B21B6"/>
-        </w:rPr>
-        <w:t>"Seu plantão não acabou."</w:t>
-      </w:r>
-    </w:p>
-    <w:p>
-      <w:pPr>
-        <w:jc w:val="center"/>
-      </w:pPr>
-      <w:r>
-        <w:rPr>
-          <w:b/>
-          <w:color w:val="5B21B6"/>
-        </w:rPr>
-        <w:t>QUINTA · 20H</w:t>
-      </w:r>
-    </w:p>
-    <w:p>
-      <w:r>
-        <w:rPr>
-          <w:b/>
-          <w:color w:val="555555"/>
-        </w:rPr>
-        <w:t>LEGENDA DO POST</w:t>
-      </w:r>
-    </w:p>
-    <w:p>
-      <w:r>
-        <w:rPr>
-          <w:i w:val="0"/>
-        </w:rPr>
-        <w:t>🚨 PLANTÃO #003 · É Só Ansiedade</w:t>
-      </w:r>
-    </w:p>
-    <w:p>
-      <w:r>
-        <w:rPr>
-          <w:i w:val="0"/>
-        </w:rPr>
-        <w:t>Você assumiria esse caso?</w:t>
-      </w:r>
-    </w:p>
-    <w:p>
-      <w:r>
-        <w:rPr>
-          <w:i w:val="0"/>
-        </w:rPr>
-        <w:t>Rapaz, 18 anos.</w:t>
-      </w:r>
-    </w:p>
-    <w:p>
-      <w:r>
-        <w:rPr>
-          <w:i w:val="0"/>
-        </w:rPr>
-        <w:t>Tratado como ansiedade há meses.</w:t>
-      </w:r>
-    </w:p>
-    <w:p>
-      <w:r>
-        <w:rPr>
-          <w:i w:val="0"/>
-        </w:rPr>
-        <w:t>Pressão 20x16 que não cede.</w:t>
-      </w:r>
-    </w:p>
-    <w:p>
-      <w:r>
-        <w:rPr>
-          <w:i w:val="0"/>
-        </w:rPr>
-        <w:t>E você — qual é o próximo passo?</w:t>
-      </w:r>
-    </w:p>
-    <w:p>
-      <w:r>
-        <w:rPr>
-          <w:i w:val="0"/>
-        </w:rPr>
-        <w:t>👇 Quero ler sua conduta antes do debrief de quinta.</w:t>
-      </w:r>
-    </w:p>
-    <w:p>
-      <w:r>
-        <w:rPr>
-          <w:i w:val="0"/>
-        </w:rPr>
-      </w:r>
-    </w:p>
-    <w:p>
-      <w:r>
-        <w:rPr>
-          <w:i w:val="0"/>
-        </w:rPr>
-        <w:t>#pendurajaleco #medicina #casoclinico #plantao #internato #residenciamedica #estudantedemedicina #emergencia</w:t>
-      </w:r>
-    </w:p>
-    <w:p>
-      <w:r>
-        <w:rPr>
-          <w:b/>
-          <w:color w:val="555555"/>
-        </w:rPr>
-        <w:t>COMENTÁRIO FIXADO</w:t>
-      </w:r>
-    </w:p>
-    <w:p>
-      <w:r>
-        <w:rPr>
-          <w:i w:val="0"/>
-        </w:rPr>
-        <w:t>Jovem + hipertensão grave que não cede ≠ ansiedade. 🧠 Comenta seu próximo passo antes do debrief de quinta. 👇</w:t>
-      </w:r>
-    </w:p>
-    <w:p>
-      <w:pPr>
-        <w:jc w:val="center"/>
-      </w:pPr>
-      <w:r>
-        <w:rPr>
-          <w:color w:val="CCCCCC"/>
-        </w:rPr>
-        <w:t>— — — — — — — — — — — — — — — — — — — —</w:t>
-      </w:r>
-    </w:p>
-    <w:p>
-      <w:r>
-        <w:rPr>
-          <w:b/>
-          <w:color w:val="5B21B6"/>
-          <w:sz w:val="30"/>
-        </w:rPr>
-        <w:t>🩺 DEBRIEF — QUINTA (a discussão de corredor)</w:t>
-      </w:r>
-    </w:p>
-    <w:p>
-      <w:r>
-        <w:rPr>
-          <w:b/>
-          <w:color w:val="555555"/>
-        </w:rPr>
-        <w:t>CAPA (mesma, com 🩺 e "DEBRIEF")</w:t>
-      </w:r>
-    </w:p>
-    <w:p>
-      <w:pPr>
-        <w:jc w:val="center"/>
-      </w:pPr>
-      <w:r>
-        <w:rPr>
-          <w:b/>
-          <w:color w:val="555555"/>
-          <w:sz w:val="20"/>
-        </w:rPr>
-        <w:t>🩺</w:t>
-      </w:r>
-    </w:p>
-    <w:p>
-      <w:pPr>
-        <w:jc w:val="center"/>
-      </w:pPr>
-      <w:r>
-        <w:rPr>
-          <w:b/>
-          <w:color w:val="5B21B6"/>
-          <w:sz w:val="28"/>
-        </w:rPr>
-        <w:t>SEU PLANTÃO COMEÇOU</w:t>
-      </w:r>
-    </w:p>
-    <w:p>
-      <w:pPr>
-        <w:jc w:val="center"/>
-      </w:pPr>
-      <w:r>
-        <w:rPr>
-          <w:b/>
-          <w:color w:val="555555"/>
-          <w:sz w:val="20"/>
-        </w:rPr>
-        <w:t>TEMPORADA 01</w:t>
-      </w:r>
-    </w:p>
-    <w:p>
-      <w:pPr>
-        <w:jc w:val="center"/>
-      </w:pPr>
-      <w:r>
-        <w:rPr>
-          <w:b/>
-          <w:color w:val="555555"/>
-          <w:sz w:val="20"/>
-        </w:rPr>
-        <w:t>DEBRIEF #003</w:t>
-      </w:r>
-    </w:p>
-    <w:p>
-      <w:pPr>
-        <w:jc w:val="center"/>
-      </w:pPr>
-      <w:r>
-        <w:rPr>
-          <w:b/>
-          <w:color w:val="5B21B6"/>
-          <w:sz w:val="26"/>
-        </w:rPr>
-        <w:t>É SÓ ANSIEDADE</w:t>
-      </w:r>
-    </w:p>
-    <w:p>
-      <w:r>
-        <w:rPr>
-          <w:b/>
-          <w:color w:val="555555"/>
-        </w:rPr>
-        <w:t>ROTEIRO (falado, máx. 60s)</w:t>
-      </w:r>
-    </w:p>
-    <w:p>
-      <w:r>
-        <w:rPr>
-          <w:i w:val="0"/>
-        </w:rPr>
-        <w:t>Interno... (pausa) sobre o plantão de terça.</w:t>
-      </w:r>
-    </w:p>
-    <w:p>
-      <w:r>
-        <w:rPr>
-          <w:i w:val="0"/>
-        </w:rPr>
-        <w:t>"Vi muita gente seguindo o carimbo de ansiedade."</w:t>
-      </w:r>
-    </w:p>
-    <w:p>
-      <w:r>
-        <w:rPr>
-          <w:i w:val="0"/>
-        </w:rPr>
-        <w:t>(pausa) "Mas oito idas ao PS com pressão 20 por 16 pedem outra pergunta."</w:t>
-      </w:r>
-    </w:p>
-    <w:p>
-      <w:r>
-        <w:rPr>
-          <w:i w:val="0"/>
-        </w:rPr>
-        <w:t>(pausa) "Como vêm as crises?"</w:t>
-      </w:r>
-    </w:p>
-    <w:p>
-      <w:r>
-        <w:rPr>
-          <w:i w:val="0"/>
-        </w:rPr>
-        <w:t>(pausa) "Foi isso que mudou completamente o caso."</w:t>
-      </w:r>
-    </w:p>
-    <w:p>
-      <w:r>
-        <w:rPr>
-          <w:i w:val="0"/>
-        </w:rPr>
-        <w:t>Dor de cabeça, palpitação e sudorese — juntas, em ondas. Isso é feocromocitoma. O que parecia pânico era adrenalina de um tumor.</w:t>
-      </w:r>
-    </w:p>
-    <w:p>
-      <w:r>
-        <w:rPr>
-          <w:i w:val="0"/>
-        </w:rPr>
-        <w:t>Até terça. (pausa) Bom plantão, Interno.</w:t>
-      </w:r>
-    </w:p>
-    <w:p>
-      <w:r>
-        <w:rPr>
-          <w:b/>
-          <w:color w:val="555555"/>
-        </w:rPr>
-        <w:t>LIÇÃO (cards na tela, ~2s cada)</w:t>
-      </w:r>
-    </w:p>
-    <w:p>
-      <w:pPr>
-        <w:jc w:val="center"/>
-      </w:pPr>
-      <w:r>
-        <w:rPr>
-          <w:b/>
-          <w:color w:val="555555"/>
-        </w:rPr>
-        <w:t>O QUE ESSE CASO ENSINOU?</w:t>
-      </w:r>
-    </w:p>
-    <w:p>
-      <w:pPr>
-        <w:jc w:val="center"/>
-      </w:pPr>
-      <w:r>
-        <w:rPr>
-          <w:b/>
-          <w:color w:val="0F7B3F"/>
-          <w:sz w:val="26"/>
-        </w:rPr>
-        <w:t>Hipertensão grave no jovem você investiga, não carimba.</w:t>
-      </w:r>
-    </w:p>
-    <w:p>
-      <w:r>
-        <w:rPr>
-          <w:b/>
-          <w:color w:val="555555"/>
-        </w:rPr>
-        <w:t>ENCERRAMENTO (tela preta — sempre igual)</w:t>
-      </w:r>
-    </w:p>
-    <w:p>
-      <w:pPr>
-        <w:jc w:val="center"/>
-      </w:pPr>
-      <w:r>
-        <w:rPr>
-          <w:b/>
-          <w:color w:val="5B21B6"/>
-        </w:rPr>
-        <w:t>TERÇA · 20H</w:t>
-      </w:r>
-    </w:p>
-    <w:p>
-      <w:r>
-        <w:rPr>
-          <w:b/>
-          <w:color w:val="555555"/>
-        </w:rPr>
-        <w:t>LEGENDA DO POST</w:t>
-      </w:r>
-    </w:p>
-    <w:p>
-      <w:r>
-        <w:rPr>
-          <w:i w:val="0"/>
-        </w:rPr>
-        <w:t>🩺 DEBRIEF #003 · É Só Ansiedade</w:t>
-      </w:r>
-    </w:p>
-    <w:p>
-      <w:r>
-        <w:rPr>
-          <w:i w:val="0"/>
-        </w:rPr>
-        <w:t>O debrief do Plantão #003 já está no ar.</w:t>
-      </w:r>
-    </w:p>
-    <w:p>
-      <w:r>
-        <w:rPr>
-          <w:i w:val="0"/>
-        </w:rPr>
-        <w:t>FEOCROMOCITOMA</w:t>
-      </w:r>
-    </w:p>
-    <w:p>
-      <w:r>
-        <w:rPr>
-          <w:i w:val="0"/>
-        </w:rPr>
-        <w:t>Não era pânico — era adrenalina de um tumor. Uma pergunta ("como vêm as crises?") mudou tudo: cefaleia + palpitação + sudorese, em ondas.</w:t>
-      </w:r>
-    </w:p>
-    <w:p>
-      <w:r>
-        <w:rPr>
-          <w:i w:val="0"/>
-        </w:rPr>
-        <w:t>Lição: Hipertensão grave no jovem você investiga, não carimba.</w:t>
-      </w:r>
-    </w:p>
-    <w:p>
-      <w:r>
-        <w:rPr>
-          <w:i w:val="0"/>
-        </w:rPr>
-        <w:t>E você, quantas vezes quase carimba antes de pensar? 👇</w:t>
-      </w:r>
-    </w:p>
-    <w:p>
-      <w:r>
-        <w:rPr>
-          <w:i w:val="0"/>
-        </w:rPr>
-        <w:t>Salva pro seu próximo plantão.</w:t>
-      </w:r>
-    </w:p>
-    <w:p>
-      <w:r>
-        <w:rPr>
-          <w:i w:val="0"/>
-        </w:rPr>
-      </w:r>
-    </w:p>
-    <w:p>
-      <w:r>
-        <w:rPr>
-          <w:i w:val="0"/>
-        </w:rPr>
-        <w:t>#pendurajaleco #medicina #casoclinico #plantao #internato #residenciamedica #estudantedemedicina #emergencia</w:t>
-      </w:r>
-    </w:p>
-    <w:p>
-      <w:r>
-        <w:rPr>
-          <w:b/>
-          <w:color w:val="555555"/>
-        </w:rPr>
-        <w:t>COMENTÁRIO FIXADO</w:t>
-      </w:r>
-    </w:p>
-    <w:p>
-      <w:r>
-        <w:rPr>
-          <w:i w:val="0"/>
-        </w:rPr>
-        <w:t>Guarda a tríade do feo: cefaleia + palpitação + sudorese, em crises. ✅ Jovem com HAS grave = investiga. 🚨</w:t>
-      </w:r>
-    </w:p>
-    <w:p>
-      <w:r>
-        <w:br w:type="page"/>
-      </w:r>
-    </w:p>
-    <w:p>
-      <w:r>
-        <w:rPr>
-          <w:b/>
-          <w:color w:val="5B21B6"/>
-          <w:sz w:val="40"/>
-        </w:rPr>
-        <w:t>PLANTÃO #004 — "O Paciente Não Fala"</w:t>
-      </w:r>
-    </w:p>
-    <w:p>
-      <w:r>
-        <w:rPr>
-          <w:i/>
-          <w:color w:val="555555"/>
-        </w:rPr>
-        <w:t>Semana 4  ·  Diagnóstico: Intussuscepção</w:t>
-      </w:r>
-    </w:p>
-    <w:p>
-      <w:pPr>
-        <w:jc w:val="center"/>
-      </w:pPr>
-      <w:r>
-        <w:rPr>
-          <w:color w:val="CCCCCC"/>
-        </w:rPr>
-        <w:t>— — — — — — — — — — — — — — — — — — — —</w:t>
-      </w:r>
-    </w:p>
-    <w:p>
-      <w:r>
-        <w:rPr>
-          <w:b/>
-          <w:color w:val="5B21B6"/>
-          <w:sz w:val="30"/>
-        </w:rPr>
-        <w:t>🚨 PLANTÃO — TERÇA (o caso)</w:t>
-      </w:r>
-    </w:p>
-    <w:p>
-      <w:r>
-        <w:rPr>
-          <w:b/>
-          <w:color w:val="555555"/>
-        </w:rPr>
-        <w:t>CAPA</w:t>
-      </w:r>
-    </w:p>
-    <w:p>
-      <w:pPr>
-        <w:jc w:val="center"/>
-      </w:pPr>
-      <w:r>
-        <w:rPr>
-          <w:b/>
-          <w:color w:val="555555"/>
-          <w:sz w:val="20"/>
-        </w:rPr>
-        <w:t>🚨</w:t>
-      </w:r>
-    </w:p>
-    <w:p>
-      <w:pPr>
-        <w:jc w:val="center"/>
-      </w:pPr>
-      <w:r>
-        <w:rPr>
-          <w:b/>
-          <w:color w:val="5B21B6"/>
-          <w:sz w:val="28"/>
-        </w:rPr>
-        <w:t>SEU PLANTÃO COMEÇOU</w:t>
-      </w:r>
-    </w:p>
-    <w:p>
-      <w:pPr>
-        <w:jc w:val="center"/>
-      </w:pPr>
-      <w:r>
-        <w:rPr>
-          <w:b/>
-          <w:color w:val="555555"/>
-          <w:sz w:val="20"/>
-        </w:rPr>
-        <w:t>TEMPORADA 01</w:t>
-      </w:r>
-    </w:p>
-    <w:p>
-      <w:pPr>
-        <w:jc w:val="center"/>
-      </w:pPr>
-      <w:r>
-        <w:rPr>
-          <w:b/>
-          <w:color w:val="555555"/>
-          <w:sz w:val="20"/>
-        </w:rPr>
-        <w:t>PLANTÃO #004</w:t>
-      </w:r>
-    </w:p>
-    <w:p>
-      <w:pPr>
-        <w:jc w:val="center"/>
-      </w:pPr>
-      <w:r>
-        <w:rPr>
-          <w:b/>
-          <w:color w:val="5B21B6"/>
-          <w:sz w:val="26"/>
-        </w:rPr>
-        <w:t>O PACIENTE NÃO FALA</w:t>
-      </w:r>
-    </w:p>
-    <w:p>
-      <w:r>
-        <w:rPr>
-          <w:b/>
-          <w:color w:val="555555"/>
-        </w:rPr>
-        <w:t>ROTEIRO (falado, máx. 60s)</w:t>
-      </w:r>
-    </w:p>
-    <w:p>
-      <w:r>
-        <w:rPr>
-          <w:i w:val="0"/>
-        </w:rPr>
-        <w:t>Interno... (pausa) Seu plantão começou. (pausa) Esse paciente é seu.</w:t>
-      </w:r>
-    </w:p>
-    <w:p>
-      <w:r>
-        <w:rPr>
-          <w:i w:val="0"/>
-        </w:rPr>
-        <w:t>Você é o cirurgião. A pediatria te chama pra ver uma criança com dor na barriga.</w:t>
-      </w:r>
-    </w:p>
-    <w:p>
-      <w:r>
-        <w:rPr>
-          <w:i w:val="0"/>
-        </w:rPr>
-        <w:t>Mas ela tem... (pausa) nove meses. (pausa) Não fala. Não te conta nada.</w:t>
-      </w:r>
-    </w:p>
-    <w:p>
-      <w:r>
-        <w:rPr>
-          <w:i w:val="0"/>
-        </w:rPr>
-        <w:t>O que você quer saber primeiro?</w:t>
-      </w:r>
-    </w:p>
-    <w:p>
-      <w:r>
-        <w:rPr>
-          <w:i/>
-          <w:color w:val="555555"/>
-        </w:rPr>
-        <w:t>[DIREÇÃO: silêncio de 2 segundos. Igor parado, olhando pra câmera.]</w:t>
-      </w:r>
-    </w:p>
-    <w:p>
-      <w:r>
-        <w:rPr>
-          <w:i w:val="0"/>
-        </w:rPr>
-        <w:t>A dor vem em ondas. Ela chora, contrai, faz cara de dor... e acalma. Daqui a pouco, volta tudo. Já vomitou. Tá um pouco hipotensa.</w:t>
-      </w:r>
-    </w:p>
-    <w:p>
-      <w:r>
-        <w:rPr>
-          <w:i w:val="0"/>
-        </w:rPr>
-        <w:t>Sem queixa, sem história. Só o corpo dela fala.</w:t>
-      </w:r>
-    </w:p>
-    <w:p>
-      <w:r>
-        <w:rPr>
-          <w:i w:val="0"/>
-        </w:rPr>
-        <w:t>Tem um exame que é fácil de pular no bebê — e que muda tudo.</w:t>
-      </w:r>
-    </w:p>
-    <w:p>
-      <w:r>
-        <w:rPr>
-          <w:i w:val="0"/>
-        </w:rPr>
-        <w:t>E você... (pausa) ...qual exame faria agora? Comenta.</w:t>
-      </w:r>
-    </w:p>
-    <w:p>
-      <w:r>
-        <w:rPr>
-          <w:b/>
-          <w:color w:val="555555"/>
-        </w:rPr>
-        <w:t>ENCERRAMENTO (tela preta — sempre igual)</w:t>
-      </w:r>
-    </w:p>
-    <w:p>
-      <w:pPr>
-        <w:jc w:val="center"/>
-      </w:pPr>
-      <w:r>
-        <w:rPr>
-          <w:b/>
-          <w:color w:val="5B21B6"/>
-        </w:rPr>
-        <w:t>"Seu plantão não acabou."</w:t>
-      </w:r>
-    </w:p>
-    <w:p>
-      <w:pPr>
-        <w:jc w:val="center"/>
-      </w:pPr>
-      <w:r>
-        <w:rPr>
-          <w:b/>
-          <w:color w:val="5B21B6"/>
-        </w:rPr>
-        <w:t>QUINTA · 20H</w:t>
-      </w:r>
-    </w:p>
-    <w:p>
-      <w:r>
-        <w:rPr>
-          <w:b/>
-          <w:color w:val="555555"/>
-        </w:rPr>
-        <w:t>LEGENDA DO POST</w:t>
-      </w:r>
-    </w:p>
-    <w:p>
-      <w:r>
-        <w:rPr>
-          <w:i w:val="0"/>
-        </w:rPr>
-        <w:t>🚨 PLANTÃO #004 · O Paciente Não Fala</w:t>
-      </w:r>
-    </w:p>
-    <w:p>
-      <w:r>
-        <w:rPr>
-          <w:i w:val="0"/>
-        </w:rPr>
-        <w:t>Você assumiria esse caso?</w:t>
-      </w:r>
-    </w:p>
-    <w:p>
-      <w:r>
-        <w:rPr>
-          <w:i w:val="0"/>
-        </w:rPr>
-        <w:t>Bebê, 9 meses.</w:t>
-      </w:r>
-    </w:p>
-    <w:p>
-      <w:r>
-        <w:rPr>
-          <w:i w:val="0"/>
-        </w:rPr>
-        <w:t>Dor abdominal em ondas.</w:t>
-      </w:r>
-    </w:p>
-    <w:p>
-      <w:r>
-        <w:rPr>
-          <w:i w:val="0"/>
-        </w:rPr>
-        <w:t>Não fala, não conta nada.</w:t>
-      </w:r>
-    </w:p>
-    <w:p>
-      <w:r>
-        <w:rPr>
-          <w:i w:val="0"/>
-        </w:rPr>
-        <w:t>E você — qual é o próximo passo?</w:t>
-      </w:r>
-    </w:p>
-    <w:p>
-      <w:r>
-        <w:rPr>
-          <w:i w:val="0"/>
-        </w:rPr>
-        <w:t>👇 Quero ler sua conduta antes do debrief de quinta.</w:t>
-      </w:r>
-    </w:p>
-    <w:p>
-      <w:r>
-        <w:rPr>
-          <w:i w:val="0"/>
-        </w:rPr>
-      </w:r>
-    </w:p>
-    <w:p>
-      <w:r>
-        <w:rPr>
-          <w:i w:val="0"/>
-        </w:rPr>
-        <w:t>#pendurajaleco #medicina #casoclinico #plantao #internato #residenciamedica #estudantedemedicina #emergencia</w:t>
-      </w:r>
-    </w:p>
-    <w:p>
-      <w:r>
-        <w:rPr>
-          <w:b/>
-          <w:color w:val="555555"/>
-        </w:rPr>
-        <w:t>COMENTÁRIO FIXADO</w:t>
-      </w:r>
-    </w:p>
-    <w:p>
-      <w:r>
-        <w:rPr>
-          <w:i w:val="0"/>
-        </w:rPr>
-        <w:t>Quando o paciente não fala, o exame fala por ele. 🧠 Qual exame você não pularia? Comenta antes do debrief de quinta. 👇</w:t>
-      </w:r>
-    </w:p>
-    <w:p>
-      <w:pPr>
-        <w:jc w:val="center"/>
-      </w:pPr>
-      <w:r>
-        <w:rPr>
-          <w:color w:val="CCCCCC"/>
-        </w:rPr>
-        <w:t>— — — — — — — — — — — — — — — — — — — —</w:t>
-      </w:r>
-    </w:p>
-    <w:p>
-      <w:r>
-        <w:rPr>
-          <w:b/>
-          <w:color w:val="5B21B6"/>
-          <w:sz w:val="30"/>
-        </w:rPr>
-        <w:t>🩺 DEBRIEF — QUINTA (a discussão de corredor)</w:t>
-      </w:r>
-    </w:p>
-    <w:p>
-      <w:r>
-        <w:rPr>
-          <w:b/>
-          <w:color w:val="555555"/>
-        </w:rPr>
-        <w:t>CAPA (mesma, com 🩺 e "DEBRIEF")</w:t>
-      </w:r>
-    </w:p>
-    <w:p>
-      <w:pPr>
-        <w:jc w:val="center"/>
-      </w:pPr>
-      <w:r>
-        <w:rPr>
-          <w:b/>
-          <w:color w:val="555555"/>
-          <w:sz w:val="20"/>
-        </w:rPr>
-        <w:t>🩺</w:t>
-      </w:r>
-    </w:p>
-    <w:p>
-      <w:pPr>
-        <w:jc w:val="center"/>
-      </w:pPr>
-      <w:r>
-        <w:rPr>
-          <w:b/>
-          <w:color w:val="5B21B6"/>
-          <w:sz w:val="28"/>
-        </w:rPr>
-        <w:t>SEU PLANTÃO COMEÇOU</w:t>
-      </w:r>
-    </w:p>
-    <w:p>
-      <w:pPr>
-        <w:jc w:val="center"/>
-      </w:pPr>
-      <w:r>
-        <w:rPr>
-          <w:b/>
-          <w:color w:val="555555"/>
-          <w:sz w:val="20"/>
-        </w:rPr>
-        <w:t>TEMPORADA 01</w:t>
-      </w:r>
-    </w:p>
-    <w:p>
-      <w:pPr>
-        <w:jc w:val="center"/>
-      </w:pPr>
-      <w:r>
-        <w:rPr>
-          <w:b/>
-          <w:color w:val="555555"/>
-          <w:sz w:val="20"/>
-        </w:rPr>
-        <w:t>DEBRIEF #004</w:t>
-      </w:r>
-    </w:p>
-    <w:p>
-      <w:pPr>
-        <w:jc w:val="center"/>
-      </w:pPr>
-      <w:r>
-        <w:rPr>
-          <w:b/>
-          <w:color w:val="5B21B6"/>
-          <w:sz w:val="26"/>
-        </w:rPr>
-        <w:t>O PACIENTE NÃO FALA</w:t>
-      </w:r>
-    </w:p>
-    <w:p>
-      <w:r>
-        <w:rPr>
-          <w:b/>
-          <w:color w:val="555555"/>
-        </w:rPr>
-        <w:t>ROTEIRO (falado, máx. 60s)</w:t>
-      </w:r>
-    </w:p>
-    <w:p>
-      <w:r>
-        <w:rPr>
-          <w:i w:val="0"/>
-        </w:rPr>
-        <w:t>Interno... (pausa) sobre o plantão de terça.</w:t>
-      </w:r>
-    </w:p>
-    <w:p>
-      <w:r>
-        <w:rPr>
-          <w:i w:val="0"/>
-        </w:rPr>
-        <w:t>"Vi muita gente indo direto pro ultrassom."</w:t>
-      </w:r>
-    </w:p>
-    <w:p>
-      <w:r>
-        <w:rPr>
-          <w:i w:val="0"/>
-        </w:rPr>
-        <w:t>(pausa) "E ele ajuda."</w:t>
-      </w:r>
-    </w:p>
-    <w:p>
-      <w:r>
-        <w:rPr>
-          <w:i w:val="0"/>
-        </w:rPr>
-        <w:t>(pausa) "Mas quem entregou foi o toque retal."</w:t>
-      </w:r>
-    </w:p>
-    <w:p>
-      <w:r>
-        <w:rPr>
-          <w:i w:val="0"/>
-        </w:rPr>
-        <w:t>(pausa) "Dez segundos."</w:t>
-      </w:r>
-    </w:p>
-    <w:p>
-      <w:r>
-        <w:rPr>
-          <w:i w:val="0"/>
-        </w:rPr>
-        <w:t>(pausa) "Foi isso que mudou completamente o caso."</w:t>
-      </w:r>
-    </w:p>
-    <w:p>
-      <w:r>
-        <w:rPr>
-          <w:i w:val="0"/>
-        </w:rPr>
-        <w:t>Fezes em geleia de framboesa. Isso é intussuscepção. Bebê de 6 meses a 2 anos, dor em ondas, às vezes massa em salsicha. O ultrassom confirma: sinal do alvo.</w:t>
-      </w:r>
-    </w:p>
-    <w:p>
-      <w:r>
-        <w:rPr>
-          <w:i w:val="0"/>
-        </w:rPr>
-        <w:t>Até terça. (pausa) Bom plantão, Interno.</w:t>
-      </w:r>
-    </w:p>
-    <w:p>
-      <w:r>
-        <w:rPr>
-          <w:b/>
-          <w:color w:val="555555"/>
-        </w:rPr>
-        <w:t>LIÇÃO (cards na tela, ~2s cada)</w:t>
-      </w:r>
-    </w:p>
-    <w:p>
-      <w:pPr>
-        <w:jc w:val="center"/>
-      </w:pPr>
-      <w:r>
-        <w:rPr>
-          <w:b/>
-          <w:color w:val="555555"/>
-        </w:rPr>
-        <w:t>O QUE ESSE CASO ENSINOU?</w:t>
-      </w:r>
-    </w:p>
-    <w:p>
-      <w:pPr>
-        <w:jc w:val="center"/>
-      </w:pPr>
-      <w:r>
-        <w:rPr>
-          <w:b/>
-          <w:color w:val="0F7B3F"/>
-          <w:sz w:val="26"/>
-        </w:rPr>
-        <w:t>Quando o paciente não fala, examine. O básico fala por ele.</w:t>
-      </w:r>
-    </w:p>
-    <w:p>
-      <w:r>
-        <w:rPr>
-          <w:b/>
-          <w:color w:val="555555"/>
-        </w:rPr>
-        <w:t>ENCERRAMENTO (tela preta — sempre igual)</w:t>
-      </w:r>
-    </w:p>
-    <w:p>
-      <w:pPr>
-        <w:jc w:val="center"/>
-      </w:pPr>
-      <w:r>
-        <w:rPr>
-          <w:b/>
-          <w:color w:val="5B21B6"/>
-        </w:rPr>
-        <w:t>TERÇA · 20H</w:t>
-      </w:r>
-    </w:p>
-    <w:p>
-      <w:r>
-        <w:rPr>
-          <w:b/>
-          <w:color w:val="555555"/>
-        </w:rPr>
-        <w:t>LEGENDA DO POST</w:t>
-      </w:r>
-    </w:p>
-    <w:p>
-      <w:r>
-        <w:rPr>
-          <w:i w:val="0"/>
-        </w:rPr>
-        <w:t>🩺 DEBRIEF #004 · O Paciente Não Fala</w:t>
-      </w:r>
-    </w:p>
-    <w:p>
-      <w:r>
-        <w:rPr>
-          <w:i w:val="0"/>
-        </w:rPr>
-        <w:t>O debrief do Plantão #004 já está no ar.</w:t>
-      </w:r>
-    </w:p>
-    <w:p>
-      <w:r>
-        <w:rPr>
-          <w:i w:val="0"/>
-        </w:rPr>
-        <w:t>INTUSSUSCEPÇÃO</w:t>
-      </w:r>
-    </w:p>
-    <w:p>
-      <w:r>
-        <w:rPr>
-          <w:i w:val="0"/>
-        </w:rPr>
-        <w:t>O ultrassom confirma (sinal do alvo), mas quem entregou foi o toque: geleia de framboesa. Bebê 6m–2a + dor em ondas.</w:t>
-      </w:r>
-    </w:p>
-    <w:p>
-      <w:r>
-        <w:rPr>
-          <w:i w:val="0"/>
-        </w:rPr>
-        <w:t>Lição: Quando o paciente não fala, examine. O básico fala por ele.</w:t>
-      </w:r>
-    </w:p>
-    <w:p>
-      <w:r>
-        <w:rPr>
-          <w:i w:val="0"/>
-        </w:rPr>
-        <w:t>E você, teria feito o toque? 👇</w:t>
-      </w:r>
-    </w:p>
-    <w:p>
-      <w:r>
-        <w:rPr>
-          <w:i w:val="0"/>
-        </w:rPr>
-        <w:t>Salva pro seu próximo plantão.</w:t>
-      </w:r>
-    </w:p>
-    <w:p>
-      <w:r>
-        <w:rPr>
-          <w:i w:val="0"/>
-        </w:rPr>
-      </w:r>
-    </w:p>
-    <w:p>
-      <w:r>
-        <w:rPr>
-          <w:i w:val="0"/>
-        </w:rPr>
-        <w:t>#pendurajaleco #medicina #casoclinico #plantao #internato #residenciamedica #estudantedemedicina #emergencia</w:t>
-      </w:r>
-    </w:p>
-    <w:p>
-      <w:r>
-        <w:rPr>
-          <w:b/>
-          <w:color w:val="555555"/>
-        </w:rPr>
-        <w:t>COMENTÁRIO FIXADO</w:t>
-      </w:r>
-    </w:p>
-    <w:p>
-      <w:r>
-        <w:rPr>
-          <w:i w:val="0"/>
-        </w:rPr>
-        <w:t>Guarda o combo: 6m–2a + dor intermitente + geleia de framboesa + sinal do alvo. ✅ Salva e leva pro plantão. 🚨</w:t>
-      </w:r>
-    </w:p>
-    <w:p>
-      <w:r>
-        <w:br w:type="page"/>
-      </w:r>
-    </w:p>
-    <w:p>
-      <w:r>
-        <w:rPr>
-          <w:b/>
-          <w:color w:val="5B21B6"/>
-          <w:sz w:val="40"/>
-        </w:rPr>
-        <w:t>📊 Como medir o teste (1 mês)</w:t>
-      </w:r>
-    </w:p>
-    <w:p>
-      <w:r>
-        <w:rPr>
-          <w:i w:val="0"/>
-        </w:rPr>
-        <w:t>Não meça por VIEWS. O reel antigo viralizou com público leigo (99,4% não-seguidores). Ao virar pro interno, o alcance bruto tende a cair — e tudo bem.</w:t>
-      </w:r>
-    </w:p>
-    <w:p>
-      <w:r>
-        <w:rPr>
-          <w:b/>
-          <w:color w:val="555555"/>
-        </w:rPr>
-        <w:t>O QUE OLHAR, NESTA ORDEM</w:t>
-      </w:r>
-    </w:p>
-    <w:p>
-      <w:r>
-        <w:rPr>
-          <w:i w:val="0"/>
-        </w:rPr>
-        <w:t>1. Salvamentos ÷ views — sinal nº1 de que acertou o público de estudo. Meta: acima de 1–2% (no viral antigo foi ~0,13%).</w:t>
-      </w:r>
-    </w:p>
-    <w:p>
-      <w:r>
-        <w:rPr>
-          <w:i w:val="0"/>
-        </w:rPr>
-        <w:t>2. Comentários com conduta ("eu palparia o pulso", "pediria TSH") vs. comentários leigos. Qualidade &gt; quantidade.</w:t>
-      </w:r>
-    </w:p>
-    <w:p>
-      <w:r>
-        <w:rPr>
-          <w:i w:val="0"/>
-        </w:rPr>
-        <w:t>3. Atividade no perfil / visitas — interno que volta na quinta pro debrief é quem constrói a base.</w:t>
-      </w:r>
-    </w:p>
-    <w:p>
-      <w:r>
-        <w:rPr>
-          <w:i w:val="0"/>
-        </w:rPr>
-        <w:t>4. Retenção entre PLANTÃO (terça) e DEBRIEF (quinta).</w:t>
-      </w:r>
-    </w:p>
-    <w:p>
-      <w:r>
-        <w:rPr>
-          <w:b/>
-          <w:color w:val="555555"/>
-        </w:rPr>
-        <w:t>REGRA DE DECISÃO</w:t>
-      </w:r>
-    </w:p>
-    <w:p>
-      <w:r>
-        <w:rPr>
-          <w:i w:val="0"/>
-        </w:rPr>
-        <w:t>Views caem MAS salvamento e comentário-de-conduta sobem → funcionou, só mudou de público. Cai tudo junto → o problema é o gancho dos 3 primeiros segundos, não o conceito.</w:t>
+        <w:t>Views caem MAS salvamento e comentário-de-raciocínio sobem → funcionou, só mudou de público. Cai tudo junto → o problema é o gancho dos 3 primeiros segundos, não o conceito.</w:t>
       </w:r>
     </w:p>
     <w:sectPr>

</xml_diff>

<commit_message>
Apply showrunner notes: Caso 002 rewrite + season-level upgrades
Rewrite Caso 002 (scene-first open, drop non-load-bearing data,
universalize workup, stronger no-focus curiosity beat, reordered
debrief reveal). Roll out series-wide: cinematic scene-first openings
on all cases, a higher-impact finale, the 'Quem examina, enxerga.'
signature line, and a reordered season (003 = pediatrics, 004 =
endocrine) so adjacent cases never share a specialty.

Co-Authored-By: Claude Opus 4.8 <noreply@anthropic.com>
Claude-Session: https://claude.ai/code/session_019ZEAXjZZitDeGUTgpg3SRV
</commit_message>
<xml_diff>
--- a/SEU_PLANTAO_COMECOU_mes_de_teste.docx
+++ b/SEU_PLANTAO_COMECOU_mes_de_teste.docx
@@ -54,15 +54,20 @@
           <w:b/>
           <w:color w:val="555555"/>
         </w:rPr>
-        <w:t>ASSINATURA DA SÉRIE</w:t>
-      </w:r>
-    </w:p>
-    <w:p>
-      <w:r>
-        <w:rPr>
-          <w:i w:val="0"/>
-        </w:rPr>
-        <w:t>A hipótese óbvia não fecha → o exame físico muda completamente o rumo do caso.</w:t>
+        <w:t>FRASE-ASSINATURA (aparece após o diagnóstico em TODO debrief)</w:t>
+      </w:r>
+    </w:p>
+    <w:p>
+      <w:pPr>
+        <w:jc w:val="center"/>
+      </w:pPr>
+      <w:r>
+        <w:rPr>
+          <w:b/>
+          <w:color w:val="5B21B6"/>
+          <w:sz w:val="28"/>
+        </w:rPr>
+        <w:t>“Quem examina, enxerga.”</w:t>
       </w:r>
     </w:p>
     <w:p>
@@ -71,7 +76,7 @@
           <w:b/>
           <w:color w:val="555555"/>
         </w:rPr>
-        <w:t>O CICLO (começo e fim se conectam)</w:t>
+        <w:t>ASSINATURA DA SÉRIE</w:t>
       </w:r>
     </w:p>
     <w:p>
@@ -79,7 +84,7 @@
         <w:rPr>
           <w:i w:val="0"/>
         </w:rPr>
-        <w:t>Abre: "Esse paciente é seu."   →   Fecha: "Pode ir... esse paciente já não é mais seu."</w:t>
+        <w:t>A hipótese óbvia não fecha → o exame físico muda completamente o rumo do caso.</w:t>
       </w:r>
     </w:p>
     <w:p>
@@ -88,7 +93,7 @@
           <w:b/>
           <w:color w:val="555555"/>
         </w:rPr>
-        <w:t>PADRÕES QUE NUNCA MUDAM</w:t>
+        <w:t>ABERTURA PELA CENA (a força visual do formato)</w:t>
       </w:r>
     </w:p>
     <w:p>
@@ -96,55 +101,7 @@
         <w:rPr>
           <w:i w:val="0"/>
         </w:rPr>
-        <w:t>• ABERTURA (4s) — INTOCÁVEL, mesmo no episódio 300: "Interno..." (pausa) "Seu plantão começou." (pausa) "Esse paciente é seu."</w:t>
-      </w:r>
-    </w:p>
-    <w:p>
-      <w:r>
-        <w:rPr>
-          <w:i w:val="0"/>
-        </w:rPr>
-        <w:t>• NOMES: terça é 🚨 SEU PLANTÃO · Caso #00X · quinta é 🩺 DEBRIEF DO PLANTÃO · Caso #00X. Vira arquivo: "no Caso #017 a maioria errou".</w:t>
-      </w:r>
-    </w:p>
-    <w:p>
-      <w:r>
-        <w:rPr>
-          <w:i w:val="0"/>
-        </w:rPr>
-        <w:t>• SILÊNCIO: depois de "O que você quer saber primeiro?", Igor olha pra lente e NÃO mexe, não sorri, não fala. 2 segundos. O silêncio obriga o espectador a responder.</w:t>
-      </w:r>
-    </w:p>
-    <w:p>
-      <w:r>
-        <w:rPr>
-          <w:i w:val="0"/>
-        </w:rPr>
-        <w:t>• PASSAR O BASTÃO: o caso termina sempre com "E você... (pausa) ...por onde você começaria?"</w:t>
-      </w:r>
-    </w:p>
-    <w:p>
-      <w:r>
-        <w:rPr>
-          <w:i w:val="0"/>
-        </w:rPr>
-        <w:t>• ENCERRAMENTO da terça (tela preta): "Seu plantão não acabou." → QUINTA · 20H</w:t>
-      </w:r>
-    </w:p>
-    <w:p>
-      <w:r>
-        <w:rPr>
-          <w:i w:val="0"/>
-        </w:rPr>
-        <w:t>• ENCERRAMENTO do debrief: "Bom plantão, Interno." (pausa) "Pode ir... esse paciente já não é mais seu." → card "O QUE ESSE CASO ENSINOU?" + 1 frase → PRÓXIMO PACIENTE · TERÇA · 20H</w:t>
-      </w:r>
-    </w:p>
-    <w:p>
-      <w:r>
-        <w:rPr>
-          <w:i w:val="0"/>
-        </w:rPr>
-        <w:t>• RITMO DE FALA: uma informação por vez, em batidas com pausa. "Homem. (pausa) Sessenta e dois anos. (pausa) Hipertenso."</w:t>
+        <w:t>O caso começa pela SITUAÇÃO, não pelos dados. Antes de idade/pressão/temperatura, o espectador "entra" na cena: "Ela não para quieta... e levanta da maca pela terceira vez." Só depois vêm os números.</w:t>
       </w:r>
     </w:p>
     <w:p>
@@ -153,7 +110,7 @@
           <w:b/>
           <w:color w:val="555555"/>
         </w:rPr>
-        <w:t>CTA — sempre "próximo passo", nunca "conduta"</w:t>
+        <w:t>O CICLO (começo e fim se conectam)</w:t>
       </w:r>
     </w:p>
     <w:p>
@@ -161,7 +118,7 @@
         <w:rPr>
           <w:i w:val="0"/>
         </w:rPr>
-        <w:t>"Conduta" sugere resolver o caso inteiro. "Por onde você começaria?" / "Qual seria seu próximo passo?" é o que estamos ensinando: raciocínio.</w:t>
+        <w:t>Abre: "Esse paciente é seu."   →   Fecha: "Pode ir... esse paciente já não é mais seu."</w:t>
       </w:r>
     </w:p>
     <w:p>
@@ -170,7 +127,7 @@
           <w:b/>
           <w:color w:val="555555"/>
         </w:rPr>
-        <w:t>A EXECUÇÃO É O 0,1 QUE FALTA</w:t>
+        <w:t>VARIEDADE DE ÁREA (a série ensina raciocínio, não um assunto)</w:t>
       </w:r>
     </w:p>
     <w:p>
@@ -178,7 +135,80 @@
         <w:rPr>
           <w:i w:val="0"/>
         </w:rPr>
-        <w:t>O sucesso depende mais de COMO o Igor fala do que das palavras. Preceptor: calmo, seguro, provocando o raciocínio. Meta: a série ser reconhecida só pela primeira frase — "Interno... Seu plantão começou."</w:t>
+        <w:t>Caso 001 ❤️ Cardio/Vascular · Caso 002 🦋 Endócrino · Caso 003 👶 Pediatria/Cirurgia · Caso 004 ⚡ Endócrino. Nunca repetir a mesma área em casos colados.</w:t>
+      </w:r>
+    </w:p>
+    <w:p>
+      <w:r>
+        <w:rPr>
+          <w:b/>
+          <w:color w:val="555555"/>
+        </w:rPr>
+        <w:t>PADRÕES QUE NUNCA MUDAM</w:t>
+      </w:r>
+    </w:p>
+    <w:p>
+      <w:r>
+        <w:rPr>
+          <w:i w:val="0"/>
+        </w:rPr>
+        <w:t>• ABERTURA (4s) — INTOCÁVEL: "Interno..." (pausa) "Seu plantão começou." (pausa) "Esse paciente é seu."</w:t>
+      </w:r>
+    </w:p>
+    <w:p>
+      <w:r>
+        <w:rPr>
+          <w:i w:val="0"/>
+        </w:rPr>
+        <w:t>• NOMES: terça 🚨 SEU PLANTÃO · Caso #00X · quinta 🩺 DEBRIEF DO PLANTÃO · Caso #00X. Vira arquivo: "no Caso #017 a maioria errou".</w:t>
+      </w:r>
+    </w:p>
+    <w:p>
+      <w:r>
+        <w:rPr>
+          <w:i w:val="0"/>
+        </w:rPr>
+        <w:t>• SILÊNCIO: após "O que você quer saber primeiro?", Igor olha pra lente e NÃO mexe, não sorri, não fala. 2 segundos.</w:t>
+      </w:r>
+    </w:p>
+    <w:p>
+      <w:r>
+        <w:rPr>
+          <w:i w:val="0"/>
+        </w:rPr>
+        <w:t>• PASSAR O BASTÃO: o caso termina com "E você... (pausa) ...por onde você começaria?"</w:t>
+      </w:r>
+    </w:p>
+    <w:p>
+      <w:r>
+        <w:rPr>
+          <w:i w:val="0"/>
+        </w:rPr>
+        <w:t>• FINALE COM PESO: "A hipótese mais provável... (pausa) [diagnóstico]. (pausa) E o que mudou esse caso... não foi um exame. Foi o exame físico." → silêncio → frase-assinatura.</w:t>
+      </w:r>
+    </w:p>
+    <w:p>
+      <w:r>
+        <w:rPr>
+          <w:i w:val="0"/>
+        </w:rPr>
+        <w:t>• ENCERRAMENTO terça: "Seu plantão não acabou." → QUINTA · 20H. Debrief: "Pode ir... esse paciente já não é mais seu." → PRÓXIMO PACIENTE · TERÇA · 20H.</w:t>
+      </w:r>
+    </w:p>
+    <w:p>
+      <w:r>
+        <w:rPr>
+          <w:i w:val="0"/>
+        </w:rPr>
+        <w:t>• CTA: sempre "por onde você começaria?" / "próximo passo" — nunca "conduta".</w:t>
+      </w:r>
+    </w:p>
+    <w:p>
+      <w:r>
+        <w:rPr>
+          <w:i w:val="0"/>
+        </w:rPr>
+        <w:t>• RITMO: uma informação por vez, em batidas com pausa.</w:t>
       </w:r>
     </w:p>
     <w:p>
@@ -282,6 +312,14 @@
     <w:p>
       <w:r>
         <w:rPr>
+          <w:i w:val="0"/>
+        </w:rPr>
+        <w:t>❌ Repetir a mesma especialidade em casos seguidos.</w:t>
+      </w:r>
+    </w:p>
+    <w:p>
+      <w:r>
+        <w:rPr>
           <w:b/>
           <w:color w:val="0F7B3F"/>
           <w:sz w:val="30"/>
@@ -294,6 +332,14 @@
         <w:rPr>
           <w:i w:val="0"/>
         </w:rPr>
+        <w:t>✅ Abrir pela cena, não pelos dados.</w:t>
+      </w:r>
+    </w:p>
+    <w:p>
+      <w:r>
+        <w:rPr>
+          <w:i w:val="0"/>
+        </w:rPr>
         <w:t>✅ Olhar para a lente.</w:t>
       </w:r>
     </w:p>
@@ -327,6 +373,14 @@
           <w:i w:val="0"/>
         </w:rPr>
         <w:t>✅ Terminar criando expectativa.</w:t>
+      </w:r>
+    </w:p>
+    <w:p>
+      <w:r>
+        <w:rPr>
+          <w:i w:val="0"/>
+        </w:rPr>
+        <w:t>✅ Fechar com a frase-assinatura.</w:t>
       </w:r>
     </w:p>
     <w:p>
@@ -350,7 +404,7 @@
           <w:i/>
           <w:color w:val="555555"/>
         </w:rPr>
-        <w:t>Semana 1  ·  Diagnóstico: Dissecção aguda de aorta</w:t>
+        <w:t>❤️ Cardiologia / Vascular  ·  Semana 1  ·  Diagnóstico: Dissecção aguda de aorta</w:t>
       </w:r>
     </w:p>
     <w:p>
@@ -441,7 +495,7 @@
           <w:b/>
           <w:color w:val="555555"/>
         </w:rPr>
-        <w:t>ROTEIRO (falado, máx. 60s)</w:t>
+        <w:t>ROTEIRO (falado, máx. 60s) — abre pela cena</w:t>
       </w:r>
     </w:p>
     <w:p>
@@ -457,15 +511,15 @@
         <w:rPr>
           <w:i w:val="0"/>
         </w:rPr>
+        <w:t>Ele chega segurando o peito. (pausa) A dor vai pras costas... e ele não consegue ficar deitado na maca.</w:t>
+      </w:r>
+    </w:p>
+    <w:p>
+      <w:r>
+        <w:rPr>
+          <w:i w:val="0"/>
+        </w:rPr>
         <w:t>Homem. (pausa) Sessenta e dois anos. (pausa) Hipertenso.</w:t>
-      </w:r>
-    </w:p>
-    <w:p>
-      <w:r>
-        <w:rPr>
-          <w:i w:val="0"/>
-        </w:rPr>
-        <w:t>Chega agitado, com dor no peito que vai pras costas. Não consegue ficar deitado na maca.</w:t>
       </w:r>
     </w:p>
     <w:p>
@@ -534,6 +588,7 @@
         <w:rPr>
           <w:b/>
           <w:color w:val="5B21B6"/>
+          <w:sz w:val="22"/>
         </w:rPr>
         <w:t>"Seu plantão não acabou."</w:t>
       </w:r>
@@ -546,6 +601,7 @@
         <w:rPr>
           <w:b/>
           <w:color w:val="5B21B6"/>
+          <w:sz w:val="22"/>
         </w:rPr>
         <w:t>QUINTA · 20H</w:t>
       </w:r>
@@ -783,7 +839,7 @@
         <w:rPr>
           <w:i w:val="0"/>
         </w:rPr>
-        <w:t>(pausa) "Foi o exame físico... (pausa) ...que mudou completamente o rumo desse caso."</w:t>
+        <w:t>Pulso assimétrico entre os braços. E no raio-X, mediastino alargado.</w:t>
       </w:r>
     </w:p>
     <w:p>
@@ -791,7 +847,24 @@
         <w:rPr>
           <w:i w:val="0"/>
         </w:rPr>
-        <w:t>Pulso assimétrico entre os braços. E no raio-X, mediastino alargado. Isso é dissecção aguda de aorta.</w:t>
+        <w:t>A hipótese mais provável... (pausa) dissecção aguda de aorta.</w:t>
+      </w:r>
+    </w:p>
+    <w:p>
+      <w:r>
+        <w:rPr>
+          <w:i w:val="0"/>
+        </w:rPr>
+        <w:t>E o que mudou esse caso... (pausa) não foi um exame. (pausa) Foi o exame físico.</w:t>
+      </w:r>
+    </w:p>
+    <w:p>
+      <w:r>
+        <w:rPr>
+          <w:i/>
+          <w:color w:val="555555"/>
+        </w:rPr>
+        <w:t>[silêncio · tela preta]</w:t>
       </w:r>
     </w:p>
     <w:p>
@@ -816,7 +889,7 @@
           <w:b/>
           <w:color w:val="555555"/>
         </w:rPr>
-        <w:t>LIÇÃO (cards na tela, ~2s cada)</w:t>
+        <w:t>FRASE-ASSINATURA (card, ~2s)</w:t>
       </w:r>
     </w:p>
     <w:p>
@@ -826,9 +899,19 @@
       <w:r>
         <w:rPr>
           <w:b/>
+          <w:color w:val="5B21B6"/>
+          <w:sz w:val="26"/>
+        </w:rPr>
+        <w:t>“Quem examina, enxerga.”</w:t>
+      </w:r>
+    </w:p>
+    <w:p>
+      <w:r>
+        <w:rPr>
+          <w:b/>
           <w:color w:val="555555"/>
         </w:rPr>
-        <w:t>O QUE ESSE CASO ENSINOU?</w:t>
+        <w:t>LIÇÃO (cards na tela, ~2s cada)</w:t>
       </w:r>
     </w:p>
     <w:p>
@@ -838,19 +921,9 @@
       <w:r>
         <w:rPr>
           <w:b/>
-          <w:color w:val="0F7B3F"/>
-          <w:sz w:val="26"/>
-        </w:rPr>
-        <w:t>ECG normal NÃO encerra o raciocínio.</w:t>
-      </w:r>
-    </w:p>
-    <w:p>
-      <w:r>
-        <w:rPr>
-          <w:b/>
           <w:color w:val="555555"/>
         </w:rPr>
-        <w:t>ENCERRAMENTO (tela preta — sempre igual)</w:t>
+        <w:t>O QUE ESSE CASO ENSINOU?</w:t>
       </w:r>
     </w:p>
     <w:p>
@@ -860,9 +933,19 @@
       <w:r>
         <w:rPr>
           <w:b/>
-          <w:color w:val="5B21B6"/>
-        </w:rPr>
-        <w:t>PRÓXIMO PACIENTE</w:t>
+          <w:color w:val="0F7B3F"/>
+          <w:sz w:val="26"/>
+        </w:rPr>
+        <w:t>ECG normal NÃO encerra o raciocínio.</w:t>
+      </w:r>
+    </w:p>
+    <w:p>
+      <w:r>
+        <w:rPr>
+          <w:b/>
+          <w:color w:val="555555"/>
+        </w:rPr>
+        <w:t>ENCERRAMENTO (tela preta — sempre igual)</w:t>
       </w:r>
     </w:p>
     <w:p>
@@ -873,6 +956,20 @@
         <w:rPr>
           <w:b/>
           <w:color w:val="5B21B6"/>
+          <w:sz w:val="22"/>
+        </w:rPr>
+        <w:t>PRÓXIMO PACIENTE</w:t>
+      </w:r>
+    </w:p>
+    <w:p>
+      <w:pPr>
+        <w:jc w:val="center"/>
+      </w:pPr>
+      <w:r>
+        <w:rPr>
+          <w:b/>
+          <w:color w:val="5B21B6"/>
+          <w:sz w:val="22"/>
         </w:rPr>
         <w:t>TERÇA · 20H</w:t>
       </w:r>
@@ -924,6 +1021,14 @@
           <w:i w:val="0"/>
         </w:rPr>
         <w:t>Lição: ECG normal NÃO encerra o raciocínio.</w:t>
+      </w:r>
+    </w:p>
+    <w:p>
+      <w:r>
+        <w:rPr>
+          <w:i w:val="0"/>
+        </w:rPr>
+        <w:t>Quem examina, enxerga.</w:t>
       </w:r>
     </w:p>
     <w:p>
@@ -995,7 +1100,7 @@
           <w:i/>
           <w:color w:val="555555"/>
         </w:rPr>
-        <w:t>Semana 2  ·  Diagnóstico: Crise tireotóxica</w:t>
+        <w:t>🦋 Endocrinologia  ·  Semana 2  ·  Diagnóstico: Crise tireotóxica</w:t>
       </w:r>
     </w:p>
     <w:p>
@@ -1086,7 +1191,7 @@
           <w:b/>
           <w:color w:val="555555"/>
         </w:rPr>
-        <w:t>ROTEIRO (falado, máx. 60s)</w:t>
+        <w:t>ROTEIRO (falado, máx. 60s) — abre pela cena</w:t>
       </w:r>
     </w:p>
     <w:p>
@@ -1102,7 +1207,7 @@
         <w:rPr>
           <w:i w:val="0"/>
         </w:rPr>
-        <w:t>Mulher. (pausa) Trinta e oito anos. (pausa) Hipertensa.</w:t>
+        <w:t>Ela não para quieta. (pausa) Você tenta conversar... e ela levanta da maca pela terceira vez.</w:t>
       </w:r>
     </w:p>
     <w:p>
@@ -1110,7 +1215,15 @@
         <w:rPr>
           <w:i w:val="0"/>
         </w:rPr>
-        <w:t>Chega muito agitada, não consegue ficar quieta na maca. Calafrios, diarreia e febre.</w:t>
+        <w:t>Mulher. (pausa) Trinta e oito anos.</w:t>
+      </w:r>
+    </w:p>
+    <w:p>
+      <w:r>
+        <w:rPr>
+          <w:i w:val="0"/>
+        </w:rPr>
+        <w:t>Febre. Diarreia. Calafrios.</w:t>
       </w:r>
     </w:p>
     <w:p>
@@ -1135,7 +1248,7 @@
         <w:rPr>
           <w:i w:val="0"/>
         </w:rPr>
-        <w:t>Temperatura: 38,2. Taquicárdica. Pressão 18 por 10. Coração regular, pulmão limpo, abdome sem nada demais.</w:t>
+        <w:t>Temperatura: 38,2. Taquicárdica. Pressão 18 por 10. Coração, pulmão e abdome sem alterações.</w:t>
       </w:r>
     </w:p>
     <w:p>
@@ -1143,7 +1256,7 @@
         <w:rPr>
           <w:i w:val="0"/>
         </w:rPr>
-        <w:t>Você pensa infecção — e faz certo em pensar. Pede o pacote. Urina limpa. Raio-X normal. Hemograma sem nada de infeccioso.</w:t>
+        <w:t>Você pensa infecção — e faz certo em pensar.</w:t>
       </w:r>
     </w:p>
     <w:p>
@@ -1151,7 +1264,23 @@
         <w:rPr>
           <w:i w:val="0"/>
         </w:rPr>
-        <w:t>Só que o foco não aparece. (pausa) E tem um detalhe que muda tudo.</w:t>
+        <w:t>Você começa investigando infecção. (pausa) Urina: normal. Raio-X: normal. Hemograma: sem foco infeccioso.</w:t>
+      </w:r>
+    </w:p>
+    <w:p>
+      <w:r>
+        <w:rPr>
+          <w:i w:val="0"/>
+        </w:rPr>
+        <w:t>Só que tem um problema. (pausa) Você procura o foco... (pausa) ...e ele simplesmente não existe.</w:t>
+      </w:r>
+    </w:p>
+    <w:p>
+      <w:r>
+        <w:rPr>
+          <w:i w:val="0"/>
+        </w:rPr>
+        <w:t>É aí que esse caso muda completamente.</w:t>
       </w:r>
     </w:p>
     <w:p>
@@ -1179,6 +1308,7 @@
         <w:rPr>
           <w:b/>
           <w:color w:val="5B21B6"/>
+          <w:sz w:val="22"/>
         </w:rPr>
         <w:t>"Seu plantão não acabou."</w:t>
       </w:r>
@@ -1191,6 +1321,7 @@
         <w:rPr>
           <w:b/>
           <w:color w:val="5B21B6"/>
+          <w:sz w:val="22"/>
         </w:rPr>
         <w:t>QUINTA · 20H</w:t>
       </w:r>
@@ -1412,7 +1543,7 @@
         <w:rPr>
           <w:i w:val="0"/>
         </w:rPr>
-        <w:t>(pausa) "Olhar pro rosto dela."</w:t>
+        <w:t>(pausa) "Olhar pra paciente."</w:t>
       </w:r>
     </w:p>
     <w:p>
@@ -1428,7 +1559,7 @@
         <w:rPr>
           <w:i w:val="0"/>
         </w:rPr>
-        <w:t>(pausa) "Foi o exame físico... (pausa) ...que mudou completamente o rumo desse caso."</w:t>
+        <w:t>Ela estava emagrecida. (pausa) E tinha exoftalmia. (pausa) A partir daí, faz sentido pedir função tireoidiana. TSH baixo. T4 alto.</w:t>
       </w:r>
     </w:p>
     <w:p>
@@ -1436,7 +1567,24 @@
         <w:rPr>
           <w:i w:val="0"/>
         </w:rPr>
-        <w:t>Olhos saltados, exoftalmia. E emagrecida. Pede a tireoide: TSH baixo, T4 alto. É crise tireotóxica.</w:t>
+        <w:t>A hipótese mais provável... (pausa) crise tireotóxica.</w:t>
+      </w:r>
+    </w:p>
+    <w:p>
+      <w:r>
+        <w:rPr>
+          <w:i w:val="0"/>
+        </w:rPr>
+        <w:t>E o que mudou esse caso... (pausa) não foi um exame. (pausa) Foi o exame físico.</w:t>
+      </w:r>
+    </w:p>
+    <w:p>
+      <w:r>
+        <w:rPr>
+          <w:i/>
+          <w:color w:val="555555"/>
+        </w:rPr>
+        <w:t>[silêncio · tela preta]</w:t>
       </w:r>
     </w:p>
     <w:p>
@@ -1461,7 +1609,7 @@
           <w:b/>
           <w:color w:val="555555"/>
         </w:rPr>
-        <w:t>LIÇÃO (cards na tela, ~2s cada)</w:t>
+        <w:t>FRASE-ASSINATURA (card, ~2s)</w:t>
       </w:r>
     </w:p>
     <w:p>
@@ -1471,9 +1619,19 @@
       <w:r>
         <w:rPr>
           <w:b/>
+          <w:color w:val="5B21B6"/>
+          <w:sz w:val="26"/>
+        </w:rPr>
+        <w:t>“Quem examina, enxerga.”</w:t>
+      </w:r>
+    </w:p>
+    <w:p>
+      <w:r>
+        <w:rPr>
+          <w:b/>
           <w:color w:val="555555"/>
         </w:rPr>
-        <w:t>O QUE ESSE CASO ENSINOU?</w:t>
+        <w:t>LIÇÃO (cards na tela, ~2s cada)</w:t>
       </w:r>
     </w:p>
     <w:p>
@@ -1483,19 +1641,9 @@
       <w:r>
         <w:rPr>
           <w:b/>
-          <w:color w:val="0F7B3F"/>
-          <w:sz w:val="26"/>
-        </w:rPr>
-        <w:t>Febre sem foco não é sempre infecção.</w:t>
-      </w:r>
-    </w:p>
-    <w:p>
-      <w:r>
-        <w:rPr>
-          <w:b/>
           <w:color w:val="555555"/>
         </w:rPr>
-        <w:t>ENCERRAMENTO (tela preta — sempre igual)</w:t>
+        <w:t>O QUE ESSE CASO ENSINOU?</w:t>
       </w:r>
     </w:p>
     <w:p>
@@ -1505,9 +1653,19 @@
       <w:r>
         <w:rPr>
           <w:b/>
-          <w:color w:val="5B21B6"/>
-        </w:rPr>
-        <w:t>PRÓXIMO PACIENTE</w:t>
+          <w:color w:val="0F7B3F"/>
+          <w:sz w:val="26"/>
+        </w:rPr>
+        <w:t>Febre sem foco não é sempre infecção.</w:t>
+      </w:r>
+    </w:p>
+    <w:p>
+      <w:r>
+        <w:rPr>
+          <w:b/>
+          <w:color w:val="555555"/>
+        </w:rPr>
+        <w:t>ENCERRAMENTO (tela preta — sempre igual)</w:t>
       </w:r>
     </w:p>
     <w:p>
@@ -1518,6 +1676,20 @@
         <w:rPr>
           <w:b/>
           <w:color w:val="5B21B6"/>
+          <w:sz w:val="22"/>
+        </w:rPr>
+        <w:t>PRÓXIMO PACIENTE</w:t>
+      </w:r>
+    </w:p>
+    <w:p>
+      <w:pPr>
+        <w:jc w:val="center"/>
+      </w:pPr>
+      <w:r>
+        <w:rPr>
+          <w:b/>
+          <w:color w:val="5B21B6"/>
+          <w:sz w:val="22"/>
         </w:rPr>
         <w:t>TERÇA · 20H</w:t>
       </w:r>
@@ -1560,7 +1732,7 @@
         <w:rPr>
           <w:i w:val="0"/>
         </w:rPr>
-        <w:t>O foco infeccioso não existia. Cinco segundos de exame físico mudaram tudo: exoftalmia + emagrecimento → TSH baixo, T4 alto.</w:t>
+        <w:t>O foco infeccioso não existia. Cinco segundos de exame físico mudaram tudo: emagrecimento + exoftalmia → TSH baixo, T4 alto.</w:t>
       </w:r>
     </w:p>
     <w:p>
@@ -1576,7 +1748,15 @@
         <w:rPr>
           <w:i w:val="0"/>
         </w:rPr>
-        <w:t>E você, tinha olhado pros olhos dela? 👇</w:t>
+        <w:t>Quem examina, enxerga.</w:t>
+      </w:r>
+    </w:p>
+    <w:p>
+      <w:r>
+        <w:rPr>
+          <w:i w:val="0"/>
+        </w:rPr>
+        <w:t>E você, tinha olhado pra paciente? 👇</w:t>
       </w:r>
     </w:p>
     <w:p>
@@ -1631,7 +1811,7 @@
           <w:color w:val="5B21B6"/>
           <w:sz w:val="40"/>
         </w:rPr>
-        <w:t>CASO #003 — "É Só Ansiedade"</w:t>
+        <w:t>CASO #003 — "O Paciente Não Fala"</w:t>
       </w:r>
     </w:p>
     <w:p>
@@ -1640,7 +1820,7 @@
           <w:i/>
           <w:color w:val="555555"/>
         </w:rPr>
-        <w:t>Semana 3  ·  Diagnóstico: Feocromocitoma</w:t>
+        <w:t>👶 Pediatria / Cirurgia  ·  Semana 3  ·  Diagnóstico: Intussuscepção</w:t>
       </w:r>
     </w:p>
     <w:p>
@@ -1722,7 +1902,7 @@
           <w:color w:val="5B21B6"/>
           <w:sz w:val="26"/>
         </w:rPr>
-        <w:t>É SÓ ANSIEDADE</w:t>
+        <w:t>O PACIENTE NÃO FALA</w:t>
       </w:r>
     </w:p>
     <w:p>
@@ -1731,7 +1911,7 @@
           <w:b/>
           <w:color w:val="555555"/>
         </w:rPr>
-        <w:t>ROTEIRO (falado, máx. 60s)</w:t>
+        <w:t>ROTEIRO (falado, máx. 60s) — abre pela cena</w:t>
       </w:r>
     </w:p>
     <w:p>
@@ -1747,7 +1927,7 @@
         <w:rPr>
           <w:i w:val="0"/>
         </w:rPr>
-        <w:t>Rapaz. (pausa) Dezoito anos. (pausa) Começou a trabalhar agora.</w:t>
+        <w:t>Ela chora, encolhe as perninhas... e de repente para, como se nada fosse. (pausa) Minutos depois, começa tudo de novo.</w:t>
       </w:r>
     </w:p>
     <w:p>
@@ -1755,7 +1935,15 @@
         <w:rPr>
           <w:i w:val="0"/>
         </w:rPr>
-        <w:t>Diagnóstico de burnout, crises de ansiedade. Já toma ansiolítico e antidepressivo. É a oitava vez que volta no pronto-socorro.</w:t>
+        <w:t>Você é o cirurgião. A pediatria te chamou.</w:t>
+      </w:r>
+    </w:p>
+    <w:p>
+      <w:r>
+        <w:rPr>
+          <w:i w:val="0"/>
+        </w:rPr>
+        <w:t>E ela tem... (pausa) nove meses. (pausa) Não fala. Não te conta nada.</w:t>
       </w:r>
     </w:p>
     <w:p>
@@ -1780,7 +1968,7 @@
         <w:rPr>
           <w:i w:val="0"/>
         </w:rPr>
-        <w:t>Pressão: 20 por 16. Já em dois anti-hipertensivos — e não cede. Taquicardia. Dor de cabeça forte. Palpitação e suor... em crises. Tem hora que tá bem, tem hora que dispara.</w:t>
+        <w:t>A dor vem em ondas. Já vomitou. Tá um pouco hipotensa.</w:t>
       </w:r>
     </w:p>
     <w:p>
@@ -1788,7 +1976,7 @@
         <w:rPr>
           <w:i w:val="0"/>
         </w:rPr>
-        <w:t>Num jovem, pressão que não cede a dois remédios não pode parar em "ansiedade".</w:t>
+        <w:t>Sem queixa, sem história. Só o corpo dela fala.</w:t>
       </w:r>
     </w:p>
     <w:p>
@@ -1796,7 +1984,7 @@
         <w:rPr>
           <w:i w:val="0"/>
         </w:rPr>
-        <w:t>Tem um padrão nas crises que muda tudo.</w:t>
+        <w:t>Tem um exame que é fácil de pular no bebê — e que muda tudo.</w:t>
       </w:r>
     </w:p>
     <w:p>
@@ -1824,6 +2012,7 @@
         <w:rPr>
           <w:b/>
           <w:color w:val="5B21B6"/>
+          <w:sz w:val="22"/>
         </w:rPr>
         <w:t>"Seu plantão não acabou."</w:t>
       </w:r>
@@ -1836,6 +2025,7 @@
         <w:rPr>
           <w:b/>
           <w:color w:val="5B21B6"/>
+          <w:sz w:val="22"/>
         </w:rPr>
         <w:t>QUINTA · 20H</w:t>
       </w:r>
@@ -1854,7 +2044,7 @@
         <w:rPr>
           <w:i w:val="0"/>
         </w:rPr>
-        <w:t>🚨 SEU PLANTÃO · Caso #003 · É Só Ansiedade</w:t>
+        <w:t>🚨 SEU PLANTÃO · Caso #003 · O Paciente Não Fala</w:t>
       </w:r>
     </w:p>
     <w:p>
@@ -1870,7 +2060,7 @@
         <w:rPr>
           <w:i w:val="0"/>
         </w:rPr>
-        <w:t>Rapaz, 18 anos.</w:t>
+        <w:t>Bebê, 9 meses.</w:t>
       </w:r>
     </w:p>
     <w:p>
@@ -1878,7 +2068,7 @@
         <w:rPr>
           <w:i w:val="0"/>
         </w:rPr>
-        <w:t>Tratado como ansiedade há meses.</w:t>
+        <w:t>Dor abdominal em ondas.</w:t>
       </w:r>
     </w:p>
     <w:p>
@@ -1886,7 +2076,7 @@
         <w:rPr>
           <w:i w:val="0"/>
         </w:rPr>
-        <w:t>Pressão 20x16 que não cede.</w:t>
+        <w:t>Não fala, não conta nada.</w:t>
       </w:r>
     </w:p>
     <w:p>
@@ -1934,7 +2124,7 @@
         <w:rPr>
           <w:i w:val="0"/>
         </w:rPr>
-        <w:t>Jovem + hipertensão grave que não cede ≠ ansiedade. 🧠 Comenta por onde você começaria, antes do debrief de quinta. 👇</w:t>
+        <w:t>Quando o paciente não fala, o exame fala por ele. 🧠 Comenta por onde você começaria, antes do debrief de quinta. 👇</w:t>
       </w:r>
     </w:p>
     <w:p>
@@ -2016,7 +2206,7 @@
           <w:color w:val="5B21B6"/>
           <w:sz w:val="26"/>
         </w:rPr>
-        <w:t>É SÓ ANSIEDADE</w:t>
+        <w:t>O PACIENTE NÃO FALA</w:t>
       </w:r>
     </w:p>
     <w:p>
@@ -2041,7 +2231,7 @@
         <w:rPr>
           <w:i w:val="0"/>
         </w:rPr>
-        <w:t>"Vi muita gente seguindo o carimbo de ansiedade."</w:t>
+        <w:t>"Vi muita gente indo direto pro ultrassom."</w:t>
       </w:r>
     </w:p>
     <w:p>
@@ -2049,7 +2239,7 @@
         <w:rPr>
           <w:i w:val="0"/>
         </w:rPr>
-        <w:t>(pausa) "Mas oito idas ao PS com pressão 20 por 16 pedem outra pergunta."</w:t>
+        <w:t>(pausa) "E ele ajuda."</w:t>
       </w:r>
     </w:p>
     <w:p>
@@ -2057,7 +2247,7 @@
         <w:rPr>
           <w:i w:val="0"/>
         </w:rPr>
-        <w:t>(pausa) "Uma pergunta: como vêm as crises?"</w:t>
+        <w:t>(pausa) "Mas quem entregou foi o básico."</w:t>
       </w:r>
     </w:p>
     <w:p>
@@ -2065,7 +2255,7 @@
         <w:rPr>
           <w:i w:val="0"/>
         </w:rPr>
-        <w:t>(pausa) "Foi a anamnese... (pausa) ...que mudou completamente o rumo desse caso."</w:t>
+        <w:t>(pausa) "O toque retal."</w:t>
       </w:r>
     </w:p>
     <w:p>
@@ -2073,7 +2263,40 @@
         <w:rPr>
           <w:i w:val="0"/>
         </w:rPr>
-        <w:t>Dor de cabeça, palpitação e sudorese — juntas, em ondas. Isso é feocromocitoma. O que parecia pânico era adrenalina de um tumor.</w:t>
+        <w:t>(pausa) "Dez segundos."</w:t>
+      </w:r>
+    </w:p>
+    <w:p>
+      <w:r>
+        <w:rPr>
+          <w:i w:val="0"/>
+        </w:rPr>
+        <w:t>Fezes em geleia de framboesa. Bebê de 6 meses a 2 anos, dor em ondas, às vezes massa em salsicha. O ultrassom confirma: sinal do alvo.</w:t>
+      </w:r>
+    </w:p>
+    <w:p>
+      <w:r>
+        <w:rPr>
+          <w:i w:val="0"/>
+        </w:rPr>
+        <w:t>A hipótese mais provável... (pausa) intussuscepção.</w:t>
+      </w:r>
+    </w:p>
+    <w:p>
+      <w:r>
+        <w:rPr>
+          <w:i w:val="0"/>
+        </w:rPr>
+        <w:t>E o que mudou esse caso... (pausa) não foi um exame. (pausa) Foi o exame físico.</w:t>
+      </w:r>
+    </w:p>
+    <w:p>
+      <w:r>
+        <w:rPr>
+          <w:i/>
+          <w:color w:val="555555"/>
+        </w:rPr>
+        <w:t>[silêncio · tela preta]</w:t>
       </w:r>
     </w:p>
     <w:p>
@@ -2098,7 +2321,7 @@
           <w:b/>
           <w:color w:val="555555"/>
         </w:rPr>
-        <w:t>LIÇÃO (cards na tela, ~2s cada)</w:t>
+        <w:t>FRASE-ASSINATURA (card, ~2s)</w:t>
       </w:r>
     </w:p>
     <w:p>
@@ -2108,9 +2331,19 @@
       <w:r>
         <w:rPr>
           <w:b/>
+          <w:color w:val="5B21B6"/>
+          <w:sz w:val="26"/>
+        </w:rPr>
+        <w:t>“Quem examina, enxerga.”</w:t>
+      </w:r>
+    </w:p>
+    <w:p>
+      <w:r>
+        <w:rPr>
+          <w:b/>
           <w:color w:val="555555"/>
         </w:rPr>
-        <w:t>O QUE ESSE CASO ENSINOU?</w:t>
+        <w:t>LIÇÃO (cards na tela, ~2s cada)</w:t>
       </w:r>
     </w:p>
     <w:p>
@@ -2120,19 +2353,9 @@
       <w:r>
         <w:rPr>
           <w:b/>
-          <w:color w:val="0F7B3F"/>
-          <w:sz w:val="26"/>
-        </w:rPr>
-        <w:t>Hipertensão grave no jovem você investiga, não carimba.</w:t>
-      </w:r>
-    </w:p>
-    <w:p>
-      <w:r>
-        <w:rPr>
-          <w:b/>
           <w:color w:val="555555"/>
         </w:rPr>
-        <w:t>ENCERRAMENTO (tela preta — sempre igual)</w:t>
+        <w:t>O QUE ESSE CASO ENSINOU?</w:t>
       </w:r>
     </w:p>
     <w:p>
@@ -2142,9 +2365,19 @@
       <w:r>
         <w:rPr>
           <w:b/>
-          <w:color w:val="5B21B6"/>
-        </w:rPr>
-        <w:t>PRÓXIMO PACIENTE</w:t>
+          <w:color w:val="0F7B3F"/>
+          <w:sz w:val="26"/>
+        </w:rPr>
+        <w:t>Quando o paciente não fala, examine. O básico fala por ele.</w:t>
+      </w:r>
+    </w:p>
+    <w:p>
+      <w:r>
+        <w:rPr>
+          <w:b/>
+          <w:color w:val="555555"/>
+        </w:rPr>
+        <w:t>ENCERRAMENTO (tela preta — sempre igual)</w:t>
       </w:r>
     </w:p>
     <w:p>
@@ -2155,6 +2388,20 @@
         <w:rPr>
           <w:b/>
           <w:color w:val="5B21B6"/>
+          <w:sz w:val="22"/>
+        </w:rPr>
+        <w:t>PRÓXIMO PACIENTE</w:t>
+      </w:r>
+    </w:p>
+    <w:p>
+      <w:pPr>
+        <w:jc w:val="center"/>
+      </w:pPr>
+      <w:r>
+        <w:rPr>
+          <w:b/>
+          <w:color w:val="5B21B6"/>
+          <w:sz w:val="22"/>
         </w:rPr>
         <w:t>TERÇA · 20H</w:t>
       </w:r>
@@ -2173,7 +2420,7 @@
         <w:rPr>
           <w:i w:val="0"/>
         </w:rPr>
-        <w:t>🩺 DEBRIEF DO PLANTÃO · Caso #003 · É Só Ansiedade</w:t>
+        <w:t>🩺 DEBRIEF DO PLANTÃO · Caso #003 · O Paciente Não Fala</w:t>
       </w:r>
     </w:p>
     <w:p>
@@ -2189,7 +2436,7 @@
         <w:rPr>
           <w:i w:val="0"/>
         </w:rPr>
-        <w:t>FEOCROMOCITOMA</w:t>
+        <w:t>INTUSSUSCEPÇÃO</w:t>
       </w:r>
     </w:p>
     <w:p>
@@ -2197,7 +2444,7 @@
         <w:rPr>
           <w:i w:val="0"/>
         </w:rPr>
-        <w:t>Não era pânico — era adrenalina de um tumor. Uma pergunta ("como vêm as crises?") mudou tudo: cefaleia + palpitação + sudorese, em ondas.</w:t>
+        <w:t>O ultrassom confirma (sinal do alvo), mas quem entregou foi o toque: geleia de framboesa. Bebê 6m–2a + dor em ondas.</w:t>
       </w:r>
     </w:p>
     <w:p>
@@ -2205,7 +2452,7 @@
         <w:rPr>
           <w:i w:val="0"/>
         </w:rPr>
-        <w:t>Lição: Hipertensão grave no jovem você investiga, não carimba.</w:t>
+        <w:t>Lição: Quando o paciente não fala, examine. O básico fala por ele.</w:t>
       </w:r>
     </w:p>
     <w:p>
@@ -2213,7 +2460,15 @@
         <w:rPr>
           <w:i w:val="0"/>
         </w:rPr>
-        <w:t>E você, quantas vezes quase carimba antes de pensar? 👇</w:t>
+        <w:t>Quem examina, enxerga.</w:t>
+      </w:r>
+    </w:p>
+    <w:p>
+      <w:r>
+        <w:rPr>
+          <w:i w:val="0"/>
+        </w:rPr>
+        <w:t>E você, teria feito o toque? 👇</w:t>
       </w:r>
     </w:p>
     <w:p>
@@ -2253,7 +2508,7 @@
         <w:rPr>
           <w:i w:val="0"/>
         </w:rPr>
-        <w:t>Guarda a tríade do feo: cefaleia + palpitação + sudorese, em crises. ✅ Jovem com HAS grave = investiga. 🚨</w:t>
+        <w:t>Guarda o combo: 6m–2a + dor intermitente + geleia de framboesa + sinal do alvo. ✅ Salva e leva pro plantão. 🚨</w:t>
       </w:r>
     </w:p>
     <w:p>
@@ -2268,7 +2523,7 @@
           <w:color w:val="5B21B6"/>
           <w:sz w:val="40"/>
         </w:rPr>
-        <w:t>CASO #004 — "O Paciente Não Fala"</w:t>
+        <w:t>CASO #004 — "É Só Ansiedade"</w:t>
       </w:r>
     </w:p>
     <w:p>
@@ -2277,7 +2532,7 @@
           <w:i/>
           <w:color w:val="555555"/>
         </w:rPr>
-        <w:t>Semana 4  ·  Diagnóstico: Intussuscepção</w:t>
+        <w:t>⚡ Endocrinologia  ·  Semana 4  ·  Diagnóstico: Feocromocitoma</w:t>
       </w:r>
     </w:p>
     <w:p>
@@ -2359,7 +2614,7 @@
           <w:color w:val="5B21B6"/>
           <w:sz w:val="26"/>
         </w:rPr>
-        <w:t>O PACIENTE NÃO FALA</w:t>
+        <w:t>É SÓ ANSIEDADE</w:t>
       </w:r>
     </w:p>
     <w:p>
@@ -2368,7 +2623,7 @@
           <w:b/>
           <w:color w:val="555555"/>
         </w:rPr>
-        <w:t>ROTEIRO (falado, máx. 60s)</w:t>
+        <w:t>ROTEIRO (falado, máx. 60s) — abre pela cena</w:t>
       </w:r>
     </w:p>
     <w:p>
@@ -2384,7 +2639,7 @@
         <w:rPr>
           <w:i w:val="0"/>
         </w:rPr>
-        <w:t>Você é o cirurgião. A pediatria te chama pra ver uma criança com dor na barriga.</w:t>
+        <w:t>É a oitava vez que ele cruza essa porta. (pausa) Todo mundo já decidiu que é ansiedade.</w:t>
       </w:r>
     </w:p>
     <w:p>
@@ -2392,7 +2647,15 @@
         <w:rPr>
           <w:i w:val="0"/>
         </w:rPr>
-        <w:t>Mas ela tem... (pausa) nove meses. (pausa) Não fala. Não te conta nada.</w:t>
+        <w:t>Rapaz. (pausa) Dezoito anos. (pausa) Começou a trabalhar agora.</w:t>
+      </w:r>
+    </w:p>
+    <w:p>
+      <w:r>
+        <w:rPr>
+          <w:i w:val="0"/>
+        </w:rPr>
+        <w:t>Diagnóstico de burnout. Já toma ansiolítico e antidepressivo.</w:t>
       </w:r>
     </w:p>
     <w:p>
@@ -2417,7 +2680,7 @@
         <w:rPr>
           <w:i w:val="0"/>
         </w:rPr>
-        <w:t>A dor vem em ondas. Ela chora, contrai, faz cara de dor... e acalma. Daqui a pouco, volta tudo. Já vomitou. Tá um pouco hipotensa.</w:t>
+        <w:t>Pressão: 20 por 16. Já em dois anti-hipertensivos — e não cede. Dor de cabeça, palpitação e suor... em crises. Tem hora que tá bem, tem hora que dispara.</w:t>
       </w:r>
     </w:p>
     <w:p>
@@ -2425,7 +2688,7 @@
         <w:rPr>
           <w:i w:val="0"/>
         </w:rPr>
-        <w:t>Sem queixa, sem história. Só o corpo dela fala.</w:t>
+        <w:t>Num jovem, pressão que não cede a dois remédios não pode parar em "ansiedade".</w:t>
       </w:r>
     </w:p>
     <w:p>
@@ -2433,7 +2696,7 @@
         <w:rPr>
           <w:i w:val="0"/>
         </w:rPr>
-        <w:t>Tem um exame que é fácil de pular no bebê — e que muda tudo.</w:t>
+        <w:t>Tem um padrão nas crises que muda tudo.</w:t>
       </w:r>
     </w:p>
     <w:p>
@@ -2461,6 +2724,7 @@
         <w:rPr>
           <w:b/>
           <w:color w:val="5B21B6"/>
+          <w:sz w:val="22"/>
         </w:rPr>
         <w:t>"Seu plantão não acabou."</w:t>
       </w:r>
@@ -2473,6 +2737,7 @@
         <w:rPr>
           <w:b/>
           <w:color w:val="5B21B6"/>
+          <w:sz w:val="22"/>
         </w:rPr>
         <w:t>QUINTA · 20H</w:t>
       </w:r>
@@ -2491,7 +2756,7 @@
         <w:rPr>
           <w:i w:val="0"/>
         </w:rPr>
-        <w:t>🚨 SEU PLANTÃO · Caso #004 · O Paciente Não Fala</w:t>
+        <w:t>🚨 SEU PLANTÃO · Caso #004 · É Só Ansiedade</w:t>
       </w:r>
     </w:p>
     <w:p>
@@ -2507,7 +2772,7 @@
         <w:rPr>
           <w:i w:val="0"/>
         </w:rPr>
-        <w:t>Bebê, 9 meses.</w:t>
+        <w:t>Rapaz, 18 anos.</w:t>
       </w:r>
     </w:p>
     <w:p>
@@ -2515,7 +2780,7 @@
         <w:rPr>
           <w:i w:val="0"/>
         </w:rPr>
-        <w:t>Dor abdominal em ondas.</w:t>
+        <w:t>Tratado como ansiedade há meses.</w:t>
       </w:r>
     </w:p>
     <w:p>
@@ -2523,7 +2788,7 @@
         <w:rPr>
           <w:i w:val="0"/>
         </w:rPr>
-        <w:t>Não fala, não conta nada.</w:t>
+        <w:t>Pressão 20x16 que não cede.</w:t>
       </w:r>
     </w:p>
     <w:p>
@@ -2571,7 +2836,7 @@
         <w:rPr>
           <w:i w:val="0"/>
         </w:rPr>
-        <w:t>Quando o paciente não fala, o exame fala por ele. 🧠 Comenta por onde você começaria, antes do debrief de quinta. 👇</w:t>
+        <w:t>Jovem + hipertensão grave que não cede ≠ ansiedade. 🧠 Comenta por onde você começaria, antes do debrief de quinta. 👇</w:t>
       </w:r>
     </w:p>
     <w:p>
@@ -2653,7 +2918,7 @@
           <w:color w:val="5B21B6"/>
           <w:sz w:val="26"/>
         </w:rPr>
-        <w:t>O PACIENTE NÃO FALA</w:t>
+        <w:t>É SÓ ANSIEDADE</w:t>
       </w:r>
     </w:p>
     <w:p>
@@ -2678,7 +2943,7 @@
         <w:rPr>
           <w:i w:val="0"/>
         </w:rPr>
-        <w:t>"Vi muita gente indo direto pro ultrassom."</w:t>
+        <w:t>"Vi muita gente seguindo o carimbo de ansiedade."</w:t>
       </w:r>
     </w:p>
     <w:p>
@@ -2686,7 +2951,7 @@
         <w:rPr>
           <w:i w:val="0"/>
         </w:rPr>
-        <w:t>(pausa) "E ele ajuda."</w:t>
+        <w:t>(pausa) "Mas oito idas ao PS com pressão 20 por 16 pedem outra pergunta."</w:t>
       </w:r>
     </w:p>
     <w:p>
@@ -2694,7 +2959,7 @@
         <w:rPr>
           <w:i w:val="0"/>
         </w:rPr>
-        <w:t>(pausa) "Mas quem entregou foi o básico."</w:t>
+        <w:t>(pausa) "Uma pergunta: como vêm as crises?"</w:t>
       </w:r>
     </w:p>
     <w:p>
@@ -2702,7 +2967,7 @@
         <w:rPr>
           <w:i w:val="0"/>
         </w:rPr>
-        <w:t>(pausa) "O toque retal."</w:t>
+        <w:t>Cefaleia, palpitação e sudorese — juntas, em ondas. O que parecia pânico era adrenalina de um tumor.</w:t>
       </w:r>
     </w:p>
     <w:p>
@@ -2710,7 +2975,7 @@
         <w:rPr>
           <w:i w:val="0"/>
         </w:rPr>
-        <w:t>(pausa) "Dez segundos."</w:t>
+        <w:t>A hipótese mais provável... (pausa) feocromocitoma.</w:t>
       </w:r>
     </w:p>
     <w:p>
@@ -2718,15 +2983,16 @@
         <w:rPr>
           <w:i w:val="0"/>
         </w:rPr>
-        <w:t>(pausa) "Foi o exame físico... (pausa) ...que mudou completamente o rumo desse caso."</w:t>
-      </w:r>
-    </w:p>
-    <w:p>
-      <w:r>
-        <w:rPr>
-          <w:i w:val="0"/>
-        </w:rPr>
-        <w:t>Fezes em geleia de framboesa. Isso é intussuscepção. Bebê de 6 meses a 2 anos, dor em ondas, às vezes massa em salsicha. O ultrassom confirma: sinal do alvo.</w:t>
+        <w:t>E o que mudou esse caso... (pausa) não foi um exame. (pausa) Foi a anamnese.</w:t>
+      </w:r>
+    </w:p>
+    <w:p>
+      <w:r>
+        <w:rPr>
+          <w:i/>
+          <w:color w:val="555555"/>
+        </w:rPr>
+        <w:t>[silêncio · tela preta]</w:t>
       </w:r>
     </w:p>
     <w:p>
@@ -2751,7 +3017,7 @@
           <w:b/>
           <w:color w:val="555555"/>
         </w:rPr>
-        <w:t>LIÇÃO (cards na tela, ~2s cada)</w:t>
+        <w:t>FRASE-ASSINATURA (card, ~2s)</w:t>
       </w:r>
     </w:p>
     <w:p>
@@ -2761,9 +3027,19 @@
       <w:r>
         <w:rPr>
           <w:b/>
+          <w:color w:val="5B21B6"/>
+          <w:sz w:val="26"/>
+        </w:rPr>
+        <w:t>“Quem examina, enxerga.”</w:t>
+      </w:r>
+    </w:p>
+    <w:p>
+      <w:r>
+        <w:rPr>
+          <w:b/>
           <w:color w:val="555555"/>
         </w:rPr>
-        <w:t>O QUE ESSE CASO ENSINOU?</w:t>
+        <w:t>LIÇÃO (cards na tela, ~2s cada)</w:t>
       </w:r>
     </w:p>
     <w:p>
@@ -2773,19 +3049,9 @@
       <w:r>
         <w:rPr>
           <w:b/>
-          <w:color w:val="0F7B3F"/>
-          <w:sz w:val="26"/>
-        </w:rPr>
-        <w:t>Quando o paciente não fala, examine. O básico fala por ele.</w:t>
-      </w:r>
-    </w:p>
-    <w:p>
-      <w:r>
-        <w:rPr>
-          <w:b/>
           <w:color w:val="555555"/>
         </w:rPr>
-        <w:t>ENCERRAMENTO (tela preta — sempre igual)</w:t>
+        <w:t>O QUE ESSE CASO ENSINOU?</w:t>
       </w:r>
     </w:p>
     <w:p>
@@ -2795,9 +3061,19 @@
       <w:r>
         <w:rPr>
           <w:b/>
-          <w:color w:val="5B21B6"/>
-        </w:rPr>
-        <w:t>PRÓXIMO PACIENTE</w:t>
+          <w:color w:val="0F7B3F"/>
+          <w:sz w:val="26"/>
+        </w:rPr>
+        <w:t>Hipertensão grave no jovem você investiga, não carimba.</w:t>
+      </w:r>
+    </w:p>
+    <w:p>
+      <w:r>
+        <w:rPr>
+          <w:b/>
+          <w:color w:val="555555"/>
+        </w:rPr>
+        <w:t>ENCERRAMENTO (tela preta — sempre igual)</w:t>
       </w:r>
     </w:p>
     <w:p>
@@ -2808,6 +3084,20 @@
         <w:rPr>
           <w:b/>
           <w:color w:val="5B21B6"/>
+          <w:sz w:val="22"/>
+        </w:rPr>
+        <w:t>PRÓXIMO PACIENTE</w:t>
+      </w:r>
+    </w:p>
+    <w:p>
+      <w:pPr>
+        <w:jc w:val="center"/>
+      </w:pPr>
+      <w:r>
+        <w:rPr>
+          <w:b/>
+          <w:color w:val="5B21B6"/>
+          <w:sz w:val="22"/>
         </w:rPr>
         <w:t>TERÇA · 20H</w:t>
       </w:r>
@@ -2826,7 +3116,7 @@
         <w:rPr>
           <w:i w:val="0"/>
         </w:rPr>
-        <w:t>🩺 DEBRIEF DO PLANTÃO · Caso #004 · O Paciente Não Fala</w:t>
+        <w:t>🩺 DEBRIEF DO PLANTÃO · Caso #004 · É Só Ansiedade</w:t>
       </w:r>
     </w:p>
     <w:p>
@@ -2842,7 +3132,7 @@
         <w:rPr>
           <w:i w:val="0"/>
         </w:rPr>
-        <w:t>INTUSSUSCEPÇÃO</w:t>
+        <w:t>FEOCROMOCITOMA</w:t>
       </w:r>
     </w:p>
     <w:p>
@@ -2850,7 +3140,7 @@
         <w:rPr>
           <w:i w:val="0"/>
         </w:rPr>
-        <w:t>O ultrassom confirma (sinal do alvo), mas quem entregou foi o toque: geleia de framboesa. Bebê 6m–2a + dor em ondas.</w:t>
+        <w:t>Não era pânico — era adrenalina de um tumor. Uma pergunta ("como vêm as crises?") mudou tudo: cefaleia + palpitação + sudorese, em ondas.</w:t>
       </w:r>
     </w:p>
     <w:p>
@@ -2858,7 +3148,7 @@
         <w:rPr>
           <w:i w:val="0"/>
         </w:rPr>
-        <w:t>Lição: Quando o paciente não fala, examine. O básico fala por ele.</w:t>
+        <w:t>Lição: Hipertensão grave no jovem você investiga, não carimba.</w:t>
       </w:r>
     </w:p>
     <w:p>
@@ -2866,7 +3156,15 @@
         <w:rPr>
           <w:i w:val="0"/>
         </w:rPr>
-        <w:t>E você, teria feito o toque? 👇</w:t>
+        <w:t>Quem examina, enxerga.</w:t>
+      </w:r>
+    </w:p>
+    <w:p>
+      <w:r>
+        <w:rPr>
+          <w:i w:val="0"/>
+        </w:rPr>
+        <w:t>E você, quantas vezes quase carimba antes de pensar? 👇</w:t>
       </w:r>
     </w:p>
     <w:p>
@@ -2906,7 +3204,7 @@
         <w:rPr>
           <w:i w:val="0"/>
         </w:rPr>
-        <w:t>Guarda o combo: 6m–2a + dor intermitente + geleia de framboesa + sinal do alvo. ✅ Salva e leva pro plantão. 🚨</w:t>
+        <w:t>Guarda a tríade do feo: cefaleia + palpitação + sudorese, em crises. ✅ Jovem com HAS grave = investiga. 🚨</w:t>
       </w:r>
     </w:p>
     <w:p>

</xml_diff>

<commit_message>
Pivot to single-reel format (case + answer in one video)
Igor/Vitor found the two-part continuation loses viewers who forget to
return. Collapse PLANTAO/DEBRIEF into one self-contained ~60s reel per
case: the 'por onde voce comecaria?' prompt becomes the mid-video
comment hook, the reveal and finale land in the same reel. Keep the
craft (fixed open, scene-first, 2s silence, weighted finale, 'Quem
examina, enxerga.' signature, area variety). Update cadence and
measurement (in-reel retention) accordingly.

Co-Authored-By: Claude Opus 4.8 <noreply@anthropic.com>
Claude-Session: https://claude.ai/code/session_019ZEAXjZZitDeGUTgpg3SRV
</commit_message>
<xml_diff>
--- a/SEU_PLANTAO_COMECOU_mes_de_teste.docx
+++ b/SEU_PLANTAO_COMECOU_mes_de_teste.docx
@@ -23,12 +23,12 @@
     </w:p>
     <w:p>
       <w:r>
-        <w:t>Pendura Jaleco · Mês de teste · 4 casos / 8 posts</w:t>
+        <w:t>Pendura Jaleco · Mês de teste · 4 casos completos (reel único)</w:t>
       </w:r>
     </w:p>
     <w:p>
       <w:r>
-        <w:t>TERÇA = 🚨 SEU PLANTÃO (o caso)   ·   QUINTA = 🩺 DEBRIEF DO PLANTÃO (a discussão)</w:t>
+        <w:t>FORMATO: caso + resposta no MESMO reel. Sem continuação — o pessoal esquece de voltar.</w:t>
       </w:r>
     </w:p>
     <w:p>
@@ -45,7 +45,7 @@
         <w:rPr>
           <w:i w:val="0"/>
         </w:rPr>
-        <w:t>Não é um quadro. Não é um Reels. É um formato editorial — e formato dura anos. A marca é "SEU PLANTÃO"; cada episódio é um "Caso #00X".</w:t>
+        <w:t>Um formato editorial de caso clínico em ~60s. Cada reel é um "Caso #00X" completo: a situação, o desafio ("por onde você começaria?"), a virada e a resposta — tudo no mesmo vídeo. A marca é "SEU PLANTÃO".</w:t>
       </w:r>
     </w:p>
     <w:p>
@@ -54,7 +54,7 @@
           <w:b/>
           <w:color w:val="555555"/>
         </w:rPr>
-        <w:t>FRASE-ASSINATURA (aparece após o diagnóstico em TODO debrief)</w:t>
+        <w:t>FRASE-ASSINATURA (aparece após o diagnóstico em TODO caso)</w:t>
       </w:r>
     </w:p>
     <w:p>
@@ -93,7 +93,7 @@
           <w:b/>
           <w:color w:val="555555"/>
         </w:rPr>
-        <w:t>ABERTURA PELA CENA (a força visual do formato)</w:t>
+        <w:t>A ESTRUTURA DE CADA REEL (~60s)</w:t>
       </w:r>
     </w:p>
     <w:p>
@@ -101,7 +101,63 @@
         <w:rPr>
           <w:i w:val="0"/>
         </w:rPr>
-        <w:t>O caso começa pela SITUAÇÃO, não pelos dados. Antes de idade/pressão/temperatura, o espectador "entra" na cena: "Ela não para quieta... e levanta da maca pela terceira vez." Só depois vêm os números.</w:t>
+        <w:t>1) Abertura fixa "Interno... Seu plantão começou. Esse paciente é seu."</w:t>
+      </w:r>
+    </w:p>
+    <w:p>
+      <w:r>
+        <w:rPr>
+          <w:i w:val="0"/>
+        </w:rPr>
+        <w:t>2) Abre pela CENA (a imagem forte), não pelos dados.</w:t>
+      </w:r>
+    </w:p>
+    <w:p>
+      <w:r>
+        <w:rPr>
+          <w:i w:val="0"/>
+        </w:rPr>
+        <w:t>3) Idade e dados em batidas curtas, com pausa.</w:t>
+      </w:r>
+    </w:p>
+    <w:p>
+      <w:r>
+        <w:rPr>
+          <w:i w:val="0"/>
+        </w:rPr>
+        <w:t>4) O gancho: "Antes de eu continuar... por onde você começaria?" + 2s de silêncio (a pessoa pausa e comenta).</w:t>
+      </w:r>
+    </w:p>
+    <w:p>
+      <w:r>
+        <w:rPr>
+          <w:i w:val="0"/>
+        </w:rPr>
+        <w:t>5) A virada: a hipótese óbvia não fecha.</w:t>
+      </w:r>
+    </w:p>
+    <w:p>
+      <w:r>
+        <w:rPr>
+          <w:i w:val="0"/>
+        </w:rPr>
+        <w:t>6) O detalhe do exame físico + o diagnóstico.</w:t>
+      </w:r>
+    </w:p>
+    <w:p>
+      <w:r>
+        <w:rPr>
+          <w:i w:val="0"/>
+        </w:rPr>
+        <w:t>7) Finale com peso: "não foi um exame. Foi o exame físico." → frase-assinatura → lição.</w:t>
+      </w:r>
+    </w:p>
+    <w:p>
+      <w:r>
+        <w:rPr>
+          <w:i w:val="0"/>
+        </w:rPr>
+        <w:t>8) CTA de comentário + fechamento do ciclo: "Esse paciente já não é mais seu."</w:t>
       </w:r>
     </w:p>
     <w:p>
@@ -127,7 +183,7 @@
           <w:b/>
           <w:color w:val="555555"/>
         </w:rPr>
-        <w:t>VARIEDADE DE ÁREA (a série ensina raciocínio, não um assunto)</w:t>
+        <w:t>VARIEDADE DE ÁREA (ensina raciocínio, não um assunto)</w:t>
       </w:r>
     </w:p>
     <w:p>
@@ -144,7 +200,7 @@
           <w:b/>
           <w:color w:val="555555"/>
         </w:rPr>
-        <w:t>PADRÕES QUE NUNCA MUDAM</w:t>
+        <w:t>CTA — sempre "por onde você começaria?" / "próximo passo" (nunca "conduta")</w:t>
       </w:r>
     </w:p>
     <w:p>
@@ -152,7 +208,16 @@
         <w:rPr>
           <w:i w:val="0"/>
         </w:rPr>
-        <w:t>• ABERTURA (4s) — INTOCÁVEL: "Interno..." (pausa) "Seu plantão começou." (pausa) "Esse paciente é seu."</w:t>
+        <w:t>O gancho no meio do vídeo puxa o comentário; o CTA final ("tinha pego o pulso? comenta") puxa o debate depois da resposta.</w:t>
+      </w:r>
+    </w:p>
+    <w:p>
+      <w:r>
+        <w:rPr>
+          <w:b/>
+          <w:color w:val="555555"/>
+        </w:rPr>
+        <w:t>CADÊNCIA SUGERIDA</w:t>
       </w:r>
     </w:p>
     <w:p>
@@ -160,55 +225,7 @@
         <w:rPr>
           <w:i w:val="0"/>
         </w:rPr>
-        <w:t>• NOMES: terça 🚨 SEU PLANTÃO · Caso #00X · quinta 🩺 DEBRIEF DO PLANTÃO · Caso #00X. Vira arquivo: "no Caso #017 a maioria errou".</w:t>
-      </w:r>
-    </w:p>
-    <w:p>
-      <w:r>
-        <w:rPr>
-          <w:i w:val="0"/>
-        </w:rPr>
-        <w:t>• SILÊNCIO: após "O que você quer saber primeiro?", Igor olha pra lente e NÃO mexe, não sorri, não fala. 2 segundos.</w:t>
-      </w:r>
-    </w:p>
-    <w:p>
-      <w:r>
-        <w:rPr>
-          <w:i w:val="0"/>
-        </w:rPr>
-        <w:t>• PASSAR O BASTÃO: o caso termina com "E você... (pausa) ...por onde você começaria?"</w:t>
-      </w:r>
-    </w:p>
-    <w:p>
-      <w:r>
-        <w:rPr>
-          <w:i w:val="0"/>
-        </w:rPr>
-        <w:t>• FINALE COM PESO: "A hipótese mais provável... (pausa) [diagnóstico]. (pausa) E o que mudou esse caso... não foi um exame. Foi o exame físico." → silêncio → frase-assinatura.</w:t>
-      </w:r>
-    </w:p>
-    <w:p>
-      <w:r>
-        <w:rPr>
-          <w:i w:val="0"/>
-        </w:rPr>
-        <w:t>• ENCERRAMENTO terça: "Seu plantão não acabou." → QUINTA · 20H. Debrief: "Pode ir... esse paciente já não é mais seu." → PRÓXIMO PACIENTE · TERÇA · 20H.</w:t>
-      </w:r>
-    </w:p>
-    <w:p>
-      <w:r>
-        <w:rPr>
-          <w:i w:val="0"/>
-        </w:rPr>
-        <w:t>• CTA: sempre "por onde você começaria?" / "próximo passo" — nunca "conduta".</w:t>
-      </w:r>
-    </w:p>
-    <w:p>
-      <w:r>
-        <w:rPr>
-          <w:i w:val="0"/>
-        </w:rPr>
-        <w:t>• RITMO: uma informação por vez, em batidas com pausa.</w:t>
+        <w:t>2 reels por semana (ex.: terça e quinta), cada um completo. 4 casos = 2 semanas; grave mais pra fechar o mês de teste.</w:t>
       </w:r>
     </w:p>
     <w:p>
@@ -248,7 +265,7 @@
         <w:rPr>
           <w:i w:val="0"/>
         </w:rPr>
-        <w:t>Cole isto na parede da edição. Vale pra todo episódio, pra sempre.</w:t>
+        <w:t>Cole isto na parede da edição. Vale pra todo reel, pra sempre.</w:t>
       </w:r>
     </w:p>
     <w:p>
@@ -274,7 +291,7 @@
         <w:rPr>
           <w:i w:val="0"/>
         </w:rPr>
-        <w:t>❌ Explicar antes da pergunta.</w:t>
+        <w:t>❌ Explicar antes da pergunta "por onde você começaria?".</w:t>
       </w:r>
     </w:p>
     <w:p>
@@ -282,7 +299,7 @@
         <w:rPr>
           <w:i w:val="0"/>
         </w:rPr>
-        <w:t>❌ Dar o diagnóstico cedo.</w:t>
+        <w:t>❌ Dar o diagnóstico logo no começo.</w:t>
       </w:r>
     </w:p>
     <w:p>
@@ -306,7 +323,7 @@
         <w:rPr>
           <w:i w:val="0"/>
         </w:rPr>
-        <w:t>❌ Cortar a pausa.</w:t>
+        <w:t>❌ Cortar a pausa/silêncio.</w:t>
       </w:r>
     </w:p>
     <w:p>
@@ -315,6 +332,14 @@
           <w:i w:val="0"/>
         </w:rPr>
         <w:t>❌ Repetir a mesma especialidade em casos seguidos.</w:t>
+      </w:r>
+    </w:p>
+    <w:p>
+      <w:r>
+        <w:rPr>
+          <w:i w:val="0"/>
+        </w:rPr>
+        <w:t>❌ Passar de ~60s (corta os dados do meio, nunca o silêncio nem o finale).</w:t>
       </w:r>
     </w:p>
     <w:p>
@@ -348,7 +373,7 @@
         <w:rPr>
           <w:i w:val="0"/>
         </w:rPr>
-        <w:t>✅ Fazer silêncio.</w:t>
+        <w:t>✅ Fazer o silêncio de 2s depois da pergunta.</w:t>
       </w:r>
     </w:p>
     <w:p>
@@ -372,7 +397,7 @@
         <w:rPr>
           <w:i w:val="0"/>
         </w:rPr>
-        <w:t>✅ Terminar criando expectativa.</w:t>
+        <w:t>✅ Fechar com a frase-assinatura + a lição.</w:t>
       </w:r>
     </w:p>
     <w:p>
@@ -380,7 +405,7 @@
         <w:rPr>
           <w:i w:val="0"/>
         </w:rPr>
-        <w:t>✅ Fechar com a frase-assinatura.</w:t>
+        <w:t>✅ Terminar com CTA de comentário.</w:t>
       </w:r>
     </w:p>
     <w:p>
@@ -404,7 +429,7 @@
           <w:i/>
           <w:color w:val="555555"/>
         </w:rPr>
-        <w:t>❤️ Cardiologia / Vascular  ·  Semana 1  ·  Diagnóstico: Dissecção aguda de aorta</w:t>
+        <w:t>❤️ Cardiologia / Vascular  ·  Diagnóstico: Dissecção aguda de aorta  ·  Reel único ~60s</w:t>
       </w:r>
     </w:p>
     <w:p>
@@ -416,16 +441,6 @@
           <w:color w:val="CCCCCC"/>
         </w:rPr>
         <w:t>— — — — — — — — — — — — — — — — — — — —</w:t>
-      </w:r>
-    </w:p>
-    <w:p>
-      <w:r>
-        <w:rPr>
-          <w:b/>
-          <w:color w:val="5B21B6"/>
-          <w:sz w:val="30"/>
-        </w:rPr>
-        <w:t>🚨 SEU PLANTÃO — TERÇA (o caso)</w:t>
       </w:r>
     </w:p>
     <w:p>
@@ -495,7 +510,7 @@
           <w:b/>
           <w:color w:val="555555"/>
         </w:rPr>
-        <w:t>ROTEIRO (falado, máx. 60s) — abre pela cena</w:t>
+        <w:t>ROTEIRO ÚNICO (falado, ~60s) — caso + resposta no mesmo reel</w:t>
       </w:r>
     </w:p>
     <w:p>
@@ -511,7 +526,7 @@
         <w:rPr>
           <w:i w:val="0"/>
         </w:rPr>
-        <w:t>Ele chega segurando o peito. (pausa) A dor vai pras costas... e ele não consegue ficar deitado na maca.</w:t>
+        <w:t>Ele chega segurando o peito. (pausa) A dor vai pras costas... e não consegue ficar deitado na maca.</w:t>
       </w:r>
     </w:p>
     <w:p>
@@ -527,7 +542,15 @@
         <w:rPr>
           <w:i w:val="0"/>
         </w:rPr>
-        <w:t>O que você quer saber primeiro?</w:t>
+        <w:t>Pressão 18 por 10. FC 122. Saturando 92%.</w:t>
+      </w:r>
+    </w:p>
+    <w:p>
+      <w:r>
+        <w:rPr>
+          <w:i w:val="0"/>
+        </w:rPr>
+        <w:t>Antes de eu continuar... (pausa) por onde você começaria?</w:t>
       </w:r>
     </w:p>
     <w:p>
@@ -536,7 +559,7 @@
           <w:i/>
           <w:color w:val="555555"/>
         </w:rPr>
-        <w:t>[DIREÇÃO: olha pra lente · não mexe · não sorri · não fala · 2 segundos de silêncio]</w:t>
+        <w:t>[DIREÇÃO: olha pra lente · 2 segundos de silêncio · deixa o interno responder]</w:t>
       </w:r>
     </w:p>
     <w:p>
@@ -544,7 +567,7 @@
         <w:rPr>
           <w:i w:val="0"/>
         </w:rPr>
-        <w:t>Pressão: 18 por 10. FC: 122. Saturando 92%. ECG: sem isquemia aguda.</w:t>
+        <w:t>Pediu o ECG? Veio limpo. Muita gente pararia o raciocínio por aqui. (pausa) Só que esse caso ainda não terminou.</w:t>
       </w:r>
     </w:p>
     <w:p>
@@ -552,294 +575,7 @@
         <w:rPr>
           <w:i w:val="0"/>
         </w:rPr>
-        <w:t>O ECG veio limpo. Muita gente pararia o raciocínio por aqui.</w:t>
-      </w:r>
-    </w:p>
-    <w:p>
-      <w:r>
-        <w:rPr>
-          <w:i w:val="0"/>
-        </w:rPr>
-        <w:t>Só que esse caso ainda não terminou. (pausa) Tem um detalhe que muda tudo.</w:t>
-      </w:r>
-    </w:p>
-    <w:p>
-      <w:r>
-        <w:rPr>
-          <w:i w:val="0"/>
-        </w:rPr>
-        <w:t>E você... (pausa) ...por onde você começaria?</w:t>
-      </w:r>
-    </w:p>
-    <w:p>
-      <w:r>
-        <w:rPr>
-          <w:b/>
-          <w:color w:val="555555"/>
-        </w:rPr>
-        <w:t>ENCERRAMENTO (tela preta — sempre igual)</w:t>
-      </w:r>
-    </w:p>
-    <w:p>
-      <w:pPr>
-        <w:jc w:val="center"/>
-      </w:pPr>
-      <w:r>
-        <w:rPr>
-          <w:b/>
-          <w:color w:val="5B21B6"/>
-          <w:sz w:val="22"/>
-        </w:rPr>
-        <w:t>"Seu plantão não acabou."</w:t>
-      </w:r>
-    </w:p>
-    <w:p>
-      <w:pPr>
-        <w:jc w:val="center"/>
-      </w:pPr>
-      <w:r>
-        <w:rPr>
-          <w:b/>
-          <w:color w:val="5B21B6"/>
-          <w:sz w:val="22"/>
-        </w:rPr>
-        <w:t>QUINTA · 20H</w:t>
-      </w:r>
-    </w:p>
-    <w:p>
-      <w:r>
-        <w:rPr>
-          <w:b/>
-          <w:color w:val="555555"/>
-        </w:rPr>
-        <w:t>LEGENDA DO POST</w:t>
-      </w:r>
-    </w:p>
-    <w:p>
-      <w:r>
-        <w:rPr>
-          <w:i w:val="0"/>
-        </w:rPr>
-        <w:t>🚨 SEU PLANTÃO · Caso #001 · Dor Torácica</w:t>
-      </w:r>
-    </w:p>
-    <w:p>
-      <w:r>
-        <w:rPr>
-          <w:i w:val="0"/>
-        </w:rPr>
-        <w:t>Você assumiria esse caso?</w:t>
-      </w:r>
-    </w:p>
-    <w:p>
-      <w:r>
-        <w:rPr>
-          <w:i w:val="0"/>
-        </w:rPr>
-        <w:t>Homem, 62 anos.</w:t>
-      </w:r>
-    </w:p>
-    <w:p>
-      <w:r>
-        <w:rPr>
-          <w:i w:val="0"/>
-        </w:rPr>
-        <w:t>Dor no peito indo pras costas.</w:t>
-      </w:r>
-    </w:p>
-    <w:p>
-      <w:r>
-        <w:rPr>
-          <w:i w:val="0"/>
-        </w:rPr>
-        <w:t>ECG limpo.</w:t>
-      </w:r>
-    </w:p>
-    <w:p>
-      <w:r>
-        <w:rPr>
-          <w:i w:val="0"/>
-        </w:rPr>
-        <w:t>E você — por onde começaria?</w:t>
-      </w:r>
-    </w:p>
-    <w:p>
-      <w:r>
-        <w:rPr>
-          <w:i w:val="0"/>
-        </w:rPr>
-        <w:t>👇 Quero saber seu próximo passo, antes do debrief de quinta.</w:t>
-      </w:r>
-    </w:p>
-    <w:p>
-      <w:r>
-        <w:rPr>
-          <w:i w:val="0"/>
-        </w:rPr>
-      </w:r>
-    </w:p>
-    <w:p>
-      <w:r>
-        <w:rPr>
-          <w:i w:val="0"/>
-        </w:rPr>
-        <w:t>#pendurajaleco #medicina #casoclinico #plantao #internato #residenciamedica #estudantedemedicina #emergencia</w:t>
-      </w:r>
-    </w:p>
-    <w:p>
-      <w:r>
-        <w:rPr>
-          <w:b/>
-          <w:color w:val="555555"/>
-        </w:rPr>
-        <w:t>COMENTÁRIO FIXADO</w:t>
-      </w:r>
-    </w:p>
-    <w:p>
-      <w:r>
-        <w:rPr>
-          <w:i w:val="0"/>
-        </w:rPr>
-        <w:t>Regra da série: ECG normal não fecha o raciocínio. 🧠 Comenta por onde você começaria, antes do debrief de quinta — quem cravar marca presença. 👇</w:t>
-      </w:r>
-    </w:p>
-    <w:p>
-      <w:pPr>
-        <w:jc w:val="center"/>
-      </w:pPr>
-      <w:r>
-        <w:rPr>
-          <w:color w:val="CCCCCC"/>
-        </w:rPr>
-        <w:t>— — — — — — — — — — — — — — — — — — — —</w:t>
-      </w:r>
-    </w:p>
-    <w:p>
-      <w:r>
-        <w:rPr>
-          <w:b/>
-          <w:color w:val="5B21B6"/>
-          <w:sz w:val="30"/>
-        </w:rPr>
-        <w:t>🩺 DEBRIEF DO PLANTÃO — QUINTA (discussão de corredor)</w:t>
-      </w:r>
-    </w:p>
-    <w:p>
-      <w:r>
-        <w:rPr>
-          <w:b/>
-          <w:color w:val="555555"/>
-        </w:rPr>
-        <w:t>CAPA (mesma arte, com 🩺)</w:t>
-      </w:r>
-    </w:p>
-    <w:p>
-      <w:pPr>
-        <w:jc w:val="center"/>
-      </w:pPr>
-      <w:r>
-        <w:rPr>
-          <w:b/>
-          <w:color w:val="555555"/>
-          <w:sz w:val="20"/>
-        </w:rPr>
-        <w:t>🩺</w:t>
-      </w:r>
-    </w:p>
-    <w:p>
-      <w:pPr>
-        <w:jc w:val="center"/>
-      </w:pPr>
-      <w:r>
-        <w:rPr>
-          <w:b/>
-          <w:color w:val="5B21B6"/>
-          <w:sz w:val="28"/>
-        </w:rPr>
-        <w:t>DEBRIEF DO PLANTÃO</w:t>
-      </w:r>
-    </w:p>
-    <w:p>
-      <w:pPr>
-        <w:jc w:val="center"/>
-      </w:pPr>
-      <w:r>
-        <w:rPr>
-          <w:b/>
-          <w:color w:val="555555"/>
-          <w:sz w:val="20"/>
-        </w:rPr>
-        <w:t>CASO #001</w:t>
-      </w:r>
-    </w:p>
-    <w:p>
-      <w:pPr>
-        <w:jc w:val="center"/>
-      </w:pPr>
-      <w:r>
-        <w:rPr>
-          <w:b/>
-          <w:color w:val="5B21B6"/>
-          <w:sz w:val="26"/>
-        </w:rPr>
-        <w:t>DOR TORÁCICA</w:t>
-      </w:r>
-    </w:p>
-    <w:p>
-      <w:r>
-        <w:rPr>
-          <w:b/>
-          <w:color w:val="555555"/>
-        </w:rPr>
-        <w:t>ROTEIRO (falado, máx. 60s)</w:t>
-      </w:r>
-    </w:p>
-    <w:p>
-      <w:r>
-        <w:rPr>
-          <w:i w:val="0"/>
-        </w:rPr>
-        <w:t>Interno... (pausa) sobre o plantão de terça.</w:t>
-      </w:r>
-    </w:p>
-    <w:p>
-      <w:r>
-        <w:rPr>
-          <w:i w:val="0"/>
-        </w:rPr>
-        <w:t>"Vi muita gente indo direto para a tomografia."</w:t>
-      </w:r>
-    </w:p>
-    <w:p>
-      <w:r>
-        <w:rPr>
-          <w:i w:val="0"/>
-        </w:rPr>
-        <w:t>(pausa) "Mas antes dela... tinha uma informação que custava dez segundos."</w:t>
-      </w:r>
-    </w:p>
-    <w:p>
-      <w:r>
-        <w:rPr>
-          <w:i w:val="0"/>
-        </w:rPr>
-        <w:t>(pausa) "Palpar os pulsos."</w:t>
-      </w:r>
-    </w:p>
-    <w:p>
-      <w:r>
-        <w:rPr>
-          <w:i w:val="0"/>
-        </w:rPr>
-        <w:t>(pausa) "Dez segundos."</w:t>
-      </w:r>
-    </w:p>
-    <w:p>
-      <w:r>
-        <w:rPr>
-          <w:i w:val="0"/>
-        </w:rPr>
-        <w:t>Pulso assimétrico entre os braços. E no raio-X, mediastino alargado.</w:t>
+        <w:t>O detalhe estava no exame físico: pulso assimétrico entre os braços. (pausa) E no raio-X, mediastino alargado.</w:t>
       </w:r>
     </w:p>
     <w:p>
@@ -856,31 +592,6 @@
           <w:i w:val="0"/>
         </w:rPr>
         <w:t>E o que mudou esse caso... (pausa) não foi um exame. (pausa) Foi o exame físico.</w:t>
-      </w:r>
-    </w:p>
-    <w:p>
-      <w:r>
-        <w:rPr>
-          <w:i/>
-          <w:color w:val="555555"/>
-        </w:rPr>
-        <w:t>[silêncio · tela preta]</w:t>
-      </w:r>
-    </w:p>
-    <w:p>
-      <w:r>
-        <w:rPr>
-          <w:i w:val="0"/>
-        </w:rPr>
-        <w:t>Bom plantão, Interno.</w:t>
-      </w:r>
-    </w:p>
-    <w:p>
-      <w:r>
-        <w:rPr>
-          <w:i w:val="0"/>
-        </w:rPr>
-        <w:t>Pode ir... (pausa) esse paciente já não é mais seu.</w:t>
       </w:r>
     </w:p>
     <w:p>
@@ -945,33 +656,31 @@
           <w:b/>
           <w:color w:val="555555"/>
         </w:rPr>
-        <w:t>ENCERRAMENTO (tela preta — sempre igual)</w:t>
+        <w:t>CTA + FECHAMENTO DO CICLO</w:t>
       </w:r>
     </w:p>
     <w:p>
-      <w:pPr>
-        <w:jc w:val="center"/>
-      </w:pPr>
       <w:r>
         <w:rPr>
-          <w:b/>
-          <w:color w:val="5B21B6"/>
-          <w:sz w:val="22"/>
+          <w:i w:val="0"/>
         </w:rPr>
-        <w:t>PRÓXIMO PACIENTE</w:t>
+        <w:t>E você — tinha pego o pulso? Comenta o que faria diferente.</w:t>
       </w:r>
     </w:p>
     <w:p>
-      <w:pPr>
-        <w:jc w:val="center"/>
-      </w:pPr>
       <w:r>
         <w:rPr>
-          <w:b/>
-          <w:color w:val="5B21B6"/>
-          <w:sz w:val="22"/>
+          <w:i w:val="0"/>
         </w:rPr>
-        <w:t>TERÇA · 20H</w:t>
+        <w:t>Bom plantão, Interno.</w:t>
+      </w:r>
+    </w:p>
+    <w:p>
+      <w:r>
+        <w:rPr>
+          <w:i w:val="0"/>
+        </w:rPr>
+        <w:t>Pode ir... (pausa) esse paciente já não é mais seu.</w:t>
       </w:r>
     </w:p>
     <w:p>
@@ -988,7 +697,7 @@
         <w:rPr>
           <w:i w:val="0"/>
         </w:rPr>
-        <w:t>🩺 DEBRIEF DO PLANTÃO · Caso #001 · Dor Torácica</w:t>
+        <w:t>🚨 SEU PLANTÃO · Caso #001 · Dor Torácica</w:t>
       </w:r>
     </w:p>
     <w:p>
@@ -996,7 +705,7 @@
         <w:rPr>
           <w:i w:val="0"/>
         </w:rPr>
-        <w:t>O debrief do Caso #001 já está no ar.</w:t>
+        <w:t>Você assumiria esse caso?</w:t>
       </w:r>
     </w:p>
     <w:p>
@@ -1004,7 +713,7 @@
         <w:rPr>
           <w:i w:val="0"/>
         </w:rPr>
-        <w:t>DISSECÇÃO AGUDA DE AORTA</w:t>
+        <w:t>Homem, 62 anos.</w:t>
       </w:r>
     </w:p>
     <w:p>
@@ -1012,7 +721,7 @@
         <w:rPr>
           <w:i w:val="0"/>
         </w:rPr>
-        <w:t>O ECG limpo parou muita gente. Dez segundos de exame físico mudaram tudo: pulso assimétrico + mediastino alargado.</w:t>
+        <w:t>Dor no peito indo pras costas.</w:t>
       </w:r>
     </w:p>
     <w:p>
@@ -1020,7 +729,7 @@
         <w:rPr>
           <w:i w:val="0"/>
         </w:rPr>
-        <w:t>Lição: ECG normal NÃO encerra o raciocínio.</w:t>
+        <w:t>ECG limpo.</w:t>
       </w:r>
     </w:p>
     <w:p>
@@ -1028,7 +737,7 @@
         <w:rPr>
           <w:i w:val="0"/>
         </w:rPr>
-        <w:t>Quem examina, enxerga.</w:t>
+        <w:t>A resposta está no vídeo — mas antes: por onde VOCÊ começaria?</w:t>
       </w:r>
     </w:p>
     <w:p>
@@ -1036,7 +745,7 @@
         <w:rPr>
           <w:i w:val="0"/>
         </w:rPr>
-        <w:t>E você, tinha pego o pulso? 👇</w:t>
+        <w:t>👇 Comenta. Tinha pego o pulso?</w:t>
       </w:r>
     </w:p>
     <w:p>
@@ -1044,7 +753,7 @@
         <w:rPr>
           <w:i w:val="0"/>
         </w:rPr>
-        <w:t>Salva pro seu próximo plantão.</w:t>
+        <w:t>Lição: ECG normal NÃO encerra o raciocínio.  ·  Quem examina, enxerga.</w:t>
       </w:r>
     </w:p>
     <w:p>
@@ -1076,7 +785,7 @@
         <w:rPr>
           <w:i w:val="0"/>
         </w:rPr>
-        <w:t>Guarda a tríade: dor pras costas + assimetria de pulso + mediastino alargado. ✅ Salva e leva pro plantão. 🚨</w:t>
+        <w:t>Regra da série: ECG normal não fecha o raciocínio. 🧠 Você tinha pego o pulso? Comenta o que faria diferente. 👇</w:t>
       </w:r>
     </w:p>
     <w:p>
@@ -1100,7 +809,7 @@
           <w:i/>
           <w:color w:val="555555"/>
         </w:rPr>
-        <w:t>🦋 Endocrinologia  ·  Semana 2  ·  Diagnóstico: Crise tireotóxica</w:t>
+        <w:t>🦋 Endocrinologia  ·  Diagnóstico: Crise tireotóxica  ·  Reel único ~60s</w:t>
       </w:r>
     </w:p>
     <w:p>
@@ -1112,16 +821,6 @@
           <w:color w:val="CCCCCC"/>
         </w:rPr>
         <w:t>— — — — — — — — — — — — — — — — — — — —</w:t>
-      </w:r>
-    </w:p>
-    <w:p>
-      <w:r>
-        <w:rPr>
-          <w:b/>
-          <w:color w:val="5B21B6"/>
-          <w:sz w:val="30"/>
-        </w:rPr>
-        <w:t>🚨 SEU PLANTÃO — TERÇA (o caso)</w:t>
       </w:r>
     </w:p>
     <w:p>
@@ -1191,7 +890,7 @@
           <w:b/>
           <w:color w:val="555555"/>
         </w:rPr>
-        <w:t>ROTEIRO (falado, máx. 60s) — abre pela cena</w:t>
+        <w:t>ROTEIRO ÚNICO (falado, ~60s) — caso + resposta no mesmo reel</w:t>
       </w:r>
     </w:p>
     <w:p>
@@ -1215,7 +914,7 @@
         <w:rPr>
           <w:i w:val="0"/>
         </w:rPr>
-        <w:t>Mulher. (pausa) Trinta e oito anos.</w:t>
+        <w:t>Mulher. (pausa) Trinta e oito anos. (pausa) Febre, diarreia e calafrios.</w:t>
       </w:r>
     </w:p>
     <w:p>
@@ -1223,7 +922,7 @@
         <w:rPr>
           <w:i w:val="0"/>
         </w:rPr>
-        <w:t>Febre. Diarreia. Calafrios.</w:t>
+        <w:t>Temperatura 38,2. Taquicárdica. Pressão 18 por 10.</w:t>
       </w:r>
     </w:p>
     <w:p>
@@ -1231,7 +930,7 @@
         <w:rPr>
           <w:i w:val="0"/>
         </w:rPr>
-        <w:t>O que você quer saber primeiro?</w:t>
+        <w:t>Antes de eu continuar... (pausa) por onde você começaria?</w:t>
       </w:r>
     </w:p>
     <w:p>
@@ -1240,7 +939,7 @@
           <w:i/>
           <w:color w:val="555555"/>
         </w:rPr>
-        <w:t>[DIREÇÃO: olha pra lente · não mexe · não sorri · não fala · 2 segundos de silêncio]</w:t>
+        <w:t>[DIREÇÃO: olha pra lente · 2 segundos de silêncio]</w:t>
       </w:r>
     </w:p>
     <w:p>
@@ -1248,7 +947,7 @@
         <w:rPr>
           <w:i w:val="0"/>
         </w:rPr>
-        <w:t>Temperatura: 38,2. Taquicárdica. Pressão 18 por 10. Coração, pulmão e abdome sem alterações.</w:t>
+        <w:t>Você pensa infecção — e faz certo em pensar. Urina: normal. Raio-X: normal. Hemograma: sem foco infeccioso.</w:t>
       </w:r>
     </w:p>
     <w:p>
@@ -1256,7 +955,7 @@
         <w:rPr>
           <w:i w:val="0"/>
         </w:rPr>
-        <w:t>Você pensa infecção — e faz certo em pensar.</w:t>
+        <w:t>Só que tem um problema. (pausa) Você procura o foco... e ele simplesmente não existe.</w:t>
       </w:r>
     </w:p>
     <w:p>
@@ -1264,302 +963,7 @@
         <w:rPr>
           <w:i w:val="0"/>
         </w:rPr>
-        <w:t>Você começa investigando infecção. (pausa) Urina: normal. Raio-X: normal. Hemograma: sem foco infeccioso.</w:t>
-      </w:r>
-    </w:p>
-    <w:p>
-      <w:r>
-        <w:rPr>
-          <w:i w:val="0"/>
-        </w:rPr>
-        <w:t>Só que tem um problema. (pausa) Você procura o foco... (pausa) ...e ele simplesmente não existe.</w:t>
-      </w:r>
-    </w:p>
-    <w:p>
-      <w:r>
-        <w:rPr>
-          <w:i w:val="0"/>
-        </w:rPr>
-        <w:t>É aí que esse caso muda completamente.</w:t>
-      </w:r>
-    </w:p>
-    <w:p>
-      <w:r>
-        <w:rPr>
-          <w:i w:val="0"/>
-        </w:rPr>
-        <w:t>E você... (pausa) ...por onde você começaria?</w:t>
-      </w:r>
-    </w:p>
-    <w:p>
-      <w:r>
-        <w:rPr>
-          <w:b/>
-          <w:color w:val="555555"/>
-        </w:rPr>
-        <w:t>ENCERRAMENTO (tela preta — sempre igual)</w:t>
-      </w:r>
-    </w:p>
-    <w:p>
-      <w:pPr>
-        <w:jc w:val="center"/>
-      </w:pPr>
-      <w:r>
-        <w:rPr>
-          <w:b/>
-          <w:color w:val="5B21B6"/>
-          <w:sz w:val="22"/>
-        </w:rPr>
-        <w:t>"Seu plantão não acabou."</w:t>
-      </w:r>
-    </w:p>
-    <w:p>
-      <w:pPr>
-        <w:jc w:val="center"/>
-      </w:pPr>
-      <w:r>
-        <w:rPr>
-          <w:b/>
-          <w:color w:val="5B21B6"/>
-          <w:sz w:val="22"/>
-        </w:rPr>
-        <w:t>QUINTA · 20H</w:t>
-      </w:r>
-    </w:p>
-    <w:p>
-      <w:r>
-        <w:rPr>
-          <w:b/>
-          <w:color w:val="555555"/>
-        </w:rPr>
-        <w:t>LEGENDA DO POST</w:t>
-      </w:r>
-    </w:p>
-    <w:p>
-      <w:r>
-        <w:rPr>
-          <w:i w:val="0"/>
-        </w:rPr>
-        <w:t>🚨 SEU PLANTÃO · Caso #002 · Ela Não Para Quieta</w:t>
-      </w:r>
-    </w:p>
-    <w:p>
-      <w:r>
-        <w:rPr>
-          <w:i w:val="0"/>
-        </w:rPr>
-        <w:t>Você assumiria esse caso?</w:t>
-      </w:r>
-    </w:p>
-    <w:p>
-      <w:r>
-        <w:rPr>
-          <w:i w:val="0"/>
-        </w:rPr>
-        <w:t>Mulher, 38 anos.</w:t>
-      </w:r>
-    </w:p>
-    <w:p>
-      <w:r>
-        <w:rPr>
-          <w:i w:val="0"/>
-        </w:rPr>
-        <w:t>Febre, calafrio e taquicardia.</w:t>
-      </w:r>
-    </w:p>
-    <w:p>
-      <w:r>
-        <w:rPr>
-          <w:i w:val="0"/>
-        </w:rPr>
-        <w:t>Exames de infecção limpos.</w:t>
-      </w:r>
-    </w:p>
-    <w:p>
-      <w:r>
-        <w:rPr>
-          <w:i w:val="0"/>
-        </w:rPr>
-        <w:t>E você — por onde começaria?</w:t>
-      </w:r>
-    </w:p>
-    <w:p>
-      <w:r>
-        <w:rPr>
-          <w:i w:val="0"/>
-        </w:rPr>
-        <w:t>👇 Quero saber seu próximo passo, antes do debrief de quinta.</w:t>
-      </w:r>
-    </w:p>
-    <w:p>
-      <w:r>
-        <w:rPr>
-          <w:i w:val="0"/>
-        </w:rPr>
-      </w:r>
-    </w:p>
-    <w:p>
-      <w:r>
-        <w:rPr>
-          <w:i w:val="0"/>
-        </w:rPr>
-        <w:t>#pendurajaleco #medicina #casoclinico #plantao #internato #residenciamedica #estudantedemedicina #emergencia</w:t>
-      </w:r>
-    </w:p>
-    <w:p>
-      <w:r>
-        <w:rPr>
-          <w:b/>
-          <w:color w:val="555555"/>
-        </w:rPr>
-        <w:t>COMENTÁRIO FIXADO</w:t>
-      </w:r>
-    </w:p>
-    <w:p>
-      <w:r>
-        <w:rPr>
-          <w:i w:val="0"/>
-        </w:rPr>
-        <w:t>Pista da série: febre sem foco nem sempre é infecção. 🧠 Comenta por onde você começaria, antes do debrief de quinta. 👇</w:t>
-      </w:r>
-    </w:p>
-    <w:p>
-      <w:pPr>
-        <w:jc w:val="center"/>
-      </w:pPr>
-      <w:r>
-        <w:rPr>
-          <w:color w:val="CCCCCC"/>
-        </w:rPr>
-        <w:t>— — — — — — — — — — — — — — — — — — — —</w:t>
-      </w:r>
-    </w:p>
-    <w:p>
-      <w:r>
-        <w:rPr>
-          <w:b/>
-          <w:color w:val="5B21B6"/>
-          <w:sz w:val="30"/>
-        </w:rPr>
-        <w:t>🩺 DEBRIEF DO PLANTÃO — QUINTA (discussão de corredor)</w:t>
-      </w:r>
-    </w:p>
-    <w:p>
-      <w:r>
-        <w:rPr>
-          <w:b/>
-          <w:color w:val="555555"/>
-        </w:rPr>
-        <w:t>CAPA (mesma arte, com 🩺)</w:t>
-      </w:r>
-    </w:p>
-    <w:p>
-      <w:pPr>
-        <w:jc w:val="center"/>
-      </w:pPr>
-      <w:r>
-        <w:rPr>
-          <w:b/>
-          <w:color w:val="555555"/>
-          <w:sz w:val="20"/>
-        </w:rPr>
-        <w:t>🩺</w:t>
-      </w:r>
-    </w:p>
-    <w:p>
-      <w:pPr>
-        <w:jc w:val="center"/>
-      </w:pPr>
-      <w:r>
-        <w:rPr>
-          <w:b/>
-          <w:color w:val="5B21B6"/>
-          <w:sz w:val="28"/>
-        </w:rPr>
-        <w:t>DEBRIEF DO PLANTÃO</w:t>
-      </w:r>
-    </w:p>
-    <w:p>
-      <w:pPr>
-        <w:jc w:val="center"/>
-      </w:pPr>
-      <w:r>
-        <w:rPr>
-          <w:b/>
-          <w:color w:val="555555"/>
-          <w:sz w:val="20"/>
-        </w:rPr>
-        <w:t>CASO #002</w:t>
-      </w:r>
-    </w:p>
-    <w:p>
-      <w:pPr>
-        <w:jc w:val="center"/>
-      </w:pPr>
-      <w:r>
-        <w:rPr>
-          <w:b/>
-          <w:color w:val="5B21B6"/>
-          <w:sz w:val="26"/>
-        </w:rPr>
-        <w:t>ELA NÃO PARA QUIETA</w:t>
-      </w:r>
-    </w:p>
-    <w:p>
-      <w:r>
-        <w:rPr>
-          <w:b/>
-          <w:color w:val="555555"/>
-        </w:rPr>
-        <w:t>ROTEIRO (falado, máx. 60s)</w:t>
-      </w:r>
-    </w:p>
-    <w:p>
-      <w:r>
-        <w:rPr>
-          <w:i w:val="0"/>
-        </w:rPr>
-        <w:t>Interno... (pausa) sobre o plantão de terça.</w:t>
-      </w:r>
-    </w:p>
-    <w:p>
-      <w:r>
-        <w:rPr>
-          <w:i w:val="0"/>
-        </w:rPr>
-        <w:t>"Vi muita gente fechando sepse e caçando um foco."</w:t>
-      </w:r>
-    </w:p>
-    <w:p>
-      <w:r>
-        <w:rPr>
-          <w:i w:val="0"/>
-        </w:rPr>
-        <w:t>(pausa) "Mas o foco não existia."</w:t>
-      </w:r>
-    </w:p>
-    <w:p>
-      <w:r>
-        <w:rPr>
-          <w:i w:val="0"/>
-        </w:rPr>
-        <w:t>(pausa) "Olhar pra paciente."</w:t>
-      </w:r>
-    </w:p>
-    <w:p>
-      <w:r>
-        <w:rPr>
-          <w:i w:val="0"/>
-        </w:rPr>
-        <w:t>(pausa) "Cinco segundos."</w:t>
-      </w:r>
-    </w:p>
-    <w:p>
-      <w:r>
-        <w:rPr>
-          <w:i w:val="0"/>
-        </w:rPr>
-        <w:t>Ela estava emagrecida. (pausa) E tinha exoftalmia. (pausa) A partir daí, faz sentido pedir função tireoidiana. TSH baixo. T4 alto.</w:t>
+        <w:t>Aí você olha pra paciente. (pausa) Emagrecida. (pausa) E com exoftalmia. A partir daí, faz sentido pedir função tireoidiana: TSH baixo, T4 alto.</w:t>
       </w:r>
     </w:p>
     <w:p>
@@ -1576,31 +980,6 @@
           <w:i w:val="0"/>
         </w:rPr>
         <w:t>E o que mudou esse caso... (pausa) não foi um exame. (pausa) Foi o exame físico.</w:t>
-      </w:r>
-    </w:p>
-    <w:p>
-      <w:r>
-        <w:rPr>
-          <w:i/>
-          <w:color w:val="555555"/>
-        </w:rPr>
-        <w:t>[silêncio · tela preta]</w:t>
-      </w:r>
-    </w:p>
-    <w:p>
-      <w:r>
-        <w:rPr>
-          <w:i w:val="0"/>
-        </w:rPr>
-        <w:t>Bom plantão, Interno.</w:t>
-      </w:r>
-    </w:p>
-    <w:p>
-      <w:r>
-        <w:rPr>
-          <w:i w:val="0"/>
-        </w:rPr>
-        <w:t>Pode ir... (pausa) esse paciente já não é mais seu.</w:t>
       </w:r>
     </w:p>
     <w:p>
@@ -1665,33 +1044,31 @@
           <w:b/>
           <w:color w:val="555555"/>
         </w:rPr>
-        <w:t>ENCERRAMENTO (tela preta — sempre igual)</w:t>
+        <w:t>CTA + FECHAMENTO DO CICLO</w:t>
       </w:r>
     </w:p>
     <w:p>
-      <w:pPr>
-        <w:jc w:val="center"/>
-      </w:pPr>
       <w:r>
         <w:rPr>
-          <w:b/>
-          <w:color w:val="5B21B6"/>
-          <w:sz w:val="22"/>
+          <w:i w:val="0"/>
         </w:rPr>
-        <w:t>PRÓXIMO PACIENTE</w:t>
+        <w:t>E você — tinha olhado pra paciente? Comenta.</w:t>
       </w:r>
     </w:p>
     <w:p>
-      <w:pPr>
-        <w:jc w:val="center"/>
-      </w:pPr>
       <w:r>
         <w:rPr>
-          <w:b/>
-          <w:color w:val="5B21B6"/>
-          <w:sz w:val="22"/>
+          <w:i w:val="0"/>
         </w:rPr>
-        <w:t>TERÇA · 20H</w:t>
+        <w:t>Bom plantão, Interno.</w:t>
+      </w:r>
+    </w:p>
+    <w:p>
+      <w:r>
+        <w:rPr>
+          <w:i w:val="0"/>
+        </w:rPr>
+        <w:t>Pode ir... (pausa) esse paciente já não é mais seu.</w:t>
       </w:r>
     </w:p>
     <w:p>
@@ -1708,7 +1085,7 @@
         <w:rPr>
           <w:i w:val="0"/>
         </w:rPr>
-        <w:t>🩺 DEBRIEF DO PLANTÃO · Caso #002 · Ela Não Para Quieta</w:t>
+        <w:t>🚨 SEU PLANTÃO · Caso #002 · Ela Não Para Quieta</w:t>
       </w:r>
     </w:p>
     <w:p>
@@ -1716,7 +1093,7 @@
         <w:rPr>
           <w:i w:val="0"/>
         </w:rPr>
-        <w:t>O debrief do Caso #002 já está no ar.</w:t>
+        <w:t>Você assumiria esse caso?</w:t>
       </w:r>
     </w:p>
     <w:p>
@@ -1724,7 +1101,7 @@
         <w:rPr>
           <w:i w:val="0"/>
         </w:rPr>
-        <w:t>CRISE TIREOTÓXICA</w:t>
+        <w:t>Mulher, 38 anos.</w:t>
       </w:r>
     </w:p>
     <w:p>
@@ -1732,7 +1109,7 @@
         <w:rPr>
           <w:i w:val="0"/>
         </w:rPr>
-        <w:t>O foco infeccioso não existia. Cinco segundos de exame físico mudaram tudo: emagrecimento + exoftalmia → TSH baixo, T4 alto.</w:t>
+        <w:t>Febre, calafrio e taquicardia.</w:t>
       </w:r>
     </w:p>
     <w:p>
@@ -1740,7 +1117,7 @@
         <w:rPr>
           <w:i w:val="0"/>
         </w:rPr>
-        <w:t>Lição: Febre sem foco não é sempre infecção.</w:t>
+        <w:t>Exames de infecção limpos.</w:t>
       </w:r>
     </w:p>
     <w:p>
@@ -1748,7 +1125,7 @@
         <w:rPr>
           <w:i w:val="0"/>
         </w:rPr>
-        <w:t>Quem examina, enxerga.</w:t>
+        <w:t>A resposta está no vídeo — mas antes: por onde VOCÊ começaria?</w:t>
       </w:r>
     </w:p>
     <w:p>
@@ -1756,7 +1133,7 @@
         <w:rPr>
           <w:i w:val="0"/>
         </w:rPr>
-        <w:t>E você, tinha olhado pra paciente? 👇</w:t>
+        <w:t>👇 Comenta. Tinha olhado pra paciente?</w:t>
       </w:r>
     </w:p>
     <w:p>
@@ -1764,7 +1141,7 @@
         <w:rPr>
           <w:i w:val="0"/>
         </w:rPr>
-        <w:t>Salva pro seu próximo plantão.</w:t>
+        <w:t>Lição: Febre sem foco não é sempre infecção.  ·  Quem examina, enxerga.</w:t>
       </w:r>
     </w:p>
     <w:p>
@@ -1796,7 +1173,7 @@
         <w:rPr>
           <w:i w:val="0"/>
         </w:rPr>
-        <w:t>Guarda o combo: febre + taquicardia + agitação + diarreia + olho saltado = pensa TIREOIDE. ✅ Salva e leva pro plantão. 🚨</w:t>
+        <w:t>Pista da série: febre sem foco nem sempre é infecção. 🧠 Você tinha olhado pra paciente inteira? Comenta. 👇</w:t>
       </w:r>
     </w:p>
     <w:p>
@@ -1820,7 +1197,7 @@
           <w:i/>
           <w:color w:val="555555"/>
         </w:rPr>
-        <w:t>👶 Pediatria / Cirurgia  ·  Semana 3  ·  Diagnóstico: Intussuscepção</w:t>
+        <w:t>👶 Pediatria / Cirurgia  ·  Diagnóstico: Intussuscepção  ·  Reel único ~60s</w:t>
       </w:r>
     </w:p>
     <w:p>
@@ -1832,16 +1209,6 @@
           <w:color w:val="CCCCCC"/>
         </w:rPr>
         <w:t>— — — — — — — — — — — — — — — — — — — —</w:t>
-      </w:r>
-    </w:p>
-    <w:p>
-      <w:r>
-        <w:rPr>
-          <w:b/>
-          <w:color w:val="5B21B6"/>
-          <w:sz w:val="30"/>
-        </w:rPr>
-        <w:t>🚨 SEU PLANTÃO — TERÇA (o caso)</w:t>
       </w:r>
     </w:p>
     <w:p>
@@ -1911,7 +1278,7 @@
           <w:b/>
           <w:color w:val="555555"/>
         </w:rPr>
-        <w:t>ROTEIRO (falado, máx. 60s) — abre pela cena</w:t>
+        <w:t>ROTEIRO ÚNICO (falado, ~60s) — caso + resposta no mesmo reel</w:t>
       </w:r>
     </w:p>
     <w:p>
@@ -1935,32 +1302,7 @@
         <w:rPr>
           <w:i w:val="0"/>
         </w:rPr>
-        <w:t>Você é o cirurgião. A pediatria te chamou.</w:t>
-      </w:r>
-    </w:p>
-    <w:p>
-      <w:r>
-        <w:rPr>
-          <w:i w:val="0"/>
-        </w:rPr>
-        <w:t>E ela tem... (pausa) nove meses. (pausa) Não fala. Não te conta nada.</w:t>
-      </w:r>
-    </w:p>
-    <w:p>
-      <w:r>
-        <w:rPr>
-          <w:i w:val="0"/>
-        </w:rPr>
-        <w:t>O que você quer saber primeiro?</w:t>
-      </w:r>
-    </w:p>
-    <w:p>
-      <w:r>
-        <w:rPr>
-          <w:i/>
-          <w:color w:val="555555"/>
-        </w:rPr>
-        <w:t>[DIREÇÃO: olha pra lente · não mexe · não sorri · não fala · 2 segundos de silêncio]</w:t>
+        <w:t>Você é o cirurgião. A pediatria te chamou. E ela tem... (pausa) nove meses. Não fala.</w:t>
       </w:r>
     </w:p>
     <w:p>
@@ -1976,6 +1318,23 @@
         <w:rPr>
           <w:i w:val="0"/>
         </w:rPr>
+        <w:t>Antes de eu continuar... (pausa) por onde você começaria?</w:t>
+      </w:r>
+    </w:p>
+    <w:p>
+      <w:r>
+        <w:rPr>
+          <w:i/>
+          <w:color w:val="555555"/>
+        </w:rPr>
+        <w:t>[DIREÇÃO: olha pra lente · 2 segundos de silêncio]</w:t>
+      </w:r>
+    </w:p>
+    <w:p>
+      <w:r>
+        <w:rPr>
+          <w:i w:val="0"/>
+        </w:rPr>
         <w:t>Sem queixa, sem história. Só o corpo dela fala.</w:t>
       </w:r>
     </w:p>
@@ -1984,7 +1343,7 @@
         <w:rPr>
           <w:i w:val="0"/>
         </w:rPr>
-        <w:t>Tem um exame que é fácil de pular no bebê — e que muda tudo.</w:t>
+        <w:t>Muita gente vai direto pro ultrassom — e ele ajuda. (pausa) Mas quem entrega é o básico.</w:t>
       </w:r>
     </w:p>
     <w:p>
@@ -1992,286 +1351,7 @@
         <w:rPr>
           <w:i w:val="0"/>
         </w:rPr>
-        <w:t>E você... (pausa) ...por onde você começaria?</w:t>
-      </w:r>
-    </w:p>
-    <w:p>
-      <w:r>
-        <w:rPr>
-          <w:b/>
-          <w:color w:val="555555"/>
-        </w:rPr>
-        <w:t>ENCERRAMENTO (tela preta — sempre igual)</w:t>
-      </w:r>
-    </w:p>
-    <w:p>
-      <w:pPr>
-        <w:jc w:val="center"/>
-      </w:pPr>
-      <w:r>
-        <w:rPr>
-          <w:b/>
-          <w:color w:val="5B21B6"/>
-          <w:sz w:val="22"/>
-        </w:rPr>
-        <w:t>"Seu plantão não acabou."</w:t>
-      </w:r>
-    </w:p>
-    <w:p>
-      <w:pPr>
-        <w:jc w:val="center"/>
-      </w:pPr>
-      <w:r>
-        <w:rPr>
-          <w:b/>
-          <w:color w:val="5B21B6"/>
-          <w:sz w:val="22"/>
-        </w:rPr>
-        <w:t>QUINTA · 20H</w:t>
-      </w:r>
-    </w:p>
-    <w:p>
-      <w:r>
-        <w:rPr>
-          <w:b/>
-          <w:color w:val="555555"/>
-        </w:rPr>
-        <w:t>LEGENDA DO POST</w:t>
-      </w:r>
-    </w:p>
-    <w:p>
-      <w:r>
-        <w:rPr>
-          <w:i w:val="0"/>
-        </w:rPr>
-        <w:t>🚨 SEU PLANTÃO · Caso #003 · O Paciente Não Fala</w:t>
-      </w:r>
-    </w:p>
-    <w:p>
-      <w:r>
-        <w:rPr>
-          <w:i w:val="0"/>
-        </w:rPr>
-        <w:t>Você assumiria esse caso?</w:t>
-      </w:r>
-    </w:p>
-    <w:p>
-      <w:r>
-        <w:rPr>
-          <w:i w:val="0"/>
-        </w:rPr>
-        <w:t>Bebê, 9 meses.</w:t>
-      </w:r>
-    </w:p>
-    <w:p>
-      <w:r>
-        <w:rPr>
-          <w:i w:val="0"/>
-        </w:rPr>
-        <w:t>Dor abdominal em ondas.</w:t>
-      </w:r>
-    </w:p>
-    <w:p>
-      <w:r>
-        <w:rPr>
-          <w:i w:val="0"/>
-        </w:rPr>
-        <w:t>Não fala, não conta nada.</w:t>
-      </w:r>
-    </w:p>
-    <w:p>
-      <w:r>
-        <w:rPr>
-          <w:i w:val="0"/>
-        </w:rPr>
-        <w:t>E você — por onde começaria?</w:t>
-      </w:r>
-    </w:p>
-    <w:p>
-      <w:r>
-        <w:rPr>
-          <w:i w:val="0"/>
-        </w:rPr>
-        <w:t>👇 Quero saber seu próximo passo, antes do debrief de quinta.</w:t>
-      </w:r>
-    </w:p>
-    <w:p>
-      <w:r>
-        <w:rPr>
-          <w:i w:val="0"/>
-        </w:rPr>
-      </w:r>
-    </w:p>
-    <w:p>
-      <w:r>
-        <w:rPr>
-          <w:i w:val="0"/>
-        </w:rPr>
-        <w:t>#pendurajaleco #medicina #casoclinico #plantao #internato #residenciamedica #estudantedemedicina #emergencia</w:t>
-      </w:r>
-    </w:p>
-    <w:p>
-      <w:r>
-        <w:rPr>
-          <w:b/>
-          <w:color w:val="555555"/>
-        </w:rPr>
-        <w:t>COMENTÁRIO FIXADO</w:t>
-      </w:r>
-    </w:p>
-    <w:p>
-      <w:r>
-        <w:rPr>
-          <w:i w:val="0"/>
-        </w:rPr>
-        <w:t>Quando o paciente não fala, o exame fala por ele. 🧠 Comenta por onde você começaria, antes do debrief de quinta. 👇</w:t>
-      </w:r>
-    </w:p>
-    <w:p>
-      <w:pPr>
-        <w:jc w:val="center"/>
-      </w:pPr>
-      <w:r>
-        <w:rPr>
-          <w:color w:val="CCCCCC"/>
-        </w:rPr>
-        <w:t>— — — — — — — — — — — — — — — — — — — —</w:t>
-      </w:r>
-    </w:p>
-    <w:p>
-      <w:r>
-        <w:rPr>
-          <w:b/>
-          <w:color w:val="5B21B6"/>
-          <w:sz w:val="30"/>
-        </w:rPr>
-        <w:t>🩺 DEBRIEF DO PLANTÃO — QUINTA (discussão de corredor)</w:t>
-      </w:r>
-    </w:p>
-    <w:p>
-      <w:r>
-        <w:rPr>
-          <w:b/>
-          <w:color w:val="555555"/>
-        </w:rPr>
-        <w:t>CAPA (mesma arte, com 🩺)</w:t>
-      </w:r>
-    </w:p>
-    <w:p>
-      <w:pPr>
-        <w:jc w:val="center"/>
-      </w:pPr>
-      <w:r>
-        <w:rPr>
-          <w:b/>
-          <w:color w:val="555555"/>
-          <w:sz w:val="20"/>
-        </w:rPr>
-        <w:t>🩺</w:t>
-      </w:r>
-    </w:p>
-    <w:p>
-      <w:pPr>
-        <w:jc w:val="center"/>
-      </w:pPr>
-      <w:r>
-        <w:rPr>
-          <w:b/>
-          <w:color w:val="5B21B6"/>
-          <w:sz w:val="28"/>
-        </w:rPr>
-        <w:t>DEBRIEF DO PLANTÃO</w:t>
-      </w:r>
-    </w:p>
-    <w:p>
-      <w:pPr>
-        <w:jc w:val="center"/>
-      </w:pPr>
-      <w:r>
-        <w:rPr>
-          <w:b/>
-          <w:color w:val="555555"/>
-          <w:sz w:val="20"/>
-        </w:rPr>
-        <w:t>CASO #003</w:t>
-      </w:r>
-    </w:p>
-    <w:p>
-      <w:pPr>
-        <w:jc w:val="center"/>
-      </w:pPr>
-      <w:r>
-        <w:rPr>
-          <w:b/>
-          <w:color w:val="5B21B6"/>
-          <w:sz w:val="26"/>
-        </w:rPr>
-        <w:t>O PACIENTE NÃO FALA</w:t>
-      </w:r>
-    </w:p>
-    <w:p>
-      <w:r>
-        <w:rPr>
-          <w:b/>
-          <w:color w:val="555555"/>
-        </w:rPr>
-        <w:t>ROTEIRO (falado, máx. 60s)</w:t>
-      </w:r>
-    </w:p>
-    <w:p>
-      <w:r>
-        <w:rPr>
-          <w:i w:val="0"/>
-        </w:rPr>
-        <w:t>Interno... (pausa) sobre o plantão de terça.</w:t>
-      </w:r>
-    </w:p>
-    <w:p>
-      <w:r>
-        <w:rPr>
-          <w:i w:val="0"/>
-        </w:rPr>
-        <w:t>"Vi muita gente indo direto pro ultrassom."</w:t>
-      </w:r>
-    </w:p>
-    <w:p>
-      <w:r>
-        <w:rPr>
-          <w:i w:val="0"/>
-        </w:rPr>
-        <w:t>(pausa) "E ele ajuda."</w:t>
-      </w:r>
-    </w:p>
-    <w:p>
-      <w:r>
-        <w:rPr>
-          <w:i w:val="0"/>
-        </w:rPr>
-        <w:t>(pausa) "Mas quem entregou foi o básico."</w:t>
-      </w:r>
-    </w:p>
-    <w:p>
-      <w:r>
-        <w:rPr>
-          <w:i w:val="0"/>
-        </w:rPr>
-        <w:t>(pausa) "O toque retal."</w:t>
-      </w:r>
-    </w:p>
-    <w:p>
-      <w:r>
-        <w:rPr>
-          <w:i w:val="0"/>
-        </w:rPr>
-        <w:t>(pausa) "Dez segundos."</w:t>
-      </w:r>
-    </w:p>
-    <w:p>
-      <w:r>
-        <w:rPr>
-          <w:i w:val="0"/>
-        </w:rPr>
-        <w:t>Fezes em geleia de framboesa. Bebê de 6 meses a 2 anos, dor em ondas, às vezes massa em salsicha. O ultrassom confirma: sinal do alvo.</w:t>
+        <w:t>O toque retal: fezes em geleia de framboesa. Bebê de 6 meses a 2 anos, dor em ondas, às vezes massa em salsicha. O ultrassom confirma: sinal do alvo.</w:t>
       </w:r>
     </w:p>
     <w:p>
@@ -2288,31 +1368,6 @@
           <w:i w:val="0"/>
         </w:rPr>
         <w:t>E o que mudou esse caso... (pausa) não foi um exame. (pausa) Foi o exame físico.</w:t>
-      </w:r>
-    </w:p>
-    <w:p>
-      <w:r>
-        <w:rPr>
-          <w:i/>
-          <w:color w:val="555555"/>
-        </w:rPr>
-        <w:t>[silêncio · tela preta]</w:t>
-      </w:r>
-    </w:p>
-    <w:p>
-      <w:r>
-        <w:rPr>
-          <w:i w:val="0"/>
-        </w:rPr>
-        <w:t>Bom plantão, Interno.</w:t>
-      </w:r>
-    </w:p>
-    <w:p>
-      <w:r>
-        <w:rPr>
-          <w:i w:val="0"/>
-        </w:rPr>
-        <w:t>Pode ir... (pausa) esse paciente já não é mais seu.</w:t>
       </w:r>
     </w:p>
     <w:p>
@@ -2377,33 +1432,31 @@
           <w:b/>
           <w:color w:val="555555"/>
         </w:rPr>
-        <w:t>ENCERRAMENTO (tela preta — sempre igual)</w:t>
+        <w:t>CTA + FECHAMENTO DO CICLO</w:t>
       </w:r>
     </w:p>
     <w:p>
-      <w:pPr>
-        <w:jc w:val="center"/>
-      </w:pPr>
       <w:r>
         <w:rPr>
-          <w:b/>
-          <w:color w:val="5B21B6"/>
-          <w:sz w:val="22"/>
+          <w:i w:val="0"/>
         </w:rPr>
-        <w:t>PRÓXIMO PACIENTE</w:t>
+        <w:t>E você — teria feito o toque? Comenta.</w:t>
       </w:r>
     </w:p>
     <w:p>
-      <w:pPr>
-        <w:jc w:val="center"/>
-      </w:pPr>
       <w:r>
         <w:rPr>
-          <w:b/>
-          <w:color w:val="5B21B6"/>
-          <w:sz w:val="22"/>
+          <w:i w:val="0"/>
         </w:rPr>
-        <w:t>TERÇA · 20H</w:t>
+        <w:t>Bom plantão, Interno.</w:t>
+      </w:r>
+    </w:p>
+    <w:p>
+      <w:r>
+        <w:rPr>
+          <w:i w:val="0"/>
+        </w:rPr>
+        <w:t>Pode ir... (pausa) esse paciente já não é mais seu.</w:t>
       </w:r>
     </w:p>
     <w:p>
@@ -2420,7 +1473,7 @@
         <w:rPr>
           <w:i w:val="0"/>
         </w:rPr>
-        <w:t>🩺 DEBRIEF DO PLANTÃO · Caso #003 · O Paciente Não Fala</w:t>
+        <w:t>🚨 SEU PLANTÃO · Caso #003 · O Paciente Não Fala</w:t>
       </w:r>
     </w:p>
     <w:p>
@@ -2428,7 +1481,7 @@
         <w:rPr>
           <w:i w:val="0"/>
         </w:rPr>
-        <w:t>O debrief do Caso #003 já está no ar.</w:t>
+        <w:t>Você assumiria esse caso?</w:t>
       </w:r>
     </w:p>
     <w:p>
@@ -2436,7 +1489,7 @@
         <w:rPr>
           <w:i w:val="0"/>
         </w:rPr>
-        <w:t>INTUSSUSCEPÇÃO</w:t>
+        <w:t>Bebê, 9 meses.</w:t>
       </w:r>
     </w:p>
     <w:p>
@@ -2444,7 +1497,7 @@
         <w:rPr>
           <w:i w:val="0"/>
         </w:rPr>
-        <w:t>O ultrassom confirma (sinal do alvo), mas quem entregou foi o toque: geleia de framboesa. Bebê 6m–2a + dor em ondas.</w:t>
+        <w:t>Dor abdominal em ondas.</w:t>
       </w:r>
     </w:p>
     <w:p>
@@ -2452,7 +1505,7 @@
         <w:rPr>
           <w:i w:val="0"/>
         </w:rPr>
-        <w:t>Lição: Quando o paciente não fala, examine. O básico fala por ele.</w:t>
+        <w:t>Não fala, não conta nada.</w:t>
       </w:r>
     </w:p>
     <w:p>
@@ -2460,7 +1513,7 @@
         <w:rPr>
           <w:i w:val="0"/>
         </w:rPr>
-        <w:t>Quem examina, enxerga.</w:t>
+        <w:t>A resposta está no vídeo — mas antes: por onde VOCÊ começaria?</w:t>
       </w:r>
     </w:p>
     <w:p>
@@ -2468,7 +1521,7 @@
         <w:rPr>
           <w:i w:val="0"/>
         </w:rPr>
-        <w:t>E você, teria feito o toque? 👇</w:t>
+        <w:t>👇 Comenta. Teria feito o toque?</w:t>
       </w:r>
     </w:p>
     <w:p>
@@ -2476,7 +1529,7 @@
         <w:rPr>
           <w:i w:val="0"/>
         </w:rPr>
-        <w:t>Salva pro seu próximo plantão.</w:t>
+        <w:t>Lição: Quando o paciente não fala, examine. O básico fala por ele.  ·  Quem examina, enxerga.</w:t>
       </w:r>
     </w:p>
     <w:p>
@@ -2508,7 +1561,7 @@
         <w:rPr>
           <w:i w:val="0"/>
         </w:rPr>
-        <w:t>Guarda o combo: 6m–2a + dor intermitente + geleia de framboesa + sinal do alvo. ✅ Salva e leva pro plantão. 🚨</w:t>
+        <w:t>Quando o paciente não fala, o exame fala por ele. 🧠 Você teria feito o toque? Comenta. 👇</w:t>
       </w:r>
     </w:p>
     <w:p>
@@ -2532,7 +1585,7 @@
           <w:i/>
           <w:color w:val="555555"/>
         </w:rPr>
-        <w:t>⚡ Endocrinologia  ·  Semana 4  ·  Diagnóstico: Feocromocitoma</w:t>
+        <w:t>⚡ Endocrinologia  ·  Diagnóstico: Feocromocitoma  ·  Reel único ~60s</w:t>
       </w:r>
     </w:p>
     <w:p>
@@ -2544,16 +1597,6 @@
           <w:color w:val="CCCCCC"/>
         </w:rPr>
         <w:t>— — — — — — — — — — — — — — — — — — — —</w:t>
-      </w:r>
-    </w:p>
-    <w:p>
-      <w:r>
-        <w:rPr>
-          <w:b/>
-          <w:color w:val="5B21B6"/>
-          <w:sz w:val="30"/>
-        </w:rPr>
-        <w:t>🚨 SEU PLANTÃO — TERÇA (o caso)</w:t>
       </w:r>
     </w:p>
     <w:p>
@@ -2623,7 +1666,7 @@
           <w:b/>
           <w:color w:val="555555"/>
         </w:rPr>
-        <w:t>ROTEIRO (falado, máx. 60s) — abre pela cena</w:t>
+        <w:t>ROTEIRO ÚNICO (falado, ~60s) — caso + resposta no mesmo reel</w:t>
       </w:r>
     </w:p>
     <w:p>
@@ -2647,7 +1690,7 @@
         <w:rPr>
           <w:i w:val="0"/>
         </w:rPr>
-        <w:t>Rapaz. (pausa) Dezoito anos. (pausa) Começou a trabalhar agora.</w:t>
+        <w:t>Rapaz. (pausa) Dezoito anos. (pausa) Diagnóstico de burnout. Já toma ansiolítico e antidepressivo.</w:t>
       </w:r>
     </w:p>
     <w:p>
@@ -2655,7 +1698,7 @@
         <w:rPr>
           <w:i w:val="0"/>
         </w:rPr>
-        <w:t>Diagnóstico de burnout. Já toma ansiolítico e antidepressivo.</w:t>
+        <w:t>Pressão 20 por 16 — e não cede com dois remédios. Dor de cabeça, palpitação e suor... em crises.</w:t>
       </w:r>
     </w:p>
     <w:p>
@@ -2663,7 +1706,7 @@
         <w:rPr>
           <w:i w:val="0"/>
         </w:rPr>
-        <w:t>O que você quer saber primeiro?</w:t>
+        <w:t>Antes de eu continuar... (pausa) por onde você começaria?</w:t>
       </w:r>
     </w:p>
     <w:p>
@@ -2672,15 +1715,7 @@
           <w:i/>
           <w:color w:val="555555"/>
         </w:rPr>
-        <w:t>[DIREÇÃO: olha pra lente · não mexe · não sorri · não fala · 2 segundos de silêncio]</w:t>
-      </w:r>
-    </w:p>
-    <w:p>
-      <w:r>
-        <w:rPr>
-          <w:i w:val="0"/>
-        </w:rPr>
-        <w:t>Pressão: 20 por 16. Já em dois anti-hipertensivos — e não cede. Dor de cabeça, palpitação e suor... em crises. Tem hora que tá bem, tem hora que dispara.</w:t>
+        <w:t>[DIREÇÃO: olha pra lente · 2 segundos de silêncio]</w:t>
       </w:r>
     </w:p>
     <w:p>
@@ -2696,7 +1731,7 @@
         <w:rPr>
           <w:i w:val="0"/>
         </w:rPr>
-        <w:t>Tem um padrão nas crises que muda tudo.</w:t>
+        <w:t>A pista tava numa pergunta: (pausa) como vêm as crises? Cefaleia, palpitação e sudorese — juntas, em ondas.</w:t>
       </w:r>
     </w:p>
     <w:p>
@@ -2704,270 +1739,7 @@
         <w:rPr>
           <w:i w:val="0"/>
         </w:rPr>
-        <w:t>E você... (pausa) ...por onde você começaria?</w:t>
-      </w:r>
-    </w:p>
-    <w:p>
-      <w:r>
-        <w:rPr>
-          <w:b/>
-          <w:color w:val="555555"/>
-        </w:rPr>
-        <w:t>ENCERRAMENTO (tela preta — sempre igual)</w:t>
-      </w:r>
-    </w:p>
-    <w:p>
-      <w:pPr>
-        <w:jc w:val="center"/>
-      </w:pPr>
-      <w:r>
-        <w:rPr>
-          <w:b/>
-          <w:color w:val="5B21B6"/>
-          <w:sz w:val="22"/>
-        </w:rPr>
-        <w:t>"Seu plantão não acabou."</w:t>
-      </w:r>
-    </w:p>
-    <w:p>
-      <w:pPr>
-        <w:jc w:val="center"/>
-      </w:pPr>
-      <w:r>
-        <w:rPr>
-          <w:b/>
-          <w:color w:val="5B21B6"/>
-          <w:sz w:val="22"/>
-        </w:rPr>
-        <w:t>QUINTA · 20H</w:t>
-      </w:r>
-    </w:p>
-    <w:p>
-      <w:r>
-        <w:rPr>
-          <w:b/>
-          <w:color w:val="555555"/>
-        </w:rPr>
-        <w:t>LEGENDA DO POST</w:t>
-      </w:r>
-    </w:p>
-    <w:p>
-      <w:r>
-        <w:rPr>
-          <w:i w:val="0"/>
-        </w:rPr>
-        <w:t>🚨 SEU PLANTÃO · Caso #004 · É Só Ansiedade</w:t>
-      </w:r>
-    </w:p>
-    <w:p>
-      <w:r>
-        <w:rPr>
-          <w:i w:val="0"/>
-        </w:rPr>
-        <w:t>Você assumiria esse caso?</w:t>
-      </w:r>
-    </w:p>
-    <w:p>
-      <w:r>
-        <w:rPr>
-          <w:i w:val="0"/>
-        </w:rPr>
-        <w:t>Rapaz, 18 anos.</w:t>
-      </w:r>
-    </w:p>
-    <w:p>
-      <w:r>
-        <w:rPr>
-          <w:i w:val="0"/>
-        </w:rPr>
-        <w:t>Tratado como ansiedade há meses.</w:t>
-      </w:r>
-    </w:p>
-    <w:p>
-      <w:r>
-        <w:rPr>
-          <w:i w:val="0"/>
-        </w:rPr>
-        <w:t>Pressão 20x16 que não cede.</w:t>
-      </w:r>
-    </w:p>
-    <w:p>
-      <w:r>
-        <w:rPr>
-          <w:i w:val="0"/>
-        </w:rPr>
-        <w:t>E você — por onde começaria?</w:t>
-      </w:r>
-    </w:p>
-    <w:p>
-      <w:r>
-        <w:rPr>
-          <w:i w:val="0"/>
-        </w:rPr>
-        <w:t>👇 Quero saber seu próximo passo, antes do debrief de quinta.</w:t>
-      </w:r>
-    </w:p>
-    <w:p>
-      <w:r>
-        <w:rPr>
-          <w:i w:val="0"/>
-        </w:rPr>
-      </w:r>
-    </w:p>
-    <w:p>
-      <w:r>
-        <w:rPr>
-          <w:i w:val="0"/>
-        </w:rPr>
-        <w:t>#pendurajaleco #medicina #casoclinico #plantao #internato #residenciamedica #estudantedemedicina #emergencia</w:t>
-      </w:r>
-    </w:p>
-    <w:p>
-      <w:r>
-        <w:rPr>
-          <w:b/>
-          <w:color w:val="555555"/>
-        </w:rPr>
-        <w:t>COMENTÁRIO FIXADO</w:t>
-      </w:r>
-    </w:p>
-    <w:p>
-      <w:r>
-        <w:rPr>
-          <w:i w:val="0"/>
-        </w:rPr>
-        <w:t>Jovem + hipertensão grave que não cede ≠ ansiedade. 🧠 Comenta por onde você começaria, antes do debrief de quinta. 👇</w:t>
-      </w:r>
-    </w:p>
-    <w:p>
-      <w:pPr>
-        <w:jc w:val="center"/>
-      </w:pPr>
-      <w:r>
-        <w:rPr>
-          <w:color w:val="CCCCCC"/>
-        </w:rPr>
-        <w:t>— — — — — — — — — — — — — — — — — — — —</w:t>
-      </w:r>
-    </w:p>
-    <w:p>
-      <w:r>
-        <w:rPr>
-          <w:b/>
-          <w:color w:val="5B21B6"/>
-          <w:sz w:val="30"/>
-        </w:rPr>
-        <w:t>🩺 DEBRIEF DO PLANTÃO — QUINTA (discussão de corredor)</w:t>
-      </w:r>
-    </w:p>
-    <w:p>
-      <w:r>
-        <w:rPr>
-          <w:b/>
-          <w:color w:val="555555"/>
-        </w:rPr>
-        <w:t>CAPA (mesma arte, com 🩺)</w:t>
-      </w:r>
-    </w:p>
-    <w:p>
-      <w:pPr>
-        <w:jc w:val="center"/>
-      </w:pPr>
-      <w:r>
-        <w:rPr>
-          <w:b/>
-          <w:color w:val="555555"/>
-          <w:sz w:val="20"/>
-        </w:rPr>
-        <w:t>🩺</w:t>
-      </w:r>
-    </w:p>
-    <w:p>
-      <w:pPr>
-        <w:jc w:val="center"/>
-      </w:pPr>
-      <w:r>
-        <w:rPr>
-          <w:b/>
-          <w:color w:val="5B21B6"/>
-          <w:sz w:val="28"/>
-        </w:rPr>
-        <w:t>DEBRIEF DO PLANTÃO</w:t>
-      </w:r>
-    </w:p>
-    <w:p>
-      <w:pPr>
-        <w:jc w:val="center"/>
-      </w:pPr>
-      <w:r>
-        <w:rPr>
-          <w:b/>
-          <w:color w:val="555555"/>
-          <w:sz w:val="20"/>
-        </w:rPr>
-        <w:t>CASO #004</w:t>
-      </w:r>
-    </w:p>
-    <w:p>
-      <w:pPr>
-        <w:jc w:val="center"/>
-      </w:pPr>
-      <w:r>
-        <w:rPr>
-          <w:b/>
-          <w:color w:val="5B21B6"/>
-          <w:sz w:val="26"/>
-        </w:rPr>
-        <w:t>É SÓ ANSIEDADE</w:t>
-      </w:r>
-    </w:p>
-    <w:p>
-      <w:r>
-        <w:rPr>
-          <w:b/>
-          <w:color w:val="555555"/>
-        </w:rPr>
-        <w:t>ROTEIRO (falado, máx. 60s)</w:t>
-      </w:r>
-    </w:p>
-    <w:p>
-      <w:r>
-        <w:rPr>
-          <w:i w:val="0"/>
-        </w:rPr>
-        <w:t>Interno... (pausa) sobre o plantão de terça.</w:t>
-      </w:r>
-    </w:p>
-    <w:p>
-      <w:r>
-        <w:rPr>
-          <w:i w:val="0"/>
-        </w:rPr>
-        <w:t>"Vi muita gente seguindo o carimbo de ansiedade."</w:t>
-      </w:r>
-    </w:p>
-    <w:p>
-      <w:r>
-        <w:rPr>
-          <w:i w:val="0"/>
-        </w:rPr>
-        <w:t>(pausa) "Mas oito idas ao PS com pressão 20 por 16 pedem outra pergunta."</w:t>
-      </w:r>
-    </w:p>
-    <w:p>
-      <w:r>
-        <w:rPr>
-          <w:i w:val="0"/>
-        </w:rPr>
-        <w:t>(pausa) "Uma pergunta: como vêm as crises?"</w:t>
-      </w:r>
-    </w:p>
-    <w:p>
-      <w:r>
-        <w:rPr>
-          <w:i w:val="0"/>
-        </w:rPr>
-        <w:t>Cefaleia, palpitação e sudorese — juntas, em ondas. O que parecia pânico era adrenalina de um tumor.</w:t>
+        <w:t>O que parecia pânico era adrenalina despejada por um tumor.</w:t>
       </w:r>
     </w:p>
     <w:p>
@@ -2984,31 +1756,6 @@
           <w:i w:val="0"/>
         </w:rPr>
         <w:t>E o que mudou esse caso... (pausa) não foi um exame. (pausa) Foi a anamnese.</w:t>
-      </w:r>
-    </w:p>
-    <w:p>
-      <w:r>
-        <w:rPr>
-          <w:i/>
-          <w:color w:val="555555"/>
-        </w:rPr>
-        <w:t>[silêncio · tela preta]</w:t>
-      </w:r>
-    </w:p>
-    <w:p>
-      <w:r>
-        <w:rPr>
-          <w:i w:val="0"/>
-        </w:rPr>
-        <w:t>Bom plantão, Interno.</w:t>
-      </w:r>
-    </w:p>
-    <w:p>
-      <w:r>
-        <w:rPr>
-          <w:i w:val="0"/>
-        </w:rPr>
-        <w:t>Pode ir... (pausa) esse paciente já não é mais seu.</w:t>
       </w:r>
     </w:p>
     <w:p>
@@ -3073,33 +1820,31 @@
           <w:b/>
           <w:color w:val="555555"/>
         </w:rPr>
-        <w:t>ENCERRAMENTO (tela preta — sempre igual)</w:t>
+        <w:t>CTA + FECHAMENTO DO CICLO</w:t>
       </w:r>
     </w:p>
     <w:p>
-      <w:pPr>
-        <w:jc w:val="center"/>
-      </w:pPr>
       <w:r>
         <w:rPr>
-          <w:b/>
-          <w:color w:val="5B21B6"/>
-          <w:sz w:val="22"/>
+          <w:i w:val="0"/>
         </w:rPr>
-        <w:t>PRÓXIMO PACIENTE</w:t>
+        <w:t>E você — quantas vezes quase carimba antes de pensar? Comenta.</w:t>
       </w:r>
     </w:p>
     <w:p>
-      <w:pPr>
-        <w:jc w:val="center"/>
-      </w:pPr>
       <w:r>
         <w:rPr>
-          <w:b/>
-          <w:color w:val="5B21B6"/>
-          <w:sz w:val="22"/>
+          <w:i w:val="0"/>
         </w:rPr>
-        <w:t>TERÇA · 20H</w:t>
+        <w:t>Bom plantão, Interno.</w:t>
+      </w:r>
+    </w:p>
+    <w:p>
+      <w:r>
+        <w:rPr>
+          <w:i w:val="0"/>
+        </w:rPr>
+        <w:t>Pode ir... (pausa) esse paciente já não é mais seu.</w:t>
       </w:r>
     </w:p>
     <w:p>
@@ -3116,7 +1861,7 @@
         <w:rPr>
           <w:i w:val="0"/>
         </w:rPr>
-        <w:t>🩺 DEBRIEF DO PLANTÃO · Caso #004 · É Só Ansiedade</w:t>
+        <w:t>🚨 SEU PLANTÃO · Caso #004 · É Só Ansiedade</w:t>
       </w:r>
     </w:p>
     <w:p>
@@ -3124,7 +1869,7 @@
         <w:rPr>
           <w:i w:val="0"/>
         </w:rPr>
-        <w:t>O debrief do Caso #004 já está no ar.</w:t>
+        <w:t>Você assumiria esse caso?</w:t>
       </w:r>
     </w:p>
     <w:p>
@@ -3132,7 +1877,7 @@
         <w:rPr>
           <w:i w:val="0"/>
         </w:rPr>
-        <w:t>FEOCROMOCITOMA</w:t>
+        <w:t>Rapaz, 18 anos.</w:t>
       </w:r>
     </w:p>
     <w:p>
@@ -3140,7 +1885,7 @@
         <w:rPr>
           <w:i w:val="0"/>
         </w:rPr>
-        <w:t>Não era pânico — era adrenalina de um tumor. Uma pergunta ("como vêm as crises?") mudou tudo: cefaleia + palpitação + sudorese, em ondas.</w:t>
+        <w:t>Tratado como ansiedade há meses.</w:t>
       </w:r>
     </w:p>
     <w:p>
@@ -3148,7 +1893,7 @@
         <w:rPr>
           <w:i w:val="0"/>
         </w:rPr>
-        <w:t>Lição: Hipertensão grave no jovem você investiga, não carimba.</w:t>
+        <w:t>Pressão 20x16 que não cede.</w:t>
       </w:r>
     </w:p>
     <w:p>
@@ -3156,7 +1901,7 @@
         <w:rPr>
           <w:i w:val="0"/>
         </w:rPr>
-        <w:t>Quem examina, enxerga.</w:t>
+        <w:t>A resposta está no vídeo — mas antes: por onde VOCÊ começaria?</w:t>
       </w:r>
     </w:p>
     <w:p>
@@ -3164,7 +1909,7 @@
         <w:rPr>
           <w:i w:val="0"/>
         </w:rPr>
-        <w:t>E você, quantas vezes quase carimba antes de pensar? 👇</w:t>
+        <w:t>👇 Comenta. Quantas vezes quase carimba antes de pensar?</w:t>
       </w:r>
     </w:p>
     <w:p>
@@ -3172,7 +1917,7 @@
         <w:rPr>
           <w:i w:val="0"/>
         </w:rPr>
-        <w:t>Salva pro seu próximo plantão.</w:t>
+        <w:t>Lição: Hipertensão grave no jovem você investiga, não carimba.  ·  Quem examina, enxerga.</w:t>
       </w:r>
     </w:p>
     <w:p>
@@ -3204,7 +1949,7 @@
         <w:rPr>
           <w:i w:val="0"/>
         </w:rPr>
-        <w:t>Guarda a tríade do feo: cefaleia + palpitação + sudorese, em crises. ✅ Jovem com HAS grave = investiga. 🚨</w:t>
+        <w:t>Jovem + hipertensão grave que não cede ≠ ansiedade. 🧠 Comenta seu próximo passo. 👇</w:t>
       </w:r>
     </w:p>
     <w:p>
@@ -3260,7 +2005,7 @@
         <w:rPr>
           <w:i w:val="0"/>
         </w:rPr>
-        <w:t>3. Atividade no perfil / visitas — interno que volta na quinta pro debrief é quem constrói a base.</w:t>
+        <w:t>3. Retenção até o FIM do reel — a resposta está no final. Se caírem antes, encurte os dados do meio (não o silêncio nem o finale).</w:t>
       </w:r>
     </w:p>
     <w:p>
@@ -3268,7 +2013,7 @@
         <w:rPr>
           <w:i w:val="0"/>
         </w:rPr>
-        <w:t>4. Retenção entre PLANTÃO (terça) e DEBRIEF (quinta).</w:t>
+        <w:t>4. Atividade no perfil / visitas e seguidores ganhos por reel.</w:t>
       </w:r>
     </w:p>
     <w:p>

</xml_diff>